<commit_message>
continue brouillon tp3 veille
</commit_message>
<xml_diff>
--- a/brouillon-veille/Brouillon_Projet_3.docx
+++ b/brouillon-veille/Brouillon_Projet_3.docx
@@ -1,6 +1,6 @@
 
 <file path=word/document.xml><?xml version="1.0" encoding="utf-8"?>
-<w:document xmlns:wpc="http://schemas.microsoft.com/office/word/2010/wordprocessingCanvas" xmlns:cx="http://schemas.microsoft.com/office/drawing/2014/chartex" xmlns:cx1="http://schemas.microsoft.com/office/drawing/2015/9/8/chartex" xmlns:cx2="http://schemas.microsoft.com/office/drawing/2015/10/21/chartex" xmlns:cx3="http://schemas.microsoft.com/office/drawing/2016/5/9/chartex" xmlns:cx4="http://schemas.microsoft.com/office/drawing/2016/5/10/chartex" xmlns:cx5="http://schemas.microsoft.com/office/drawing/2016/5/11/chartex" xmlns:cx6="http://schemas.microsoft.com/office/drawing/2016/5/12/chartex" xmlns:cx7="http://schemas.microsoft.com/office/drawing/2016/5/13/chartex" xmlns:cx8="http://schemas.microsoft.com/office/drawing/2016/5/14/chartex" xmlns:mc="http://schemas.openxmlformats.org/markup-compatibility/2006" xmlns:aink="http://schemas.microsoft.com/office/drawing/2016/ink" xmlns:am3d="http://schemas.microsoft.com/office/drawing/2017/model3d" xmlns:o="urn:schemas-microsoft-com:office:office" xmlns:r="http://schemas.openxmlformats.org/officeDocument/2006/relationships" xmlns:m="http://schemas.openxmlformats.org/officeDocument/2006/math" xmlns:v="urn:schemas-microsoft-com:vml" xmlns:wp14="http://schemas.microsoft.com/office/word/2010/wordprocessingDrawing" xmlns:wp="http://schemas.openxmlformats.org/drawingml/2006/wordprocessingDrawing" xmlns:w10="urn:schemas-microsoft-com:office:word" xmlns:w="http://schemas.openxmlformats.org/wordprocessingml/2006/main" xmlns:w14="http://schemas.microsoft.com/office/word/2010/wordml" xmlns:w15="http://schemas.microsoft.com/office/word/2012/wordml" xmlns:w16cid="http://schemas.microsoft.com/office/word/2016/wordml/cid" xmlns:w16se="http://schemas.microsoft.com/office/word/2015/wordml/symex" xmlns:wpg="http://schemas.microsoft.com/office/word/2010/wordprocessingGroup" xmlns:wpi="http://schemas.microsoft.com/office/word/2010/wordprocessingInk" xmlns:wne="http://schemas.microsoft.com/office/word/2006/wordml" xmlns:wps="http://schemas.microsoft.com/office/word/2010/wordprocessingShape" mc:Ignorable="w14 w15 w16se w16cid wp14">
+<w:document xmlns:wpc="http://schemas.microsoft.com/office/word/2010/wordprocessingCanvas" xmlns:cx="http://schemas.microsoft.com/office/drawing/2014/chartex" xmlns:cx1="http://schemas.microsoft.com/office/drawing/2015/9/8/chartex" xmlns:cx2="http://schemas.microsoft.com/office/drawing/2015/10/21/chartex" xmlns:cx3="http://schemas.microsoft.com/office/drawing/2016/5/9/chartex" xmlns:cx4="http://schemas.microsoft.com/office/drawing/2016/5/10/chartex" xmlns:cx5="http://schemas.microsoft.com/office/drawing/2016/5/11/chartex" xmlns:cx6="http://schemas.microsoft.com/office/drawing/2016/5/12/chartex" xmlns:cx7="http://schemas.microsoft.com/office/drawing/2016/5/13/chartex" xmlns:cx8="http://schemas.microsoft.com/office/drawing/2016/5/14/chartex" xmlns:mc="http://schemas.openxmlformats.org/markup-compatibility/2006" xmlns:aink="http://schemas.microsoft.com/office/drawing/2016/ink" xmlns:am3d="http://schemas.microsoft.com/office/drawing/2017/model3d" xmlns:o="urn:schemas-microsoft-com:office:office" xmlns:oel="http://schemas.microsoft.com/office/2019/extlst" xmlns:r="http://schemas.openxmlformats.org/officeDocument/2006/relationships" xmlns:m="http://schemas.openxmlformats.org/officeDocument/2006/math" xmlns:v="urn:schemas-microsoft-com:vml" xmlns:wp14="http://schemas.microsoft.com/office/word/2010/wordprocessingDrawing" xmlns:wp="http://schemas.openxmlformats.org/drawingml/2006/wordprocessingDrawing" xmlns:w10="urn:schemas-microsoft-com:office:word" xmlns:w="http://schemas.openxmlformats.org/wordprocessingml/2006/main" xmlns:w14="http://schemas.microsoft.com/office/word/2010/wordml" xmlns:w15="http://schemas.microsoft.com/office/word/2012/wordml" xmlns:w16cex="http://schemas.microsoft.com/office/word/2018/wordml/cex" xmlns:w16cid="http://schemas.microsoft.com/office/word/2016/wordml/cid" xmlns:w16="http://schemas.microsoft.com/office/word/2018/wordml" xmlns:w16du="http://schemas.microsoft.com/office/word/2023/wordml/word16du" xmlns:w16sdtdh="http://schemas.microsoft.com/office/word/2020/wordml/sdtdatahash" xmlns:w16sdtfl="http://schemas.microsoft.com/office/word/2024/wordml/sdtformatlock" xmlns:w16se="http://schemas.microsoft.com/office/word/2015/wordml/symex" xmlns:wpg="http://schemas.microsoft.com/office/word/2010/wordprocessingGroup" xmlns:wpi="http://schemas.microsoft.com/office/word/2010/wordprocessingInk" xmlns:wne="http://schemas.microsoft.com/office/word/2006/wordml" xmlns:wps="http://schemas.microsoft.com/office/word/2010/wordprocessingShape" mc:Ignorable="w14 w15 w16se w16cid w16 w16cex w16sdtdh w16sdtfl w16du wp14">
   <w:body>
     <w:p>
       <w:pPr>
@@ -36,7 +36,6 @@
               <w:showingPlcHdr/>
               <w:bibliography/>
             </w:sdtPr>
-            <w:sdtEndPr/>
             <w:sdtContent>
               <w:r>
                 <w:rPr>
@@ -90,8 +89,6 @@
         </w:rPr>
         <w:t>Veille</w:t>
       </w:r>
-      <w:bookmarkStart w:id="0" w:name="_GoBack"/>
-      <w:bookmarkEnd w:id="0"/>
       <w:r>
         <w:rPr>
           <w:rFonts w:ascii="Times New Roman" w:hAnsi="Times New Roman" w:cs="Times New Roman"/>
@@ -134,7 +131,7 @@
           <w:i/>
           <w:iCs/>
         </w:rPr>
-        <w:t xml:space="preserve">dans le cadre </w:t>
+        <w:t>Dans</w:t>
       </w:r>
       <w:r>
         <w:rPr>
@@ -142,7 +139,7 @@
           <w:i/>
           <w:iCs/>
         </w:rPr>
-        <w:t xml:space="preserve">du projet final </w:t>
+        <w:t xml:space="preserve"> le cadre </w:t>
       </w:r>
       <w:r>
         <w:rPr>
@@ -150,7 +147,15 @@
           <w:i/>
           <w:iCs/>
         </w:rPr>
-        <w:t xml:space="preserve"> L’Attaque</w:t>
+        <w:t xml:space="preserve">du projet </w:t>
+      </w:r>
+      <w:r>
+        <w:rPr>
+          <w:rFonts w:ascii="Times New Roman" w:hAnsi="Times New Roman" w:cs="Times New Roman"/>
+          <w:i/>
+          <w:iCs/>
+        </w:rPr>
+        <w:t>final L’Attaque</w:t>
       </w:r>
     </w:p>
     <w:p>
@@ -165,7 +170,33 @@
         <w:rPr>
           <w:rFonts w:ascii="Times New Roman" w:hAnsi="Times New Roman" w:cs="Times New Roman"/>
         </w:rPr>
-        <w:t>Charlotte DUPRAS  •  Eddy HUART</w:t>
+        <w:t xml:space="preserve">Charlotte </w:t>
+      </w:r>
+      <w:r>
+        <w:rPr>
+          <w:rFonts w:ascii="Times New Roman" w:hAnsi="Times New Roman" w:cs="Times New Roman"/>
+        </w:rPr>
+        <w:t xml:space="preserve">DUPRAS </w:t>
+      </w:r>
+      <w:proofErr w:type="gramStart"/>
+      <w:r>
+        <w:rPr>
+          <w:rFonts w:ascii="Times New Roman" w:hAnsi="Times New Roman" w:cs="Times New Roman"/>
+        </w:rPr>
+        <w:t>•</w:t>
+      </w:r>
+      <w:r>
+        <w:rPr>
+          <w:rFonts w:ascii="Times New Roman" w:hAnsi="Times New Roman" w:cs="Times New Roman"/>
+        </w:rPr>
+        <w:t xml:space="preserve">  Eddy</w:t>
+      </w:r>
+      <w:proofErr w:type="gramEnd"/>
+      <w:r>
+        <w:rPr>
+          <w:rFonts w:ascii="Times New Roman" w:hAnsi="Times New Roman" w:cs="Times New Roman"/>
+        </w:rPr>
+        <w:t xml:space="preserve"> HUART</w:t>
       </w:r>
     </w:p>
     <w:p>
@@ -299,11 +330,19 @@
           <w:rFonts w:ascii="Times New Roman" w:hAnsi="Times New Roman" w:cs="Times New Roman"/>
         </w:rPr>
       </w:pPr>
-      <w:r>
-        <w:rPr>
-          <w:rFonts w:ascii="Times New Roman" w:hAnsi="Times New Roman" w:cs="Times New Roman"/>
-        </w:rPr>
-        <w:t>lundi, 4 mai 2026</w:t>
+      <w:proofErr w:type="gramStart"/>
+      <w:r>
+        <w:rPr>
+          <w:rFonts w:ascii="Times New Roman" w:hAnsi="Times New Roman" w:cs="Times New Roman"/>
+        </w:rPr>
+        <w:t>lundi</w:t>
+      </w:r>
+      <w:proofErr w:type="gramEnd"/>
+      <w:r>
+        <w:rPr>
+          <w:rFonts w:ascii="Times New Roman" w:hAnsi="Times New Roman" w:cs="Times New Roman"/>
+        </w:rPr>
+        <w:t>, 4 mai 2026</w:t>
       </w:r>
     </w:p>
     <w:p>
@@ -364,10 +403,7 @@
         <w:t xml:space="preserve"> </w:t>
       </w:r>
       <w:r>
-        <w:rPr>
-          <w:highlight w:val="yellow"/>
-        </w:rPr>
-        <w:t>AJOUTER CONCLUSIONS PROJET2 MCTS ICI</w:t>
+        <w:t>Du côté du MCTS, le projet 2 a identifié les priors, ainsi que les heuristiques comme mécanismes qui pourraient optimiser l’algorithme, ainsi que réitéré l’importance des belief states pour la « déterminisation » du plateau de jeu. Ces éléments combinés permettent de mieux gérer l’incertitude et d’orienter efficacement la recherche vers des décisions stratégiques plus robustes.</w:t>
       </w:r>
     </w:p>
     <w:p>
@@ -375,7 +411,7 @@
         <w:pStyle w:val="font-claude-response-body"/>
         <w:jc w:val="both"/>
       </w:pPr>
-      <w:bookmarkStart w:id="1" w:name="_Hlk228803356"/>
+      <w:bookmarkStart w:id="0" w:name="_Hlk228803356"/>
       <w:r>
         <w:t xml:space="preserve">Ce troisième travail prolonge la réflexion amorcée dans le Projet 2 en étudiant conjointement React et le MCTS dans le cadre du projet synthèse </w:t>
       </w:r>
@@ -449,27 +485,185 @@
     </w:p>
     <w:p>
       <w:pPr>
-        <w:spacing w:after="120"/>
-        <w:rPr>
-          <w:rFonts w:ascii="Times New Roman" w:hAnsi="Times New Roman" w:cs="Times New Roman"/>
-        </w:rPr>
-      </w:pPr>
-      <w:r>
-        <w:rPr>
-          <w:rFonts w:ascii="Times New Roman" w:hAnsi="Times New Roman" w:cs="Times New Roman"/>
-        </w:rPr>
-        <w:t>L’implémentation du MCTS constitue le cœur de l’adversaire artificiel</w:t>
-      </w:r>
-      <w:r>
-        <w:rPr>
-          <w:rFonts w:ascii="Times New Roman" w:hAnsi="Times New Roman" w:cs="Times New Roman"/>
-          <w:highlight w:val="yellow"/>
-        </w:rPr>
-        <w:t>...</w:t>
+        <w:rPr>
+          <w:rFonts w:ascii="Times New Roman" w:eastAsia="Times New Roman" w:hAnsi="Times New Roman" w:cs="Times New Roman"/>
+          <w:kern w:val="0"/>
+          <w:lang w:eastAsia="fr-CA"/>
+          <w14:ligatures w14:val="none"/>
+        </w:rPr>
+      </w:pPr>
+      <w:r>
+        <w:rPr>
+          <w:rFonts w:ascii="Times New Roman" w:eastAsia="Times New Roman" w:hAnsi="Times New Roman" w:cs="Times New Roman"/>
+          <w:kern w:val="0"/>
+          <w:lang w:eastAsia="fr-CA"/>
+          <w14:ligatures w14:val="none"/>
+        </w:rPr>
+        <w:t>L’IA du jeu repose sur une combinaison de MCTS, de belief states, de priors et de fonctions heuristiques afin de gérer la complexité et l’incertitude qui sont propres à Stratego.</w:t>
+      </w:r>
+    </w:p>
+    <w:p>
+      <w:pPr>
+        <w:keepNext/>
+      </w:pPr>
+      <w:r>
+        <w:rPr>
+          <w:rFonts w:ascii="Times New Roman" w:eastAsia="Times New Roman" w:hAnsi="Times New Roman" w:cs="Times New Roman"/>
+          <w:kern w:val="0"/>
+          <w:lang w:eastAsia="fr-CA"/>
+          <w14:ligatures w14:val="none"/>
+        </w:rPr>
+        <w:lastRenderedPageBreak/>
+        <w:drawing>
+          <wp:inline distT="0" distB="0" distL="0" distR="0" wp14:anchorId="4DB9F65D" wp14:editId="2F80BF71">
+            <wp:extent cx="5486400" cy="2436495"/>
+            <wp:effectExtent l="0" t="0" r="0" b="1905"/>
+            <wp:docPr id="263758846" name="Image 1"/>
+            <wp:cNvGraphicFramePr>
+              <a:graphicFrameLocks xmlns:a="http://schemas.openxmlformats.org/drawingml/2006/main" noChangeAspect="1"/>
+            </wp:cNvGraphicFramePr>
+            <a:graphic xmlns:a="http://schemas.openxmlformats.org/drawingml/2006/main">
+              <a:graphicData uri="http://schemas.openxmlformats.org/drawingml/2006/picture">
+                <pic:pic xmlns:pic="http://schemas.openxmlformats.org/drawingml/2006/picture">
+                  <pic:nvPicPr>
+                    <pic:cNvPr id="263758846" name=""/>
+                    <pic:cNvPicPr/>
+                  </pic:nvPicPr>
+                  <pic:blipFill>
+                    <a:blip r:embed="rId8"/>
+                    <a:stretch>
+                      <a:fillRect/>
+                    </a:stretch>
+                  </pic:blipFill>
+                  <pic:spPr>
+                    <a:xfrm>
+                      <a:off x="0" y="0"/>
+                      <a:ext cx="5486400" cy="2436495"/>
+                    </a:xfrm>
+                    <a:prstGeom prst="rect">
+                      <a:avLst/>
+                    </a:prstGeom>
+                  </pic:spPr>
+                </pic:pic>
+              </a:graphicData>
+            </a:graphic>
+          </wp:inline>
+        </w:drawing>
+      </w:r>
+    </w:p>
+    <w:p>
+      <w:pPr>
+        <w:pStyle w:val="Lgende"/>
+        <w:jc w:val="center"/>
+      </w:pPr>
+      <w:r>
+        <w:t xml:space="preserve">Explication des priors, belief states et heuristiques utilisés par un algorithme MCTS pour Stratego </w:t>
+      </w:r>
+      <w:sdt>
+        <w:sdtPr>
+          <w:id w:val="-1622836471"/>
+          <w:citation/>
+        </w:sdtPr>
+        <w:sdtContent>
+          <w:r>
+            <w:fldChar w:fldCharType="begin"/>
+          </w:r>
+          <w:r>
+            <w:instrText xml:space="preserve"> CITATION Ope26 \l 3084 </w:instrText>
+          </w:r>
+          <w:r>
+            <w:fldChar w:fldCharType="separate"/>
+          </w:r>
+          <w:r>
+            <w:rPr>
+              <w:noProof/>
+            </w:rPr>
+            <w:t>(OpenAI, 2026)</w:t>
+          </w:r>
+          <w:r>
+            <w:fldChar w:fldCharType="end"/>
+          </w:r>
+        </w:sdtContent>
+      </w:sdt>
+    </w:p>
+    <w:p>
+      <w:pPr>
+        <w:rPr>
+          <w:rFonts w:ascii="Times New Roman" w:eastAsia="Times New Roman" w:hAnsi="Times New Roman" w:cs="Times New Roman"/>
+          <w:kern w:val="0"/>
+          <w:lang w:eastAsia="fr-CA"/>
+          <w14:ligatures w14:val="none"/>
+        </w:rPr>
+      </w:pPr>
+      <w:r>
+        <w:rPr>
+          <w:rFonts w:ascii="Times New Roman" w:eastAsia="Times New Roman" w:hAnsi="Times New Roman" w:cs="Times New Roman"/>
+          <w:kern w:val="0"/>
+          <w:lang w:eastAsia="fr-CA"/>
+          <w14:ligatures w14:val="none"/>
+        </w:rPr>
+        <w:t xml:space="preserve"> </w:t>
+      </w:r>
+    </w:p>
+    <w:p>
+      <w:pPr>
+        <w:rPr>
+          <w:rFonts w:ascii="Times New Roman" w:eastAsia="Times New Roman" w:hAnsi="Times New Roman" w:cs="Times New Roman"/>
+          <w:kern w:val="0"/>
+          <w:lang w:eastAsia="fr-CA"/>
+          <w14:ligatures w14:val="none"/>
+        </w:rPr>
+      </w:pPr>
+      <w:r>
+        <w:rPr>
+          <w:rFonts w:ascii="Times New Roman" w:eastAsia="Times New Roman" w:hAnsi="Times New Roman" w:cs="Times New Roman"/>
+          <w:kern w:val="0"/>
+          <w:lang w:eastAsia="fr-CA"/>
+          <w14:ligatures w14:val="none"/>
+        </w:rPr>
+        <w:t>Tout d’abord, les belief states permettent de « déterminiser » le plateau de jeu, c’est-à-dire de transformer une configuration partiellement inconnue en une version cohérente où chaque pièce cachée se voit attribuer une valeur précise. Dans le cas de Stratego, les BeliefPieces contiennent l’ensemble des valeurs possibles pour chaque pièce non révélée, associées à des probabilités. La déterminisation consiste alors à parcourir récursivement cette liste et à assigner à chaque pièce un type concret en fonction de ses probabilités, tout en introduisant une part de hasard contrôlé afin d’éviter que la même configuration de plateau soit toujours générée. Cela permet de produire plusieurs états “réels” plausibles à partir d’un même état de croyance.</w:t>
+      </w:r>
+    </w:p>
+    <w:p>
+      <w:pPr>
+        <w:rPr>
+          <w:rFonts w:ascii="Times New Roman" w:eastAsia="Times New Roman" w:hAnsi="Times New Roman" w:cs="Times New Roman"/>
+          <w:kern w:val="0"/>
+          <w:lang w:eastAsia="fr-CA"/>
+          <w14:ligatures w14:val="none"/>
+        </w:rPr>
+      </w:pPr>
+      <w:r>
+        <w:rPr>
+          <w:rFonts w:ascii="Times New Roman" w:eastAsia="Times New Roman" w:hAnsi="Times New Roman" w:cs="Times New Roman"/>
+          <w:kern w:val="0"/>
+          <w:lang w:eastAsia="fr-CA"/>
+          <w14:ligatures w14:val="none"/>
+        </w:rPr>
+        <w:t>Ensuite, le MCTS explore progressivement l’arbre des coups possibles sur le plateau « déterminisé » en se concentrant sur les branches les plus prometteuses grâce aux priors. Les priors servent à guider cette exploration en attribuant une valeur initiale aux actions avant même d’effectuer une quelconque simulation. Ils estiment si un coup révèle de l’information sur une pièce non révélée, s’il permet de capturer une pièce de haut rang, ou s’il expose une pièce importante à un danger immédiat. Ces signaux permettent de privilégier les décisions qui ont un potentiel stratégique élevé dès les premières itérations de recherche, tout en laissant le MCTS affiner progressivement les évaluations via les résultats des simulations.</w:t>
+      </w:r>
+    </w:p>
+    <w:p>
+      <w:pPr>
+        <w:rPr>
+          <w:rFonts w:ascii="Times New Roman" w:eastAsia="Times New Roman" w:hAnsi="Times New Roman" w:cs="Times New Roman"/>
+          <w:kern w:val="0"/>
+          <w:lang w:eastAsia="fr-CA"/>
+          <w14:ligatures w14:val="none"/>
+        </w:rPr>
+      </w:pPr>
+      <w:r>
+        <w:rPr>
+          <w:rFonts w:ascii="Times New Roman" w:eastAsia="Times New Roman" w:hAnsi="Times New Roman" w:cs="Times New Roman"/>
+          <w:kern w:val="0"/>
+          <w:lang w:eastAsia="fr-CA"/>
+          <w14:ligatures w14:val="none"/>
+        </w:rPr>
+        <w:t>Finalement, les fonctions heuristiques permettent d’évaluer l’état du plateau de jeu après plusieurs itérations de simulation. Elles servent à attribuer un score aux positions atteintes en prenant en compte des facteurs stratégiques globaux. Elles combinent l’avantage matériel, la sécurité des pièces restantes, les informations gagnées sur les pièces adverses, ainsi que la pression exercée sur les zones critiques du plateau. Contrairement aux priors qui orientent la recherche au début, les heuristiques synthétisent les résultats des simulations pour estimer la qualité réelle d’un état. Le MCTS va rétropropager cette qualité afin d’affiner la sélection des coups prometteurs.</w:t>
       </w:r>
     </w:p>
     <w:p/>
-    <w:bookmarkEnd w:id="1"/>
+    <w:bookmarkEnd w:id="0"/>
     <w:p>
       <w:pPr>
         <w:pStyle w:val="Titre2"/>
@@ -481,6 +675,7 @@
         <w:rPr>
           <w:rFonts w:ascii="Times New Roman" w:hAnsi="Times New Roman" w:cs="Times New Roman"/>
         </w:rPr>
+        <w:lastRenderedPageBreak/>
         <w:t>2</w:t>
       </w:r>
       <w:r>
@@ -589,14 +784,19 @@
         <w:rPr>
           <w:rFonts w:ascii="Times New Roman" w:hAnsi="Times New Roman" w:cs="Times New Roman"/>
         </w:rPr>
-        <w:t xml:space="preserve">Devant la complexité croissante du composant principal, plusieurs hooks personnalisés ont été mis en place. useGameSync interroge périodiquement le serveur pour garder l’état du jeu à jour, usePlacement gère la phase de placement des pièces, tandis que useCellClick </w:t>
-      </w:r>
-      <w:r>
-        <w:rPr>
-          <w:rFonts w:ascii="Times New Roman" w:hAnsi="Times New Roman" w:cs="Times New Roman"/>
-        </w:rPr>
-        <w:lastRenderedPageBreak/>
-        <w:t>traite les interactions effectuées sur le plateau. Ces hooks reposent eux-mêmes sur les hooks natifs useState et useEffect, qui permettent de gérer l’état et les effets de bord directement dans des composants fonctionnels, sans avoir recours à des classes.</w:t>
+        <w:t xml:space="preserve">Devant la complexité croissante du composant principal, plusieurs hooks personnalisés ont été mis en place. </w:t>
+      </w:r>
+      <w:r>
+        <w:rPr>
+          <w:rFonts w:ascii="Times New Roman" w:hAnsi="Times New Roman" w:cs="Times New Roman"/>
+        </w:rPr>
+        <w:t>UseGameSync</w:t>
+      </w:r>
+      <w:r>
+        <w:rPr>
+          <w:rFonts w:ascii="Times New Roman" w:hAnsi="Times New Roman" w:cs="Times New Roman"/>
+        </w:rPr>
+        <w:t xml:space="preserve"> interroge périodiquement le serveur pour garder l’état du jeu à jour, usePlacement gère la phase de placement des pièces, tandis que useCellClick traite les interactions effectuées sur le plateau. Ces hooks reposent eux-mêmes sur les hooks natifs useState et useEffect, qui permettent de gérer l’état et les effets de bord directement dans des composants fonctionnels, sans avoir recours à des classes.</w:t>
       </w:r>
     </w:p>
     <w:p>
@@ -632,7 +832,6 @@
           <w:id w:val="-485709115"/>
           <w:citation/>
         </w:sdtPr>
-        <w:sdtEndPr/>
         <w:sdtContent>
           <w:r>
             <w:rPr>
@@ -716,7 +915,7 @@
                     <pic:cNvPicPr/>
                   </pic:nvPicPr>
                   <pic:blipFill>
-                    <a:blip r:embed="rId8" cstate="print">
+                    <a:blip r:embed="rId9" cstate="print">
                       <a:extLst>
                         <a:ext uri="{28A0092B-C50C-407E-A947-70E740481C1C}">
                           <a14:useLocalDpi xmlns:a14="http://schemas.microsoft.com/office/drawing/2010/main" val="0"/>
@@ -801,8 +1000,17 @@
       <w:pPr>
         <w:pStyle w:val="Titre2"/>
       </w:pPr>
-      <w:r>
-        <w:lastRenderedPageBreak/>
+    </w:p>
+    <w:p>
+      <w:pPr>
+        <w:pStyle w:val="Titre2"/>
+      </w:pPr>
+    </w:p>
+    <w:p>
+      <w:pPr>
+        <w:pStyle w:val="Titre2"/>
+      </w:pPr>
+      <w:r>
         <w:t>2.3 Liens et synergies entre les deux technologies</w:t>
       </w:r>
     </w:p>
@@ -832,13 +1040,10 @@
         <w:pStyle w:val="Titre2"/>
       </w:pPr>
       <w:r>
-        <w:t xml:space="preserve">2.4 Intérêt général </w:t>
-      </w:r>
-      <w:r>
-        <w:t>,</w:t>
-      </w:r>
-      <w:r>
-        <w:t>interopérabilité</w:t>
+        <w:t xml:space="preserve">2.4 Intérêt </w:t>
+      </w:r>
+      <w:r>
+        <w:t>général, interopérabilité</w:t>
       </w:r>
       <w:r>
         <w:t xml:space="preserve"> et technologies similaires</w:t>
@@ -898,7 +1103,27 @@
           <w:sz w:val="24"/>
           <w:szCs w:val="24"/>
         </w:rPr>
-        <w:t xml:space="preserve"> De son côté, le MCTS reste une approche reconnue dans l’intelligence artificielle des jeux, mais son intérêt tient aussi à sa mise en œuvre pratique : dans L’Attaque, son implémentation en Python permet de structurer plus clairement la logique de recherche, de tester plus facilement les simulations et d’ajuster l’algorithme au comportement du jeu. On peut ainsi comparer React à Angular ou à Vue pour l’interface</w:t>
+        <w:t xml:space="preserve"> De son côté, le MCTS reste une approche reconnue dans l’intelligence artificielle des jeux, mais son intérêt tient aussi à sa mise en œuvre pratique : dans L’Attaque, son implémentation en Python permet de structurer plus clairement la logique de recherche, de tester plus facilement les simulations et d’ajuster l’algorithme au comportement du jeu. On peut ainsi comparer React à </w:t>
+      </w:r>
+      <w:proofErr w:type="spellStart"/>
+      <w:r>
+        <w:rPr>
+          <w:rFonts w:ascii="Times New Roman" w:eastAsiaTheme="minorHAnsi" w:hAnsi="Times New Roman" w:cs="Times New Roman"/>
+          <w:color w:val="auto"/>
+          <w:sz w:val="24"/>
+          <w:szCs w:val="24"/>
+        </w:rPr>
+        <w:t>Angular</w:t>
+      </w:r>
+      <w:proofErr w:type="spellEnd"/>
+      <w:r>
+        <w:rPr>
+          <w:rFonts w:ascii="Times New Roman" w:eastAsiaTheme="minorHAnsi" w:hAnsi="Times New Roman" w:cs="Times New Roman"/>
+          <w:color w:val="auto"/>
+          <w:sz w:val="24"/>
+          <w:szCs w:val="24"/>
+        </w:rPr>
+        <w:t xml:space="preserve"> ou à Vue pour l’interface</w:t>
       </w:r>
       <w:r>
         <w:rPr>
@@ -920,7 +1145,6 @@
           <w:id w:val="1017890882"/>
           <w:citation/>
         </w:sdtPr>
-        <w:sdtEndPr/>
         <w:sdtContent>
           <w:r>
             <w:rPr>
@@ -952,6 +1176,7 @@
           <w:r>
             <w:rPr>
               <w:rFonts w:ascii="Times New Roman" w:eastAsiaTheme="minorHAnsi" w:hAnsi="Times New Roman" w:cs="Times New Roman"/>
+              <w:noProof/>
               <w:color w:val="auto"/>
               <w:sz w:val="24"/>
               <w:szCs w:val="24"/>
@@ -979,23 +1204,35 @@
         <w:t>, et le MCTS à des méthodes comme le minimax pour la prise de décision ; dans le projet, leur combinaison a surtout été retenue parce qu’elle correspond bien aux besoins du jeu et permet une bonne articulation entre l’interface et la logique de l’IA.</w:t>
       </w:r>
     </w:p>
+    <w:p/>
+    <w:p/>
+    <w:p/>
     <w:p>
       <w:r>
         <w:rPr>
           <w:noProof/>
         </w:rPr>
+        <w:lastRenderedPageBreak/>
         <w:drawing>
-          <wp:anchor distT="0" distB="0" distL="114300" distR="114300" simplePos="0" relativeHeight="251659264" behindDoc="0" locked="0" layoutInCell="1" allowOverlap="1" wp14:anchorId="4B04B8A9" wp14:editId="2C20E4D5">
+          <wp:anchor distT="0" distB="0" distL="114300" distR="114300" simplePos="0" relativeHeight="251659264" behindDoc="0" locked="0" layoutInCell="1" allowOverlap="1" wp14:anchorId="4B04B8A9" wp14:editId="7F9BA4B3">
             <wp:simplePos x="0" y="0"/>
-            <wp:positionH relativeFrom="column">
-              <wp:posOffset>655320</wp:posOffset>
+            <wp:positionH relativeFrom="margin">
+              <wp:align>center</wp:align>
             </wp:positionH>
             <wp:positionV relativeFrom="paragraph">
-              <wp:posOffset>167640</wp:posOffset>
+              <wp:posOffset>177165</wp:posOffset>
             </wp:positionV>
             <wp:extent cx="2849880" cy="2173033"/>
             <wp:effectExtent l="0" t="0" r="7620" b="0"/>
-            <wp:wrapNone/>
+            <wp:wrapThrough wrapText="bothSides">
+              <wp:wrapPolygon edited="0">
+                <wp:start x="0" y="0"/>
+                <wp:lineTo x="0" y="21398"/>
+                <wp:lineTo x="21513" y="21398"/>
+                <wp:lineTo x="21513" y="0"/>
+                <wp:lineTo x="0" y="0"/>
+              </wp:wrapPolygon>
+            </wp:wrapThrough>
             <wp:docPr id="4" name="Image 4"/>
             <wp:cNvGraphicFramePr>
               <a:graphicFrameLocks xmlns:a="http://schemas.openxmlformats.org/drawingml/2006/main" noChangeAspect="1"/>
@@ -1008,7 +1245,7 @@
                     <pic:cNvPicPr/>
                   </pic:nvPicPr>
                   <pic:blipFill>
-                    <a:blip r:embed="rId9" cstate="print">
+                    <a:blip r:embed="rId10" cstate="print">
                       <a:extLst>
                         <a:ext uri="{28A0092B-C50C-407E-A947-70E740481C1C}">
                           <a14:useLocalDpi xmlns:a14="http://schemas.microsoft.com/office/drawing/2010/main" val="0"/>
@@ -1138,7 +1375,6 @@
         <w:rPr>
           <w:rFonts w:ascii="Times New Roman" w:hAnsi="Times New Roman" w:cs="Times New Roman"/>
         </w:rPr>
-        <w:lastRenderedPageBreak/>
         <w:t>3. Veille technologique</w:t>
       </w:r>
     </w:p>
@@ -1175,7 +1411,7 @@
         <w:rPr>
           <w:rFonts w:ascii="Times New Roman" w:hAnsi="Times New Roman" w:cs="Times New Roman"/>
         </w:rPr>
-        <w:t xml:space="preserve"> En somme, cette veille confirme la pertinence des choix technologiques déjà retenus. Elle ne met en évidence aucun changement urgent à envisager, mais montre que React et le MCTS restent des solutions actuelles et adaptées au projet.</w:t>
+        <w:t>En somme, cette veille confirme la pertinence des choix technologiques déjà retenus. Elle ne met en évidence aucun changement urgent à envisager, mais montre que React et le MCTS restent des solutions actuelles et adaptées au projet.</w:t>
       </w:r>
     </w:p>
     <w:p>
@@ -1224,13 +1460,19 @@
         <w:rPr>
           <w:rFonts w:ascii="Times New Roman" w:hAnsi="Times New Roman" w:cs="Times New Roman"/>
         </w:rPr>
-        <w:t xml:space="preserve">, une combinaison technologique cohérente et complémentaire. React excelle à transformer un état de jeu abstrait en une interface visuelle dynamique et réactive,  </w:t>
-      </w:r>
-      <w:r>
-        <w:rPr>
-          <w:rFonts w:ascii="Times New Roman" w:hAnsi="Times New Roman" w:cs="Times New Roman"/>
-        </w:rPr>
-        <w:t xml:space="preserve">tandis que le MCTS offre à </w:t>
+        <w:t xml:space="preserve">, une combinaison technologique cohérente et complémentaire. React excelle à transformer un état de jeu abstrait en une interface visuelle dynamique et </w:t>
+      </w:r>
+      <w:r>
+        <w:rPr>
+          <w:rFonts w:ascii="Times New Roman" w:hAnsi="Times New Roman" w:cs="Times New Roman"/>
+        </w:rPr>
+        <w:t>réactive, tandis</w:t>
+      </w:r>
+      <w:r>
+        <w:rPr>
+          <w:rFonts w:ascii="Times New Roman" w:hAnsi="Times New Roman" w:cs="Times New Roman"/>
+        </w:rPr>
+        <w:t xml:space="preserve"> que le MCTS offre à </w:t>
       </w:r>
       <w:r>
         <w:rPr>
@@ -1284,6 +1526,7 @@
           <w:sz w:val="24"/>
           <w:szCs w:val="24"/>
         </w:rPr>
+        <w:lastRenderedPageBreak/>
         <w:t>Quant à leur avenir, React et le MCTS devraient rester pertinents dans les années à venir. React continue d’évoluer, même si les aspects client-serveur de son écosystème, comme les Server Components ou Next.js, n’ont pas été abordés dans notre projet. De son côté, le MCTS demeure une méthode efficace pour explorer de grands espaces de décision en conciliant exploration et exploitation</w:t>
       </w:r>
       <w:r>
@@ -1314,7 +1557,16 @@
           <w:sz w:val="24"/>
           <w:szCs w:val="24"/>
         </w:rPr>
-        <w:t>Au final, le développement de L’Attaque montre qu’il est possible de concevoir une application à la fois fonctionnelle, claire et capable d’évoluer avec le temps. React et le MCTS appartiennent à deux domaines différents, mais leur association répond bien aux besoins d’un jeu web moderne. L’un facilite la création d’une interface structurée et dynamique, tandis que l’autre permet de mettre en place une intelligence artificielle capable de prendre des décision</w:t>
+        <w:t>Finalement</w:t>
+      </w:r>
+      <w:r>
+        <w:rPr>
+          <w:rFonts w:ascii="Times New Roman" w:eastAsiaTheme="minorHAnsi" w:hAnsi="Times New Roman" w:cs="Times New Roman"/>
+          <w:color w:val="auto"/>
+          <w:sz w:val="24"/>
+          <w:szCs w:val="24"/>
+        </w:rPr>
+        <w:t>, le développement de L’Attaque montre qu’il est possible de concevoir une application à la fois fonctionnelle, claire et capable d’évoluer avec le temps. React et le MCTS appartiennent à deux domaines différents, mais leur association répond bien aux besoins d’un jeu web moderne. L’un facilite la création d’une interface structurée et dynamique, tandis que l’autre permet de mettre en place une intelligence artificielle capable de prendre des décision</w:t>
       </w:r>
       <w:r>
         <w:rPr>
@@ -1377,7 +1629,6 @@
             <w:id w:val="1336738728"/>
             <w:bibliography/>
           </w:sdtPr>
-          <w:sdtEndPr/>
           <w:sdtContent>
             <w:p>
               <w:pPr>
@@ -1385,6 +1636,8 @@
                 <w:ind w:left="720" w:hanging="720"/>
                 <w:rPr>
                   <w:noProof/>
+                  <w:kern w:val="0"/>
+                  <w14:ligatures w14:val="none"/>
                 </w:rPr>
               </w:pPr>
               <w:r>
@@ -1429,7 +1682,6 @@
                 <w:rPr>
                   <w:noProof/>
                 </w:rPr>
-                <w:lastRenderedPageBreak/>
                 <w:t xml:space="preserve">Ayush. (2026, 05 04). </w:t>
               </w:r>
               <w:r>
@@ -1458,6 +1710,7 @@
               <w:r>
                 <w:rPr>
                   <w:noProof/>
+                  <w:lang w:val="en-CA"/>
                 </w:rPr>
                 <w:t xml:space="preserve">blog.isquaredsoftware.com. (2026, 27 03). </w:t>
               </w:r>
@@ -1466,14 +1719,22 @@
                   <w:i/>
                   <w:iCs/>
                   <w:noProof/>
+                  <w:lang w:val="en-CA"/>
                 </w:rPr>
                 <w:t>https://blog.isquaredsoftware.com/2025/06/react-community-2025/</w:t>
               </w:r>
               <w:r>
                 <w:rPr>
                   <w:noProof/>
-                </w:rPr>
-                <w:t>. Récupéré sur https://blog.isquaredsoftware.com/2025/06/react-community-2025/.</w:t>
+                  <w:lang w:val="en-CA"/>
+                </w:rPr>
+                <w:t xml:space="preserve">. </w:t>
+              </w:r>
+              <w:r>
+                <w:rPr>
+                  <w:noProof/>
+                </w:rPr>
+                <w:t>Récupéré sur https://blog.isquaredsoftware.com/2025/06/react-community-2025/.</w:t>
               </w:r>
             </w:p>
             <w:p>
@@ -1488,21 +1749,29 @@
                 <w:rPr>
                   <w:noProof/>
                 </w:rPr>
-                <w:t xml:space="preserve">Dan Abramov et Rachel Nabors. (2026, 30 01). </w:t>
+                <w:t xml:space="preserve">Bradberry, J. (2015, Septembre 7). </w:t>
               </w:r>
               <w:r>
                 <w:rPr>
                   <w:i/>
                   <w:iCs/>
                   <w:noProof/>
-                </w:rPr>
-                <w:t>React Reference Overview</w:t>
-              </w:r>
-              <w:r>
-                <w:rPr>
-                  <w:noProof/>
-                </w:rPr>
-                <w:t>. Récupéré sur https://react.dev/reference/react.</w:t>
+                  <w:lang w:val="en-CA"/>
+                </w:rPr>
+                <w:t>Introduction to Monte Carlo Tree Search</w:t>
+              </w:r>
+              <w:r>
+                <w:rPr>
+                  <w:noProof/>
+                  <w:lang w:val="en-CA"/>
+                </w:rPr>
+                <w:t xml:space="preserve">. </w:t>
+              </w:r>
+              <w:r>
+                <w:rPr>
+                  <w:noProof/>
+                </w:rPr>
+                <w:t>Récupéré sur Jeff Bradberry: https://jeffbradberry.com/posts/2015/09/intro-to-monte-carlo-tree-search/</w:t>
               </w:r>
             </w:p>
             <w:p>
@@ -1511,27 +1780,31 @@
                 <w:ind w:left="720" w:hanging="720"/>
                 <w:rPr>
                   <w:noProof/>
+                  <w:lang w:val="en-CA"/>
                 </w:rPr>
               </w:pPr>
               <w:r>
                 <w:rPr>
                   <w:noProof/>
-                </w:rPr>
-                <w:t xml:space="preserve">Dodds, K. C. (2026, 05 04). </w:t>
+                  <w:lang w:val="en-CA"/>
+                </w:rPr>
+                <w:t xml:space="preserve">Chaslot, G. M.-B. (2008, Volume 4). PROGRESSIVE STRATEGIES FOR MONTE-CARLO TREE SEARCH. </w:t>
               </w:r>
               <w:r>
                 <w:rPr>
                   <w:i/>
                   <w:iCs/>
                   <w:noProof/>
-                </w:rPr>
-                <w:t>kentcdodds.com</w:t>
-              </w:r>
-              <w:r>
-                <w:rPr>
-                  <w:noProof/>
-                </w:rPr>
-                <w:t>. Récupéré sur kentcdodds.com: https://kentcdodds.com/blog/application-state-management-with-react</w:t>
+                  <w:lang w:val="en-CA"/>
+                </w:rPr>
+                <w:t>New Mathematics and Natural Computation</w:t>
+              </w:r>
+              <w:r>
+                <w:rPr>
+                  <w:noProof/>
+                  <w:lang w:val="en-CA"/>
+                </w:rPr>
+                <w:t>, pp. 343-357.</w:t>
               </w:r>
             </w:p>
             <w:p>
@@ -1545,8 +1818,9 @@
               <w:r>
                 <w:rPr>
                   <w:noProof/>
-                </w:rPr>
-                <w:t xml:space="preserve">Flavio, C. (2026). </w:t>
+                  <w:lang w:val="en-CA"/>
+                </w:rPr>
+                <w:t xml:space="preserve">Cowling, P., Powley, E., &amp; Whitehouse, D. (2012, September). </w:t>
               </w:r>
               <w:r>
                 <w:rPr>
@@ -1554,13 +1828,13 @@
                   <w:iCs/>
                   <w:noProof/>
                 </w:rPr>
-                <w:t>React Handbook.</w:t>
-              </w:r>
-              <w:r>
-                <w:rPr>
-                  <w:noProof/>
-                </w:rPr>
-                <w:t xml:space="preserve"> </w:t>
+                <w:t>Python Code</w:t>
+              </w:r>
+              <w:r>
+                <w:rPr>
+                  <w:noProof/>
+                </w:rPr>
+                <w:t>. Récupéré sur mcts.ai: https://mcts.ai/code/python.html</w:t>
               </w:r>
             </w:p>
             <w:p>
@@ -1569,27 +1843,37 @@
                 <w:ind w:left="720" w:hanging="720"/>
                 <w:rPr>
                   <w:noProof/>
+                  <w:lang w:val="en-CA"/>
                 </w:rPr>
               </w:pPr>
               <w:r>
                 <w:rPr>
                   <w:noProof/>
                 </w:rPr>
-                <w:t xml:space="preserve">freecodecamp.org. (2026, 03 27). </w:t>
+                <w:t xml:space="preserve">Dan Abramov et Rachel Nabors. </w:t>
+              </w:r>
+              <w:r>
+                <w:rPr>
+                  <w:noProof/>
+                  <w:lang w:val="en-CA"/>
+                </w:rPr>
+                <w:t xml:space="preserve">(2026, 30 01). </w:t>
               </w:r>
               <w:r>
                 <w:rPr>
                   <w:i/>
                   <w:iCs/>
                   <w:noProof/>
-                </w:rPr>
-                <w:t>https://www.freecodecamp.org/news/react-state-management/</w:t>
-              </w:r>
-              <w:r>
-                <w:rPr>
-                  <w:noProof/>
-                </w:rPr>
-                <w:t>. Récupéré sur https://www.freecodecamp.org/news/react-state-management/.</w:t>
+                  <w:lang w:val="en-CA"/>
+                </w:rPr>
+                <w:t>React Reference Overview</w:t>
+              </w:r>
+              <w:r>
+                <w:rPr>
+                  <w:noProof/>
+                  <w:lang w:val="en-CA"/>
+                </w:rPr>
+                <w:t>. Récupéré sur https://react.dev/reference/react.</w:t>
               </w:r>
             </w:p>
             <w:p>
@@ -1598,27 +1882,31 @@
                 <w:ind w:left="720" w:hanging="720"/>
                 <w:rPr>
                   <w:noProof/>
+                  <w:lang w:val="en-CA"/>
                 </w:rPr>
               </w:pPr>
               <w:r>
                 <w:rPr>
                   <w:noProof/>
-                </w:rPr>
-                <w:t xml:space="preserve">Geeksforgeeks. (2026, 01 30). </w:t>
+                  <w:lang w:val="en-CA"/>
+                </w:rPr>
+                <w:t xml:space="preserve">Dodds, K. C. (2026, 05 04). </w:t>
               </w:r>
               <w:r>
                 <w:rPr>
                   <w:i/>
                   <w:iCs/>
                   <w:noProof/>
-                </w:rPr>
-                <w:t>https://www.geeksforgeeks.org/reactjs/reactjs-examples/</w:t>
-              </w:r>
-              <w:r>
-                <w:rPr>
-                  <w:noProof/>
-                </w:rPr>
-                <w:t>.</w:t>
+                  <w:lang w:val="en-CA"/>
+                </w:rPr>
+                <w:t>kentcdodds.com</w:t>
+              </w:r>
+              <w:r>
+                <w:rPr>
+                  <w:noProof/>
+                  <w:lang w:val="en-CA"/>
+                </w:rPr>
+                <w:t>. Récupéré sur kentcdodds.com: https://kentcdodds.com/blog/application-state-management-with-react</w:t>
               </w:r>
             </w:p>
             <w:p>
@@ -1627,27 +1915,31 @@
                 <w:ind w:left="720" w:hanging="720"/>
                 <w:rPr>
                   <w:noProof/>
+                  <w:lang w:val="en-CA"/>
                 </w:rPr>
               </w:pPr>
               <w:r>
                 <w:rPr>
                   <w:noProof/>
-                </w:rPr>
-                <w:t xml:space="preserve">Grafikart. (2026, 01 30). </w:t>
+                  <w:lang w:val="en-CA"/>
+                </w:rPr>
+                <w:t xml:space="preserve">Flavio, C. (2026). </w:t>
               </w:r>
               <w:r>
                 <w:rPr>
                   <w:i/>
                   <w:iCs/>
                   <w:noProof/>
-                </w:rPr>
-                <w:t>Apprendre React</w:t>
-              </w:r>
-              <w:r>
-                <w:rPr>
-                  <w:noProof/>
-                </w:rPr>
-                <w:t>. Récupéré sur https://grafikart.fr/formations/react.</w:t>
+                  <w:lang w:val="en-CA"/>
+                </w:rPr>
+                <w:t>React Handbook.</w:t>
+              </w:r>
+              <w:r>
+                <w:rPr>
+                  <w:noProof/>
+                  <w:lang w:val="en-CA"/>
+                </w:rPr>
+                <w:t xml:space="preserve"> </w:t>
               </w:r>
             </w:p>
             <w:p>
@@ -1661,22 +1953,32 @@
               <w:r>
                 <w:rPr>
                   <w:noProof/>
-                </w:rPr>
-                <w:t xml:space="preserve">mikecodeur . (2026, 03 27). </w:t>
+                  <w:lang w:val="en-CA"/>
+                </w:rPr>
+                <w:lastRenderedPageBreak/>
+                <w:t xml:space="preserve">freecodecamp.org. (2026, 03 27). </w:t>
               </w:r>
               <w:r>
                 <w:rPr>
                   <w:i/>
                   <w:iCs/>
                   <w:noProof/>
-                </w:rPr>
-                <w:t>https://blog.mikecodeur.com/post/getting-started-with-react-and-vite-the-complete-guide</w:t>
-              </w:r>
-              <w:r>
-                <w:rPr>
-                  <w:noProof/>
-                </w:rPr>
-                <w:t>. Récupéré sur https://blog.mikecodeur.com/post/getting-started-with-react-and-vite-the-complete-guide.</w:t>
+                  <w:lang w:val="en-CA"/>
+                </w:rPr>
+                <w:t>https://www.freecodecamp.org/news/react-state-management/</w:t>
+              </w:r>
+              <w:r>
+                <w:rPr>
+                  <w:noProof/>
+                  <w:lang w:val="en-CA"/>
+                </w:rPr>
+                <w:t xml:space="preserve">. </w:t>
+              </w:r>
+              <w:r>
+                <w:rPr>
+                  <w:noProof/>
+                </w:rPr>
+                <w:t>Récupéré sur https://www.freecodecamp.org/news/react-state-management/.</w:t>
               </w:r>
             </w:p>
             <w:p>
@@ -1685,27 +1987,31 @@
                 <w:ind w:left="720" w:hanging="720"/>
                 <w:rPr>
                   <w:noProof/>
+                  <w:lang w:val="en-CA"/>
                 </w:rPr>
               </w:pPr>
               <w:r>
                 <w:rPr>
                   <w:noProof/>
-                </w:rPr>
-                <w:t xml:space="preserve">mozilla. (2026, 03 26). </w:t>
+                  <w:lang w:val="en-CA"/>
+                </w:rPr>
+                <w:t xml:space="preserve">Geeks, G. f. (2026, 01 30). </w:t>
               </w:r>
               <w:r>
                 <w:rPr>
                   <w:i/>
                   <w:iCs/>
                   <w:noProof/>
-                </w:rPr>
-                <w:t>https://developer.mozilla.org/fr/docs/Learn_web_development/Core/Frameworks_libraries/React_getting_started</w:t>
-              </w:r>
-              <w:r>
-                <w:rPr>
-                  <w:noProof/>
-                </w:rPr>
-                <w:t>. Récupéré sur https://developer.mozilla.org/fr/docs/Learn_web_development/Core/Frameworks_libraries/React_getting_started.</w:t>
+                  <w:lang w:val="en-CA"/>
+                </w:rPr>
+                <w:t>Monte Carlo Tree Search (MCTS) in Machine Learning</w:t>
+              </w:r>
+              <w:r>
+                <w:rPr>
+                  <w:noProof/>
+                  <w:lang w:val="en-CA"/>
+                </w:rPr>
+                <w:t>. Récupéré sur Geeks for Geeks: https://www.geeksforgeeks.org/machine-learning/monte-carlo-tree-search-mcts-in-machine-learning/</w:t>
               </w:r>
             </w:p>
             <w:p>
@@ -1714,12 +2020,369 @@
                 <w:ind w:left="720" w:hanging="720"/>
                 <w:rPr>
                   <w:noProof/>
+                  <w:lang w:val="en-CA"/>
                 </w:rPr>
               </w:pPr>
               <w:r>
                 <w:rPr>
                   <w:noProof/>
-                </w:rPr>
+                  <w:lang w:val="en-CA"/>
+                </w:rPr>
+                <w:t xml:space="preserve">Geeksforgeeks. (2026, 01 30). </w:t>
+              </w:r>
+              <w:r>
+                <w:rPr>
+                  <w:i/>
+                  <w:iCs/>
+                  <w:noProof/>
+                  <w:lang w:val="en-CA"/>
+                </w:rPr>
+                <w:t>https://www.geeksforgeeks.org/reactjs/reactjs-examples/</w:t>
+              </w:r>
+              <w:r>
+                <w:rPr>
+                  <w:noProof/>
+                  <w:lang w:val="en-CA"/>
+                </w:rPr>
+                <w:t>.</w:t>
+              </w:r>
+            </w:p>
+            <w:p>
+              <w:pPr>
+                <w:pStyle w:val="Bibliographie"/>
+                <w:ind w:left="720" w:hanging="720"/>
+                <w:rPr>
+                  <w:noProof/>
+                </w:rPr>
+              </w:pPr>
+              <w:r>
+                <w:rPr>
+                  <w:noProof/>
+                </w:rPr>
+                <w:t xml:space="preserve">Grafikart. (2026, 01 30). </w:t>
+              </w:r>
+              <w:r>
+                <w:rPr>
+                  <w:i/>
+                  <w:iCs/>
+                  <w:noProof/>
+                </w:rPr>
+                <w:t>Apprendre React</w:t>
+              </w:r>
+              <w:r>
+                <w:rPr>
+                  <w:noProof/>
+                </w:rPr>
+                <w:t>. Récupéré sur https://grafikart.fr/formations/react.</w:t>
+              </w:r>
+            </w:p>
+            <w:p>
+              <w:pPr>
+                <w:pStyle w:val="Bibliographie"/>
+                <w:ind w:left="720" w:hanging="720"/>
+                <w:rPr>
+                  <w:noProof/>
+                </w:rPr>
+              </w:pPr>
+              <w:r>
+                <w:rPr>
+                  <w:noProof/>
+                  <w:lang w:val="en-CA"/>
+                </w:rPr>
+                <w:t xml:space="preserve">Lanctot, M. W. (2014, June 2). </w:t>
+              </w:r>
+              <w:r>
+                <w:rPr>
+                  <w:i/>
+                  <w:iCs/>
+                  <w:noProof/>
+                  <w:lang w:val="en-CA"/>
+                </w:rPr>
+                <w:t>Monte Carlo Tree Search with Heuristic Evaluations using Implicit Minimax Backups</w:t>
+              </w:r>
+              <w:r>
+                <w:rPr>
+                  <w:noProof/>
+                  <w:lang w:val="en-CA"/>
+                </w:rPr>
+                <w:t xml:space="preserve">. </w:t>
+              </w:r>
+              <w:r>
+                <w:rPr>
+                  <w:noProof/>
+                </w:rPr>
+                <w:t>Récupéré sur arxiv: https://arxiv.org/abs/1406.0486?utm_source=chatgpt.com</w:t>
+              </w:r>
+            </w:p>
+            <w:p>
+              <w:pPr>
+                <w:pStyle w:val="Bibliographie"/>
+                <w:ind w:left="720" w:hanging="720"/>
+                <w:rPr>
+                  <w:noProof/>
+                </w:rPr>
+              </w:pPr>
+              <w:r>
+                <w:rPr>
+                  <w:noProof/>
+                  <w:lang w:val="en-CA"/>
+                </w:rPr>
+                <w:t xml:space="preserve">Lorentz, R. (2016, September). Using evaluation functions in Monte-Carlo Tree Search. </w:t>
+              </w:r>
+              <w:r>
+                <w:rPr>
+                  <w:i/>
+                  <w:iCs/>
+                  <w:noProof/>
+                </w:rPr>
+                <w:t>ScienceDirect</w:t>
+              </w:r>
+              <w:r>
+                <w:rPr>
+                  <w:noProof/>
+                </w:rPr>
+                <w:t>, pp. 106-113.</w:t>
+              </w:r>
+            </w:p>
+            <w:p>
+              <w:pPr>
+                <w:pStyle w:val="Bibliographie"/>
+                <w:ind w:left="720" w:hanging="720"/>
+                <w:rPr>
+                  <w:noProof/>
+                </w:rPr>
+              </w:pPr>
+              <w:r>
+                <w:rPr>
+                  <w:noProof/>
+                </w:rPr>
+                <w:t xml:space="preserve">mikecodeur . (2026, 03 27). </w:t>
+              </w:r>
+              <w:r>
+                <w:rPr>
+                  <w:i/>
+                  <w:iCs/>
+                  <w:noProof/>
+                </w:rPr>
+                <w:t>https://blog.mikecodeur.com/post/getting-started-with-react-and-vite-the-complete-guide</w:t>
+              </w:r>
+              <w:r>
+                <w:rPr>
+                  <w:noProof/>
+                </w:rPr>
+                <w:t>. Récupéré sur https://blog.mikecodeur.com/post/getting-started-with-react-and-vite-the-complete-guide.</w:t>
+              </w:r>
+            </w:p>
+            <w:p>
+              <w:pPr>
+                <w:pStyle w:val="Bibliographie"/>
+                <w:ind w:left="720" w:hanging="720"/>
+                <w:rPr>
+                  <w:noProof/>
+                </w:rPr>
+              </w:pPr>
+              <w:r>
+                <w:rPr>
+                  <w:noProof/>
+                </w:rPr>
+                <w:t xml:space="preserve">Morenville, A., &amp; Piette, E. (2025, Août 19). </w:t>
+              </w:r>
+              <w:r>
+                <w:rPr>
+                  <w:i/>
+                  <w:iCs/>
+                  <w:noProof/>
+                  <w:lang w:val="en-CA"/>
+                </w:rPr>
+                <w:t>Modeling Uncertainty: Constraint-Based Belief</w:t>
+              </w:r>
+              <w:r>
+                <w:rPr>
+                  <w:noProof/>
+                  <w:lang w:val="en-CA"/>
+                </w:rPr>
+                <w:t xml:space="preserve">. </w:t>
+              </w:r>
+              <w:r>
+                <w:rPr>
+                  <w:noProof/>
+                </w:rPr>
+                <w:t>Récupéré sur arxiv: https://arxiv.org/pdf/2507.19263</w:t>
+              </w:r>
+            </w:p>
+            <w:p>
+              <w:pPr>
+                <w:pStyle w:val="Bibliographie"/>
+                <w:ind w:left="720" w:hanging="720"/>
+                <w:rPr>
+                  <w:noProof/>
+                </w:rPr>
+              </w:pPr>
+              <w:r>
+                <w:rPr>
+                  <w:noProof/>
+                </w:rPr>
+                <w:t xml:space="preserve">mozilla. (2026, 03 26). </w:t>
+              </w:r>
+              <w:r>
+                <w:rPr>
+                  <w:i/>
+                  <w:iCs/>
+                  <w:noProof/>
+                </w:rPr>
+                <w:t>https://developer.mozilla.org/fr/docs/Learn_web_development/Core/Frameworks_libraries/React_getting_started</w:t>
+              </w:r>
+              <w:r>
+                <w:rPr>
+                  <w:noProof/>
+                </w:rPr>
+                <w:t>. Récupéré sur https://developer.mozilla.org/fr/docs/Learn_web_development/Core/Frameworks_libraries/React_getting_started.</w:t>
+              </w:r>
+            </w:p>
+            <w:p>
+              <w:pPr>
+                <w:pStyle w:val="Bibliographie"/>
+                <w:ind w:left="720" w:hanging="720"/>
+                <w:rPr>
+                  <w:noProof/>
+                </w:rPr>
+              </w:pPr>
+              <w:r>
+                <w:rPr>
+                  <w:noProof/>
+                </w:rPr>
+                <w:t xml:space="preserve">OpenAI. (2026). </w:t>
+              </w:r>
+              <w:r>
+                <w:rPr>
+                  <w:i/>
+                  <w:iCs/>
+                  <w:noProof/>
+                </w:rPr>
+                <w:t>ChatGPT.</w:t>
+              </w:r>
+              <w:r>
+                <w:rPr>
+                  <w:noProof/>
+                </w:rPr>
+                <w:t xml:space="preserve"> Récupéré sur https://chat.openai.com/</w:t>
+              </w:r>
+            </w:p>
+            <w:p>
+              <w:pPr>
+                <w:pStyle w:val="Bibliographie"/>
+                <w:ind w:left="720" w:hanging="720"/>
+                <w:rPr>
+                  <w:noProof/>
+                </w:rPr>
+              </w:pPr>
+              <w:r>
+                <w:rPr>
+                  <w:noProof/>
+                </w:rPr>
+                <w:t xml:space="preserve">Perolat et al, J. (2022, Juin 30). </w:t>
+              </w:r>
+              <w:r>
+                <w:rPr>
+                  <w:i/>
+                  <w:iCs/>
+                  <w:noProof/>
+                  <w:lang w:val="en-CA"/>
+                </w:rPr>
+                <w:t>Mastering the Game of Stratego with Model-Free Multiagent Reinforcement Learning</w:t>
+              </w:r>
+              <w:r>
+                <w:rPr>
+                  <w:noProof/>
+                  <w:lang w:val="en-CA"/>
+                </w:rPr>
+                <w:t xml:space="preserve">. </w:t>
+              </w:r>
+              <w:r>
+                <w:rPr>
+                  <w:noProof/>
+                </w:rPr>
+                <w:t>Récupéré sur arxiv.com: https://arxiv.org/pdf/2206.15378</w:t>
+              </w:r>
+            </w:p>
+            <w:p>
+              <w:pPr>
+                <w:pStyle w:val="Bibliographie"/>
+                <w:ind w:left="720" w:hanging="720"/>
+                <w:rPr>
+                  <w:noProof/>
+                </w:rPr>
+              </w:pPr>
+              <w:r>
+                <w:rPr>
+                  <w:noProof/>
+                </w:rPr>
+                <w:t xml:space="preserve">Świechowski, M. G. (2022, July 19). </w:t>
+              </w:r>
+              <w:r>
+                <w:rPr>
+                  <w:noProof/>
+                  <w:lang w:val="en-CA"/>
+                </w:rPr>
+                <w:t xml:space="preserve">Monte Carlo Tree Search: a review of recent modifications and applications. </w:t>
+              </w:r>
+              <w:r>
+                <w:rPr>
+                  <w:i/>
+                  <w:iCs/>
+                  <w:noProof/>
+                </w:rPr>
+                <w:t>Open Access</w:t>
+              </w:r>
+              <w:r>
+                <w:rPr>
+                  <w:noProof/>
+                </w:rPr>
+                <w:t>, pp. 2497-2652.</w:t>
+              </w:r>
+            </w:p>
+            <w:p>
+              <w:pPr>
+                <w:pStyle w:val="Bibliographie"/>
+                <w:ind w:left="720" w:hanging="720"/>
+                <w:rPr>
+                  <w:noProof/>
+                </w:rPr>
+              </w:pPr>
+              <w:r>
+                <w:rPr>
+                  <w:noProof/>
+                </w:rPr>
+                <w:t xml:space="preserve">Turcotte, M. (2025, Décembre 1). </w:t>
+              </w:r>
+              <w:r>
+                <w:rPr>
+                  <w:i/>
+                  <w:iCs/>
+                  <w:noProof/>
+                </w:rPr>
+                <w:t>CSI 4106: Introduction to Artificial Intelligence.</w:t>
+              </w:r>
+              <w:r>
+                <w:rPr>
+                  <w:noProof/>
+                </w:rPr>
+                <w:t xml:space="preserve"> Récupéré sur turcotte.xyz: https://turcotte.xyz/teaching/csi-4106/lectures/22/slides.html?q=monte#/monte-carlo-tree-search-mcts</w:t>
+              </w:r>
+            </w:p>
+            <w:p>
+              <w:pPr>
+                <w:pStyle w:val="Bibliographie"/>
+                <w:ind w:left="720" w:hanging="720"/>
+                <w:rPr>
+                  <w:noProof/>
+                </w:rPr>
+              </w:pPr>
+              <w:r>
+                <w:rPr>
+                  <w:noProof/>
+                </w:rPr>
+                <w:lastRenderedPageBreak/>
                 <w:t xml:space="preserve">w3schools. (2026, 01 30). </w:t>
               </w:r>
               <w:r>
@@ -1754,7 +2417,7 @@
       </w:sdtContent>
     </w:sdt>
     <w:sectPr>
-      <w:footerReference w:type="default" r:id="rId10"/>
+      <w:footerReference w:type="default" r:id="rId11"/>
       <w:pgSz w:w="12240" w:h="15840"/>
       <w:pgMar w:top="709" w:right="1800" w:bottom="993" w:left="1800" w:header="708" w:footer="0" w:gutter="0"/>
       <w:pgNumType w:start="0"/>
@@ -1767,7 +2430,7 @@
 </file>
 
 <file path=word/endnotes.xml><?xml version="1.0" encoding="utf-8"?>
-<w:endnotes xmlns:wpc="http://schemas.microsoft.com/office/word/2010/wordprocessingCanvas" xmlns:cx="http://schemas.microsoft.com/office/drawing/2014/chartex" xmlns:cx1="http://schemas.microsoft.com/office/drawing/2015/9/8/chartex" xmlns:cx2="http://schemas.microsoft.com/office/drawing/2015/10/21/chartex" xmlns:cx3="http://schemas.microsoft.com/office/drawing/2016/5/9/chartex" xmlns:cx4="http://schemas.microsoft.com/office/drawing/2016/5/10/chartex" xmlns:cx5="http://schemas.microsoft.com/office/drawing/2016/5/11/chartex" xmlns:cx6="http://schemas.microsoft.com/office/drawing/2016/5/12/chartex" xmlns:cx7="http://schemas.microsoft.com/office/drawing/2016/5/13/chartex" xmlns:cx8="http://schemas.microsoft.com/office/drawing/2016/5/14/chartex" xmlns:mc="http://schemas.openxmlformats.org/markup-compatibility/2006" xmlns:aink="http://schemas.microsoft.com/office/drawing/2016/ink" xmlns:am3d="http://schemas.microsoft.com/office/drawing/2017/model3d" xmlns:o="urn:schemas-microsoft-com:office:office" xmlns:r="http://schemas.openxmlformats.org/officeDocument/2006/relationships" xmlns:m="http://schemas.openxmlformats.org/officeDocument/2006/math" xmlns:v="urn:schemas-microsoft-com:vml" xmlns:wp14="http://schemas.microsoft.com/office/word/2010/wordprocessingDrawing" xmlns:wp="http://schemas.openxmlformats.org/drawingml/2006/wordprocessingDrawing" xmlns:w10="urn:schemas-microsoft-com:office:word" xmlns:w="http://schemas.openxmlformats.org/wordprocessingml/2006/main" xmlns:w14="http://schemas.microsoft.com/office/word/2010/wordml" xmlns:w15="http://schemas.microsoft.com/office/word/2012/wordml" xmlns:w16cid="http://schemas.microsoft.com/office/word/2016/wordml/cid" xmlns:w16se="http://schemas.microsoft.com/office/word/2015/wordml/symex" xmlns:wpg="http://schemas.microsoft.com/office/word/2010/wordprocessingGroup" xmlns:wpi="http://schemas.microsoft.com/office/word/2010/wordprocessingInk" xmlns:wne="http://schemas.microsoft.com/office/word/2006/wordml" xmlns:wps="http://schemas.microsoft.com/office/word/2010/wordprocessingShape" mc:Ignorable="w14 w15 w16se w16cid wp14">
+<w:endnotes xmlns:wpc="http://schemas.microsoft.com/office/word/2010/wordprocessingCanvas" xmlns:cx="http://schemas.microsoft.com/office/drawing/2014/chartex" xmlns:cx1="http://schemas.microsoft.com/office/drawing/2015/9/8/chartex" xmlns:cx2="http://schemas.microsoft.com/office/drawing/2015/10/21/chartex" xmlns:cx3="http://schemas.microsoft.com/office/drawing/2016/5/9/chartex" xmlns:cx4="http://schemas.microsoft.com/office/drawing/2016/5/10/chartex" xmlns:cx5="http://schemas.microsoft.com/office/drawing/2016/5/11/chartex" xmlns:cx6="http://schemas.microsoft.com/office/drawing/2016/5/12/chartex" xmlns:cx7="http://schemas.microsoft.com/office/drawing/2016/5/13/chartex" xmlns:cx8="http://schemas.microsoft.com/office/drawing/2016/5/14/chartex" xmlns:mc="http://schemas.openxmlformats.org/markup-compatibility/2006" xmlns:aink="http://schemas.microsoft.com/office/drawing/2016/ink" xmlns:am3d="http://schemas.microsoft.com/office/drawing/2017/model3d" xmlns:o="urn:schemas-microsoft-com:office:office" xmlns:oel="http://schemas.microsoft.com/office/2019/extlst" xmlns:r="http://schemas.openxmlformats.org/officeDocument/2006/relationships" xmlns:m="http://schemas.openxmlformats.org/officeDocument/2006/math" xmlns:v="urn:schemas-microsoft-com:vml" xmlns:wp14="http://schemas.microsoft.com/office/word/2010/wordprocessingDrawing" xmlns:wp="http://schemas.openxmlformats.org/drawingml/2006/wordprocessingDrawing" xmlns:w10="urn:schemas-microsoft-com:office:word" xmlns:w="http://schemas.openxmlformats.org/wordprocessingml/2006/main" xmlns:w14="http://schemas.microsoft.com/office/word/2010/wordml" xmlns:w15="http://schemas.microsoft.com/office/word/2012/wordml" xmlns:w16cex="http://schemas.microsoft.com/office/word/2018/wordml/cex" xmlns:w16cid="http://schemas.microsoft.com/office/word/2016/wordml/cid" xmlns:w16="http://schemas.microsoft.com/office/word/2018/wordml" xmlns:w16du="http://schemas.microsoft.com/office/word/2023/wordml/word16du" xmlns:w16sdtdh="http://schemas.microsoft.com/office/word/2020/wordml/sdtdatahash" xmlns:w16sdtfl="http://schemas.microsoft.com/office/word/2024/wordml/sdtformatlock" xmlns:w16se="http://schemas.microsoft.com/office/word/2015/wordml/symex" xmlns:wpg="http://schemas.microsoft.com/office/word/2010/wordprocessingGroup" xmlns:wpi="http://schemas.microsoft.com/office/word/2010/wordprocessingInk" xmlns:wne="http://schemas.microsoft.com/office/word/2006/wordml" xmlns:wps="http://schemas.microsoft.com/office/word/2010/wordprocessingShape" mc:Ignorable="w14 w15 w16se w16cid w16 w16cex w16sdtdh w16sdtfl w16du wp14">
   <w:endnote w:type="separator" w:id="-1">
     <w:p>
       <w:pPr>
@@ -1792,7 +2455,7 @@
 </file>
 
 <file path=word/footer1.xml><?xml version="1.0" encoding="utf-8"?>
-<w:ftr xmlns:wpc="http://schemas.microsoft.com/office/word/2010/wordprocessingCanvas" xmlns:cx="http://schemas.microsoft.com/office/drawing/2014/chartex" xmlns:cx1="http://schemas.microsoft.com/office/drawing/2015/9/8/chartex" xmlns:cx2="http://schemas.microsoft.com/office/drawing/2015/10/21/chartex" xmlns:cx3="http://schemas.microsoft.com/office/drawing/2016/5/9/chartex" xmlns:cx4="http://schemas.microsoft.com/office/drawing/2016/5/10/chartex" xmlns:cx5="http://schemas.microsoft.com/office/drawing/2016/5/11/chartex" xmlns:cx6="http://schemas.microsoft.com/office/drawing/2016/5/12/chartex" xmlns:cx7="http://schemas.microsoft.com/office/drawing/2016/5/13/chartex" xmlns:cx8="http://schemas.microsoft.com/office/drawing/2016/5/14/chartex" xmlns:mc="http://schemas.openxmlformats.org/markup-compatibility/2006" xmlns:aink="http://schemas.microsoft.com/office/drawing/2016/ink" xmlns:am3d="http://schemas.microsoft.com/office/drawing/2017/model3d" xmlns:o="urn:schemas-microsoft-com:office:office" xmlns:r="http://schemas.openxmlformats.org/officeDocument/2006/relationships" xmlns:m="http://schemas.openxmlformats.org/officeDocument/2006/math" xmlns:v="urn:schemas-microsoft-com:vml" xmlns:wp14="http://schemas.microsoft.com/office/word/2010/wordprocessingDrawing" xmlns:wp="http://schemas.openxmlformats.org/drawingml/2006/wordprocessingDrawing" xmlns:w10="urn:schemas-microsoft-com:office:word" xmlns:w="http://schemas.openxmlformats.org/wordprocessingml/2006/main" xmlns:w14="http://schemas.microsoft.com/office/word/2010/wordml" xmlns:w15="http://schemas.microsoft.com/office/word/2012/wordml" xmlns:w16cid="http://schemas.microsoft.com/office/word/2016/wordml/cid" xmlns:w16se="http://schemas.microsoft.com/office/word/2015/wordml/symex" xmlns:wpg="http://schemas.microsoft.com/office/word/2010/wordprocessingGroup" xmlns:wpi="http://schemas.microsoft.com/office/word/2010/wordprocessingInk" xmlns:wne="http://schemas.microsoft.com/office/word/2006/wordml" xmlns:wps="http://schemas.microsoft.com/office/word/2010/wordprocessingShape" mc:Ignorable="w14 w15 w16se w16cid wp14">
+<w:ftr xmlns:wpc="http://schemas.microsoft.com/office/word/2010/wordprocessingCanvas" xmlns:cx="http://schemas.microsoft.com/office/drawing/2014/chartex" xmlns:cx1="http://schemas.microsoft.com/office/drawing/2015/9/8/chartex" xmlns:cx2="http://schemas.microsoft.com/office/drawing/2015/10/21/chartex" xmlns:cx3="http://schemas.microsoft.com/office/drawing/2016/5/9/chartex" xmlns:cx4="http://schemas.microsoft.com/office/drawing/2016/5/10/chartex" xmlns:cx5="http://schemas.microsoft.com/office/drawing/2016/5/11/chartex" xmlns:cx6="http://schemas.microsoft.com/office/drawing/2016/5/12/chartex" xmlns:cx7="http://schemas.microsoft.com/office/drawing/2016/5/13/chartex" xmlns:cx8="http://schemas.microsoft.com/office/drawing/2016/5/14/chartex" xmlns:mc="http://schemas.openxmlformats.org/markup-compatibility/2006" xmlns:aink="http://schemas.microsoft.com/office/drawing/2016/ink" xmlns:am3d="http://schemas.microsoft.com/office/drawing/2017/model3d" xmlns:o="urn:schemas-microsoft-com:office:office" xmlns:oel="http://schemas.microsoft.com/office/2019/extlst" xmlns:r="http://schemas.openxmlformats.org/officeDocument/2006/relationships" xmlns:m="http://schemas.openxmlformats.org/officeDocument/2006/math" xmlns:v="urn:schemas-microsoft-com:vml" xmlns:wp14="http://schemas.microsoft.com/office/word/2010/wordprocessingDrawing" xmlns:wp="http://schemas.openxmlformats.org/drawingml/2006/wordprocessingDrawing" xmlns:w10="urn:schemas-microsoft-com:office:word" xmlns:w="http://schemas.openxmlformats.org/wordprocessingml/2006/main" xmlns:w14="http://schemas.microsoft.com/office/word/2010/wordml" xmlns:w15="http://schemas.microsoft.com/office/word/2012/wordml" xmlns:w16cex="http://schemas.microsoft.com/office/word/2018/wordml/cex" xmlns:w16cid="http://schemas.microsoft.com/office/word/2016/wordml/cid" xmlns:w16="http://schemas.microsoft.com/office/word/2018/wordml" xmlns:w16du="http://schemas.microsoft.com/office/word/2023/wordml/word16du" xmlns:w16sdtdh="http://schemas.microsoft.com/office/word/2020/wordml/sdtdatahash" xmlns:w16sdtfl="http://schemas.microsoft.com/office/word/2024/wordml/sdtformatlock" xmlns:w16se="http://schemas.microsoft.com/office/word/2015/wordml/symex" xmlns:wpg="http://schemas.microsoft.com/office/word/2010/wordprocessingGroup" xmlns:wpi="http://schemas.microsoft.com/office/word/2010/wordprocessingInk" xmlns:wne="http://schemas.microsoft.com/office/word/2006/wordml" xmlns:wps="http://schemas.microsoft.com/office/word/2010/wordprocessingShape" mc:Ignorable="w14 w15 w16se w16cid w16 w16cex w16sdtdh w16sdtfl w16du wp14">
   <w:sdt>
     <w:sdtPr>
       <w:id w:val="-866069514"/>
@@ -1801,7 +2464,6 @@
         <w:docPartUnique/>
       </w:docPartObj>
     </w:sdtPr>
-    <w:sdtEndPr/>
     <w:sdtContent>
       <w:p>
         <w:pPr>
@@ -1838,7 +2500,7 @@
 </file>
 
 <file path=word/footnotes.xml><?xml version="1.0" encoding="utf-8"?>
-<w:footnotes xmlns:wpc="http://schemas.microsoft.com/office/word/2010/wordprocessingCanvas" xmlns:cx="http://schemas.microsoft.com/office/drawing/2014/chartex" xmlns:cx1="http://schemas.microsoft.com/office/drawing/2015/9/8/chartex" xmlns:cx2="http://schemas.microsoft.com/office/drawing/2015/10/21/chartex" xmlns:cx3="http://schemas.microsoft.com/office/drawing/2016/5/9/chartex" xmlns:cx4="http://schemas.microsoft.com/office/drawing/2016/5/10/chartex" xmlns:cx5="http://schemas.microsoft.com/office/drawing/2016/5/11/chartex" xmlns:cx6="http://schemas.microsoft.com/office/drawing/2016/5/12/chartex" xmlns:cx7="http://schemas.microsoft.com/office/drawing/2016/5/13/chartex" xmlns:cx8="http://schemas.microsoft.com/office/drawing/2016/5/14/chartex" xmlns:mc="http://schemas.openxmlformats.org/markup-compatibility/2006" xmlns:aink="http://schemas.microsoft.com/office/drawing/2016/ink" xmlns:am3d="http://schemas.microsoft.com/office/drawing/2017/model3d" xmlns:o="urn:schemas-microsoft-com:office:office" xmlns:r="http://schemas.openxmlformats.org/officeDocument/2006/relationships" xmlns:m="http://schemas.openxmlformats.org/officeDocument/2006/math" xmlns:v="urn:schemas-microsoft-com:vml" xmlns:wp14="http://schemas.microsoft.com/office/word/2010/wordprocessingDrawing" xmlns:wp="http://schemas.openxmlformats.org/drawingml/2006/wordprocessingDrawing" xmlns:w10="urn:schemas-microsoft-com:office:word" xmlns:w="http://schemas.openxmlformats.org/wordprocessingml/2006/main" xmlns:w14="http://schemas.microsoft.com/office/word/2010/wordml" xmlns:w15="http://schemas.microsoft.com/office/word/2012/wordml" xmlns:w16cid="http://schemas.microsoft.com/office/word/2016/wordml/cid" xmlns:w16se="http://schemas.microsoft.com/office/word/2015/wordml/symex" xmlns:wpg="http://schemas.microsoft.com/office/word/2010/wordprocessingGroup" xmlns:wpi="http://schemas.microsoft.com/office/word/2010/wordprocessingInk" xmlns:wne="http://schemas.microsoft.com/office/word/2006/wordml" xmlns:wps="http://schemas.microsoft.com/office/word/2010/wordprocessingShape" mc:Ignorable="w14 w15 w16se w16cid wp14">
+<w:footnotes xmlns:wpc="http://schemas.microsoft.com/office/word/2010/wordprocessingCanvas" xmlns:cx="http://schemas.microsoft.com/office/drawing/2014/chartex" xmlns:cx1="http://schemas.microsoft.com/office/drawing/2015/9/8/chartex" xmlns:cx2="http://schemas.microsoft.com/office/drawing/2015/10/21/chartex" xmlns:cx3="http://schemas.microsoft.com/office/drawing/2016/5/9/chartex" xmlns:cx4="http://schemas.microsoft.com/office/drawing/2016/5/10/chartex" xmlns:cx5="http://schemas.microsoft.com/office/drawing/2016/5/11/chartex" xmlns:cx6="http://schemas.microsoft.com/office/drawing/2016/5/12/chartex" xmlns:cx7="http://schemas.microsoft.com/office/drawing/2016/5/13/chartex" xmlns:cx8="http://schemas.microsoft.com/office/drawing/2016/5/14/chartex" xmlns:mc="http://schemas.openxmlformats.org/markup-compatibility/2006" xmlns:aink="http://schemas.microsoft.com/office/drawing/2016/ink" xmlns:am3d="http://schemas.microsoft.com/office/drawing/2017/model3d" xmlns:o="urn:schemas-microsoft-com:office:office" xmlns:oel="http://schemas.microsoft.com/office/2019/extlst" xmlns:r="http://schemas.openxmlformats.org/officeDocument/2006/relationships" xmlns:m="http://schemas.openxmlformats.org/officeDocument/2006/math" xmlns:v="urn:schemas-microsoft-com:vml" xmlns:wp14="http://schemas.microsoft.com/office/word/2010/wordprocessingDrawing" xmlns:wp="http://schemas.openxmlformats.org/drawingml/2006/wordprocessingDrawing" xmlns:w10="urn:schemas-microsoft-com:office:word" xmlns:w="http://schemas.openxmlformats.org/wordprocessingml/2006/main" xmlns:w14="http://schemas.microsoft.com/office/word/2010/wordml" xmlns:w15="http://schemas.microsoft.com/office/word/2012/wordml" xmlns:w16cex="http://schemas.microsoft.com/office/word/2018/wordml/cex" xmlns:w16cid="http://schemas.microsoft.com/office/word/2016/wordml/cid" xmlns:w16="http://schemas.microsoft.com/office/word/2018/wordml" xmlns:w16du="http://schemas.microsoft.com/office/word/2023/wordml/word16du" xmlns:w16sdtdh="http://schemas.microsoft.com/office/word/2020/wordml/sdtdatahash" xmlns:w16sdtfl="http://schemas.microsoft.com/office/word/2024/wordml/sdtformatlock" xmlns:w16se="http://schemas.microsoft.com/office/word/2015/wordml/symex" xmlns:wpg="http://schemas.microsoft.com/office/word/2010/wordprocessingGroup" xmlns:wpi="http://schemas.microsoft.com/office/word/2010/wordprocessingInk" xmlns:wne="http://schemas.microsoft.com/office/word/2006/wordml" xmlns:wps="http://schemas.microsoft.com/office/word/2010/wordprocessingShape" mc:Ignorable="w14 w15 w16se w16cid w16 w16cex w16sdtdh w16sdtfl w16du wp14">
   <w:footnote w:type="separator" w:id="-1">
     <w:p>
       <w:pPr>
@@ -1863,7 +2525,7 @@
 </file>
 
 <file path=word/numbering.xml><?xml version="1.0" encoding="utf-8"?>
-<w:numbering xmlns:wpc="http://schemas.microsoft.com/office/word/2010/wordprocessingCanvas" xmlns:cx="http://schemas.microsoft.com/office/drawing/2014/chartex" xmlns:cx1="http://schemas.microsoft.com/office/drawing/2015/9/8/chartex" xmlns:cx2="http://schemas.microsoft.com/office/drawing/2015/10/21/chartex" xmlns:cx3="http://schemas.microsoft.com/office/drawing/2016/5/9/chartex" xmlns:cx4="http://schemas.microsoft.com/office/drawing/2016/5/10/chartex" xmlns:cx5="http://schemas.microsoft.com/office/drawing/2016/5/11/chartex" xmlns:cx6="http://schemas.microsoft.com/office/drawing/2016/5/12/chartex" xmlns:cx7="http://schemas.microsoft.com/office/drawing/2016/5/13/chartex" xmlns:cx8="http://schemas.microsoft.com/office/drawing/2016/5/14/chartex" xmlns:mc="http://schemas.openxmlformats.org/markup-compatibility/2006" xmlns:aink="http://schemas.microsoft.com/office/drawing/2016/ink" xmlns:am3d="http://schemas.microsoft.com/office/drawing/2017/model3d" xmlns:o="urn:schemas-microsoft-com:office:office" xmlns:r="http://schemas.openxmlformats.org/officeDocument/2006/relationships" xmlns:m="http://schemas.openxmlformats.org/officeDocument/2006/math" xmlns:v="urn:schemas-microsoft-com:vml" xmlns:wp14="http://schemas.microsoft.com/office/word/2010/wordprocessingDrawing" xmlns:wp="http://schemas.openxmlformats.org/drawingml/2006/wordprocessingDrawing" xmlns:w10="urn:schemas-microsoft-com:office:word" xmlns:w="http://schemas.openxmlformats.org/wordprocessingml/2006/main" xmlns:w14="http://schemas.microsoft.com/office/word/2010/wordml" xmlns:w15="http://schemas.microsoft.com/office/word/2012/wordml" xmlns:w16cid="http://schemas.microsoft.com/office/word/2016/wordml/cid" xmlns:w16se="http://schemas.microsoft.com/office/word/2015/wordml/symex" xmlns:wpg="http://schemas.microsoft.com/office/word/2010/wordprocessingGroup" xmlns:wpi="http://schemas.microsoft.com/office/word/2010/wordprocessingInk" xmlns:wne="http://schemas.microsoft.com/office/word/2006/wordml" xmlns:wps="http://schemas.microsoft.com/office/word/2010/wordprocessingShape" mc:Ignorable="w14 w15 w16se w16cid wp14">
+<w:numbering xmlns:wpc="http://schemas.microsoft.com/office/word/2010/wordprocessingCanvas" xmlns:cx="http://schemas.microsoft.com/office/drawing/2014/chartex" xmlns:cx1="http://schemas.microsoft.com/office/drawing/2015/9/8/chartex" xmlns:cx2="http://schemas.microsoft.com/office/drawing/2015/10/21/chartex" xmlns:cx3="http://schemas.microsoft.com/office/drawing/2016/5/9/chartex" xmlns:cx4="http://schemas.microsoft.com/office/drawing/2016/5/10/chartex" xmlns:cx5="http://schemas.microsoft.com/office/drawing/2016/5/11/chartex" xmlns:cx6="http://schemas.microsoft.com/office/drawing/2016/5/12/chartex" xmlns:cx7="http://schemas.microsoft.com/office/drawing/2016/5/13/chartex" xmlns:cx8="http://schemas.microsoft.com/office/drawing/2016/5/14/chartex" xmlns:mc="http://schemas.openxmlformats.org/markup-compatibility/2006" xmlns:aink="http://schemas.microsoft.com/office/drawing/2016/ink" xmlns:am3d="http://schemas.microsoft.com/office/drawing/2017/model3d" xmlns:o="urn:schemas-microsoft-com:office:office" xmlns:oel="http://schemas.microsoft.com/office/2019/extlst" xmlns:r="http://schemas.openxmlformats.org/officeDocument/2006/relationships" xmlns:m="http://schemas.openxmlformats.org/officeDocument/2006/math" xmlns:v="urn:schemas-microsoft-com:vml" xmlns:wp14="http://schemas.microsoft.com/office/word/2010/wordprocessingDrawing" xmlns:wp="http://schemas.openxmlformats.org/drawingml/2006/wordprocessingDrawing" xmlns:w10="urn:schemas-microsoft-com:office:word" xmlns:w="http://schemas.openxmlformats.org/wordprocessingml/2006/main" xmlns:w14="http://schemas.microsoft.com/office/word/2010/wordml" xmlns:w15="http://schemas.microsoft.com/office/word/2012/wordml" xmlns:w16cex="http://schemas.microsoft.com/office/word/2018/wordml/cex" xmlns:w16cid="http://schemas.microsoft.com/office/word/2016/wordml/cid" xmlns:w16="http://schemas.microsoft.com/office/word/2018/wordml" xmlns:w16du="http://schemas.microsoft.com/office/word/2023/wordml/word16du" xmlns:w16sdtdh="http://schemas.microsoft.com/office/word/2020/wordml/sdtdatahash" xmlns:w16sdtfl="http://schemas.microsoft.com/office/word/2024/wordml/sdtformatlock" xmlns:w16se="http://schemas.microsoft.com/office/word/2015/wordml/symex" xmlns:wpg="http://schemas.microsoft.com/office/word/2010/wordprocessingGroup" xmlns:wpi="http://schemas.microsoft.com/office/word/2010/wordprocessingInk" xmlns:wne="http://schemas.microsoft.com/office/word/2006/wordml" xmlns:wps="http://schemas.microsoft.com/office/word/2010/wordprocessingShape" mc:Ignorable="w14 w15 w16se w16cid w16 w16cex w16sdtdh w16sdtfl w16du wp14">
   <w:abstractNum w:abstractNumId="0" w15:restartNumberingAfterBreak="0">
     <w:nsid w:val="1B5D7A44"/>
     <w:multiLevelType w:val="multilevel"/>
@@ -3162,41 +3824,41 @@
       </w:rPr>
     </w:lvl>
   </w:abstractNum>
-  <w:num w:numId="1">
+  <w:num w:numId="1" w16cid:durableId="1750149517">
     <w:abstractNumId w:val="2"/>
   </w:num>
-  <w:num w:numId="2">
+  <w:num w:numId="2" w16cid:durableId="310133458">
     <w:abstractNumId w:val="5"/>
   </w:num>
-  <w:num w:numId="3">
+  <w:num w:numId="3" w16cid:durableId="409236569">
     <w:abstractNumId w:val="9"/>
   </w:num>
-  <w:num w:numId="4">
+  <w:num w:numId="4" w16cid:durableId="1860389145">
     <w:abstractNumId w:val="3"/>
   </w:num>
-  <w:num w:numId="5">
+  <w:num w:numId="5" w16cid:durableId="1790509833">
     <w:abstractNumId w:val="8"/>
   </w:num>
-  <w:num w:numId="6">
+  <w:num w:numId="6" w16cid:durableId="974599377">
     <w:abstractNumId w:val="4"/>
   </w:num>
-  <w:num w:numId="7">
+  <w:num w:numId="7" w16cid:durableId="1130050924">
     <w:abstractNumId w:val="7"/>
   </w:num>
-  <w:num w:numId="8">
+  <w:num w:numId="8" w16cid:durableId="238633383">
     <w:abstractNumId w:val="0"/>
   </w:num>
-  <w:num w:numId="9">
+  <w:num w:numId="9" w16cid:durableId="707409402">
     <w:abstractNumId w:val="1"/>
   </w:num>
-  <w:num w:numId="10">
+  <w:num w:numId="10" w16cid:durableId="744650464">
     <w:abstractNumId w:val="6"/>
   </w:num>
 </w:numbering>
 </file>
 
 <file path=word/styles.xml><?xml version="1.0" encoding="utf-8"?>
-<w:styles xmlns:mc="http://schemas.openxmlformats.org/markup-compatibility/2006" xmlns:r="http://schemas.openxmlformats.org/officeDocument/2006/relationships" xmlns:w="http://schemas.openxmlformats.org/wordprocessingml/2006/main" xmlns:w14="http://schemas.microsoft.com/office/word/2010/wordml" xmlns:w15="http://schemas.microsoft.com/office/word/2012/wordml" xmlns:w16cid="http://schemas.microsoft.com/office/word/2016/wordml/cid" xmlns:w16se="http://schemas.microsoft.com/office/word/2015/wordml/symex" mc:Ignorable="w14 w15 w16se w16cid">
+<w:styles xmlns:mc="http://schemas.openxmlformats.org/markup-compatibility/2006" xmlns:r="http://schemas.openxmlformats.org/officeDocument/2006/relationships" xmlns:w="http://schemas.openxmlformats.org/wordprocessingml/2006/main" xmlns:w14="http://schemas.microsoft.com/office/word/2010/wordml" xmlns:w15="http://schemas.microsoft.com/office/word/2012/wordml" xmlns:w16cex="http://schemas.microsoft.com/office/word/2018/wordml/cex" xmlns:w16cid="http://schemas.microsoft.com/office/word/2016/wordml/cid" xmlns:w16="http://schemas.microsoft.com/office/word/2018/wordml" xmlns:w16du="http://schemas.microsoft.com/office/word/2023/wordml/word16du" xmlns:w16sdtdh="http://schemas.microsoft.com/office/word/2020/wordml/sdtdatahash" xmlns:w16sdtfl="http://schemas.microsoft.com/office/word/2024/wordml/sdtformatlock" xmlns:w16se="http://schemas.microsoft.com/office/word/2015/wordml/symex" mc:Ignorable="w14 w15 w16se w16cid w16 w16cex w16sdtdh w16sdtfl w16du">
   <w:docDefaults>
     <w:rPrDefault>
       <w:rPr>
@@ -3214,7 +3876,7 @@
       </w:pPr>
     </w:pPrDefault>
   </w:docDefaults>
-  <w:latentStyles w:defLockedState="0" w:defUIPriority="99" w:defSemiHidden="0" w:defUnhideWhenUsed="0" w:defQFormat="0" w:count="377">
+  <w:latentStyles w:defLockedState="0" w:defUIPriority="99" w:defSemiHidden="0" w:defUnhideWhenUsed="0" w:defQFormat="0" w:count="376">
     <w:lsdException w:name="Normal" w:uiPriority="0" w:qFormat="1"/>
     <w:lsdException w:name="heading 1" w:uiPriority="9" w:qFormat="1"/>
     <w:lsdException w:name="heading 2" w:semiHidden="1" w:uiPriority="9" w:unhideWhenUsed="1" w:qFormat="1"/>
@@ -3591,7 +4253,6 @@
     <w:lsdException w:name="Hashtag" w:semiHidden="1" w:unhideWhenUsed="1"/>
     <w:lsdException w:name="Unresolved Mention" w:semiHidden="1" w:unhideWhenUsed="1"/>
     <w:lsdException w:name="Smart Link" w:semiHidden="1" w:unhideWhenUsed="1"/>
-    <w:lsdException w:name="Smart Link Error" w:semiHidden="1" w:unhideWhenUsed="1"/>
   </w:latentStyles>
   <w:style w:type="paragraph" w:default="1" w:styleId="Normal">
     <w:name w:val="Normal"/>
@@ -3798,7 +4459,6 @@
   <w:style w:type="character" w:default="1" w:styleId="Policepardfaut">
     <w:name w:val="Default Paragraph Font"/>
     <w:uiPriority w:val="1"/>
-    <w:semiHidden/>
     <w:unhideWhenUsed/>
   </w:style>
   <w:style w:type="table" w:default="1" w:styleId="TableauNormal">
@@ -4111,7 +4771,7 @@
       <w:spacing w:val="5"/>
     </w:rPr>
   </w:style>
-  <w:style w:type="character" w:styleId="Lienhypertexte">
+  <w:style w:type="character" w:styleId="Hyperlien">
     <w:name w:val="Hyperlink"/>
     <w:basedOn w:val="Policepardfaut"/>
     <w:uiPriority w:val="99"/>
@@ -4134,7 +4794,7 @@
       <w:shd w:val="clear" w:color="auto" w:fill="E1DFDD"/>
     </w:rPr>
   </w:style>
-  <w:style w:type="character" w:styleId="Lienhypertextesuivivisit">
+  <w:style w:type="character" w:styleId="Lienvisit">
     <w:name w:val="FollowedHyperlink"/>
     <w:basedOn w:val="Policepardfaut"/>
     <w:uiPriority w:val="99"/>
@@ -4748,7 +5408,7 @@
     <b:Month>30</b:Month>
     <b:Day>01</b:Day>
     <b:InternetSiteTitle>https://react.dev/reference/react</b:InternetSiteTitle>
-    <b:RefOrder>3</b:RefOrder>
+    <b:RefOrder>4</b:RefOrder>
   </b:Source>
   <b:Source>
     <b:Tag>htt26</b:Tag>
@@ -4763,7 +5423,7 @@
         <b:Corporate>Geeksforgeeks</b:Corporate>
       </b:Author>
     </b:Author>
-    <b:RefOrder>4</b:RefOrder>
+    <b:RefOrder>5</b:RefOrder>
   </b:Source>
   <b:Source>
     <b:Tag>w3s26</b:Tag>
@@ -4779,7 +5439,7 @@
     <b:Month>01</b:Month>
     <b:Day>30</b:Day>
     <b:InternetSiteTitle>https://www.w3schools.com/REACT/default.asp</b:InternetSiteTitle>
-    <b:RefOrder>5</b:RefOrder>
+    <b:RefOrder>6</b:RefOrder>
   </b:Source>
   <b:Source xmlns:b="http://schemas.openxmlformats.org/officeDocument/2006/bibliography">
     <b:Tag>gra26</b:Tag>
@@ -4795,7 +5455,7 @@
     <b:Month>01</b:Month>
     <b:Day>30</b:Day>
     <b:Title>Apprendre React</b:Title>
-    <b:RefOrder>6</b:RefOrder>
+    <b:RefOrder>7</b:RefOrder>
   </b:Source>
   <b:Source>
     <b:Tag>mik26</b:Tag>
@@ -4811,7 +5471,7 @@
     <b:InternetSiteTitle>https://blog.mikecodeur.com/post/getting-started-with-react-and-vite-the-complete-guide</b:InternetSiteTitle>
     <b:Month>03</b:Month>
     <b:Day>27</b:Day>
-    <b:RefOrder>7</b:RefOrder>
+    <b:RefOrder>8</b:RefOrder>
   </b:Source>
   <b:Source>
     <b:Tag>Fla26</b:Tag>
@@ -4827,7 +5487,7 @@
     <b:Month>27</b:Month>
     <b:Day>03</b:Day>
     <b:InternetSiteTitle>https://www.premieroctet.com/blog/nouveautes-react-19</b:InternetSiteTitle>
-    <b:RefOrder>8</b:RefOrder>
+    <b:RefOrder>9</b:RefOrder>
   </b:Source>
   <b:Source>
     <b:Tag>Cop26</b:Tag>
@@ -4845,7 +5505,7 @@
         </b:NameList>
       </b:Author>
     </b:Author>
-    <b:RefOrder>9</b:RefOrder>
+    <b:RefOrder>10</b:RefOrder>
   </b:Source>
   <b:Source>
     <b:Tag>moz26</b:Tag>
@@ -4865,7 +5525,7 @@
         </b:NameList>
       </b:Author>
     </b:Author>
-    <b:RefOrder>10</b:RefOrder>
+    <b:RefOrder>11</b:RefOrder>
   </b:Source>
   <b:Source>
     <b:Tag>fre26</b:Tag>
@@ -4885,7 +5545,7 @@
     <b:Year>2026</b:Year>
     <b:Month>03</b:Month>
     <b:Day>27</b:Day>
-    <b:RefOrder>11</b:RefOrder>
+    <b:RefOrder>12</b:RefOrder>
   </b:Source>
   <b:Source>
     <b:Tag>blo26</b:Tag>
@@ -4905,7 +5565,7 @@
     <b:Year>2026</b:Year>
     <b:Month>27</b:Month>
     <b:Day>03</b:Day>
-    <b:RefOrder>12</b:RefOrder>
+    <b:RefOrder>13</b:RefOrder>
   </b:Source>
   <b:Source>
     <b:Tag>Ken26</b:Tag>
@@ -4928,7 +5588,7 @@
     <b:Month>05</b:Month>
     <b:Day>04</b:Day>
     <b:URL>https://kentcdodds.com/blog/application-state-management-with-react</b:URL>
-    <b:RefOrder>1</b:RefOrder>
+    <b:RefOrder>2</b:RefOrder>
   </b:Source>
   <b:Source>
     <b:Tag>Ayu26</b:Tag>
@@ -4949,13 +5609,261 @@
     <b:Month>05</b:Month>
     <b:Day>04</b:Day>
     <b:URL>https://dev.to/08ayush/what-is-the-difference-between-angular-and-reactjs-and-which-is-best-to-use-for-building-a-website-4h8b</b:URL>
-    <b:RefOrder>2</b:RefOrder>
+    <b:RefOrder>3</b:RefOrder>
+  </b:Source>
+  <b:Source>
+    <b:Tag>Ope26</b:Tag>
+    <b:SourceType>Report</b:SourceType>
+    <b:Guid>{DDC91220-A0DA-4F59-9688-9FE3D520C04D}</b:Guid>
+    <b:Author>
+      <b:Author>
+        <b:Corporate>OpenAI</b:Corporate>
+      </b:Author>
+    </b:Author>
+    <b:Title>ChatGPT</b:Title>
+    <b:Year>2026</b:Year>
+    <b:URL>https://chat.openai.com/</b:URL>
+    <b:Comments>I am building a Stratego AI using belief-state MCTS (IS-MCTS style). Before each MCTS iteration, I sample a possible opponent board from my belief distribution, so each iteration runs on a fully deterministic hidden-information rollout.</b:Comments>
+    <b:RefOrder>1</b:RefOrder>
+  </b:Source>
+  <b:Source>
+    <b:Tag>Jef15</b:Tag>
+    <b:SourceType>InternetSite</b:SourceType>
+    <b:Guid>{392E606C-6EB1-48F8-A4CD-47B9F5C92ED3}</b:Guid>
+    <b:Title>Introduction to Monte Carlo Tree Search</b:Title>
+    <b:InternetSiteTitle>Jeff Bradberry</b:InternetSiteTitle>
+    <b:Year>2015</b:Year>
+    <b:Month>Septembre</b:Month>
+    <b:Day>7</b:Day>
+    <b:URL>https://jeffbradberry.com/posts/2015/09/intro-to-monte-carlo-tree-search/</b:URL>
+    <b:Author>
+      <b:Author>
+        <b:NameList>
+          <b:Person>
+            <b:Last>Bradberry</b:Last>
+            <b:First>Jeff</b:First>
+          </b:Person>
+        </b:NameList>
+      </b:Author>
+    </b:Author>
+    <b:RefOrder>14</b:RefOrder>
+  </b:Source>
+  <b:Source>
+    <b:Tag>Sil16</b:Tag>
+    <b:SourceType>ArticleInAPeriodical</b:SourceType>
+    <b:Guid>{81CC86FE-B363-467A-A130-170F7392603E}</b:Guid>
+    <b:Title>PROGRESSIVE STRATEGIES FOR MONTE-CARLO TREE SEARCH</b:Title>
+    <b:Year>2008</b:Year>
+    <b:Author>
+      <b:Author>
+        <b:NameList>
+          <b:Person>
+            <b:Last>Chaslot</b:Last>
+            <b:First>G.</b:First>
+            <b:Middle>M. J-B., Winands, M. H. M, et al</b:Middle>
+          </b:Person>
+        </b:NameList>
+      </b:Author>
+    </b:Author>
+    <b:PeriodicalTitle>New Mathematics and Natural Computation</b:PeriodicalTitle>
+    <b:Month>Volume 4</b:Month>
+    <b:Pages>343-357</b:Pages>
+    <b:RefOrder>15</b:RefOrder>
+  </b:Source>
+  <b:Source>
+    <b:Tag>Pet12</b:Tag>
+    <b:SourceType>InternetSite</b:SourceType>
+    <b:Guid>{9039DA65-5912-4660-AACE-0691F65DC27A}</b:Guid>
+    <b:Author>
+      <b:Author>
+        <b:NameList>
+          <b:Person>
+            <b:Last>Cowling</b:Last>
+            <b:First>Peter</b:First>
+          </b:Person>
+          <b:Person>
+            <b:Last>Powley</b:Last>
+            <b:First>Ed</b:First>
+          </b:Person>
+          <b:Person>
+            <b:Last>Whitehouse</b:Last>
+            <b:First>Daniel</b:First>
+          </b:Person>
+        </b:NameList>
+      </b:Author>
+    </b:Author>
+    <b:Title>Python Code</b:Title>
+    <b:InternetSiteTitle>mcts.ai</b:InternetSiteTitle>
+    <b:Year>2012</b:Year>
+    <b:Month>September</b:Month>
+    <b:URL>https://mcts.ai/code/python.html</b:URL>
+    <b:RefOrder>16</b:RefOrder>
+  </b:Source>
+  <b:Source>
+    <b:Tag>Gee26</b:Tag>
+    <b:SourceType>InternetSite</b:SourceType>
+    <b:Guid>{260A8ED4-DA5A-42AE-8A6E-E54621278433}</b:Guid>
+    <b:Title>Monte Carlo Tree Search (MCTS) in Machine Learning</b:Title>
+    <b:Year>2026</b:Year>
+    <b:Author>
+      <b:Author>
+        <b:NameList>
+          <b:Person>
+            <b:Last>Geeks</b:Last>
+            <b:First>Geeks</b:First>
+            <b:Middle>for</b:Middle>
+          </b:Person>
+        </b:NameList>
+      </b:Author>
+    </b:Author>
+    <b:InternetSiteTitle>Geeks for Geeks</b:InternetSiteTitle>
+    <b:Month>01</b:Month>
+    <b:Day>30</b:Day>
+    <b:URL>https://www.geeksforgeeks.org/machine-learning/monte-carlo-tree-search-mcts-in-machine-learning/</b:URL>
+    <b:RefOrder>17</b:RefOrder>
+  </b:Source>
+  <b:Source>
+    <b:Tag>Lan14</b:Tag>
+    <b:SourceType>InternetSite</b:SourceType>
+    <b:Guid>{520599F7-406C-4419-86C3-385DD76CB90D}</b:Guid>
+    <b:Title>Monte Carlo Tree Search with Heuristic Evaluations using Implicit Minimax Backups</b:Title>
+    <b:Year>2014</b:Year>
+    <b:Month>June</b:Month>
+    <b:Day>2</b:Day>
+    <b:Author>
+      <b:Author>
+        <b:NameList>
+          <b:Person>
+            <b:Last>Lanctot</b:Last>
+            <b:First>M.,</b:First>
+            <b:Middle>Winands, M. H. M, et al.</b:Middle>
+          </b:Person>
+        </b:NameList>
+      </b:Author>
+    </b:Author>
+    <b:InternetSiteTitle>arxiv</b:InternetSiteTitle>
+    <b:URL>https://arxiv.org/abs/1406.0486?utm_source=chatgpt.com</b:URL>
+    <b:RefOrder>18</b:RefOrder>
+  </b:Source>
+  <b:Source>
+    <b:Tag>Lor16</b:Tag>
+    <b:SourceType>ArticleInAPeriodical</b:SourceType>
+    <b:Guid>{06C0C3FD-4C4B-46FA-AB21-17A5A7AC566F}</b:Guid>
+    <b:Author>
+      <b:Author>
+        <b:NameList>
+          <b:Person>
+            <b:Last>Lorentz</b:Last>
+            <b:First>R.</b:First>
+          </b:Person>
+        </b:NameList>
+      </b:Author>
+    </b:Author>
+    <b:Title>Using evaluation functions in Monte-Carlo Tree Search</b:Title>
+    <b:PeriodicalTitle>ScienceDirect</b:PeriodicalTitle>
+    <b:Year>2016</b:Year>
+    <b:Month>September</b:Month>
+    <b:Pages>106-113</b:Pages>
+    <b:RefOrder>19</b:RefOrder>
+  </b:Source>
+  <b:Source>
+    <b:Tag>Ach25</b:Tag>
+    <b:SourceType>InternetSite</b:SourceType>
+    <b:Guid>{845A54FF-4CA4-4676-9664-62005D249D0A}</b:Guid>
+    <b:Title>Modeling Uncertainty: Constraint-Based Belief</b:Title>
+    <b:InternetSiteTitle>arxiv</b:InternetSiteTitle>
+    <b:Year>2025</b:Year>
+    <b:Month>Août</b:Month>
+    <b:Day>19</b:Day>
+    <b:URL>https://arxiv.org/pdf/2507.19263</b:URL>
+    <b:Author>
+      <b:Author>
+        <b:NameList>
+          <b:Person>
+            <b:Last>Morenville</b:Last>
+            <b:First>Achille</b:First>
+          </b:Person>
+          <b:Person>
+            <b:Last>Piette</b:Last>
+            <b:First>Eric</b:First>
+          </b:Person>
+        </b:NameList>
+      </b:Author>
+    </b:Author>
+    <b:RefOrder>20</b:RefOrder>
+  </b:Source>
+  <b:Source>
+    <b:Tag>Jul22</b:Tag>
+    <b:SourceType>InternetSite</b:SourceType>
+    <b:Guid>{4FBBFBE0-0FA8-4459-91FC-F40B5E922FA9}</b:Guid>
+    <b:Title>Mastering the Game of Stratego with Model-Free Multiagent Reinforcement Learning</b:Title>
+    <b:Year>2022</b:Year>
+    <b:Author>
+      <b:Author>
+        <b:NameList>
+          <b:Person>
+            <b:Last>Perolat et al</b:Last>
+            <b:First>Julien</b:First>
+          </b:Person>
+        </b:NameList>
+      </b:Author>
+    </b:Author>
+    <b:InternetSiteTitle>arxiv.com</b:InternetSiteTitle>
+    <b:Month>Juin</b:Month>
+    <b:Day>30</b:Day>
+    <b:URL>https://arxiv.org/pdf/2206.15378</b:URL>
+    <b:RefOrder>21</b:RefOrder>
+  </b:Source>
+  <b:Source>
+    <b:Tag>Świ22</b:Tag>
+    <b:SourceType>ArticleInAPeriodical</b:SourceType>
+    <b:Guid>{F0ACB6E4-3B00-4E08-8189-2A283905F9FE}</b:Guid>
+    <b:Title>Monte Carlo Tree Search: a review of recent modifications and applications</b:Title>
+    <b:Year>2022</b:Year>
+    <b:Pages>2497-2652</b:Pages>
+    <b:Author>
+      <b:Author>
+        <b:NameList>
+          <b:Person>
+            <b:Last>Świechowski</b:Last>
+            <b:First>M.,</b:First>
+            <b:Middle>Goldewski, K., et al.</b:Middle>
+          </b:Person>
+        </b:NameList>
+      </b:Author>
+    </b:Author>
+    <b:PeriodicalTitle>Open Access</b:PeriodicalTitle>
+    <b:Month>July</b:Month>
+    <b:Day>19</b:Day>
+    <b:RefOrder>22</b:RefOrder>
+  </b:Source>
+  <b:Source>
+    <b:Tag>Mar25</b:Tag>
+    <b:SourceType>DocumentFromInternetSite</b:SourceType>
+    <b:Guid>{EB57107D-3BD8-40C8-A608-B345AFFBE7C4}</b:Guid>
+    <b:Title>CSI 4106: Introduction to Artificial Intelligence</b:Title>
+    <b:InternetSiteTitle>turcotte.xyz</b:InternetSiteTitle>
+    <b:Year>2025</b:Year>
+    <b:Month>Décembre</b:Month>
+    <b:Day>1</b:Day>
+    <b:URL>https://turcotte.xyz/teaching/csi-4106/lectures/22/slides.html?q=monte#/monte-carlo-tree-search-mcts</b:URL>
+    <b:Author>
+      <b:Author>
+        <b:NameList>
+          <b:Person>
+            <b:Last>Turcotte</b:Last>
+            <b:First>Marcel</b:First>
+          </b:Person>
+        </b:NameList>
+      </b:Author>
+    </b:Author>
+    <b:RefOrder>23</b:RefOrder>
   </b:Source>
 </b:Sources>
 </file>
 
 <file path=customXml/itemProps1.xml><?xml version="1.0" encoding="utf-8"?>
-<ds:datastoreItem xmlns:ds="http://schemas.openxmlformats.org/officeDocument/2006/customXml" ds:itemID="{5952D34F-68B2-43F5-9D37-0D10BC61C522}">
+<ds:datastoreItem xmlns:ds="http://schemas.openxmlformats.org/officeDocument/2006/customXml" ds:itemID="{5FAD8989-FB71-418F-BEFA-13BC3C329AC0}">
   <ds:schemaRefs>
     <ds:schemaRef ds:uri="http://schemas.openxmlformats.org/officeDocument/2006/bibliography"/>
   </ds:schemaRefs>

</xml_diff>

<commit_message>
ajout graphique tp3 veille
</commit_message>
<xml_diff>
--- a/brouillon-veille/Brouillon_Projet_3.docx
+++ b/brouillon-veille/Brouillon_Projet_3.docx
@@ -1,6 +1,6 @@
 
 <file path=word/document.xml><?xml version="1.0" encoding="utf-8"?>
-<w:document xmlns:wpc="http://schemas.microsoft.com/office/word/2010/wordprocessingCanvas" xmlns:cx="http://schemas.microsoft.com/office/drawing/2014/chartex" xmlns:cx1="http://schemas.microsoft.com/office/drawing/2015/9/8/chartex" xmlns:cx2="http://schemas.microsoft.com/office/drawing/2015/10/21/chartex" xmlns:cx3="http://schemas.microsoft.com/office/drawing/2016/5/9/chartex" xmlns:cx4="http://schemas.microsoft.com/office/drawing/2016/5/10/chartex" xmlns:cx5="http://schemas.microsoft.com/office/drawing/2016/5/11/chartex" xmlns:cx6="http://schemas.microsoft.com/office/drawing/2016/5/12/chartex" xmlns:cx7="http://schemas.microsoft.com/office/drawing/2016/5/13/chartex" xmlns:cx8="http://schemas.microsoft.com/office/drawing/2016/5/14/chartex" xmlns:mc="http://schemas.openxmlformats.org/markup-compatibility/2006" xmlns:aink="http://schemas.microsoft.com/office/drawing/2016/ink" xmlns:am3d="http://schemas.microsoft.com/office/drawing/2017/model3d" xmlns:o="urn:schemas-microsoft-com:office:office" xmlns:oel="http://schemas.microsoft.com/office/2019/extlst" xmlns:r="http://schemas.openxmlformats.org/officeDocument/2006/relationships" xmlns:m="http://schemas.openxmlformats.org/officeDocument/2006/math" xmlns:v="urn:schemas-microsoft-com:vml" xmlns:wp14="http://schemas.microsoft.com/office/word/2010/wordprocessingDrawing" xmlns:wp="http://schemas.openxmlformats.org/drawingml/2006/wordprocessingDrawing" xmlns:w10="urn:schemas-microsoft-com:office:word" xmlns:w="http://schemas.openxmlformats.org/wordprocessingml/2006/main" xmlns:w14="http://schemas.microsoft.com/office/word/2010/wordml" xmlns:w15="http://schemas.microsoft.com/office/word/2012/wordml" xmlns:w16cex="http://schemas.microsoft.com/office/word/2018/wordml/cex" xmlns:w16cid="http://schemas.microsoft.com/office/word/2016/wordml/cid" xmlns:w16="http://schemas.microsoft.com/office/word/2018/wordml" xmlns:w16du="http://schemas.microsoft.com/office/word/2023/wordml/word16du" xmlns:w16sdtdh="http://schemas.microsoft.com/office/word/2020/wordml/sdtdatahash" xmlns:w16sdtfl="http://schemas.microsoft.com/office/word/2024/wordml/sdtformatlock" xmlns:w16se="http://schemas.microsoft.com/office/word/2015/wordml/symex" xmlns:wpg="http://schemas.microsoft.com/office/word/2010/wordprocessingGroup" xmlns:wpi="http://schemas.microsoft.com/office/word/2010/wordprocessingInk" xmlns:wne="http://schemas.microsoft.com/office/word/2006/wordml" xmlns:wps="http://schemas.microsoft.com/office/word/2010/wordprocessingShape" mc:Ignorable="w14 w15 w16se w16cid w16 w16cex w16sdtdh w16sdtfl w16du wp14">
+<w:document xmlns:wpc="http://schemas.microsoft.com/office/word/2010/wordprocessingCanvas" xmlns:cx="http://schemas.microsoft.com/office/drawing/2014/chartex" xmlns:cx1="http://schemas.microsoft.com/office/drawing/2015/9/8/chartex" xmlns:cx2="http://schemas.microsoft.com/office/drawing/2015/10/21/chartex" xmlns:cx3="http://schemas.microsoft.com/office/drawing/2016/5/9/chartex" xmlns:cx4="http://schemas.microsoft.com/office/drawing/2016/5/10/chartex" xmlns:cx5="http://schemas.microsoft.com/office/drawing/2016/5/11/chartex" xmlns:cx6="http://schemas.microsoft.com/office/drawing/2016/5/12/chartex" xmlns:cx7="http://schemas.microsoft.com/office/drawing/2016/5/13/chartex" xmlns:cx8="http://schemas.microsoft.com/office/drawing/2016/5/14/chartex" xmlns:mc="http://schemas.openxmlformats.org/markup-compatibility/2006" xmlns:aink="http://schemas.microsoft.com/office/drawing/2016/ink" xmlns:am3d="http://schemas.microsoft.com/office/drawing/2017/model3d" xmlns:o="urn:schemas-microsoft-com:office:office" xmlns:r="http://schemas.openxmlformats.org/officeDocument/2006/relationships" xmlns:m="http://schemas.openxmlformats.org/officeDocument/2006/math" xmlns:v="urn:schemas-microsoft-com:vml" xmlns:wp14="http://schemas.microsoft.com/office/word/2010/wordprocessingDrawing" xmlns:wp="http://schemas.openxmlformats.org/drawingml/2006/wordprocessingDrawing" xmlns:w10="urn:schemas-microsoft-com:office:word" xmlns:w="http://schemas.openxmlformats.org/wordprocessingml/2006/main" xmlns:w14="http://schemas.microsoft.com/office/word/2010/wordml" xmlns:w15="http://schemas.microsoft.com/office/word/2012/wordml" xmlns:w16cid="http://schemas.microsoft.com/office/word/2016/wordml/cid" xmlns:w16se="http://schemas.microsoft.com/office/word/2015/wordml/symex" xmlns:wpg="http://schemas.microsoft.com/office/word/2010/wordprocessingGroup" xmlns:wpi="http://schemas.microsoft.com/office/word/2010/wordprocessingInk" xmlns:wne="http://schemas.microsoft.com/office/word/2006/wordml" xmlns:wps="http://schemas.microsoft.com/office/word/2010/wordprocessingShape" mc:Ignorable="w14 w15 w16se w16cid wp14">
   <w:body>
     <w:p>
       <w:pPr>
@@ -36,6 +36,7 @@
               <w:showingPlcHdr/>
               <w:bibliography/>
             </w:sdtPr>
+            <w:sdtEndPr/>
             <w:sdtContent>
               <w:r>
                 <w:rPr>
@@ -509,6 +510,7 @@
       <w:r>
         <w:rPr>
           <w:rFonts w:ascii="Times New Roman" w:eastAsia="Times New Roman" w:hAnsi="Times New Roman" w:cs="Times New Roman"/>
+          <w:noProof/>
           <w:kern w:val="0"/>
           <w:lang w:eastAsia="fr-CA"/>
           <w14:ligatures w14:val="none"/>
@@ -564,6 +566,7 @@
           <w:id w:val="-1622836471"/>
           <w:citation/>
         </w:sdtPr>
+        <w:sdtEndPr/>
         <w:sdtContent>
           <w:r>
             <w:fldChar w:fldCharType="begin"/>
@@ -635,13 +638,501 @@
       </w:pPr>
       <w:r>
         <w:rPr>
+          <w:noProof/>
+        </w:rPr>
+        <mc:AlternateContent>
+          <mc:Choice Requires="wps">
+            <w:drawing>
+              <wp:anchor distT="0" distB="0" distL="114300" distR="114300" simplePos="0" relativeHeight="251662336" behindDoc="0" locked="0" layoutInCell="1" allowOverlap="1" wp14:anchorId="5D0269FA" wp14:editId="4B1B628E">
+                <wp:simplePos x="0" y="0"/>
+                <wp:positionH relativeFrom="column">
+                  <wp:posOffset>676275</wp:posOffset>
+                </wp:positionH>
+                <wp:positionV relativeFrom="paragraph">
+                  <wp:posOffset>2809240</wp:posOffset>
+                </wp:positionV>
+                <wp:extent cx="4124325" cy="635"/>
+                <wp:effectExtent l="0" t="0" r="0" b="0"/>
+                <wp:wrapThrough wrapText="bothSides">
+                  <wp:wrapPolygon edited="0">
+                    <wp:start x="0" y="0"/>
+                    <wp:lineTo x="0" y="21600"/>
+                    <wp:lineTo x="21600" y="21600"/>
+                    <wp:lineTo x="21600" y="0"/>
+                  </wp:wrapPolygon>
+                </wp:wrapThrough>
+                <wp:docPr id="9" name="Zone de texte 9"/>
+                <wp:cNvGraphicFramePr/>
+                <a:graphic xmlns:a="http://schemas.openxmlformats.org/drawingml/2006/main">
+                  <a:graphicData uri="http://schemas.microsoft.com/office/word/2010/wordprocessingShape">
+                    <wps:wsp>
+                      <wps:cNvSpPr txBox="1"/>
+                      <wps:spPr>
+                        <a:xfrm>
+                          <a:off x="0" y="0"/>
+                          <a:ext cx="4124325" cy="635"/>
+                        </a:xfrm>
+                        <a:prstGeom prst="rect">
+                          <a:avLst/>
+                        </a:prstGeom>
+                        <a:solidFill>
+                          <a:prstClr val="white"/>
+                        </a:solidFill>
+                        <a:ln>
+                          <a:noFill/>
+                        </a:ln>
+                      </wps:spPr>
+                      <wps:txbx>
+                        <w:txbxContent>
+                          <w:p>
+                            <w:pPr>
+                              <w:pStyle w:val="Lgende"/>
+                              <w:jc w:val="center"/>
+                              <w:rPr>
+                                <w:rFonts w:ascii="Times New Roman" w:eastAsia="Times New Roman" w:hAnsi="Times New Roman" w:cs="Times New Roman"/>
+                                <w:noProof/>
+                                <w:sz w:val="24"/>
+                                <w:szCs w:val="24"/>
+                              </w:rPr>
+                            </w:pPr>
+                            <w:r>
+                              <w:t xml:space="preserve">Figure </w:t>
+                            </w:r>
+                            <w:r>
+                              <w:fldChar w:fldCharType="begin"/>
+                            </w:r>
+                            <w:r>
+                              <w:instrText xml:space="preserve"> SEQ Figure \* ARABIC </w:instrText>
+                            </w:r>
+                            <w:r>
+                              <w:fldChar w:fldCharType="separate"/>
+                            </w:r>
+                            <w:r>
+                              <w:rPr>
+                                <w:noProof/>
+                              </w:rPr>
+                              <w:t>1</w:t>
+                            </w:r>
+                            <w:r>
+                              <w:fldChar w:fldCharType="end"/>
+                            </w:r>
+                            <w:r>
+                              <w:t xml:space="preserve"> : 3 déterminisations différentes d’une main adverse selon les belief states de l’algorithme </w:t>
+                            </w:r>
+                            <w:sdt>
+                              <w:sdtPr>
+                                <w:id w:val="2940355"/>
+                                <w:citation/>
+                              </w:sdtPr>
+                              <w:sdtContent>
+                                <w:r>
+                                  <w:fldChar w:fldCharType="begin"/>
+                                </w:r>
+                                <w:r>
+                                  <w:instrText xml:space="preserve"> CITATION Świ22 \l 3084 </w:instrText>
+                                </w:r>
+                                <w:r>
+                                  <w:fldChar w:fldCharType="separate"/>
+                                </w:r>
+                                <w:r>
+                                  <w:rPr>
+                                    <w:noProof/>
+                                  </w:rPr>
+                                  <w:t>(Świechowski, 2022)</w:t>
+                                </w:r>
+                                <w:r>
+                                  <w:fldChar w:fldCharType="end"/>
+                                </w:r>
+                              </w:sdtContent>
+                            </w:sdt>
+                          </w:p>
+                        </w:txbxContent>
+                      </wps:txbx>
+                      <wps:bodyPr rot="0" spcFirstLastPara="0" vertOverflow="overflow" horzOverflow="overflow" vert="horz" wrap="square" lIns="0" tIns="0" rIns="0" bIns="0" numCol="1" spcCol="0" rtlCol="0" fromWordArt="0" anchor="t" anchorCtr="0" forceAA="0" compatLnSpc="1">
+                        <a:prstTxWarp prst="textNoShape">
+                          <a:avLst/>
+                        </a:prstTxWarp>
+                        <a:spAutoFit/>
+                      </wps:bodyPr>
+                    </wps:wsp>
+                  </a:graphicData>
+                </a:graphic>
+              </wp:anchor>
+            </w:drawing>
+          </mc:Choice>
+          <mc:Fallback>
+            <w:pict>
+              <v:shapetype w14:anchorId="5D0269FA" id="_x0000_t202" coordsize="21600,21600" o:spt="202" path="m,l,21600r21600,l21600,xe">
+                <v:stroke joinstyle="miter"/>
+                <v:path gradientshapeok="t" o:connecttype="rect"/>
+              </v:shapetype>
+              <v:shape id="Zone de texte 9" o:spid="_x0000_s1026" type="#_x0000_t202" style="position:absolute;margin-left:53.25pt;margin-top:221.2pt;width:324.75pt;height:.05pt;z-index:251662336;visibility:visible;mso-wrap-style:square;mso-wrap-distance-left:9pt;mso-wrap-distance-top:0;mso-wrap-distance-right:9pt;mso-wrap-distance-bottom:0;mso-position-horizontal:absolute;mso-position-horizontal-relative:text;mso-position-vertical:absolute;mso-position-vertical-relative:text;v-text-anchor:top" o:gfxdata="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" stroked="f">
+                <v:textbox style="mso-fit-shape-to-text:t" inset="0,0,0,0">
+                  <w:txbxContent>
+                    <w:p>
+                      <w:pPr>
+                        <w:pStyle w:val="Lgende"/>
+                        <w:jc w:val="center"/>
+                        <w:rPr>
+                          <w:rFonts w:ascii="Times New Roman" w:eastAsia="Times New Roman" w:hAnsi="Times New Roman" w:cs="Times New Roman"/>
+                          <w:noProof/>
+                          <w:sz w:val="24"/>
+                          <w:szCs w:val="24"/>
+                        </w:rPr>
+                      </w:pPr>
+                      <w:r>
+                        <w:t xml:space="preserve">Figure </w:t>
+                      </w:r>
+                      <w:r>
+                        <w:fldChar w:fldCharType="begin"/>
+                      </w:r>
+                      <w:r>
+                        <w:instrText xml:space="preserve"> SEQ Figure \* ARABIC </w:instrText>
+                      </w:r>
+                      <w:r>
+                        <w:fldChar w:fldCharType="separate"/>
+                      </w:r>
+                      <w:r>
+                        <w:rPr>
+                          <w:noProof/>
+                        </w:rPr>
+                        <w:t>1</w:t>
+                      </w:r>
+                      <w:r>
+                        <w:fldChar w:fldCharType="end"/>
+                      </w:r>
+                      <w:r>
+                        <w:t xml:space="preserve"> : 3 déterminisations différentes d’une main adverse selon les belief states de l’algorithme </w:t>
+                      </w:r>
+                      <w:sdt>
+                        <w:sdtPr>
+                          <w:id w:val="2940355"/>
+                          <w:citation/>
+                        </w:sdtPr>
+                        <w:sdtContent>
+                          <w:r>
+                            <w:fldChar w:fldCharType="begin"/>
+                          </w:r>
+                          <w:r>
+                            <w:instrText xml:space="preserve"> CITATION Świ22 \l 3084 </w:instrText>
+                          </w:r>
+                          <w:r>
+                            <w:fldChar w:fldCharType="separate"/>
+                          </w:r>
+                          <w:r>
+                            <w:rPr>
+                              <w:noProof/>
+                            </w:rPr>
+                            <w:t>(Świechowski, 2022)</w:t>
+                          </w:r>
+                          <w:r>
+                            <w:fldChar w:fldCharType="end"/>
+                          </w:r>
+                        </w:sdtContent>
+                      </w:sdt>
+                    </w:p>
+                  </w:txbxContent>
+                </v:textbox>
+                <w10:wrap type="through"/>
+              </v:shape>
+            </w:pict>
+          </mc:Fallback>
+        </mc:AlternateContent>
+      </w:r>
+      <w:r>
+        <w:rPr>
+          <w:rFonts w:ascii="Times New Roman" w:eastAsia="Times New Roman" w:hAnsi="Times New Roman" w:cs="Times New Roman"/>
+          <w:noProof/>
+          <w:kern w:val="0"/>
+          <w:lang w:eastAsia="fr-CA"/>
+        </w:rPr>
+        <w:drawing>
+          <wp:anchor distT="0" distB="0" distL="114300" distR="114300" simplePos="0" relativeHeight="251660288" behindDoc="0" locked="0" layoutInCell="1" allowOverlap="1" wp14:anchorId="3D460912" wp14:editId="2A438596">
+            <wp:simplePos x="0" y="0"/>
+            <wp:positionH relativeFrom="margin">
+              <wp:align>center</wp:align>
+            </wp:positionH>
+            <wp:positionV relativeFrom="paragraph">
+              <wp:posOffset>83820</wp:posOffset>
+            </wp:positionV>
+            <wp:extent cx="4124325" cy="2668270"/>
+            <wp:effectExtent l="0" t="0" r="9525" b="0"/>
+            <wp:wrapThrough wrapText="bothSides">
+              <wp:wrapPolygon edited="0">
+                <wp:start x="0" y="0"/>
+                <wp:lineTo x="0" y="21436"/>
+                <wp:lineTo x="21550" y="21436"/>
+                <wp:lineTo x="21550" y="0"/>
+                <wp:lineTo x="0" y="0"/>
+              </wp:wrapPolygon>
+            </wp:wrapThrough>
+            <wp:docPr id="8" name="Image 8"/>
+            <wp:cNvGraphicFramePr>
+              <a:graphicFrameLocks xmlns:a="http://schemas.openxmlformats.org/drawingml/2006/main" noChangeAspect="1"/>
+            </wp:cNvGraphicFramePr>
+            <a:graphic xmlns:a="http://schemas.openxmlformats.org/drawingml/2006/main">
+              <a:graphicData uri="http://schemas.openxmlformats.org/drawingml/2006/picture">
+                <pic:pic xmlns:pic="http://schemas.openxmlformats.org/drawingml/2006/picture">
+                  <pic:nvPicPr>
+                    <pic:cNvPr id="8" name="determinizationMaciek.png"/>
+                    <pic:cNvPicPr/>
+                  </pic:nvPicPr>
+                  <pic:blipFill>
+                    <a:blip r:embed="rId9" cstate="print">
+                      <a:extLst>
+                        <a:ext uri="{28A0092B-C50C-407E-A947-70E740481C1C}">
+                          <a14:useLocalDpi xmlns:a14="http://schemas.microsoft.com/office/drawing/2010/main" val="0"/>
+                        </a:ext>
+                      </a:extLst>
+                    </a:blip>
+                    <a:stretch>
+                      <a:fillRect/>
+                    </a:stretch>
+                  </pic:blipFill>
+                  <pic:spPr>
+                    <a:xfrm>
+                      <a:off x="0" y="0"/>
+                      <a:ext cx="4124325" cy="2668270"/>
+                    </a:xfrm>
+                    <a:prstGeom prst="rect">
+                      <a:avLst/>
+                    </a:prstGeom>
+                  </pic:spPr>
+                </pic:pic>
+              </a:graphicData>
+            </a:graphic>
+            <wp14:sizeRelH relativeFrom="page">
+              <wp14:pctWidth>0</wp14:pctWidth>
+            </wp14:sizeRelH>
+            <wp14:sizeRelV relativeFrom="page">
+              <wp14:pctHeight>0</wp14:pctHeight>
+            </wp14:sizeRelV>
+          </wp:anchor>
+        </w:drawing>
+      </w:r>
+      <w:r>
+        <w:rPr>
+          <w:noProof/>
+        </w:rPr>
+        <mc:AlternateContent>
+          <mc:Choice Requires="wps">
+            <w:drawing>
+              <wp:inline distT="0" distB="0" distL="0" distR="0" wp14:anchorId="6796AE41" wp14:editId="48F59BB6">
+                <wp:extent cx="304800" cy="304800"/>
+                <wp:effectExtent l="0" t="0" r="0" b="0"/>
+                <wp:docPr id="2" name="Rectangle 2" descr="Refer to caption"/>
+                <wp:cNvGraphicFramePr>
+                  <a:graphicFrameLocks xmlns:a="http://schemas.openxmlformats.org/drawingml/2006/main" noChangeAspect="1"/>
+                </wp:cNvGraphicFramePr>
+                <a:graphic xmlns:a="http://schemas.openxmlformats.org/drawingml/2006/main">
+                  <a:graphicData uri="http://schemas.microsoft.com/office/word/2010/wordprocessingShape">
+                    <wps:wsp>
+                      <wps:cNvSpPr>
+                        <a:spLocks noChangeAspect="1" noChangeArrowheads="1"/>
+                      </wps:cNvSpPr>
+                      <wps:spPr bwMode="auto">
+                        <a:xfrm>
+                          <a:off x="0" y="0"/>
+                          <a:ext cx="304800" cy="304800"/>
+                        </a:xfrm>
+                        <a:prstGeom prst="rect">
+                          <a:avLst/>
+                        </a:prstGeom>
+                        <a:noFill/>
+                        <a:ln>
+                          <a:noFill/>
+                        </a:ln>
+                        <a:extLst>
+                          <a:ext uri="{909E8E84-426E-40DD-AFC4-6F175D3DCCD1}">
+                            <a14:hiddenFill xmlns:a14="http://schemas.microsoft.com/office/drawing/2010/main">
+                              <a:solidFill>
+                                <a:srgbClr val="FFFFFF"/>
+                              </a:solidFill>
+                            </a14:hiddenFill>
+                          </a:ext>
+                          <a:ext uri="{91240B29-F687-4F45-9708-019B960494DF}">
+                            <a14:hiddenLine xmlns:a14="http://schemas.microsoft.com/office/drawing/2010/main" w="9525">
+                              <a:solidFill>
+                                <a:srgbClr val="000000"/>
+                              </a:solidFill>
+                              <a:miter lim="800000"/>
+                              <a:headEnd/>
+                              <a:tailEnd/>
+                            </a14:hiddenLine>
+                          </a:ext>
+                        </a:extLst>
+                      </wps:spPr>
+                      <wps:bodyPr rot="0" vert="horz" wrap="square" lIns="91440" tIns="45720" rIns="91440" bIns="45720" anchor="t" anchorCtr="0" upright="1">
+                        <a:noAutofit/>
+                      </wps:bodyPr>
+                    </wps:wsp>
+                  </a:graphicData>
+                </a:graphic>
+              </wp:inline>
+            </w:drawing>
+          </mc:Choice>
+          <mc:Fallback>
+            <w:pict>
+              <v:rect w14:anchorId="3FFDB0B1" id="Rectangle 2" o:spid="_x0000_s1026" alt="Refer to caption" style="width:24pt;height:24pt;visibility:visible;mso-wrap-style:square;mso-left-percent:-10001;mso-top-percent:-10001;mso-position-horizontal:absolute;mso-position-horizontal-relative:char;mso-position-vertical:absolute;mso-position-vertical-relative:line;mso-left-percent:-10001;mso-top-percent:-10001;v-text-anchor:top" o:gfxdata="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" filled="f" stroked="f">
+                <o:lock v:ext="edit" aspectratio="t"/>
+                <w10:anchorlock/>
+              </v:rect>
+            </w:pict>
+          </mc:Fallback>
+        </mc:AlternateContent>
+      </w:r>
+      <w:r>
+        <w:rPr>
+          <w:noProof/>
+        </w:rPr>
+        <mc:AlternateContent>
+          <mc:Choice Requires="wps">
+            <w:drawing>
+              <wp:inline distT="0" distB="0" distL="0" distR="0" wp14:anchorId="7E4C15B1" wp14:editId="19F0EA0D">
+                <wp:extent cx="304800" cy="304800"/>
+                <wp:effectExtent l="0" t="0" r="0" b="0"/>
+                <wp:docPr id="5" name="Rectangle 5" descr="Refer to caption"/>
+                <wp:cNvGraphicFramePr>
+                  <a:graphicFrameLocks xmlns:a="http://schemas.openxmlformats.org/drawingml/2006/main" noChangeAspect="1"/>
+                </wp:cNvGraphicFramePr>
+                <a:graphic xmlns:a="http://schemas.openxmlformats.org/drawingml/2006/main">
+                  <a:graphicData uri="http://schemas.microsoft.com/office/word/2010/wordprocessingShape">
+                    <wps:wsp>
+                      <wps:cNvSpPr>
+                        <a:spLocks noChangeAspect="1" noChangeArrowheads="1"/>
+                      </wps:cNvSpPr>
+                      <wps:spPr bwMode="auto">
+                        <a:xfrm>
+                          <a:off x="0" y="0"/>
+                          <a:ext cx="304800" cy="304800"/>
+                        </a:xfrm>
+                        <a:prstGeom prst="rect">
+                          <a:avLst/>
+                        </a:prstGeom>
+                        <a:noFill/>
+                        <a:ln>
+                          <a:noFill/>
+                        </a:ln>
+                        <a:extLst>
+                          <a:ext uri="{909E8E84-426E-40DD-AFC4-6F175D3DCCD1}">
+                            <a14:hiddenFill xmlns:a14="http://schemas.microsoft.com/office/drawing/2010/main">
+                              <a:solidFill>
+                                <a:srgbClr val="FFFFFF"/>
+                              </a:solidFill>
+                            </a14:hiddenFill>
+                          </a:ext>
+                          <a:ext uri="{91240B29-F687-4F45-9708-019B960494DF}">
+                            <a14:hiddenLine xmlns:a14="http://schemas.microsoft.com/office/drawing/2010/main" w="9525">
+                              <a:solidFill>
+                                <a:srgbClr val="000000"/>
+                              </a:solidFill>
+                              <a:miter lim="800000"/>
+                              <a:headEnd/>
+                              <a:tailEnd/>
+                            </a14:hiddenLine>
+                          </a:ext>
+                        </a:extLst>
+                      </wps:spPr>
+                      <wps:bodyPr rot="0" vert="horz" wrap="square" lIns="91440" tIns="45720" rIns="91440" bIns="45720" anchor="t" anchorCtr="0" upright="1">
+                        <a:noAutofit/>
+                      </wps:bodyPr>
+                    </wps:wsp>
+                  </a:graphicData>
+                </a:graphic>
+              </wp:inline>
+            </w:drawing>
+          </mc:Choice>
+          <mc:Fallback>
+            <w:pict>
+              <v:rect w14:anchorId="27B1F895" id="Rectangle 5" o:spid="_x0000_s1026" alt="Refer to caption" style="width:24pt;height:24pt;visibility:visible;mso-wrap-style:square;mso-left-percent:-10001;mso-top-percent:-10001;mso-position-horizontal:absolute;mso-position-horizontal-relative:char;mso-position-vertical:absolute;mso-position-vertical-relative:line;mso-left-percent:-10001;mso-top-percent:-10001;v-text-anchor:top" o:gfxdata="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" filled="f" stroked="f">
+                <o:lock v:ext="edit" aspectratio="t"/>
+                <w10:anchorlock/>
+              </v:rect>
+            </w:pict>
+          </mc:Fallback>
+        </mc:AlternateContent>
+      </w:r>
+      <w:r>
+        <w:rPr>
+          <w:noProof/>
+        </w:rPr>
+        <mc:AlternateContent>
+          <mc:Choice Requires="wps">
+            <w:drawing>
+              <wp:inline distT="0" distB="0" distL="0" distR="0" wp14:anchorId="7783E840" wp14:editId="1A71DD35">
+                <wp:extent cx="304800" cy="304800"/>
+                <wp:effectExtent l="0" t="0" r="0" b="0"/>
+                <wp:docPr id="7" name="AutoShape 5" descr="Refer to caption"/>
+                <wp:cNvGraphicFramePr>
+                  <a:graphicFrameLocks xmlns:a="http://schemas.openxmlformats.org/drawingml/2006/main" noChangeAspect="1"/>
+                </wp:cNvGraphicFramePr>
+                <a:graphic xmlns:a="http://schemas.openxmlformats.org/drawingml/2006/main">
+                  <a:graphicData uri="http://schemas.microsoft.com/office/word/2010/wordprocessingShape">
+                    <wps:wsp>
+                      <wps:cNvSpPr>
+                        <a:spLocks noChangeAspect="1" noChangeArrowheads="1"/>
+                      </wps:cNvSpPr>
+                      <wps:spPr bwMode="auto">
+                        <a:xfrm>
+                          <a:off x="0" y="0"/>
+                          <a:ext cx="304800" cy="304800"/>
+                        </a:xfrm>
+                        <a:prstGeom prst="rect">
+                          <a:avLst/>
+                        </a:prstGeom>
+                        <a:noFill/>
+                        <a:ln>
+                          <a:noFill/>
+                        </a:ln>
+                        <a:extLst>
+                          <a:ext uri="{909E8E84-426E-40DD-AFC4-6F175D3DCCD1}">
+                            <a14:hiddenFill xmlns:a14="http://schemas.microsoft.com/office/drawing/2010/main">
+                              <a:solidFill>
+                                <a:srgbClr val="FFFFFF"/>
+                              </a:solidFill>
+                            </a14:hiddenFill>
+                          </a:ext>
+                          <a:ext uri="{91240B29-F687-4F45-9708-019B960494DF}">
+                            <a14:hiddenLine xmlns:a14="http://schemas.microsoft.com/office/drawing/2010/main" w="9525">
+                              <a:solidFill>
+                                <a:srgbClr val="000000"/>
+                              </a:solidFill>
+                              <a:miter lim="800000"/>
+                              <a:headEnd/>
+                              <a:tailEnd/>
+                            </a14:hiddenLine>
+                          </a:ext>
+                        </a:extLst>
+                      </wps:spPr>
+                      <wps:bodyPr rot="0" vert="horz" wrap="square" lIns="91440" tIns="45720" rIns="91440" bIns="45720" anchor="t" anchorCtr="0" upright="1">
+                        <a:noAutofit/>
+                      </wps:bodyPr>
+                    </wps:wsp>
+                  </a:graphicData>
+                </a:graphic>
+              </wp:inline>
+            </w:drawing>
+          </mc:Choice>
+          <mc:Fallback>
+            <w:pict>
+              <v:rect w14:anchorId="311802AD" id="AutoShape 5" o:spid="_x0000_s1026" alt="Refer to caption" style="width:24pt;height:24pt;visibility:visible;mso-wrap-style:square;mso-left-percent:-10001;mso-top-percent:-10001;mso-position-horizontal:absolute;mso-position-horizontal-relative:char;mso-position-vertical:absolute;mso-position-vertical-relative:line;mso-left-percent:-10001;mso-top-percent:-10001;v-text-anchor:top" o:gfxdata="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" filled="f" stroked="f">
+                <o:lock v:ext="edit" aspectratio="t"/>
+                <w10:anchorlock/>
+              </v:rect>
+            </w:pict>
+          </mc:Fallback>
+        </mc:AlternateContent>
+      </w:r>
+    </w:p>
+    <w:p>
+      <w:pPr>
+        <w:rPr>
           <w:rFonts w:ascii="Times New Roman" w:eastAsia="Times New Roman" w:hAnsi="Times New Roman" w:cs="Times New Roman"/>
           <w:kern w:val="0"/>
           <w:lang w:eastAsia="fr-CA"/>
           <w14:ligatures w14:val="none"/>
         </w:rPr>
-        <w:t>Ensuite, le MCTS explore progressivement l’arbre des coups possibles sur le plateau « déterminisé » en se concentrant sur les branches les plus prometteuses grâce aux priors. Les priors servent à guider cette exploration en attribuant une valeur initiale aux actions avant même d’effectuer une quelconque simulation. Ils estiment si un coup révèle de l’information sur une pièce non révélée, s’il permet de capturer une pièce de haut rang, ou s’il expose une pièce importante à un danger immédiat. Ces signaux permettent de privilégier les décisions qui ont un potentiel stratégique élevé dès les premières itérations de recherche, tout en laissant le MCTS affiner progressivement les évaluations via les résultats des simulations.</w:t>
-      </w:r>
+      </w:pPr>
     </w:p>
     <w:p>
       <w:pPr>
@@ -652,13 +1143,125 @@
           <w14:ligatures w14:val="none"/>
         </w:rPr>
       </w:pPr>
-      <w:r>
+    </w:p>
+    <w:p>
+      <w:pPr>
         <w:rPr>
           <w:rFonts w:ascii="Times New Roman" w:eastAsia="Times New Roman" w:hAnsi="Times New Roman" w:cs="Times New Roman"/>
           <w:kern w:val="0"/>
           <w:lang w:eastAsia="fr-CA"/>
           <w14:ligatures w14:val="none"/>
         </w:rPr>
+      </w:pPr>
+    </w:p>
+    <w:p>
+      <w:pPr>
+        <w:rPr>
+          <w:rFonts w:ascii="Times New Roman" w:eastAsia="Times New Roman" w:hAnsi="Times New Roman" w:cs="Times New Roman"/>
+          <w:kern w:val="0"/>
+          <w:lang w:eastAsia="fr-CA"/>
+          <w14:ligatures w14:val="none"/>
+        </w:rPr>
+      </w:pPr>
+    </w:p>
+    <w:p>
+      <w:pPr>
+        <w:rPr>
+          <w:rFonts w:ascii="Times New Roman" w:eastAsia="Times New Roman" w:hAnsi="Times New Roman" w:cs="Times New Roman"/>
+          <w:kern w:val="0"/>
+          <w:lang w:eastAsia="fr-CA"/>
+          <w14:ligatures w14:val="none"/>
+        </w:rPr>
+      </w:pPr>
+    </w:p>
+    <w:p>
+      <w:pPr>
+        <w:rPr>
+          <w:rFonts w:ascii="Times New Roman" w:eastAsia="Times New Roman" w:hAnsi="Times New Roman" w:cs="Times New Roman"/>
+          <w:kern w:val="0"/>
+          <w:lang w:eastAsia="fr-CA"/>
+          <w14:ligatures w14:val="none"/>
+        </w:rPr>
+      </w:pPr>
+    </w:p>
+    <w:p>
+      <w:pPr>
+        <w:rPr>
+          <w:rFonts w:ascii="Times New Roman" w:eastAsia="Times New Roman" w:hAnsi="Times New Roman" w:cs="Times New Roman"/>
+          <w:kern w:val="0"/>
+          <w:lang w:eastAsia="fr-CA"/>
+          <w14:ligatures w14:val="none"/>
+        </w:rPr>
+      </w:pPr>
+    </w:p>
+    <w:p>
+      <w:pPr>
+        <w:rPr>
+          <w:rFonts w:ascii="Times New Roman" w:eastAsia="Times New Roman" w:hAnsi="Times New Roman" w:cs="Times New Roman"/>
+          <w:kern w:val="0"/>
+          <w:lang w:eastAsia="fr-CA"/>
+          <w14:ligatures w14:val="none"/>
+        </w:rPr>
+      </w:pPr>
+    </w:p>
+    <w:p>
+      <w:pPr>
+        <w:rPr>
+          <w:rFonts w:ascii="Times New Roman" w:eastAsia="Times New Roman" w:hAnsi="Times New Roman" w:cs="Times New Roman"/>
+          <w:kern w:val="0"/>
+          <w:lang w:eastAsia="fr-CA"/>
+          <w14:ligatures w14:val="none"/>
+        </w:rPr>
+      </w:pPr>
+    </w:p>
+    <w:p>
+      <w:pPr>
+        <w:rPr>
+          <w:rFonts w:ascii="Times New Roman" w:eastAsia="Times New Roman" w:hAnsi="Times New Roman" w:cs="Times New Roman"/>
+          <w:kern w:val="0"/>
+          <w:lang w:eastAsia="fr-CA"/>
+          <w14:ligatures w14:val="none"/>
+        </w:rPr>
+      </w:pPr>
+      <w:bookmarkStart w:id="1" w:name="_GoBack"/>
+      <w:bookmarkEnd w:id="1"/>
+    </w:p>
+    <w:p>
+      <w:pPr>
+        <w:rPr>
+          <w:rFonts w:ascii="Times New Roman" w:eastAsia="Times New Roman" w:hAnsi="Times New Roman" w:cs="Times New Roman"/>
+          <w:kern w:val="0"/>
+          <w:lang w:eastAsia="fr-CA"/>
+          <w14:ligatures w14:val="none"/>
+        </w:rPr>
+      </w:pPr>
+      <w:r>
+        <w:rPr>
+          <w:rFonts w:ascii="Times New Roman" w:eastAsia="Times New Roman" w:hAnsi="Times New Roman" w:cs="Times New Roman"/>
+          <w:kern w:val="0"/>
+          <w:lang w:eastAsia="fr-CA"/>
+          <w14:ligatures w14:val="none"/>
+        </w:rPr>
+        <w:lastRenderedPageBreak/>
+        <w:t>Ensuite, le MCTS explore progressivement l’arbre des coups possibles sur le plateau « déterminisé » en se concentrant sur les branches les plus prometteuses grâce aux priors. Les priors servent à guider cette exploration en attribuant une valeur initiale aux actions avant même d’effectuer une quelconque simulation. Ils estiment si un coup révèle de l’information sur une pièce non révélée, s’il permet de capturer une pièce de haut rang, ou s’il expose une pièce importante à un danger immédiat. Ces signaux permettent de privilégier les décisions qui ont un potentiel stratégique élevé dès les premières itérations de recherche, tout en laissant le MCTS affiner progressivement les évaluations via les résultats des simulations.</w:t>
+      </w:r>
+    </w:p>
+    <w:p>
+      <w:pPr>
+        <w:rPr>
+          <w:rFonts w:ascii="Times New Roman" w:eastAsia="Times New Roman" w:hAnsi="Times New Roman" w:cs="Times New Roman"/>
+          <w:kern w:val="0"/>
+          <w:lang w:eastAsia="fr-CA"/>
+          <w14:ligatures w14:val="none"/>
+        </w:rPr>
+      </w:pPr>
+      <w:r>
+        <w:rPr>
+          <w:rFonts w:ascii="Times New Roman" w:eastAsia="Times New Roman" w:hAnsi="Times New Roman" w:cs="Times New Roman"/>
+          <w:kern w:val="0"/>
+          <w:lang w:eastAsia="fr-CA"/>
+          <w14:ligatures w14:val="none"/>
+        </w:rPr>
         <w:t>Finalement, les fonctions heuristiques permettent d’évaluer l’état du plateau de jeu après plusieurs itérations de simulation. Elles servent à attribuer un score aux positions atteintes en prenant en compte des facteurs stratégiques globaux. Elles combinent l’avantage matériel, la sécurité des pièces restantes, les informations gagnées sur les pièces adverses, ainsi que la pression exercée sur les zones critiques du plateau. Contrairement aux priors qui orientent la recherche au début, les heuristiques synthétisent les résultats des simulations pour estimer la qualité réelle d’un état. Le MCTS va rétropropager cette qualité afin d’affiner la sélection des coups prometteurs.</w:t>
       </w:r>
     </w:p>
@@ -675,154 +1278,160 @@
         <w:rPr>
           <w:rFonts w:ascii="Times New Roman" w:hAnsi="Times New Roman" w:cs="Times New Roman"/>
         </w:rPr>
+        <w:t>2</w:t>
+      </w:r>
+      <w:r>
+        <w:rPr>
+          <w:rFonts w:ascii="Times New Roman" w:hAnsi="Times New Roman" w:cs="Times New Roman"/>
+        </w:rPr>
+        <w:t>.2</w:t>
+      </w:r>
+      <w:r>
+        <w:rPr>
+          <w:rFonts w:ascii="Times New Roman" w:hAnsi="Times New Roman" w:cs="Times New Roman"/>
+        </w:rPr>
+        <w:t xml:space="preserve"> </w:t>
+      </w:r>
+      <w:r>
+        <w:rPr>
+          <w:rFonts w:ascii="Times New Roman" w:hAnsi="Times New Roman" w:cs="Times New Roman"/>
+        </w:rPr>
+        <w:t>React</w:t>
+      </w:r>
+      <w:r>
+        <w:rPr>
+          <w:rFonts w:ascii="Times New Roman" w:hAnsi="Times New Roman" w:cs="Times New Roman"/>
+        </w:rPr>
+        <w:t> :</w:t>
+      </w:r>
+      <w:r>
+        <w:rPr>
+          <w:rFonts w:ascii="Times New Roman" w:hAnsi="Times New Roman" w:cs="Times New Roman"/>
+        </w:rPr>
+        <w:t xml:space="preserve"> </w:t>
+      </w:r>
+      <w:r>
+        <w:rPr>
+          <w:rFonts w:ascii="Times New Roman" w:hAnsi="Times New Roman" w:cs="Times New Roman"/>
+        </w:rPr>
+        <w:t xml:space="preserve"> gérer la complexité d’une interface de jeu</w:t>
+      </w:r>
+    </w:p>
+    <w:p>
+      <w:pPr>
+        <w:jc w:val="both"/>
+        <w:rPr>
+          <w:rFonts w:ascii="Times New Roman" w:hAnsi="Times New Roman" w:cs="Times New Roman"/>
+        </w:rPr>
+      </w:pPr>
+      <w:r>
+        <w:rPr>
+          <w:rFonts w:ascii="Times New Roman" w:hAnsi="Times New Roman" w:cs="Times New Roman"/>
+        </w:rPr>
+        <w:t xml:space="preserve">L’intégration de React dans L’Attaque a rapidement confirmé la pertinence de son modèle par composants pour un jeu dont l’état évolue en permanence. Le composant principal, Game.jsx, coordonne à lui seul le plateau, les </w:t>
+      </w:r>
+      <w:r>
+        <w:rPr>
+          <w:rFonts w:ascii="Times New Roman" w:hAnsi="Times New Roman" w:cs="Times New Roman"/>
+        </w:rPr>
+        <w:t>timers</w:t>
+      </w:r>
+      <w:r>
+        <w:rPr>
+          <w:rFonts w:ascii="Times New Roman" w:hAnsi="Times New Roman" w:cs="Times New Roman"/>
+        </w:rPr>
+        <w:t xml:space="preserve">, les animations de combat, l’indicateur de tour et les notifications, soit un ensemble d’éléments devant demeurer synchronisés en </w:t>
+      </w:r>
+      <w:r>
+        <w:rPr>
+          <w:rFonts w:ascii="Times New Roman" w:hAnsi="Times New Roman" w:cs="Times New Roman"/>
+        </w:rPr>
+        <w:t>semi</w:t>
+      </w:r>
+      <w:r>
+        <w:rPr>
+          <w:rFonts w:ascii="Times New Roman" w:hAnsi="Times New Roman" w:cs="Times New Roman"/>
+        </w:rPr>
+        <w:t>-</w:t>
+      </w:r>
+      <w:r>
+        <w:rPr>
+          <w:rFonts w:ascii="Times New Roman" w:hAnsi="Times New Roman" w:cs="Times New Roman"/>
+        </w:rPr>
+        <w:t>temps réel.</w:t>
+      </w:r>
+    </w:p>
+    <w:p>
+      <w:pPr>
+        <w:jc w:val="both"/>
+        <w:rPr>
+          <w:rFonts w:ascii="Times New Roman" w:hAnsi="Times New Roman" w:cs="Times New Roman"/>
+        </w:rPr>
+      </w:pPr>
+      <w:r>
+        <w:rPr>
+          <w:rFonts w:ascii="Times New Roman" w:hAnsi="Times New Roman" w:cs="Times New Roman"/>
+        </w:rPr>
+        <w:t>La performance de cette interface repose en grande partie sur le Virtual DOM. React maintient en mémoire une représentation légère de l’interface et utilise un mécanisme de comparaison pour n’actualiser que les éléments du DOM réel réellement modifiés. Cette méthode réduit les traitements coûteux du navigateur et permet de conserver un affichage fluide, même lorsque plusieurs éléments sont mis à jour simultanément.</w:t>
+      </w:r>
+    </w:p>
+    <w:p>
+      <w:pPr>
+        <w:jc w:val="both"/>
+        <w:rPr>
+          <w:rFonts w:ascii="Times New Roman" w:hAnsi="Times New Roman" w:cs="Times New Roman"/>
+        </w:rPr>
+      </w:pPr>
+      <w:r>
+        <w:rPr>
+          <w:rFonts w:ascii="Times New Roman" w:hAnsi="Times New Roman" w:cs="Times New Roman"/>
+        </w:rPr>
+        <w:t xml:space="preserve">Devant la complexité croissante du composant principal, plusieurs hooks personnalisés ont été mis en place. </w:t>
+      </w:r>
+      <w:r>
+        <w:rPr>
+          <w:rFonts w:ascii="Times New Roman" w:hAnsi="Times New Roman" w:cs="Times New Roman"/>
+        </w:rPr>
+        <w:t>UseGameSync</w:t>
+      </w:r>
+      <w:r>
+        <w:rPr>
+          <w:rFonts w:ascii="Times New Roman" w:hAnsi="Times New Roman" w:cs="Times New Roman"/>
+        </w:rPr>
+        <w:t xml:space="preserve"> interroge périodiquement le serveur pour garder l’état du jeu à jour, usePlacement gère la phase de placement des pièces, tandis que useCellClick traite les interactions effectuées sur le plateau. Ces hooks reposent eux-mêmes sur les hooks natifs useState et useEffect, qui permettent de gérer l’état et les effets de bord directement dans des composants fonctionnels, sans avoir recours à des classes.</w:t>
+      </w:r>
+    </w:p>
+    <w:p>
+      <w:pPr>
+        <w:jc w:val="both"/>
+        <w:rPr>
+          <w:rFonts w:ascii="Times New Roman" w:hAnsi="Times New Roman" w:cs="Times New Roman"/>
+        </w:rPr>
+      </w:pPr>
+      <w:r>
+        <w:rPr>
+          <w:rFonts w:ascii="Times New Roman" w:hAnsi="Times New Roman" w:cs="Times New Roman"/>
+        </w:rPr>
+        <w:t xml:space="preserve">Cette organisation montre clairement que React favorise une architecture modulaire, plus simple à maintenir et à déboguer. L’utilisation de useState et de useEffect s’est également révélée naturelle pour représenter les différentes données du jeu, comme le plateau, le tour actif, les </w:t>
+      </w:r>
+      <w:r>
+        <w:rPr>
+          <w:rFonts w:ascii="Times New Roman" w:hAnsi="Times New Roman" w:cs="Times New Roman"/>
+        </w:rPr>
+        <w:t>horloge</w:t>
+      </w:r>
+      <w:r>
+        <w:rPr>
+          <w:rFonts w:ascii="Times New Roman" w:hAnsi="Times New Roman" w:cs="Times New Roman"/>
+        </w:rPr>
+        <w:t xml:space="preserve">s ou encore les résultats des combats, puis pour les synchroniser avec le serveur Flask au moyen de requêtes périodiques. Si cette méthode s’intègre bien à Flask, </w:t>
+      </w:r>
+      <w:r>
+        <w:rPr>
+          <w:rFonts w:ascii="Times New Roman" w:hAnsi="Times New Roman" w:cs="Times New Roman"/>
+        </w:rPr>
         <w:lastRenderedPageBreak/>
-        <w:t>2</w:t>
-      </w:r>
-      <w:r>
-        <w:rPr>
-          <w:rFonts w:ascii="Times New Roman" w:hAnsi="Times New Roman" w:cs="Times New Roman"/>
-        </w:rPr>
-        <w:t>.2</w:t>
-      </w:r>
-      <w:r>
-        <w:rPr>
-          <w:rFonts w:ascii="Times New Roman" w:hAnsi="Times New Roman" w:cs="Times New Roman"/>
-        </w:rPr>
-        <w:t xml:space="preserve"> </w:t>
-      </w:r>
-      <w:r>
-        <w:rPr>
-          <w:rFonts w:ascii="Times New Roman" w:hAnsi="Times New Roman" w:cs="Times New Roman"/>
-        </w:rPr>
-        <w:t>React</w:t>
-      </w:r>
-      <w:r>
-        <w:rPr>
-          <w:rFonts w:ascii="Times New Roman" w:hAnsi="Times New Roman" w:cs="Times New Roman"/>
-        </w:rPr>
-        <w:t> :</w:t>
-      </w:r>
-      <w:r>
-        <w:rPr>
-          <w:rFonts w:ascii="Times New Roman" w:hAnsi="Times New Roman" w:cs="Times New Roman"/>
-        </w:rPr>
-        <w:t xml:space="preserve"> </w:t>
-      </w:r>
-      <w:r>
-        <w:rPr>
-          <w:rFonts w:ascii="Times New Roman" w:hAnsi="Times New Roman" w:cs="Times New Roman"/>
-        </w:rPr>
-        <w:t xml:space="preserve"> gérer la complexité d’une interface de jeu</w:t>
-      </w:r>
-    </w:p>
-    <w:p>
-      <w:pPr>
-        <w:jc w:val="both"/>
-        <w:rPr>
-          <w:rFonts w:ascii="Times New Roman" w:hAnsi="Times New Roman" w:cs="Times New Roman"/>
-        </w:rPr>
-      </w:pPr>
-      <w:r>
-        <w:rPr>
-          <w:rFonts w:ascii="Times New Roman" w:hAnsi="Times New Roman" w:cs="Times New Roman"/>
-        </w:rPr>
-        <w:t xml:space="preserve">L’intégration de React dans L’Attaque a rapidement confirmé la pertinence de son modèle par composants pour un jeu dont l’état évolue en permanence. Le composant principal, Game.jsx, coordonne à lui seul le plateau, les </w:t>
-      </w:r>
-      <w:r>
-        <w:rPr>
-          <w:rFonts w:ascii="Times New Roman" w:hAnsi="Times New Roman" w:cs="Times New Roman"/>
-        </w:rPr>
-        <w:t>timers</w:t>
-      </w:r>
-      <w:r>
-        <w:rPr>
-          <w:rFonts w:ascii="Times New Roman" w:hAnsi="Times New Roman" w:cs="Times New Roman"/>
-        </w:rPr>
-        <w:t xml:space="preserve">, les animations de combat, l’indicateur de tour et les notifications, soit un ensemble d’éléments devant demeurer synchronisés en </w:t>
-      </w:r>
-      <w:r>
-        <w:rPr>
-          <w:rFonts w:ascii="Times New Roman" w:hAnsi="Times New Roman" w:cs="Times New Roman"/>
-        </w:rPr>
-        <w:t>semi</w:t>
-      </w:r>
-      <w:r>
-        <w:rPr>
-          <w:rFonts w:ascii="Times New Roman" w:hAnsi="Times New Roman" w:cs="Times New Roman"/>
-        </w:rPr>
-        <w:t>-</w:t>
-      </w:r>
-      <w:r>
-        <w:rPr>
-          <w:rFonts w:ascii="Times New Roman" w:hAnsi="Times New Roman" w:cs="Times New Roman"/>
-        </w:rPr>
-        <w:t>temps réel.</w:t>
-      </w:r>
-    </w:p>
-    <w:p>
-      <w:pPr>
-        <w:jc w:val="both"/>
-        <w:rPr>
-          <w:rFonts w:ascii="Times New Roman" w:hAnsi="Times New Roman" w:cs="Times New Roman"/>
-        </w:rPr>
-      </w:pPr>
-      <w:r>
-        <w:rPr>
-          <w:rFonts w:ascii="Times New Roman" w:hAnsi="Times New Roman" w:cs="Times New Roman"/>
-        </w:rPr>
-        <w:t>La performance de cette interface repose en grande partie sur le Virtual DOM. React maintient en mémoire une représentation légère de l’interface et utilise un mécanisme de comparaison pour n’actualiser que les éléments du DOM réel réellement modifiés. Cette méthode réduit les traitements coûteux du navigateur et permet de conserver un affichage fluide, même lorsque plusieurs éléments sont mis à jour simultanément.</w:t>
-      </w:r>
-    </w:p>
-    <w:p>
-      <w:pPr>
-        <w:jc w:val="both"/>
-        <w:rPr>
-          <w:rFonts w:ascii="Times New Roman" w:hAnsi="Times New Roman" w:cs="Times New Roman"/>
-        </w:rPr>
-      </w:pPr>
-      <w:r>
-        <w:rPr>
-          <w:rFonts w:ascii="Times New Roman" w:hAnsi="Times New Roman" w:cs="Times New Roman"/>
-        </w:rPr>
-        <w:t xml:space="preserve">Devant la complexité croissante du composant principal, plusieurs hooks personnalisés ont été mis en place. </w:t>
-      </w:r>
-      <w:r>
-        <w:rPr>
-          <w:rFonts w:ascii="Times New Roman" w:hAnsi="Times New Roman" w:cs="Times New Roman"/>
-        </w:rPr>
-        <w:t>UseGameSync</w:t>
-      </w:r>
-      <w:r>
-        <w:rPr>
-          <w:rFonts w:ascii="Times New Roman" w:hAnsi="Times New Roman" w:cs="Times New Roman"/>
-        </w:rPr>
-        <w:t xml:space="preserve"> interroge périodiquement le serveur pour garder l’état du jeu à jour, usePlacement gère la phase de placement des pièces, tandis que useCellClick traite les interactions effectuées sur le plateau. Ces hooks reposent eux-mêmes sur les hooks natifs useState et useEffect, qui permettent de gérer l’état et les effets de bord directement dans des composants fonctionnels, sans avoir recours à des classes.</w:t>
-      </w:r>
-    </w:p>
-    <w:p>
-      <w:pPr>
-        <w:jc w:val="both"/>
-        <w:rPr>
-          <w:rFonts w:ascii="Times New Roman" w:hAnsi="Times New Roman" w:cs="Times New Roman"/>
-        </w:rPr>
-      </w:pPr>
-      <w:r>
-        <w:rPr>
-          <w:rFonts w:ascii="Times New Roman" w:hAnsi="Times New Roman" w:cs="Times New Roman"/>
-        </w:rPr>
-        <w:t xml:space="preserve">Cette organisation montre clairement que React favorise une architecture modulaire, plus simple à maintenir et à déboguer. L’utilisation de useState et de useEffect s’est également révélée naturelle pour représenter les différentes données du jeu, comme le plateau, le tour actif, les </w:t>
-      </w:r>
-      <w:r>
-        <w:rPr>
-          <w:rFonts w:ascii="Times New Roman" w:hAnsi="Times New Roman" w:cs="Times New Roman"/>
-        </w:rPr>
-        <w:t>horloge</w:t>
-      </w:r>
-      <w:r>
-        <w:rPr>
-          <w:rFonts w:ascii="Times New Roman" w:hAnsi="Times New Roman" w:cs="Times New Roman"/>
-        </w:rPr>
-        <w:t xml:space="preserve">s ou encore les résultats des combats, puis pour les synchroniser avec le serveur Flask au moyen de requêtes périodiques. Si cette méthode s’intègre bien à Flask, elle introduit néanmoins un certain délai et entraîne l’envoi continu de requêtes, même en l’absence de changement. Dans ce contexte, l’isolation de cette logique dans des hooks personnalisés reste essentielle : selon </w:t>
+        <w:t xml:space="preserve">elle introduit néanmoins un certain délai et entraîne l’envoi continu de requêtes, même en l’absence de changement. Dans ce contexte, l’isolation de cette logique dans des hooks personnalisés reste essentielle : selon </w:t>
       </w:r>
       <w:sdt>
         <w:sdtPr>
@@ -832,6 +1441,7 @@
           <w:id w:val="-485709115"/>
           <w:citation/>
         </w:sdtPr>
+        <w:sdtEndPr/>
         <w:sdtContent>
           <w:r>
             <w:rPr>
@@ -915,7 +1525,7 @@
                     <pic:cNvPicPr/>
                   </pic:nvPicPr>
                   <pic:blipFill>
-                    <a:blip r:embed="rId9" cstate="print">
+                    <a:blip r:embed="rId10" cstate="print">
                       <a:extLst>
                         <a:ext uri="{28A0092B-C50C-407E-A947-70E740481C1C}">
                           <a14:useLocalDpi xmlns:a14="http://schemas.microsoft.com/office/drawing/2010/main" val="0"/>
@@ -1103,7 +1713,27 @@
           <w:sz w:val="24"/>
           <w:szCs w:val="24"/>
         </w:rPr>
-        <w:t xml:space="preserve"> De son côté, le MCTS reste une approche reconnue dans l’intelligence artificielle des jeux, mais son intérêt tient aussi à sa mise en œuvre pratique : dans L’Attaque, son implémentation en Python permet de structurer plus clairement la logique de recherche, de tester plus facilement les simulations et d’ajuster l’algorithme au comportement du jeu. On peut ainsi comparer React à </w:t>
+        <w:t xml:space="preserve"> De son côté, le MCTS reste une approche reconnue dans l’intelligence artificielle des jeux, mais son intérêt tient aussi à sa mise en œuvre pratique : dans L’Attaque, son implémentation en Python permet de structurer plus clairement la logique de recherche, de tester plus facilement les simulations et d’ajuster l’algorithme au comportement du jeu. On peut ainsi comparer </w:t>
+      </w:r>
+      <w:proofErr w:type="spellStart"/>
+      <w:r>
+        <w:rPr>
+          <w:rFonts w:ascii="Times New Roman" w:eastAsiaTheme="minorHAnsi" w:hAnsi="Times New Roman" w:cs="Times New Roman"/>
+          <w:color w:val="auto"/>
+          <w:sz w:val="24"/>
+          <w:szCs w:val="24"/>
+        </w:rPr>
+        <w:t>React</w:t>
+      </w:r>
+      <w:proofErr w:type="spellEnd"/>
+      <w:r>
+        <w:rPr>
+          <w:rFonts w:ascii="Times New Roman" w:eastAsiaTheme="minorHAnsi" w:hAnsi="Times New Roman" w:cs="Times New Roman"/>
+          <w:color w:val="auto"/>
+          <w:sz w:val="24"/>
+          <w:szCs w:val="24"/>
+        </w:rPr>
+        <w:t xml:space="preserve"> à </w:t>
       </w:r>
       <w:proofErr w:type="spellStart"/>
       <w:r>
@@ -1145,6 +1775,7 @@
           <w:id w:val="1017890882"/>
           <w:citation/>
         </w:sdtPr>
+        <w:sdtEndPr/>
         <w:sdtContent>
           <w:r>
             <w:rPr>
@@ -1245,7 +1876,7 @@
                     <pic:cNvPicPr/>
                   </pic:nvPicPr>
                   <pic:blipFill>
-                    <a:blip r:embed="rId10" cstate="print">
+                    <a:blip r:embed="rId11" cstate="print">
                       <a:extLst>
                         <a:ext uri="{28A0092B-C50C-407E-A947-70E740481C1C}">
                           <a14:useLocalDpi xmlns:a14="http://schemas.microsoft.com/office/drawing/2010/main" val="0"/>
@@ -1347,7 +1978,7 @@
               </wp:inline>
             </w:drawing>
           </mc:Choice>
-          <mc:Fallback>
+          <mc:Fallback xmlns:w16sdtfl="http://schemas.microsoft.com/office/word/2024/wordml/sdtformatlock" xmlns:w16sdtdh="http://schemas.microsoft.com/office/word/2020/wordml/sdtdatahash" xmlns:w16du="http://schemas.microsoft.com/office/word/2023/wordml/word16du" xmlns:w16="http://schemas.microsoft.com/office/word/2018/wordml" xmlns:w16cex="http://schemas.microsoft.com/office/word/2018/wordml/cex" xmlns:oel="http://schemas.microsoft.com/office/2019/extlst">
             <w:pict>
               <v:rect w14:anchorId="26949FDD" id="Rectangle 3" o:spid="_x0000_s1026" alt="Image description" style="width:24pt;height:24pt;visibility:visible;mso-wrap-style:square;mso-left-percent:-10001;mso-top-percent:-10001;mso-position-horizontal:absolute;mso-position-horizontal-relative:char;mso-position-vertical:absolute;mso-position-vertical-relative:line;mso-left-percent:-10001;mso-top-percent:-10001;v-text-anchor:top" o:gfxdata="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" filled="f" stroked="f">
                 <o:lock v:ext="edit" aspectratio="t"/>
@@ -1629,6 +2260,7 @@
             <w:id w:val="1336738728"/>
             <w:bibliography/>
           </w:sdtPr>
+          <w:sdtEndPr/>
           <w:sdtContent>
             <w:p>
               <w:pPr>
@@ -1955,7 +2587,6 @@
                   <w:noProof/>
                   <w:lang w:val="en-CA"/>
                 </w:rPr>
-                <w:lastRenderedPageBreak/>
                 <w:t xml:space="preserve">freecodecamp.org. (2026, 03 27). </w:t>
               </w:r>
               <w:r>
@@ -1995,6 +2626,7 @@
                   <w:noProof/>
                   <w:lang w:val="en-CA"/>
                 </w:rPr>
+                <w:lastRenderedPageBreak/>
                 <w:t xml:space="preserve">Geeks, G. f. (2026, 01 30). </w:t>
               </w:r>
               <w:r>
@@ -2382,7 +3014,6 @@
                 <w:rPr>
                   <w:noProof/>
                 </w:rPr>
-                <w:lastRenderedPageBreak/>
                 <w:t xml:space="preserve">w3schools. (2026, 01 30). </w:t>
               </w:r>
               <w:r>
@@ -2417,7 +3048,7 @@
       </w:sdtContent>
     </w:sdt>
     <w:sectPr>
-      <w:footerReference w:type="default" r:id="rId11"/>
+      <w:footerReference w:type="default" r:id="rId12"/>
       <w:pgSz w:w="12240" w:h="15840"/>
       <w:pgMar w:top="709" w:right="1800" w:bottom="993" w:left="1800" w:header="708" w:footer="0" w:gutter="0"/>
       <w:pgNumType w:start="0"/>
@@ -2430,7 +3061,7 @@
 </file>
 
 <file path=word/endnotes.xml><?xml version="1.0" encoding="utf-8"?>
-<w:endnotes xmlns:wpc="http://schemas.microsoft.com/office/word/2010/wordprocessingCanvas" xmlns:cx="http://schemas.microsoft.com/office/drawing/2014/chartex" xmlns:cx1="http://schemas.microsoft.com/office/drawing/2015/9/8/chartex" xmlns:cx2="http://schemas.microsoft.com/office/drawing/2015/10/21/chartex" xmlns:cx3="http://schemas.microsoft.com/office/drawing/2016/5/9/chartex" xmlns:cx4="http://schemas.microsoft.com/office/drawing/2016/5/10/chartex" xmlns:cx5="http://schemas.microsoft.com/office/drawing/2016/5/11/chartex" xmlns:cx6="http://schemas.microsoft.com/office/drawing/2016/5/12/chartex" xmlns:cx7="http://schemas.microsoft.com/office/drawing/2016/5/13/chartex" xmlns:cx8="http://schemas.microsoft.com/office/drawing/2016/5/14/chartex" xmlns:mc="http://schemas.openxmlformats.org/markup-compatibility/2006" xmlns:aink="http://schemas.microsoft.com/office/drawing/2016/ink" xmlns:am3d="http://schemas.microsoft.com/office/drawing/2017/model3d" xmlns:o="urn:schemas-microsoft-com:office:office" xmlns:oel="http://schemas.microsoft.com/office/2019/extlst" xmlns:r="http://schemas.openxmlformats.org/officeDocument/2006/relationships" xmlns:m="http://schemas.openxmlformats.org/officeDocument/2006/math" xmlns:v="urn:schemas-microsoft-com:vml" xmlns:wp14="http://schemas.microsoft.com/office/word/2010/wordprocessingDrawing" xmlns:wp="http://schemas.openxmlformats.org/drawingml/2006/wordprocessingDrawing" xmlns:w10="urn:schemas-microsoft-com:office:word" xmlns:w="http://schemas.openxmlformats.org/wordprocessingml/2006/main" xmlns:w14="http://schemas.microsoft.com/office/word/2010/wordml" xmlns:w15="http://schemas.microsoft.com/office/word/2012/wordml" xmlns:w16cex="http://schemas.microsoft.com/office/word/2018/wordml/cex" xmlns:w16cid="http://schemas.microsoft.com/office/word/2016/wordml/cid" xmlns:w16="http://schemas.microsoft.com/office/word/2018/wordml" xmlns:w16du="http://schemas.microsoft.com/office/word/2023/wordml/word16du" xmlns:w16sdtdh="http://schemas.microsoft.com/office/word/2020/wordml/sdtdatahash" xmlns:w16sdtfl="http://schemas.microsoft.com/office/word/2024/wordml/sdtformatlock" xmlns:w16se="http://schemas.microsoft.com/office/word/2015/wordml/symex" xmlns:wpg="http://schemas.microsoft.com/office/word/2010/wordprocessingGroup" xmlns:wpi="http://schemas.microsoft.com/office/word/2010/wordprocessingInk" xmlns:wne="http://schemas.microsoft.com/office/word/2006/wordml" xmlns:wps="http://schemas.microsoft.com/office/word/2010/wordprocessingShape" mc:Ignorable="w14 w15 w16se w16cid w16 w16cex w16sdtdh w16sdtfl w16du wp14">
+<w:endnotes xmlns:wpc="http://schemas.microsoft.com/office/word/2010/wordprocessingCanvas" xmlns:cx="http://schemas.microsoft.com/office/drawing/2014/chartex" xmlns:cx1="http://schemas.microsoft.com/office/drawing/2015/9/8/chartex" xmlns:cx2="http://schemas.microsoft.com/office/drawing/2015/10/21/chartex" xmlns:cx3="http://schemas.microsoft.com/office/drawing/2016/5/9/chartex" xmlns:cx4="http://schemas.microsoft.com/office/drawing/2016/5/10/chartex" xmlns:cx5="http://schemas.microsoft.com/office/drawing/2016/5/11/chartex" xmlns:cx6="http://schemas.microsoft.com/office/drawing/2016/5/12/chartex" xmlns:cx7="http://schemas.microsoft.com/office/drawing/2016/5/13/chartex" xmlns:cx8="http://schemas.microsoft.com/office/drawing/2016/5/14/chartex" xmlns:mc="http://schemas.openxmlformats.org/markup-compatibility/2006" xmlns:aink="http://schemas.microsoft.com/office/drawing/2016/ink" xmlns:am3d="http://schemas.microsoft.com/office/drawing/2017/model3d" xmlns:o="urn:schemas-microsoft-com:office:office" xmlns:r="http://schemas.openxmlformats.org/officeDocument/2006/relationships" xmlns:m="http://schemas.openxmlformats.org/officeDocument/2006/math" xmlns:v="urn:schemas-microsoft-com:vml" xmlns:wp14="http://schemas.microsoft.com/office/word/2010/wordprocessingDrawing" xmlns:wp="http://schemas.openxmlformats.org/drawingml/2006/wordprocessingDrawing" xmlns:w10="urn:schemas-microsoft-com:office:word" xmlns:w="http://schemas.openxmlformats.org/wordprocessingml/2006/main" xmlns:w14="http://schemas.microsoft.com/office/word/2010/wordml" xmlns:w15="http://schemas.microsoft.com/office/word/2012/wordml" xmlns:w16cid="http://schemas.microsoft.com/office/word/2016/wordml/cid" xmlns:w16se="http://schemas.microsoft.com/office/word/2015/wordml/symex" xmlns:wpg="http://schemas.microsoft.com/office/word/2010/wordprocessingGroup" xmlns:wpi="http://schemas.microsoft.com/office/word/2010/wordprocessingInk" xmlns:wne="http://schemas.microsoft.com/office/word/2006/wordml" xmlns:wps="http://schemas.microsoft.com/office/word/2010/wordprocessingShape" mc:Ignorable="w14 w15 w16se w16cid wp14">
   <w:endnote w:type="separator" w:id="-1">
     <w:p>
       <w:pPr>
@@ -2455,7 +3086,7 @@
 </file>
 
 <file path=word/footer1.xml><?xml version="1.0" encoding="utf-8"?>
-<w:ftr xmlns:wpc="http://schemas.microsoft.com/office/word/2010/wordprocessingCanvas" xmlns:cx="http://schemas.microsoft.com/office/drawing/2014/chartex" xmlns:cx1="http://schemas.microsoft.com/office/drawing/2015/9/8/chartex" xmlns:cx2="http://schemas.microsoft.com/office/drawing/2015/10/21/chartex" xmlns:cx3="http://schemas.microsoft.com/office/drawing/2016/5/9/chartex" xmlns:cx4="http://schemas.microsoft.com/office/drawing/2016/5/10/chartex" xmlns:cx5="http://schemas.microsoft.com/office/drawing/2016/5/11/chartex" xmlns:cx6="http://schemas.microsoft.com/office/drawing/2016/5/12/chartex" xmlns:cx7="http://schemas.microsoft.com/office/drawing/2016/5/13/chartex" xmlns:cx8="http://schemas.microsoft.com/office/drawing/2016/5/14/chartex" xmlns:mc="http://schemas.openxmlformats.org/markup-compatibility/2006" xmlns:aink="http://schemas.microsoft.com/office/drawing/2016/ink" xmlns:am3d="http://schemas.microsoft.com/office/drawing/2017/model3d" xmlns:o="urn:schemas-microsoft-com:office:office" xmlns:oel="http://schemas.microsoft.com/office/2019/extlst" xmlns:r="http://schemas.openxmlformats.org/officeDocument/2006/relationships" xmlns:m="http://schemas.openxmlformats.org/officeDocument/2006/math" xmlns:v="urn:schemas-microsoft-com:vml" xmlns:wp14="http://schemas.microsoft.com/office/word/2010/wordprocessingDrawing" xmlns:wp="http://schemas.openxmlformats.org/drawingml/2006/wordprocessingDrawing" xmlns:w10="urn:schemas-microsoft-com:office:word" xmlns:w="http://schemas.openxmlformats.org/wordprocessingml/2006/main" xmlns:w14="http://schemas.microsoft.com/office/word/2010/wordml" xmlns:w15="http://schemas.microsoft.com/office/word/2012/wordml" xmlns:w16cex="http://schemas.microsoft.com/office/word/2018/wordml/cex" xmlns:w16cid="http://schemas.microsoft.com/office/word/2016/wordml/cid" xmlns:w16="http://schemas.microsoft.com/office/word/2018/wordml" xmlns:w16du="http://schemas.microsoft.com/office/word/2023/wordml/word16du" xmlns:w16sdtdh="http://schemas.microsoft.com/office/word/2020/wordml/sdtdatahash" xmlns:w16sdtfl="http://schemas.microsoft.com/office/word/2024/wordml/sdtformatlock" xmlns:w16se="http://schemas.microsoft.com/office/word/2015/wordml/symex" xmlns:wpg="http://schemas.microsoft.com/office/word/2010/wordprocessingGroup" xmlns:wpi="http://schemas.microsoft.com/office/word/2010/wordprocessingInk" xmlns:wne="http://schemas.microsoft.com/office/word/2006/wordml" xmlns:wps="http://schemas.microsoft.com/office/word/2010/wordprocessingShape" mc:Ignorable="w14 w15 w16se w16cid w16 w16cex w16sdtdh w16sdtfl w16du wp14">
+<w:ftr xmlns:wpc="http://schemas.microsoft.com/office/word/2010/wordprocessingCanvas" xmlns:cx="http://schemas.microsoft.com/office/drawing/2014/chartex" xmlns:cx1="http://schemas.microsoft.com/office/drawing/2015/9/8/chartex" xmlns:cx2="http://schemas.microsoft.com/office/drawing/2015/10/21/chartex" xmlns:cx3="http://schemas.microsoft.com/office/drawing/2016/5/9/chartex" xmlns:cx4="http://schemas.microsoft.com/office/drawing/2016/5/10/chartex" xmlns:cx5="http://schemas.microsoft.com/office/drawing/2016/5/11/chartex" xmlns:cx6="http://schemas.microsoft.com/office/drawing/2016/5/12/chartex" xmlns:cx7="http://schemas.microsoft.com/office/drawing/2016/5/13/chartex" xmlns:cx8="http://schemas.microsoft.com/office/drawing/2016/5/14/chartex" xmlns:mc="http://schemas.openxmlformats.org/markup-compatibility/2006" xmlns:aink="http://schemas.microsoft.com/office/drawing/2016/ink" xmlns:am3d="http://schemas.microsoft.com/office/drawing/2017/model3d" xmlns:o="urn:schemas-microsoft-com:office:office" xmlns:r="http://schemas.openxmlformats.org/officeDocument/2006/relationships" xmlns:m="http://schemas.openxmlformats.org/officeDocument/2006/math" xmlns:v="urn:schemas-microsoft-com:vml" xmlns:wp14="http://schemas.microsoft.com/office/word/2010/wordprocessingDrawing" xmlns:wp="http://schemas.openxmlformats.org/drawingml/2006/wordprocessingDrawing" xmlns:w10="urn:schemas-microsoft-com:office:word" xmlns:w="http://schemas.openxmlformats.org/wordprocessingml/2006/main" xmlns:w14="http://schemas.microsoft.com/office/word/2010/wordml" xmlns:w15="http://schemas.microsoft.com/office/word/2012/wordml" xmlns:w16cid="http://schemas.microsoft.com/office/word/2016/wordml/cid" xmlns:w16se="http://schemas.microsoft.com/office/word/2015/wordml/symex" xmlns:wpg="http://schemas.microsoft.com/office/word/2010/wordprocessingGroup" xmlns:wpi="http://schemas.microsoft.com/office/word/2010/wordprocessingInk" xmlns:wne="http://schemas.microsoft.com/office/word/2006/wordml" xmlns:wps="http://schemas.microsoft.com/office/word/2010/wordprocessingShape" mc:Ignorable="w14 w15 w16se w16cid wp14">
   <w:sdt>
     <w:sdtPr>
       <w:id w:val="-866069514"/>
@@ -2464,6 +3095,7 @@
         <w:docPartUnique/>
       </w:docPartObj>
     </w:sdtPr>
+    <w:sdtEndPr/>
     <w:sdtContent>
       <w:p>
         <w:pPr>
@@ -2500,7 +3132,7 @@
 </file>
 
 <file path=word/footnotes.xml><?xml version="1.0" encoding="utf-8"?>
-<w:footnotes xmlns:wpc="http://schemas.microsoft.com/office/word/2010/wordprocessingCanvas" xmlns:cx="http://schemas.microsoft.com/office/drawing/2014/chartex" xmlns:cx1="http://schemas.microsoft.com/office/drawing/2015/9/8/chartex" xmlns:cx2="http://schemas.microsoft.com/office/drawing/2015/10/21/chartex" xmlns:cx3="http://schemas.microsoft.com/office/drawing/2016/5/9/chartex" xmlns:cx4="http://schemas.microsoft.com/office/drawing/2016/5/10/chartex" xmlns:cx5="http://schemas.microsoft.com/office/drawing/2016/5/11/chartex" xmlns:cx6="http://schemas.microsoft.com/office/drawing/2016/5/12/chartex" xmlns:cx7="http://schemas.microsoft.com/office/drawing/2016/5/13/chartex" xmlns:cx8="http://schemas.microsoft.com/office/drawing/2016/5/14/chartex" xmlns:mc="http://schemas.openxmlformats.org/markup-compatibility/2006" xmlns:aink="http://schemas.microsoft.com/office/drawing/2016/ink" xmlns:am3d="http://schemas.microsoft.com/office/drawing/2017/model3d" xmlns:o="urn:schemas-microsoft-com:office:office" xmlns:oel="http://schemas.microsoft.com/office/2019/extlst" xmlns:r="http://schemas.openxmlformats.org/officeDocument/2006/relationships" xmlns:m="http://schemas.openxmlformats.org/officeDocument/2006/math" xmlns:v="urn:schemas-microsoft-com:vml" xmlns:wp14="http://schemas.microsoft.com/office/word/2010/wordprocessingDrawing" xmlns:wp="http://schemas.openxmlformats.org/drawingml/2006/wordprocessingDrawing" xmlns:w10="urn:schemas-microsoft-com:office:word" xmlns:w="http://schemas.openxmlformats.org/wordprocessingml/2006/main" xmlns:w14="http://schemas.microsoft.com/office/word/2010/wordml" xmlns:w15="http://schemas.microsoft.com/office/word/2012/wordml" xmlns:w16cex="http://schemas.microsoft.com/office/word/2018/wordml/cex" xmlns:w16cid="http://schemas.microsoft.com/office/word/2016/wordml/cid" xmlns:w16="http://schemas.microsoft.com/office/word/2018/wordml" xmlns:w16du="http://schemas.microsoft.com/office/word/2023/wordml/word16du" xmlns:w16sdtdh="http://schemas.microsoft.com/office/word/2020/wordml/sdtdatahash" xmlns:w16sdtfl="http://schemas.microsoft.com/office/word/2024/wordml/sdtformatlock" xmlns:w16se="http://schemas.microsoft.com/office/word/2015/wordml/symex" xmlns:wpg="http://schemas.microsoft.com/office/word/2010/wordprocessingGroup" xmlns:wpi="http://schemas.microsoft.com/office/word/2010/wordprocessingInk" xmlns:wne="http://schemas.microsoft.com/office/word/2006/wordml" xmlns:wps="http://schemas.microsoft.com/office/word/2010/wordprocessingShape" mc:Ignorable="w14 w15 w16se w16cid w16 w16cex w16sdtdh w16sdtfl w16du wp14">
+<w:footnotes xmlns:wpc="http://schemas.microsoft.com/office/word/2010/wordprocessingCanvas" xmlns:cx="http://schemas.microsoft.com/office/drawing/2014/chartex" xmlns:cx1="http://schemas.microsoft.com/office/drawing/2015/9/8/chartex" xmlns:cx2="http://schemas.microsoft.com/office/drawing/2015/10/21/chartex" xmlns:cx3="http://schemas.microsoft.com/office/drawing/2016/5/9/chartex" xmlns:cx4="http://schemas.microsoft.com/office/drawing/2016/5/10/chartex" xmlns:cx5="http://schemas.microsoft.com/office/drawing/2016/5/11/chartex" xmlns:cx6="http://schemas.microsoft.com/office/drawing/2016/5/12/chartex" xmlns:cx7="http://schemas.microsoft.com/office/drawing/2016/5/13/chartex" xmlns:cx8="http://schemas.microsoft.com/office/drawing/2016/5/14/chartex" xmlns:mc="http://schemas.openxmlformats.org/markup-compatibility/2006" xmlns:aink="http://schemas.microsoft.com/office/drawing/2016/ink" xmlns:am3d="http://schemas.microsoft.com/office/drawing/2017/model3d" xmlns:o="urn:schemas-microsoft-com:office:office" xmlns:r="http://schemas.openxmlformats.org/officeDocument/2006/relationships" xmlns:m="http://schemas.openxmlformats.org/officeDocument/2006/math" xmlns:v="urn:schemas-microsoft-com:vml" xmlns:wp14="http://schemas.microsoft.com/office/word/2010/wordprocessingDrawing" xmlns:wp="http://schemas.openxmlformats.org/drawingml/2006/wordprocessingDrawing" xmlns:w10="urn:schemas-microsoft-com:office:word" xmlns:w="http://schemas.openxmlformats.org/wordprocessingml/2006/main" xmlns:w14="http://schemas.microsoft.com/office/word/2010/wordml" xmlns:w15="http://schemas.microsoft.com/office/word/2012/wordml" xmlns:w16cid="http://schemas.microsoft.com/office/word/2016/wordml/cid" xmlns:w16se="http://schemas.microsoft.com/office/word/2015/wordml/symex" xmlns:wpg="http://schemas.microsoft.com/office/word/2010/wordprocessingGroup" xmlns:wpi="http://schemas.microsoft.com/office/word/2010/wordprocessingInk" xmlns:wne="http://schemas.microsoft.com/office/word/2006/wordml" xmlns:wps="http://schemas.microsoft.com/office/word/2010/wordprocessingShape" mc:Ignorable="w14 w15 w16se w16cid wp14">
   <w:footnote w:type="separator" w:id="-1">
     <w:p>
       <w:pPr>
@@ -2525,7 +3157,7 @@
 </file>
 
 <file path=word/numbering.xml><?xml version="1.0" encoding="utf-8"?>
-<w:numbering xmlns:wpc="http://schemas.microsoft.com/office/word/2010/wordprocessingCanvas" xmlns:cx="http://schemas.microsoft.com/office/drawing/2014/chartex" xmlns:cx1="http://schemas.microsoft.com/office/drawing/2015/9/8/chartex" xmlns:cx2="http://schemas.microsoft.com/office/drawing/2015/10/21/chartex" xmlns:cx3="http://schemas.microsoft.com/office/drawing/2016/5/9/chartex" xmlns:cx4="http://schemas.microsoft.com/office/drawing/2016/5/10/chartex" xmlns:cx5="http://schemas.microsoft.com/office/drawing/2016/5/11/chartex" xmlns:cx6="http://schemas.microsoft.com/office/drawing/2016/5/12/chartex" xmlns:cx7="http://schemas.microsoft.com/office/drawing/2016/5/13/chartex" xmlns:cx8="http://schemas.microsoft.com/office/drawing/2016/5/14/chartex" xmlns:mc="http://schemas.openxmlformats.org/markup-compatibility/2006" xmlns:aink="http://schemas.microsoft.com/office/drawing/2016/ink" xmlns:am3d="http://schemas.microsoft.com/office/drawing/2017/model3d" xmlns:o="urn:schemas-microsoft-com:office:office" xmlns:oel="http://schemas.microsoft.com/office/2019/extlst" xmlns:r="http://schemas.openxmlformats.org/officeDocument/2006/relationships" xmlns:m="http://schemas.openxmlformats.org/officeDocument/2006/math" xmlns:v="urn:schemas-microsoft-com:vml" xmlns:wp14="http://schemas.microsoft.com/office/word/2010/wordprocessingDrawing" xmlns:wp="http://schemas.openxmlformats.org/drawingml/2006/wordprocessingDrawing" xmlns:w10="urn:schemas-microsoft-com:office:word" xmlns:w="http://schemas.openxmlformats.org/wordprocessingml/2006/main" xmlns:w14="http://schemas.microsoft.com/office/word/2010/wordml" xmlns:w15="http://schemas.microsoft.com/office/word/2012/wordml" xmlns:w16cex="http://schemas.microsoft.com/office/word/2018/wordml/cex" xmlns:w16cid="http://schemas.microsoft.com/office/word/2016/wordml/cid" xmlns:w16="http://schemas.microsoft.com/office/word/2018/wordml" xmlns:w16du="http://schemas.microsoft.com/office/word/2023/wordml/word16du" xmlns:w16sdtdh="http://schemas.microsoft.com/office/word/2020/wordml/sdtdatahash" xmlns:w16sdtfl="http://schemas.microsoft.com/office/word/2024/wordml/sdtformatlock" xmlns:w16se="http://schemas.microsoft.com/office/word/2015/wordml/symex" xmlns:wpg="http://schemas.microsoft.com/office/word/2010/wordprocessingGroup" xmlns:wpi="http://schemas.microsoft.com/office/word/2010/wordprocessingInk" xmlns:wne="http://schemas.microsoft.com/office/word/2006/wordml" xmlns:wps="http://schemas.microsoft.com/office/word/2010/wordprocessingShape" mc:Ignorable="w14 w15 w16se w16cid w16 w16cex w16sdtdh w16sdtfl w16du wp14">
+<w:numbering xmlns:wpc="http://schemas.microsoft.com/office/word/2010/wordprocessingCanvas" xmlns:cx="http://schemas.microsoft.com/office/drawing/2014/chartex" xmlns:cx1="http://schemas.microsoft.com/office/drawing/2015/9/8/chartex" xmlns:cx2="http://schemas.microsoft.com/office/drawing/2015/10/21/chartex" xmlns:cx3="http://schemas.microsoft.com/office/drawing/2016/5/9/chartex" xmlns:cx4="http://schemas.microsoft.com/office/drawing/2016/5/10/chartex" xmlns:cx5="http://schemas.microsoft.com/office/drawing/2016/5/11/chartex" xmlns:cx6="http://schemas.microsoft.com/office/drawing/2016/5/12/chartex" xmlns:cx7="http://schemas.microsoft.com/office/drawing/2016/5/13/chartex" xmlns:cx8="http://schemas.microsoft.com/office/drawing/2016/5/14/chartex" xmlns:mc="http://schemas.openxmlformats.org/markup-compatibility/2006" xmlns:aink="http://schemas.microsoft.com/office/drawing/2016/ink" xmlns:am3d="http://schemas.microsoft.com/office/drawing/2017/model3d" xmlns:o="urn:schemas-microsoft-com:office:office" xmlns:r="http://schemas.openxmlformats.org/officeDocument/2006/relationships" xmlns:m="http://schemas.openxmlformats.org/officeDocument/2006/math" xmlns:v="urn:schemas-microsoft-com:vml" xmlns:wp14="http://schemas.microsoft.com/office/word/2010/wordprocessingDrawing" xmlns:wp="http://schemas.openxmlformats.org/drawingml/2006/wordprocessingDrawing" xmlns:w10="urn:schemas-microsoft-com:office:word" xmlns:w="http://schemas.openxmlformats.org/wordprocessingml/2006/main" xmlns:w14="http://schemas.microsoft.com/office/word/2010/wordml" xmlns:w15="http://schemas.microsoft.com/office/word/2012/wordml" xmlns:w16cid="http://schemas.microsoft.com/office/word/2016/wordml/cid" xmlns:w16se="http://schemas.microsoft.com/office/word/2015/wordml/symex" xmlns:wpg="http://schemas.microsoft.com/office/word/2010/wordprocessingGroup" xmlns:wpi="http://schemas.microsoft.com/office/word/2010/wordprocessingInk" xmlns:wne="http://schemas.microsoft.com/office/word/2006/wordml" xmlns:wps="http://schemas.microsoft.com/office/word/2010/wordprocessingShape" mc:Ignorable="w14 w15 w16se w16cid wp14">
   <w:abstractNum w:abstractNumId="0" w15:restartNumberingAfterBreak="0">
     <w:nsid w:val="1B5D7A44"/>
     <w:multiLevelType w:val="multilevel"/>
@@ -3824,41 +4456,41 @@
       </w:rPr>
     </w:lvl>
   </w:abstractNum>
-  <w:num w:numId="1" w16cid:durableId="1750149517">
+  <w:num w:numId="1">
     <w:abstractNumId w:val="2"/>
   </w:num>
-  <w:num w:numId="2" w16cid:durableId="310133458">
+  <w:num w:numId="2">
     <w:abstractNumId w:val="5"/>
   </w:num>
-  <w:num w:numId="3" w16cid:durableId="409236569">
+  <w:num w:numId="3">
     <w:abstractNumId w:val="9"/>
   </w:num>
-  <w:num w:numId="4" w16cid:durableId="1860389145">
+  <w:num w:numId="4">
     <w:abstractNumId w:val="3"/>
   </w:num>
-  <w:num w:numId="5" w16cid:durableId="1790509833">
+  <w:num w:numId="5">
     <w:abstractNumId w:val="8"/>
   </w:num>
-  <w:num w:numId="6" w16cid:durableId="974599377">
+  <w:num w:numId="6">
     <w:abstractNumId w:val="4"/>
   </w:num>
-  <w:num w:numId="7" w16cid:durableId="1130050924">
+  <w:num w:numId="7">
     <w:abstractNumId w:val="7"/>
   </w:num>
-  <w:num w:numId="8" w16cid:durableId="238633383">
+  <w:num w:numId="8">
     <w:abstractNumId w:val="0"/>
   </w:num>
-  <w:num w:numId="9" w16cid:durableId="707409402">
+  <w:num w:numId="9">
     <w:abstractNumId w:val="1"/>
   </w:num>
-  <w:num w:numId="10" w16cid:durableId="744650464">
+  <w:num w:numId="10">
     <w:abstractNumId w:val="6"/>
   </w:num>
 </w:numbering>
 </file>
 
 <file path=word/styles.xml><?xml version="1.0" encoding="utf-8"?>
-<w:styles xmlns:mc="http://schemas.openxmlformats.org/markup-compatibility/2006" xmlns:r="http://schemas.openxmlformats.org/officeDocument/2006/relationships" xmlns:w="http://schemas.openxmlformats.org/wordprocessingml/2006/main" xmlns:w14="http://schemas.microsoft.com/office/word/2010/wordml" xmlns:w15="http://schemas.microsoft.com/office/word/2012/wordml" xmlns:w16cex="http://schemas.microsoft.com/office/word/2018/wordml/cex" xmlns:w16cid="http://schemas.microsoft.com/office/word/2016/wordml/cid" xmlns:w16="http://schemas.microsoft.com/office/word/2018/wordml" xmlns:w16du="http://schemas.microsoft.com/office/word/2023/wordml/word16du" xmlns:w16sdtdh="http://schemas.microsoft.com/office/word/2020/wordml/sdtdatahash" xmlns:w16sdtfl="http://schemas.microsoft.com/office/word/2024/wordml/sdtformatlock" xmlns:w16se="http://schemas.microsoft.com/office/word/2015/wordml/symex" mc:Ignorable="w14 w15 w16se w16cid w16 w16cex w16sdtdh w16sdtfl w16du">
+<w:styles xmlns:mc="http://schemas.openxmlformats.org/markup-compatibility/2006" xmlns:r="http://schemas.openxmlformats.org/officeDocument/2006/relationships" xmlns:w="http://schemas.openxmlformats.org/wordprocessingml/2006/main" xmlns:w14="http://schemas.microsoft.com/office/word/2010/wordml" xmlns:w15="http://schemas.microsoft.com/office/word/2012/wordml" xmlns:w16cid="http://schemas.microsoft.com/office/word/2016/wordml/cid" xmlns:w16se="http://schemas.microsoft.com/office/word/2015/wordml/symex" mc:Ignorable="w14 w15 w16se w16cid">
   <w:docDefaults>
     <w:rPrDefault>
       <w:rPr>
@@ -3876,7 +4508,7 @@
       </w:pPr>
     </w:pPrDefault>
   </w:docDefaults>
-  <w:latentStyles w:defLockedState="0" w:defUIPriority="99" w:defSemiHidden="0" w:defUnhideWhenUsed="0" w:defQFormat="0" w:count="376">
+  <w:latentStyles w:defLockedState="0" w:defUIPriority="99" w:defSemiHidden="0" w:defUnhideWhenUsed="0" w:defQFormat="0" w:count="375">
     <w:lsdException w:name="Normal" w:uiPriority="0" w:qFormat="1"/>
     <w:lsdException w:name="heading 1" w:uiPriority="9" w:qFormat="1"/>
     <w:lsdException w:name="heading 2" w:semiHidden="1" w:uiPriority="9" w:unhideWhenUsed="1" w:qFormat="1"/>
@@ -4252,7 +4884,6 @@
     <w:lsdException w:name="Smart Hyperlink" w:semiHidden="1" w:unhideWhenUsed="1"/>
     <w:lsdException w:name="Hashtag" w:semiHidden="1" w:unhideWhenUsed="1"/>
     <w:lsdException w:name="Unresolved Mention" w:semiHidden="1" w:unhideWhenUsed="1"/>
-    <w:lsdException w:name="Smart Link" w:semiHidden="1" w:unhideWhenUsed="1"/>
   </w:latentStyles>
   <w:style w:type="paragraph" w:default="1" w:styleId="Normal">
     <w:name w:val="Normal"/>
@@ -4459,6 +5090,7 @@
   <w:style w:type="character" w:default="1" w:styleId="Policepardfaut">
     <w:name w:val="Default Paragraph Font"/>
     <w:uiPriority w:val="1"/>
+    <w:semiHidden/>
     <w:unhideWhenUsed/>
   </w:style>
   <w:style w:type="table" w:default="1" w:styleId="TableauNormal">
@@ -4771,7 +5403,7 @@
       <w:spacing w:val="5"/>
     </w:rPr>
   </w:style>
-  <w:style w:type="character" w:styleId="Hyperlien">
+  <w:style w:type="character" w:styleId="Lienhypertexte">
     <w:name w:val="Hyperlink"/>
     <w:basedOn w:val="Policepardfaut"/>
     <w:uiPriority w:val="99"/>
@@ -4794,7 +5426,7 @@
       <w:shd w:val="clear" w:color="auto" w:fill="E1DFDD"/>
     </w:rPr>
   </w:style>
-  <w:style w:type="character" w:styleId="Lienvisit">
+  <w:style w:type="character" w:styleId="Lienhypertextesuivivisit">
     <w:name w:val="FollowedHyperlink"/>
     <w:basedOn w:val="Policepardfaut"/>
     <w:uiPriority w:val="99"/>
@@ -5863,7 +6495,7 @@
 </file>
 
 <file path=customXml/itemProps1.xml><?xml version="1.0" encoding="utf-8"?>
-<ds:datastoreItem xmlns:ds="http://schemas.openxmlformats.org/officeDocument/2006/customXml" ds:itemID="{5FAD8989-FB71-418F-BEFA-13BC3C329AC0}">
+<ds:datastoreItem xmlns:ds="http://schemas.openxmlformats.org/officeDocument/2006/customXml" ds:itemID="{3C52C805-D776-4BB8-93AB-AFB28DD375CA}">
   <ds:schemaRefs>
     <ds:schemaRef ds:uri="http://schemas.openxmlformats.org/officeDocument/2006/bibliography"/>
   </ds:schemaRefs>

</xml_diff>

<commit_message>
fixed bug de fin de partie trop tot
</commit_message>
<xml_diff>
--- a/brouillon-veille/Brouillon_Projet_3.docx
+++ b/brouillon-veille/Brouillon_Projet_3.docx
@@ -1,6 +1,6 @@
 
 <file path=word/document.xml><?xml version="1.0" encoding="utf-8"?>
-<w:document xmlns:wpc="http://schemas.microsoft.com/office/word/2010/wordprocessingCanvas" xmlns:cx="http://schemas.microsoft.com/office/drawing/2014/chartex" xmlns:cx1="http://schemas.microsoft.com/office/drawing/2015/9/8/chartex" xmlns:cx2="http://schemas.microsoft.com/office/drawing/2015/10/21/chartex" xmlns:cx3="http://schemas.microsoft.com/office/drawing/2016/5/9/chartex" xmlns:cx4="http://schemas.microsoft.com/office/drawing/2016/5/10/chartex" xmlns:cx5="http://schemas.microsoft.com/office/drawing/2016/5/11/chartex" xmlns:cx6="http://schemas.microsoft.com/office/drawing/2016/5/12/chartex" xmlns:cx7="http://schemas.microsoft.com/office/drawing/2016/5/13/chartex" xmlns:cx8="http://schemas.microsoft.com/office/drawing/2016/5/14/chartex" xmlns:mc="http://schemas.openxmlformats.org/markup-compatibility/2006" xmlns:aink="http://schemas.microsoft.com/office/drawing/2016/ink" xmlns:am3d="http://schemas.microsoft.com/office/drawing/2017/model3d" xmlns:o="urn:schemas-microsoft-com:office:office" xmlns:r="http://schemas.openxmlformats.org/officeDocument/2006/relationships" xmlns:m="http://schemas.openxmlformats.org/officeDocument/2006/math" xmlns:v="urn:schemas-microsoft-com:vml" xmlns:wp14="http://schemas.microsoft.com/office/word/2010/wordprocessingDrawing" xmlns:wp="http://schemas.openxmlformats.org/drawingml/2006/wordprocessingDrawing" xmlns:w10="urn:schemas-microsoft-com:office:word" xmlns:w="http://schemas.openxmlformats.org/wordprocessingml/2006/main" xmlns:w14="http://schemas.microsoft.com/office/word/2010/wordml" xmlns:w15="http://schemas.microsoft.com/office/word/2012/wordml" xmlns:w16cid="http://schemas.microsoft.com/office/word/2016/wordml/cid" xmlns:w16se="http://schemas.microsoft.com/office/word/2015/wordml/symex" xmlns:wpg="http://schemas.microsoft.com/office/word/2010/wordprocessingGroup" xmlns:wpi="http://schemas.microsoft.com/office/word/2010/wordprocessingInk" xmlns:wne="http://schemas.microsoft.com/office/word/2006/wordml" xmlns:wps="http://schemas.microsoft.com/office/word/2010/wordprocessingShape" mc:Ignorable="w14 w15 w16se w16cid wp14">
+<w:document xmlns:wpc="http://schemas.microsoft.com/office/word/2010/wordprocessingCanvas" xmlns:cx="http://schemas.microsoft.com/office/drawing/2014/chartex" xmlns:cx1="http://schemas.microsoft.com/office/drawing/2015/9/8/chartex" xmlns:cx2="http://schemas.microsoft.com/office/drawing/2015/10/21/chartex" xmlns:cx3="http://schemas.microsoft.com/office/drawing/2016/5/9/chartex" xmlns:cx4="http://schemas.microsoft.com/office/drawing/2016/5/10/chartex" xmlns:cx5="http://schemas.microsoft.com/office/drawing/2016/5/11/chartex" xmlns:cx6="http://schemas.microsoft.com/office/drawing/2016/5/12/chartex" xmlns:cx7="http://schemas.microsoft.com/office/drawing/2016/5/13/chartex" xmlns:cx8="http://schemas.microsoft.com/office/drawing/2016/5/14/chartex" xmlns:mc="http://schemas.openxmlformats.org/markup-compatibility/2006" xmlns:aink="http://schemas.microsoft.com/office/drawing/2016/ink" xmlns:am3d="http://schemas.microsoft.com/office/drawing/2017/model3d" xmlns:o="urn:schemas-microsoft-com:office:office" xmlns:oel="http://schemas.microsoft.com/office/2019/extlst" xmlns:r="http://schemas.openxmlformats.org/officeDocument/2006/relationships" xmlns:m="http://schemas.openxmlformats.org/officeDocument/2006/math" xmlns:v="urn:schemas-microsoft-com:vml" xmlns:wp14="http://schemas.microsoft.com/office/word/2010/wordprocessingDrawing" xmlns:wp="http://schemas.openxmlformats.org/drawingml/2006/wordprocessingDrawing" xmlns:w10="urn:schemas-microsoft-com:office:word" xmlns:w="http://schemas.openxmlformats.org/wordprocessingml/2006/main" xmlns:w14="http://schemas.microsoft.com/office/word/2010/wordml" xmlns:w15="http://schemas.microsoft.com/office/word/2012/wordml" xmlns:w16cex="http://schemas.microsoft.com/office/word/2018/wordml/cex" xmlns:w16cid="http://schemas.microsoft.com/office/word/2016/wordml/cid" xmlns:w16="http://schemas.microsoft.com/office/word/2018/wordml" xmlns:w16du="http://schemas.microsoft.com/office/word/2023/wordml/word16du" xmlns:w16sdtdh="http://schemas.microsoft.com/office/word/2020/wordml/sdtdatahash" xmlns:w16sdtfl="http://schemas.microsoft.com/office/word/2024/wordml/sdtformatlock" xmlns:w16se="http://schemas.microsoft.com/office/word/2015/wordml/symex" xmlns:wpg="http://schemas.microsoft.com/office/word/2010/wordprocessingGroup" xmlns:wpi="http://schemas.microsoft.com/office/word/2010/wordprocessingInk" xmlns:wne="http://schemas.microsoft.com/office/word/2006/wordml" xmlns:wps="http://schemas.microsoft.com/office/word/2010/wordprocessingShape" mc:Ignorable="w14 w15 w16se w16cid w16 w16cex w16sdtdh w16sdtfl w16du wp14">
   <w:body>
     <w:p>
       <w:pPr>
@@ -36,7 +36,6 @@
               <w:showingPlcHdr/>
               <w:bibliography/>
             </w:sdtPr>
-            <w:sdtEndPr/>
             <w:sdtContent>
               <w:r>
                 <w:rPr>
@@ -177,27 +176,13 @@
         <w:rPr>
           <w:rFonts w:ascii="Times New Roman" w:hAnsi="Times New Roman" w:cs="Times New Roman"/>
         </w:rPr>
-        <w:t xml:space="preserve">DUPRAS </w:t>
-      </w:r>
-      <w:proofErr w:type="gramStart"/>
-      <w:r>
-        <w:rPr>
-          <w:rFonts w:ascii="Times New Roman" w:hAnsi="Times New Roman" w:cs="Times New Roman"/>
-        </w:rPr>
-        <w:t>•</w:t>
-      </w:r>
-      <w:r>
-        <w:rPr>
-          <w:rFonts w:ascii="Times New Roman" w:hAnsi="Times New Roman" w:cs="Times New Roman"/>
-        </w:rPr>
-        <w:t xml:space="preserve">  Eddy</w:t>
-      </w:r>
-      <w:proofErr w:type="gramEnd"/>
-      <w:r>
-        <w:rPr>
-          <w:rFonts w:ascii="Times New Roman" w:hAnsi="Times New Roman" w:cs="Times New Roman"/>
-        </w:rPr>
-        <w:t xml:space="preserve"> HUART</w:t>
+        <w:t>DUPRAS •</w:t>
+      </w:r>
+      <w:r>
+        <w:rPr>
+          <w:rFonts w:ascii="Times New Roman" w:hAnsi="Times New Roman" w:cs="Times New Roman"/>
+        </w:rPr>
+        <w:t xml:space="preserve">  Eddy HUART</w:t>
       </w:r>
     </w:p>
     <w:p>
@@ -331,19 +316,29 @@
           <w:rFonts w:ascii="Times New Roman" w:hAnsi="Times New Roman" w:cs="Times New Roman"/>
         </w:rPr>
       </w:pPr>
-      <w:proofErr w:type="gramStart"/>
-      <w:r>
-        <w:rPr>
-          <w:rFonts w:ascii="Times New Roman" w:hAnsi="Times New Roman" w:cs="Times New Roman"/>
-        </w:rPr>
-        <w:t>lundi</w:t>
-      </w:r>
-      <w:proofErr w:type="gramEnd"/>
-      <w:r>
-        <w:rPr>
-          <w:rFonts w:ascii="Times New Roman" w:hAnsi="Times New Roman" w:cs="Times New Roman"/>
-        </w:rPr>
-        <w:t>, 4 mai 2026</w:t>
+      <w:r>
+        <w:rPr>
+          <w:rFonts w:ascii="Times New Roman" w:hAnsi="Times New Roman" w:cs="Times New Roman"/>
+        </w:rPr>
+        <w:t>L</w:t>
+      </w:r>
+      <w:r>
+        <w:rPr>
+          <w:rFonts w:ascii="Times New Roman" w:hAnsi="Times New Roman" w:cs="Times New Roman"/>
+        </w:rPr>
+        <w:t xml:space="preserve">undi, </w:t>
+      </w:r>
+      <w:r>
+        <w:rPr>
+          <w:rFonts w:ascii="Times New Roman" w:hAnsi="Times New Roman" w:cs="Times New Roman"/>
+        </w:rPr>
+        <w:t xml:space="preserve">le </w:t>
+      </w:r>
+      <w:r>
+        <w:rPr>
+          <w:rFonts w:ascii="Times New Roman" w:hAnsi="Times New Roman" w:cs="Times New Roman"/>
+        </w:rPr>
+        <w:t>4 mai 2026</w:t>
       </w:r>
     </w:p>
     <w:p>
@@ -566,7 +561,6 @@
           <w:id w:val="-1622836471"/>
           <w:citation/>
         </w:sdtPr>
-        <w:sdtEndPr/>
         <w:sdtContent>
           <w:r>
             <w:fldChar w:fldCharType="begin"/>
@@ -698,24 +692,14 @@
                             <w:r>
                               <w:t xml:space="preserve">Figure </w:t>
                             </w:r>
-                            <w:r>
-                              <w:fldChar w:fldCharType="begin"/>
-                            </w:r>
-                            <w:r>
-                              <w:instrText xml:space="preserve"> SEQ Figure \* ARABIC </w:instrText>
-                            </w:r>
-                            <w:r>
-                              <w:fldChar w:fldCharType="separate"/>
-                            </w:r>
-                            <w:r>
-                              <w:rPr>
-                                <w:noProof/>
-                              </w:rPr>
-                              <w:t>1</w:t>
-                            </w:r>
-                            <w:r>
-                              <w:fldChar w:fldCharType="end"/>
-                            </w:r>
+                            <w:fldSimple w:instr=" SEQ Figure \* ARABIC ">
+                              <w:r>
+                                <w:rPr>
+                                  <w:noProof/>
+                                </w:rPr>
+                                <w:t>1</w:t>
+                              </w:r>
+                            </w:fldSimple>
                             <w:r>
                               <w:t xml:space="preserve"> : 3 déterminisations différentes d’une main adverse selon les belief states de l’algorithme </w:t>
                             </w:r>
@@ -766,7 +750,7 @@
                 <v:stroke joinstyle="miter"/>
                 <v:path gradientshapeok="t" o:connecttype="rect"/>
               </v:shapetype>
-              <v:shape id="Zone de texte 9" o:spid="_x0000_s1026" type="#_x0000_t202" style="position:absolute;margin-left:53.25pt;margin-top:221.2pt;width:324.75pt;height:.05pt;z-index:251662336;visibility:visible;mso-wrap-style:square;mso-wrap-distance-left:9pt;mso-wrap-distance-top:0;mso-wrap-distance-right:9pt;mso-wrap-distance-bottom:0;mso-position-horizontal:absolute;mso-position-horizontal-relative:text;mso-position-vertical:absolute;mso-position-vertical-relative:text;v-text-anchor:top" o:gfxdata="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" stroked="f">
+              <v:shape id="Zone de texte 9" o:spid="_x0000_s1026" type="#_x0000_t202" style="position:absolute;margin-left:53.25pt;margin-top:221.2pt;width:324.75pt;height:.05pt;z-index:251662336;visibility:visible;mso-wrap-style:square;mso-wrap-distance-left:9pt;mso-wrap-distance-top:0;mso-wrap-distance-right:9pt;mso-wrap-distance-bottom:0;mso-position-horizontal:absolute;mso-position-horizontal-relative:text;mso-position-vertical:absolute;mso-position-vertical-relative:text;v-text-anchor:top" o:gfxdata="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" stroked="f">
                 <v:textbox style="mso-fit-shape-to-text:t" inset="0,0,0,0">
                   <w:txbxContent>
                     <w:p>
@@ -783,24 +767,14 @@
                       <w:r>
                         <w:t xml:space="preserve">Figure </w:t>
                       </w:r>
-                      <w:r>
-                        <w:fldChar w:fldCharType="begin"/>
-                      </w:r>
-                      <w:r>
-                        <w:instrText xml:space="preserve"> SEQ Figure \* ARABIC </w:instrText>
-                      </w:r>
-                      <w:r>
-                        <w:fldChar w:fldCharType="separate"/>
-                      </w:r>
-                      <w:r>
-                        <w:rPr>
-                          <w:noProof/>
-                        </w:rPr>
-                        <w:t>1</w:t>
-                      </w:r>
-                      <w:r>
-                        <w:fldChar w:fldCharType="end"/>
-                      </w:r>
+                      <w:fldSimple w:instr=" SEQ Figure \* ARABIC ">
+                        <w:r>
+                          <w:rPr>
+                            <w:noProof/>
+                          </w:rPr>
+                          <w:t>1</w:t>
+                        </w:r>
+                      </w:fldSimple>
                       <w:r>
                         <w:t xml:space="preserve"> : 3 déterminisations différentes d’une main adverse selon les belief states de l’algorithme </w:t>
                       </w:r>
@@ -1223,8 +1197,6 @@
           <w14:ligatures w14:val="none"/>
         </w:rPr>
       </w:pPr>
-      <w:bookmarkStart w:id="1" w:name="_GoBack"/>
-      <w:bookmarkEnd w:id="1"/>
     </w:p>
     <w:p>
       <w:pPr>
@@ -1441,7 +1413,6 @@
           <w:id w:val="-485709115"/>
           <w:citation/>
         </w:sdtPr>
-        <w:sdtEndPr/>
         <w:sdtContent>
           <w:r>
             <w:rPr>
@@ -1713,47 +1684,7 @@
           <w:sz w:val="24"/>
           <w:szCs w:val="24"/>
         </w:rPr>
-        <w:t xml:space="preserve"> De son côté, le MCTS reste une approche reconnue dans l’intelligence artificielle des jeux, mais son intérêt tient aussi à sa mise en œuvre pratique : dans L’Attaque, son implémentation en Python permet de structurer plus clairement la logique de recherche, de tester plus facilement les simulations et d’ajuster l’algorithme au comportement du jeu. On peut ainsi comparer </w:t>
-      </w:r>
-      <w:proofErr w:type="spellStart"/>
-      <w:r>
-        <w:rPr>
-          <w:rFonts w:ascii="Times New Roman" w:eastAsiaTheme="minorHAnsi" w:hAnsi="Times New Roman" w:cs="Times New Roman"/>
-          <w:color w:val="auto"/>
-          <w:sz w:val="24"/>
-          <w:szCs w:val="24"/>
-        </w:rPr>
-        <w:t>React</w:t>
-      </w:r>
-      <w:proofErr w:type="spellEnd"/>
-      <w:r>
-        <w:rPr>
-          <w:rFonts w:ascii="Times New Roman" w:eastAsiaTheme="minorHAnsi" w:hAnsi="Times New Roman" w:cs="Times New Roman"/>
-          <w:color w:val="auto"/>
-          <w:sz w:val="24"/>
-          <w:szCs w:val="24"/>
-        </w:rPr>
-        <w:t xml:space="preserve"> à </w:t>
-      </w:r>
-      <w:proofErr w:type="spellStart"/>
-      <w:r>
-        <w:rPr>
-          <w:rFonts w:ascii="Times New Roman" w:eastAsiaTheme="minorHAnsi" w:hAnsi="Times New Roman" w:cs="Times New Roman"/>
-          <w:color w:val="auto"/>
-          <w:sz w:val="24"/>
-          <w:szCs w:val="24"/>
-        </w:rPr>
-        <w:t>Angular</w:t>
-      </w:r>
-      <w:proofErr w:type="spellEnd"/>
-      <w:r>
-        <w:rPr>
-          <w:rFonts w:ascii="Times New Roman" w:eastAsiaTheme="minorHAnsi" w:hAnsi="Times New Roman" w:cs="Times New Roman"/>
-          <w:color w:val="auto"/>
-          <w:sz w:val="24"/>
-          <w:szCs w:val="24"/>
-        </w:rPr>
-        <w:t xml:space="preserve"> ou à Vue pour l’interface</w:t>
+        <w:t xml:space="preserve"> De son côté, le MCTS reste une approche reconnue dans l’intelligence artificielle des jeux, mais son intérêt tient aussi à sa mise en œuvre pratique : dans L’Attaque, son implémentation en Python permet de structurer plus clairement la logique de recherche, de tester plus facilement les simulations et d’ajuster l’algorithme au comportement du jeu. On peut ainsi comparer React à Angular ou à Vue pour l’interface</w:t>
       </w:r>
       <w:r>
         <w:rPr>
@@ -1775,7 +1706,6 @@
           <w:id w:val="1017890882"/>
           <w:citation/>
         </w:sdtPr>
-        <w:sdtEndPr/>
         <w:sdtContent>
           <w:r>
             <w:rPr>
@@ -1978,7 +1908,7 @@
               </wp:inline>
             </w:drawing>
           </mc:Choice>
-          <mc:Fallback xmlns:w16sdtfl="http://schemas.microsoft.com/office/word/2024/wordml/sdtformatlock" xmlns:w16sdtdh="http://schemas.microsoft.com/office/word/2020/wordml/sdtdatahash" xmlns:w16du="http://schemas.microsoft.com/office/word/2023/wordml/word16du" xmlns:w16="http://schemas.microsoft.com/office/word/2018/wordml" xmlns:w16cex="http://schemas.microsoft.com/office/word/2018/wordml/cex" xmlns:oel="http://schemas.microsoft.com/office/2019/extlst">
+          <mc:Fallback>
             <w:pict>
               <v:rect w14:anchorId="26949FDD" id="Rectangle 3" o:spid="_x0000_s1026" alt="Image description" style="width:24pt;height:24pt;visibility:visible;mso-wrap-style:square;mso-left-percent:-10001;mso-top-percent:-10001;mso-position-horizontal:absolute;mso-position-horizontal-relative:char;mso-position-vertical:absolute;mso-position-vertical-relative:line;mso-left-percent:-10001;mso-top-percent:-10001;v-text-anchor:top" o:gfxdata="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" filled="f" stroked="f">
                 <o:lock v:ext="edit" aspectratio="t"/>
@@ -2260,7 +2190,6 @@
             <w:id w:val="1336738728"/>
             <w:bibliography/>
           </w:sdtPr>
-          <w:sdtEndPr/>
           <w:sdtContent>
             <w:p>
               <w:pPr>
@@ -2587,6 +2516,7 @@
                   <w:noProof/>
                   <w:lang w:val="en-CA"/>
                 </w:rPr>
+                <w:lastRenderedPageBreak/>
                 <w:t xml:space="preserve">freecodecamp.org. (2026, 03 27). </w:t>
               </w:r>
               <w:r>
@@ -2626,7 +2556,6 @@
                   <w:noProof/>
                   <w:lang w:val="en-CA"/>
                 </w:rPr>
-                <w:lastRenderedPageBreak/>
                 <w:t xml:space="preserve">Geeks, G. f. (2026, 01 30). </w:t>
               </w:r>
               <w:r>
@@ -3008,25 +2937,63 @@
                 <w:ind w:left="720" w:hanging="720"/>
                 <w:rPr>
                   <w:noProof/>
+                  <w:lang w:val="en-CA"/>
                 </w:rPr>
               </w:pPr>
               <w:r>
                 <w:rPr>
                   <w:noProof/>
-                </w:rPr>
-                <w:t xml:space="preserve">w3schools. (2026, 01 30). </w:t>
+                  <w:lang w:val="en-CA"/>
+                </w:rPr>
+                <w:lastRenderedPageBreak/>
+                <w:t xml:space="preserve">Vodopivec, T., Samothrakis, S., &amp; Ster, B. (2017). On Monte Carlo Tree Search and Reinforcement Learning. </w:t>
               </w:r>
               <w:r>
                 <w:rPr>
                   <w:i/>
                   <w:iCs/>
                   <w:noProof/>
+                  <w:lang w:val="en-CA"/>
+                </w:rPr>
+                <w:t>Journal of Artificial Intelligence Research</w:t>
+              </w:r>
+              <w:r>
+                <w:rPr>
+                  <w:noProof/>
+                  <w:lang w:val="en-CA"/>
+                </w:rPr>
+                <w:t>, 881-936.</w:t>
+              </w:r>
+            </w:p>
+            <w:p>
+              <w:pPr>
+                <w:pStyle w:val="Bibliographie"/>
+                <w:ind w:left="720" w:hanging="720"/>
+                <w:rPr>
+                  <w:noProof/>
+                  <w:lang w:val="en-CA"/>
+                </w:rPr>
+              </w:pPr>
+              <w:r>
+                <w:rPr>
+                  <w:noProof/>
+                  <w:lang w:val="en-CA"/>
+                </w:rPr>
+                <w:t xml:space="preserve">w3schools. (2026, 01 30). </w:t>
+              </w:r>
+              <w:r>
+                <w:rPr>
+                  <w:i/>
+                  <w:iCs/>
+                  <w:noProof/>
+                  <w:lang w:val="en-CA"/>
                 </w:rPr>
                 <w:t>React Tutorial</w:t>
               </w:r>
               <w:r>
                 <w:rPr>
                   <w:noProof/>
+                  <w:lang w:val="en-CA"/>
                 </w:rPr>
                 <w:t>. Récupéré sur https://www.w3schools.com/REACT/default.asp.</w:t>
               </w:r>
@@ -3061,7 +3028,7 @@
 </file>
 
 <file path=word/endnotes.xml><?xml version="1.0" encoding="utf-8"?>
-<w:endnotes xmlns:wpc="http://schemas.microsoft.com/office/word/2010/wordprocessingCanvas" xmlns:cx="http://schemas.microsoft.com/office/drawing/2014/chartex" xmlns:cx1="http://schemas.microsoft.com/office/drawing/2015/9/8/chartex" xmlns:cx2="http://schemas.microsoft.com/office/drawing/2015/10/21/chartex" xmlns:cx3="http://schemas.microsoft.com/office/drawing/2016/5/9/chartex" xmlns:cx4="http://schemas.microsoft.com/office/drawing/2016/5/10/chartex" xmlns:cx5="http://schemas.microsoft.com/office/drawing/2016/5/11/chartex" xmlns:cx6="http://schemas.microsoft.com/office/drawing/2016/5/12/chartex" xmlns:cx7="http://schemas.microsoft.com/office/drawing/2016/5/13/chartex" xmlns:cx8="http://schemas.microsoft.com/office/drawing/2016/5/14/chartex" xmlns:mc="http://schemas.openxmlformats.org/markup-compatibility/2006" xmlns:aink="http://schemas.microsoft.com/office/drawing/2016/ink" xmlns:am3d="http://schemas.microsoft.com/office/drawing/2017/model3d" xmlns:o="urn:schemas-microsoft-com:office:office" xmlns:r="http://schemas.openxmlformats.org/officeDocument/2006/relationships" xmlns:m="http://schemas.openxmlformats.org/officeDocument/2006/math" xmlns:v="urn:schemas-microsoft-com:vml" xmlns:wp14="http://schemas.microsoft.com/office/word/2010/wordprocessingDrawing" xmlns:wp="http://schemas.openxmlformats.org/drawingml/2006/wordprocessingDrawing" xmlns:w10="urn:schemas-microsoft-com:office:word" xmlns:w="http://schemas.openxmlformats.org/wordprocessingml/2006/main" xmlns:w14="http://schemas.microsoft.com/office/word/2010/wordml" xmlns:w15="http://schemas.microsoft.com/office/word/2012/wordml" xmlns:w16cid="http://schemas.microsoft.com/office/word/2016/wordml/cid" xmlns:w16se="http://schemas.microsoft.com/office/word/2015/wordml/symex" xmlns:wpg="http://schemas.microsoft.com/office/word/2010/wordprocessingGroup" xmlns:wpi="http://schemas.microsoft.com/office/word/2010/wordprocessingInk" xmlns:wne="http://schemas.microsoft.com/office/word/2006/wordml" xmlns:wps="http://schemas.microsoft.com/office/word/2010/wordprocessingShape" mc:Ignorable="w14 w15 w16se w16cid wp14">
+<w:endnotes xmlns:wpc="http://schemas.microsoft.com/office/word/2010/wordprocessingCanvas" xmlns:cx="http://schemas.microsoft.com/office/drawing/2014/chartex" xmlns:cx1="http://schemas.microsoft.com/office/drawing/2015/9/8/chartex" xmlns:cx2="http://schemas.microsoft.com/office/drawing/2015/10/21/chartex" xmlns:cx3="http://schemas.microsoft.com/office/drawing/2016/5/9/chartex" xmlns:cx4="http://schemas.microsoft.com/office/drawing/2016/5/10/chartex" xmlns:cx5="http://schemas.microsoft.com/office/drawing/2016/5/11/chartex" xmlns:cx6="http://schemas.microsoft.com/office/drawing/2016/5/12/chartex" xmlns:cx7="http://schemas.microsoft.com/office/drawing/2016/5/13/chartex" xmlns:cx8="http://schemas.microsoft.com/office/drawing/2016/5/14/chartex" xmlns:mc="http://schemas.openxmlformats.org/markup-compatibility/2006" xmlns:aink="http://schemas.microsoft.com/office/drawing/2016/ink" xmlns:am3d="http://schemas.microsoft.com/office/drawing/2017/model3d" xmlns:o="urn:schemas-microsoft-com:office:office" xmlns:oel="http://schemas.microsoft.com/office/2019/extlst" xmlns:r="http://schemas.openxmlformats.org/officeDocument/2006/relationships" xmlns:m="http://schemas.openxmlformats.org/officeDocument/2006/math" xmlns:v="urn:schemas-microsoft-com:vml" xmlns:wp14="http://schemas.microsoft.com/office/word/2010/wordprocessingDrawing" xmlns:wp="http://schemas.openxmlformats.org/drawingml/2006/wordprocessingDrawing" xmlns:w10="urn:schemas-microsoft-com:office:word" xmlns:w="http://schemas.openxmlformats.org/wordprocessingml/2006/main" xmlns:w14="http://schemas.microsoft.com/office/word/2010/wordml" xmlns:w15="http://schemas.microsoft.com/office/word/2012/wordml" xmlns:w16cex="http://schemas.microsoft.com/office/word/2018/wordml/cex" xmlns:w16cid="http://schemas.microsoft.com/office/word/2016/wordml/cid" xmlns:w16="http://schemas.microsoft.com/office/word/2018/wordml" xmlns:w16du="http://schemas.microsoft.com/office/word/2023/wordml/word16du" xmlns:w16sdtdh="http://schemas.microsoft.com/office/word/2020/wordml/sdtdatahash" xmlns:w16sdtfl="http://schemas.microsoft.com/office/word/2024/wordml/sdtformatlock" xmlns:w16se="http://schemas.microsoft.com/office/word/2015/wordml/symex" xmlns:wpg="http://schemas.microsoft.com/office/word/2010/wordprocessingGroup" xmlns:wpi="http://schemas.microsoft.com/office/word/2010/wordprocessingInk" xmlns:wne="http://schemas.microsoft.com/office/word/2006/wordml" xmlns:wps="http://schemas.microsoft.com/office/word/2010/wordprocessingShape" mc:Ignorable="w14 w15 w16se w16cid w16 w16cex w16sdtdh w16sdtfl w16du wp14">
   <w:endnote w:type="separator" w:id="-1">
     <w:p>
       <w:pPr>
@@ -3086,7 +3053,7 @@
 </file>
 
 <file path=word/footer1.xml><?xml version="1.0" encoding="utf-8"?>
-<w:ftr xmlns:wpc="http://schemas.microsoft.com/office/word/2010/wordprocessingCanvas" xmlns:cx="http://schemas.microsoft.com/office/drawing/2014/chartex" xmlns:cx1="http://schemas.microsoft.com/office/drawing/2015/9/8/chartex" xmlns:cx2="http://schemas.microsoft.com/office/drawing/2015/10/21/chartex" xmlns:cx3="http://schemas.microsoft.com/office/drawing/2016/5/9/chartex" xmlns:cx4="http://schemas.microsoft.com/office/drawing/2016/5/10/chartex" xmlns:cx5="http://schemas.microsoft.com/office/drawing/2016/5/11/chartex" xmlns:cx6="http://schemas.microsoft.com/office/drawing/2016/5/12/chartex" xmlns:cx7="http://schemas.microsoft.com/office/drawing/2016/5/13/chartex" xmlns:cx8="http://schemas.microsoft.com/office/drawing/2016/5/14/chartex" xmlns:mc="http://schemas.openxmlformats.org/markup-compatibility/2006" xmlns:aink="http://schemas.microsoft.com/office/drawing/2016/ink" xmlns:am3d="http://schemas.microsoft.com/office/drawing/2017/model3d" xmlns:o="urn:schemas-microsoft-com:office:office" xmlns:r="http://schemas.openxmlformats.org/officeDocument/2006/relationships" xmlns:m="http://schemas.openxmlformats.org/officeDocument/2006/math" xmlns:v="urn:schemas-microsoft-com:vml" xmlns:wp14="http://schemas.microsoft.com/office/word/2010/wordprocessingDrawing" xmlns:wp="http://schemas.openxmlformats.org/drawingml/2006/wordprocessingDrawing" xmlns:w10="urn:schemas-microsoft-com:office:word" xmlns:w="http://schemas.openxmlformats.org/wordprocessingml/2006/main" xmlns:w14="http://schemas.microsoft.com/office/word/2010/wordml" xmlns:w15="http://schemas.microsoft.com/office/word/2012/wordml" xmlns:w16cid="http://schemas.microsoft.com/office/word/2016/wordml/cid" xmlns:w16se="http://schemas.microsoft.com/office/word/2015/wordml/symex" xmlns:wpg="http://schemas.microsoft.com/office/word/2010/wordprocessingGroup" xmlns:wpi="http://schemas.microsoft.com/office/word/2010/wordprocessingInk" xmlns:wne="http://schemas.microsoft.com/office/word/2006/wordml" xmlns:wps="http://schemas.microsoft.com/office/word/2010/wordprocessingShape" mc:Ignorable="w14 w15 w16se w16cid wp14">
+<w:ftr xmlns:wpc="http://schemas.microsoft.com/office/word/2010/wordprocessingCanvas" xmlns:cx="http://schemas.microsoft.com/office/drawing/2014/chartex" xmlns:cx1="http://schemas.microsoft.com/office/drawing/2015/9/8/chartex" xmlns:cx2="http://schemas.microsoft.com/office/drawing/2015/10/21/chartex" xmlns:cx3="http://schemas.microsoft.com/office/drawing/2016/5/9/chartex" xmlns:cx4="http://schemas.microsoft.com/office/drawing/2016/5/10/chartex" xmlns:cx5="http://schemas.microsoft.com/office/drawing/2016/5/11/chartex" xmlns:cx6="http://schemas.microsoft.com/office/drawing/2016/5/12/chartex" xmlns:cx7="http://schemas.microsoft.com/office/drawing/2016/5/13/chartex" xmlns:cx8="http://schemas.microsoft.com/office/drawing/2016/5/14/chartex" xmlns:mc="http://schemas.openxmlformats.org/markup-compatibility/2006" xmlns:aink="http://schemas.microsoft.com/office/drawing/2016/ink" xmlns:am3d="http://schemas.microsoft.com/office/drawing/2017/model3d" xmlns:o="urn:schemas-microsoft-com:office:office" xmlns:oel="http://schemas.microsoft.com/office/2019/extlst" xmlns:r="http://schemas.openxmlformats.org/officeDocument/2006/relationships" xmlns:m="http://schemas.openxmlformats.org/officeDocument/2006/math" xmlns:v="urn:schemas-microsoft-com:vml" xmlns:wp14="http://schemas.microsoft.com/office/word/2010/wordprocessingDrawing" xmlns:wp="http://schemas.openxmlformats.org/drawingml/2006/wordprocessingDrawing" xmlns:w10="urn:schemas-microsoft-com:office:word" xmlns:w="http://schemas.openxmlformats.org/wordprocessingml/2006/main" xmlns:w14="http://schemas.microsoft.com/office/word/2010/wordml" xmlns:w15="http://schemas.microsoft.com/office/word/2012/wordml" xmlns:w16cex="http://schemas.microsoft.com/office/word/2018/wordml/cex" xmlns:w16cid="http://schemas.microsoft.com/office/word/2016/wordml/cid" xmlns:w16="http://schemas.microsoft.com/office/word/2018/wordml" xmlns:w16du="http://schemas.microsoft.com/office/word/2023/wordml/word16du" xmlns:w16sdtdh="http://schemas.microsoft.com/office/word/2020/wordml/sdtdatahash" xmlns:w16sdtfl="http://schemas.microsoft.com/office/word/2024/wordml/sdtformatlock" xmlns:w16se="http://schemas.microsoft.com/office/word/2015/wordml/symex" xmlns:wpg="http://schemas.microsoft.com/office/word/2010/wordprocessingGroup" xmlns:wpi="http://schemas.microsoft.com/office/word/2010/wordprocessingInk" xmlns:wne="http://schemas.microsoft.com/office/word/2006/wordml" xmlns:wps="http://schemas.microsoft.com/office/word/2010/wordprocessingShape" mc:Ignorable="w14 w15 w16se w16cid w16 w16cex w16sdtdh w16sdtfl w16du wp14">
   <w:sdt>
     <w:sdtPr>
       <w:id w:val="-866069514"/>
@@ -3095,7 +3062,6 @@
         <w:docPartUnique/>
       </w:docPartObj>
     </w:sdtPr>
-    <w:sdtEndPr/>
     <w:sdtContent>
       <w:p>
         <w:pPr>
@@ -3132,7 +3098,7 @@
 </file>
 
 <file path=word/footnotes.xml><?xml version="1.0" encoding="utf-8"?>
-<w:footnotes xmlns:wpc="http://schemas.microsoft.com/office/word/2010/wordprocessingCanvas" xmlns:cx="http://schemas.microsoft.com/office/drawing/2014/chartex" xmlns:cx1="http://schemas.microsoft.com/office/drawing/2015/9/8/chartex" xmlns:cx2="http://schemas.microsoft.com/office/drawing/2015/10/21/chartex" xmlns:cx3="http://schemas.microsoft.com/office/drawing/2016/5/9/chartex" xmlns:cx4="http://schemas.microsoft.com/office/drawing/2016/5/10/chartex" xmlns:cx5="http://schemas.microsoft.com/office/drawing/2016/5/11/chartex" xmlns:cx6="http://schemas.microsoft.com/office/drawing/2016/5/12/chartex" xmlns:cx7="http://schemas.microsoft.com/office/drawing/2016/5/13/chartex" xmlns:cx8="http://schemas.microsoft.com/office/drawing/2016/5/14/chartex" xmlns:mc="http://schemas.openxmlformats.org/markup-compatibility/2006" xmlns:aink="http://schemas.microsoft.com/office/drawing/2016/ink" xmlns:am3d="http://schemas.microsoft.com/office/drawing/2017/model3d" xmlns:o="urn:schemas-microsoft-com:office:office" xmlns:r="http://schemas.openxmlformats.org/officeDocument/2006/relationships" xmlns:m="http://schemas.openxmlformats.org/officeDocument/2006/math" xmlns:v="urn:schemas-microsoft-com:vml" xmlns:wp14="http://schemas.microsoft.com/office/word/2010/wordprocessingDrawing" xmlns:wp="http://schemas.openxmlformats.org/drawingml/2006/wordprocessingDrawing" xmlns:w10="urn:schemas-microsoft-com:office:word" xmlns:w="http://schemas.openxmlformats.org/wordprocessingml/2006/main" xmlns:w14="http://schemas.microsoft.com/office/word/2010/wordml" xmlns:w15="http://schemas.microsoft.com/office/word/2012/wordml" xmlns:w16cid="http://schemas.microsoft.com/office/word/2016/wordml/cid" xmlns:w16se="http://schemas.microsoft.com/office/word/2015/wordml/symex" xmlns:wpg="http://schemas.microsoft.com/office/word/2010/wordprocessingGroup" xmlns:wpi="http://schemas.microsoft.com/office/word/2010/wordprocessingInk" xmlns:wne="http://schemas.microsoft.com/office/word/2006/wordml" xmlns:wps="http://schemas.microsoft.com/office/word/2010/wordprocessingShape" mc:Ignorable="w14 w15 w16se w16cid wp14">
+<w:footnotes xmlns:wpc="http://schemas.microsoft.com/office/word/2010/wordprocessingCanvas" xmlns:cx="http://schemas.microsoft.com/office/drawing/2014/chartex" xmlns:cx1="http://schemas.microsoft.com/office/drawing/2015/9/8/chartex" xmlns:cx2="http://schemas.microsoft.com/office/drawing/2015/10/21/chartex" xmlns:cx3="http://schemas.microsoft.com/office/drawing/2016/5/9/chartex" xmlns:cx4="http://schemas.microsoft.com/office/drawing/2016/5/10/chartex" xmlns:cx5="http://schemas.microsoft.com/office/drawing/2016/5/11/chartex" xmlns:cx6="http://schemas.microsoft.com/office/drawing/2016/5/12/chartex" xmlns:cx7="http://schemas.microsoft.com/office/drawing/2016/5/13/chartex" xmlns:cx8="http://schemas.microsoft.com/office/drawing/2016/5/14/chartex" xmlns:mc="http://schemas.openxmlformats.org/markup-compatibility/2006" xmlns:aink="http://schemas.microsoft.com/office/drawing/2016/ink" xmlns:am3d="http://schemas.microsoft.com/office/drawing/2017/model3d" xmlns:o="urn:schemas-microsoft-com:office:office" xmlns:oel="http://schemas.microsoft.com/office/2019/extlst" xmlns:r="http://schemas.openxmlformats.org/officeDocument/2006/relationships" xmlns:m="http://schemas.openxmlformats.org/officeDocument/2006/math" xmlns:v="urn:schemas-microsoft-com:vml" xmlns:wp14="http://schemas.microsoft.com/office/word/2010/wordprocessingDrawing" xmlns:wp="http://schemas.openxmlformats.org/drawingml/2006/wordprocessingDrawing" xmlns:w10="urn:schemas-microsoft-com:office:word" xmlns:w="http://schemas.openxmlformats.org/wordprocessingml/2006/main" xmlns:w14="http://schemas.microsoft.com/office/word/2010/wordml" xmlns:w15="http://schemas.microsoft.com/office/word/2012/wordml" xmlns:w16cex="http://schemas.microsoft.com/office/word/2018/wordml/cex" xmlns:w16cid="http://schemas.microsoft.com/office/word/2016/wordml/cid" xmlns:w16="http://schemas.microsoft.com/office/word/2018/wordml" xmlns:w16du="http://schemas.microsoft.com/office/word/2023/wordml/word16du" xmlns:w16sdtdh="http://schemas.microsoft.com/office/word/2020/wordml/sdtdatahash" xmlns:w16sdtfl="http://schemas.microsoft.com/office/word/2024/wordml/sdtformatlock" xmlns:w16se="http://schemas.microsoft.com/office/word/2015/wordml/symex" xmlns:wpg="http://schemas.microsoft.com/office/word/2010/wordprocessingGroup" xmlns:wpi="http://schemas.microsoft.com/office/word/2010/wordprocessingInk" xmlns:wne="http://schemas.microsoft.com/office/word/2006/wordml" xmlns:wps="http://schemas.microsoft.com/office/word/2010/wordprocessingShape" mc:Ignorable="w14 w15 w16se w16cid w16 w16cex w16sdtdh w16sdtfl w16du wp14">
   <w:footnote w:type="separator" w:id="-1">
     <w:p>
       <w:pPr>
@@ -3157,7 +3123,7 @@
 </file>
 
 <file path=word/numbering.xml><?xml version="1.0" encoding="utf-8"?>
-<w:numbering xmlns:wpc="http://schemas.microsoft.com/office/word/2010/wordprocessingCanvas" xmlns:cx="http://schemas.microsoft.com/office/drawing/2014/chartex" xmlns:cx1="http://schemas.microsoft.com/office/drawing/2015/9/8/chartex" xmlns:cx2="http://schemas.microsoft.com/office/drawing/2015/10/21/chartex" xmlns:cx3="http://schemas.microsoft.com/office/drawing/2016/5/9/chartex" xmlns:cx4="http://schemas.microsoft.com/office/drawing/2016/5/10/chartex" xmlns:cx5="http://schemas.microsoft.com/office/drawing/2016/5/11/chartex" xmlns:cx6="http://schemas.microsoft.com/office/drawing/2016/5/12/chartex" xmlns:cx7="http://schemas.microsoft.com/office/drawing/2016/5/13/chartex" xmlns:cx8="http://schemas.microsoft.com/office/drawing/2016/5/14/chartex" xmlns:mc="http://schemas.openxmlformats.org/markup-compatibility/2006" xmlns:aink="http://schemas.microsoft.com/office/drawing/2016/ink" xmlns:am3d="http://schemas.microsoft.com/office/drawing/2017/model3d" xmlns:o="urn:schemas-microsoft-com:office:office" xmlns:r="http://schemas.openxmlformats.org/officeDocument/2006/relationships" xmlns:m="http://schemas.openxmlformats.org/officeDocument/2006/math" xmlns:v="urn:schemas-microsoft-com:vml" xmlns:wp14="http://schemas.microsoft.com/office/word/2010/wordprocessingDrawing" xmlns:wp="http://schemas.openxmlformats.org/drawingml/2006/wordprocessingDrawing" xmlns:w10="urn:schemas-microsoft-com:office:word" xmlns:w="http://schemas.openxmlformats.org/wordprocessingml/2006/main" xmlns:w14="http://schemas.microsoft.com/office/word/2010/wordml" xmlns:w15="http://schemas.microsoft.com/office/word/2012/wordml" xmlns:w16cid="http://schemas.microsoft.com/office/word/2016/wordml/cid" xmlns:w16se="http://schemas.microsoft.com/office/word/2015/wordml/symex" xmlns:wpg="http://schemas.microsoft.com/office/word/2010/wordprocessingGroup" xmlns:wpi="http://schemas.microsoft.com/office/word/2010/wordprocessingInk" xmlns:wne="http://schemas.microsoft.com/office/word/2006/wordml" xmlns:wps="http://schemas.microsoft.com/office/word/2010/wordprocessingShape" mc:Ignorable="w14 w15 w16se w16cid wp14">
+<w:numbering xmlns:wpc="http://schemas.microsoft.com/office/word/2010/wordprocessingCanvas" xmlns:cx="http://schemas.microsoft.com/office/drawing/2014/chartex" xmlns:cx1="http://schemas.microsoft.com/office/drawing/2015/9/8/chartex" xmlns:cx2="http://schemas.microsoft.com/office/drawing/2015/10/21/chartex" xmlns:cx3="http://schemas.microsoft.com/office/drawing/2016/5/9/chartex" xmlns:cx4="http://schemas.microsoft.com/office/drawing/2016/5/10/chartex" xmlns:cx5="http://schemas.microsoft.com/office/drawing/2016/5/11/chartex" xmlns:cx6="http://schemas.microsoft.com/office/drawing/2016/5/12/chartex" xmlns:cx7="http://schemas.microsoft.com/office/drawing/2016/5/13/chartex" xmlns:cx8="http://schemas.microsoft.com/office/drawing/2016/5/14/chartex" xmlns:mc="http://schemas.openxmlformats.org/markup-compatibility/2006" xmlns:aink="http://schemas.microsoft.com/office/drawing/2016/ink" xmlns:am3d="http://schemas.microsoft.com/office/drawing/2017/model3d" xmlns:o="urn:schemas-microsoft-com:office:office" xmlns:oel="http://schemas.microsoft.com/office/2019/extlst" xmlns:r="http://schemas.openxmlformats.org/officeDocument/2006/relationships" xmlns:m="http://schemas.openxmlformats.org/officeDocument/2006/math" xmlns:v="urn:schemas-microsoft-com:vml" xmlns:wp14="http://schemas.microsoft.com/office/word/2010/wordprocessingDrawing" xmlns:wp="http://schemas.openxmlformats.org/drawingml/2006/wordprocessingDrawing" xmlns:w10="urn:schemas-microsoft-com:office:word" xmlns:w="http://schemas.openxmlformats.org/wordprocessingml/2006/main" xmlns:w14="http://schemas.microsoft.com/office/word/2010/wordml" xmlns:w15="http://schemas.microsoft.com/office/word/2012/wordml" xmlns:w16cex="http://schemas.microsoft.com/office/word/2018/wordml/cex" xmlns:w16cid="http://schemas.microsoft.com/office/word/2016/wordml/cid" xmlns:w16="http://schemas.microsoft.com/office/word/2018/wordml" xmlns:w16du="http://schemas.microsoft.com/office/word/2023/wordml/word16du" xmlns:w16sdtdh="http://schemas.microsoft.com/office/word/2020/wordml/sdtdatahash" xmlns:w16sdtfl="http://schemas.microsoft.com/office/word/2024/wordml/sdtformatlock" xmlns:w16se="http://schemas.microsoft.com/office/word/2015/wordml/symex" xmlns:wpg="http://schemas.microsoft.com/office/word/2010/wordprocessingGroup" xmlns:wpi="http://schemas.microsoft.com/office/word/2010/wordprocessingInk" xmlns:wne="http://schemas.microsoft.com/office/word/2006/wordml" xmlns:wps="http://schemas.microsoft.com/office/word/2010/wordprocessingShape" mc:Ignorable="w14 w15 w16se w16cid w16 w16cex w16sdtdh w16sdtfl w16du wp14">
   <w:abstractNum w:abstractNumId="0" w15:restartNumberingAfterBreak="0">
     <w:nsid w:val="1B5D7A44"/>
     <w:multiLevelType w:val="multilevel"/>
@@ -4456,41 +4422,41 @@
       </w:rPr>
     </w:lvl>
   </w:abstractNum>
-  <w:num w:numId="1">
+  <w:num w:numId="1" w16cid:durableId="532807924">
     <w:abstractNumId w:val="2"/>
   </w:num>
-  <w:num w:numId="2">
+  <w:num w:numId="2" w16cid:durableId="1063022845">
     <w:abstractNumId w:val="5"/>
   </w:num>
-  <w:num w:numId="3">
+  <w:num w:numId="3" w16cid:durableId="1096099151">
     <w:abstractNumId w:val="9"/>
   </w:num>
-  <w:num w:numId="4">
+  <w:num w:numId="4" w16cid:durableId="1342589655">
     <w:abstractNumId w:val="3"/>
   </w:num>
-  <w:num w:numId="5">
+  <w:num w:numId="5" w16cid:durableId="2075620790">
     <w:abstractNumId w:val="8"/>
   </w:num>
-  <w:num w:numId="6">
+  <w:num w:numId="6" w16cid:durableId="1728914265">
     <w:abstractNumId w:val="4"/>
   </w:num>
-  <w:num w:numId="7">
+  <w:num w:numId="7" w16cid:durableId="671614539">
     <w:abstractNumId w:val="7"/>
   </w:num>
-  <w:num w:numId="8">
+  <w:num w:numId="8" w16cid:durableId="1044716997">
     <w:abstractNumId w:val="0"/>
   </w:num>
-  <w:num w:numId="9">
+  <w:num w:numId="9" w16cid:durableId="2143964954">
     <w:abstractNumId w:val="1"/>
   </w:num>
-  <w:num w:numId="10">
+  <w:num w:numId="10" w16cid:durableId="88700415">
     <w:abstractNumId w:val="6"/>
   </w:num>
 </w:numbering>
 </file>
 
 <file path=word/styles.xml><?xml version="1.0" encoding="utf-8"?>
-<w:styles xmlns:mc="http://schemas.openxmlformats.org/markup-compatibility/2006" xmlns:r="http://schemas.openxmlformats.org/officeDocument/2006/relationships" xmlns:w="http://schemas.openxmlformats.org/wordprocessingml/2006/main" xmlns:w14="http://schemas.microsoft.com/office/word/2010/wordml" xmlns:w15="http://schemas.microsoft.com/office/word/2012/wordml" xmlns:w16cid="http://schemas.microsoft.com/office/word/2016/wordml/cid" xmlns:w16se="http://schemas.microsoft.com/office/word/2015/wordml/symex" mc:Ignorable="w14 w15 w16se w16cid">
+<w:styles xmlns:mc="http://schemas.openxmlformats.org/markup-compatibility/2006" xmlns:r="http://schemas.openxmlformats.org/officeDocument/2006/relationships" xmlns:w="http://schemas.openxmlformats.org/wordprocessingml/2006/main" xmlns:w14="http://schemas.microsoft.com/office/word/2010/wordml" xmlns:w15="http://schemas.microsoft.com/office/word/2012/wordml" xmlns:w16cex="http://schemas.microsoft.com/office/word/2018/wordml/cex" xmlns:w16cid="http://schemas.microsoft.com/office/word/2016/wordml/cid" xmlns:w16="http://schemas.microsoft.com/office/word/2018/wordml" xmlns:w16du="http://schemas.microsoft.com/office/word/2023/wordml/word16du" xmlns:w16sdtdh="http://schemas.microsoft.com/office/word/2020/wordml/sdtdatahash" xmlns:w16sdtfl="http://schemas.microsoft.com/office/word/2024/wordml/sdtformatlock" xmlns:w16se="http://schemas.microsoft.com/office/word/2015/wordml/symex" mc:Ignorable="w14 w15 w16se w16cid w16 w16cex w16sdtdh w16sdtfl w16du">
   <w:docDefaults>
     <w:rPrDefault>
       <w:rPr>
@@ -4508,7 +4474,7 @@
       </w:pPr>
     </w:pPrDefault>
   </w:docDefaults>
-  <w:latentStyles w:defLockedState="0" w:defUIPriority="99" w:defSemiHidden="0" w:defUnhideWhenUsed="0" w:defQFormat="0" w:count="375">
+  <w:latentStyles w:defLockedState="0" w:defUIPriority="99" w:defSemiHidden="0" w:defUnhideWhenUsed="0" w:defQFormat="0" w:count="376">
     <w:lsdException w:name="Normal" w:uiPriority="0" w:qFormat="1"/>
     <w:lsdException w:name="heading 1" w:uiPriority="9" w:qFormat="1"/>
     <w:lsdException w:name="heading 2" w:semiHidden="1" w:uiPriority="9" w:unhideWhenUsed="1" w:qFormat="1"/>
@@ -4884,6 +4850,7 @@
     <w:lsdException w:name="Smart Hyperlink" w:semiHidden="1" w:unhideWhenUsed="1"/>
     <w:lsdException w:name="Hashtag" w:semiHidden="1" w:unhideWhenUsed="1"/>
     <w:lsdException w:name="Unresolved Mention" w:semiHidden="1" w:unhideWhenUsed="1"/>
+    <w:lsdException w:name="Smart Link" w:semiHidden="1" w:unhideWhenUsed="1"/>
   </w:latentStyles>
   <w:style w:type="paragraph" w:default="1" w:styleId="Normal">
     <w:name w:val="Normal"/>
@@ -5403,7 +5370,7 @@
       <w:spacing w:val="5"/>
     </w:rPr>
   </w:style>
-  <w:style w:type="character" w:styleId="Lienhypertexte">
+  <w:style w:type="character" w:styleId="Hyperlien">
     <w:name w:val="Hyperlink"/>
     <w:basedOn w:val="Policepardfaut"/>
     <w:uiPriority w:val="99"/>
@@ -5426,7 +5393,7 @@
       <w:shd w:val="clear" w:color="auto" w:fill="E1DFDD"/>
     </w:rPr>
   </w:style>
-  <w:style w:type="character" w:styleId="Lienhypertextesuivivisit">
+  <w:style w:type="character" w:styleId="Lienvisit">
     <w:name w:val="FollowedHyperlink"/>
     <w:basedOn w:val="Policepardfaut"/>
     <w:uiPriority w:val="99"/>
@@ -6491,11 +6458,39 @@
     </b:Author>
     <b:RefOrder>23</b:RefOrder>
   </b:Source>
+  <b:Source>
+    <b:Tag>Vod17</b:Tag>
+    <b:SourceType>JournalArticle</b:SourceType>
+    <b:Guid>{B45A7610-1C10-424E-9557-4DB1A5826FF3}</b:Guid>
+    <b:Title>On Monte Carlo Tree Search and Reinforcement Learning</b:Title>
+    <b:Year>2017</b:Year>
+    <b:Pages>881-936</b:Pages>
+    <b:Author>
+      <b:Author>
+        <b:NameList>
+          <b:Person>
+            <b:Last>Vodopivec</b:Last>
+            <b:First>T.</b:First>
+          </b:Person>
+          <b:Person>
+            <b:Last>Samothrakis</b:Last>
+            <b:First>S.</b:First>
+          </b:Person>
+          <b:Person>
+            <b:Last>Ster</b:Last>
+            <b:First>B.</b:First>
+          </b:Person>
+        </b:NameList>
+      </b:Author>
+    </b:Author>
+    <b:JournalName>Journal of Artificial Intelligence Research</b:JournalName>
+    <b:RefOrder>24</b:RefOrder>
+  </b:Source>
 </b:Sources>
 </file>
 
 <file path=customXml/itemProps1.xml><?xml version="1.0" encoding="utf-8"?>
-<ds:datastoreItem xmlns:ds="http://schemas.openxmlformats.org/officeDocument/2006/customXml" ds:itemID="{3C52C805-D776-4BB8-93AB-AFB28DD375CA}">
+<ds:datastoreItem xmlns:ds="http://schemas.openxmlformats.org/officeDocument/2006/customXml" ds:itemID="{B99D96C0-EF57-4E69-A4D2-5D74985064FD}">
   <ds:schemaRefs>
     <ds:schemaRef ds:uri="http://schemas.openxmlformats.org/officeDocument/2006/bibliography"/>
   </ds:schemaRefs>

</xml_diff>

<commit_message>
maj brouillon veille tp3
</commit_message>
<xml_diff>
--- a/brouillon-veille/Brouillon_Projet_3.docx
+++ b/brouillon-veille/Brouillon_Projet_3.docx
@@ -59,7 +59,9 @@
         <w:spacing w:before="240" w:after="120"/>
         <w:jc w:val="center"/>
         <w:rPr>
-          <w:rFonts w:ascii="Times New Roman" w:hAnsi="Times New Roman" w:cs="Times New Roman"/>
+          <w:rFonts w:ascii="Times New Roman" w:hAnsi="Times New Roman"/>
+          <w:b/>
+          <w:sz w:val="48"/>
         </w:rPr>
       </w:pPr>
       <w:r>
@@ -75,10 +77,20 @@
     </w:p>
     <w:p>
       <w:pPr>
+        <w:spacing w:before="240" w:after="120"/>
+        <w:jc w:val="center"/>
+        <w:rPr>
+          <w:rFonts w:ascii="Times New Roman" w:hAnsi="Times New Roman" w:cs="Times New Roman"/>
+        </w:rPr>
+      </w:pPr>
+    </w:p>
+    <w:p>
+      <w:pPr>
         <w:spacing w:after="360"/>
         <w:jc w:val="center"/>
         <w:rPr>
-          <w:rFonts w:ascii="Times New Roman" w:hAnsi="Times New Roman" w:cs="Times New Roman"/>
+          <w:rFonts w:ascii="Times New Roman" w:hAnsi="Times New Roman"/>
+          <w:sz w:val="36"/>
         </w:rPr>
       </w:pPr>
       <w:r>
@@ -97,6 +109,24 @@
         </w:rPr>
         <w:t xml:space="preserve"> technologique</w:t>
       </w:r>
+    </w:p>
+    <w:p>
+      <w:pPr>
+        <w:spacing w:after="360"/>
+        <w:jc w:val="center"/>
+        <w:rPr>
+          <w:rFonts w:ascii="Times New Roman" w:hAnsi="Times New Roman" w:cs="Times New Roman"/>
+        </w:rPr>
+      </w:pPr>
+    </w:p>
+    <w:p>
+      <w:pPr>
+        <w:spacing w:after="360"/>
+        <w:jc w:val="center"/>
+        <w:rPr>
+          <w:rFonts w:ascii="Times New Roman" w:hAnsi="Times New Roman" w:cs="Times New Roman"/>
+        </w:rPr>
+      </w:pPr>
     </w:p>
     <w:p>
       <w:pPr>
@@ -122,7 +152,8 @@
         <w:spacing w:after="720"/>
         <w:jc w:val="center"/>
         <w:rPr>
-          <w:rFonts w:ascii="Times New Roman" w:hAnsi="Times New Roman" w:cs="Times New Roman"/>
+          <w:rFonts w:ascii="Times New Roman" w:hAnsi="Times New Roman"/>
+          <w:i/>
         </w:rPr>
       </w:pPr>
       <w:r>
@@ -160,6 +191,15 @@
     </w:p>
     <w:p>
       <w:pPr>
+        <w:spacing w:after="720"/>
+        <w:jc w:val="center"/>
+        <w:rPr>
+          <w:rFonts w:ascii="Times New Roman" w:hAnsi="Times New Roman" w:cs="Times New Roman"/>
+        </w:rPr>
+      </w:pPr>
+    </w:p>
+    <w:p>
+      <w:pPr>
         <w:spacing w:before="1200" w:after="120"/>
         <w:jc w:val="center"/>
         <w:rPr>
@@ -176,13 +216,27 @@
         <w:rPr>
           <w:rFonts w:ascii="Times New Roman" w:hAnsi="Times New Roman" w:cs="Times New Roman"/>
         </w:rPr>
-        <w:t>DUPRAS •</w:t>
-      </w:r>
-      <w:r>
-        <w:rPr>
-          <w:rFonts w:ascii="Times New Roman" w:hAnsi="Times New Roman" w:cs="Times New Roman"/>
-        </w:rPr>
-        <w:t xml:space="preserve">  Eddy HUART</w:t>
+        <w:t xml:space="preserve">DUPRAS </w:t>
+      </w:r>
+      <w:proofErr w:type="gramStart"/>
+      <w:r>
+        <w:rPr>
+          <w:rFonts w:ascii="Times New Roman" w:hAnsi="Times New Roman" w:cs="Times New Roman"/>
+        </w:rPr>
+        <w:t>•</w:t>
+      </w:r>
+      <w:r>
+        <w:rPr>
+          <w:rFonts w:ascii="Times New Roman" w:hAnsi="Times New Roman" w:cs="Times New Roman"/>
+        </w:rPr>
+        <w:t xml:space="preserve">  Eddy</w:t>
+      </w:r>
+      <w:proofErr w:type="gramEnd"/>
+      <w:r>
+        <w:rPr>
+          <w:rFonts w:ascii="Times New Roman" w:hAnsi="Times New Roman" w:cs="Times New Roman"/>
+        </w:rPr>
+        <w:t xml:space="preserve"> HUART</w:t>
       </w:r>
     </w:p>
     <w:p>
@@ -248,43 +302,7 @@
     <w:p>
       <w:pPr>
         <w:spacing w:after="120"/>
-        <w:jc w:val="center"/>
-        <w:rPr>
-          <w:rFonts w:ascii="Times New Roman" w:hAnsi="Times New Roman" w:cs="Times New Roman"/>
-        </w:rPr>
-      </w:pPr>
-    </w:p>
-    <w:p>
-      <w:pPr>
-        <w:spacing w:after="120"/>
-        <w:jc w:val="center"/>
-        <w:rPr>
-          <w:rFonts w:ascii="Times New Roman" w:hAnsi="Times New Roman" w:cs="Times New Roman"/>
-        </w:rPr>
-      </w:pPr>
-    </w:p>
-    <w:p>
-      <w:pPr>
-        <w:spacing w:after="120"/>
-        <w:jc w:val="center"/>
-        <w:rPr>
-          <w:rFonts w:ascii="Times New Roman" w:hAnsi="Times New Roman" w:cs="Times New Roman"/>
-        </w:rPr>
-      </w:pPr>
-    </w:p>
-    <w:p>
-      <w:pPr>
-        <w:spacing w:after="120"/>
-        <w:jc w:val="center"/>
-        <w:rPr>
-          <w:rFonts w:ascii="Times New Roman" w:hAnsi="Times New Roman" w:cs="Times New Roman"/>
-        </w:rPr>
-      </w:pPr>
-    </w:p>
-    <w:p>
-      <w:pPr>
-        <w:spacing w:after="120"/>
-        <w:jc w:val="center"/>
+        <w:ind w:left="6372"/>
         <w:rPr>
           <w:rFonts w:ascii="Times New Roman" w:hAnsi="Times New Roman" w:cs="Times New Roman"/>
         </w:rPr>
@@ -307,42 +325,28 @@
           <w:rFonts w:ascii="Times New Roman" w:hAnsi="Times New Roman" w:cs="Times New Roman"/>
         </w:rPr>
       </w:pPr>
-    </w:p>
-    <w:p>
-      <w:pPr>
-        <w:spacing w:after="120"/>
-        <w:ind w:left="6372"/>
-        <w:rPr>
-          <w:rFonts w:ascii="Times New Roman" w:hAnsi="Times New Roman" w:cs="Times New Roman"/>
-        </w:rPr>
-      </w:pPr>
-      <w:r>
-        <w:rPr>
-          <w:rFonts w:ascii="Times New Roman" w:hAnsi="Times New Roman" w:cs="Times New Roman"/>
-        </w:rPr>
-        <w:t>L</w:t>
-      </w:r>
-      <w:r>
-        <w:rPr>
-          <w:rFonts w:ascii="Times New Roman" w:hAnsi="Times New Roman" w:cs="Times New Roman"/>
-        </w:rPr>
-        <w:t xml:space="preserve">undi, </w:t>
-      </w:r>
-      <w:r>
-        <w:rPr>
-          <w:rFonts w:ascii="Times New Roman" w:hAnsi="Times New Roman" w:cs="Times New Roman"/>
-        </w:rPr>
-        <w:t xml:space="preserve">le </w:t>
-      </w:r>
-      <w:r>
-        <w:rPr>
-          <w:rFonts w:ascii="Times New Roman" w:hAnsi="Times New Roman" w:cs="Times New Roman"/>
-        </w:rPr>
-        <w:t>4 mai 2026</w:t>
-      </w:r>
-    </w:p>
-    <w:p>
-      <w:pPr>
+      <w:r>
+        <w:rPr>
+          <w:rFonts w:ascii="Times New Roman" w:hAnsi="Times New Roman" w:cs="Times New Roman"/>
+        </w:rPr>
+        <w:t>Lundi</w:t>
+      </w:r>
+      <w:r>
+        <w:rPr>
+          <w:rFonts w:ascii="Times New Roman" w:hAnsi="Times New Roman" w:cs="Times New Roman"/>
+        </w:rPr>
+        <w:t>, le</w:t>
+      </w:r>
+      <w:r>
+        <w:rPr>
+          <w:rFonts w:ascii="Times New Roman" w:hAnsi="Times New Roman" w:cs="Times New Roman"/>
+        </w:rPr>
+        <w:t xml:space="preserve"> 4 mai 2026</w:t>
+      </w:r>
+    </w:p>
+    <w:p>
+      <w:pPr>
+        <w:pStyle w:val="Titre1"/>
         <w:rPr>
           <w:rFonts w:ascii="Times New Roman" w:hAnsi="Times New Roman" w:cs="Times New Roman"/>
         </w:rPr>
@@ -353,14 +357,6 @@
         </w:rPr>
         <w:br w:type="page"/>
       </w:r>
-    </w:p>
-    <w:p>
-      <w:pPr>
-        <w:pStyle w:val="Titre1"/>
-        <w:rPr>
-          <w:rFonts w:ascii="Times New Roman" w:hAnsi="Times New Roman" w:cs="Times New Roman"/>
-        </w:rPr>
-      </w:pPr>
       <w:r>
         <w:rPr>
           <w:rFonts w:ascii="Times New Roman" w:hAnsi="Times New Roman" w:cs="Times New Roman"/>
@@ -375,16 +371,22 @@
         <w:jc w:val="both"/>
       </w:pPr>
       <w:r>
-        <w:t xml:space="preserve">Le projet synthèse </w:t>
-      </w:r>
-      <w:r>
-        <w:rPr>
-          <w:rFonts w:eastAsiaTheme="minorHAnsi"/>
-        </w:rPr>
-        <w:t xml:space="preserve">L’Attaque </w:t>
-      </w:r>
-      <w:r>
-        <w:t>est un jeu de plateau web multijoueur inspiré de Stratego, développé dans un environnement web reposant sur une interface conçue avec React et Vite ainsi que sur une logique serveur en Python/Flask. Ce projet s'inscrit dans la continuité de l'analyse amorcée dans le Projet 2 en mettant l'accent sur les deux technologies centrales qui structurent son fonctionnement, soit React, qui organise et actualise l'interface utilisateur, et l'algorithme Monte Carlo Tree Search (MCTS), qui oriente l'intelligence artificielle du jeu.</w:t>
+        <w:t>L'Attaque</w:t>
+      </w:r>
+      <w:r>
+        <w:t xml:space="preserve"> est un jeu de plateau web multijoueur inspiré de Stratego, </w:t>
+      </w:r>
+      <w:r>
+        <w:t xml:space="preserve">avec </w:t>
+      </w:r>
+      <w:r>
+        <w:t>une interface React et une logique serveur en Python/Flask.</w:t>
+      </w:r>
+      <w:r>
+        <w:t xml:space="preserve"> </w:t>
+      </w:r>
+      <w:r>
+        <w:t>Ce projet s'inscrit dans la continuité de l'analyse amorcée dans le Projet 2 en mettant l'accent sur les deux technologies centrales qui structurent son fonctionnement, soit React, qui organise et actualise l'interface utilisateur, et l'algorithme Monte Carlo Tree Search (MCTS), qui oriente l'intelligence artificielle du jeu.</w:t>
       </w:r>
     </w:p>
     <w:p>
@@ -552,32 +554,69 @@
       <w:pPr>
         <w:pStyle w:val="Lgende"/>
         <w:jc w:val="center"/>
-      </w:pPr>
-      <w:r>
+        <w:rPr>
+          <w:sz w:val="20"/>
+          <w:szCs w:val="14"/>
+        </w:rPr>
+      </w:pPr>
+      <w:r>
+        <w:rPr>
+          <w:sz w:val="20"/>
+          <w:szCs w:val="14"/>
+        </w:rPr>
+        <w:t xml:space="preserve">Figure 1 : </w:t>
+      </w:r>
+      <w:r>
+        <w:rPr>
+          <w:sz w:val="20"/>
+          <w:szCs w:val="14"/>
+        </w:rPr>
         <w:t xml:space="preserve">Explication des priors, belief states et heuristiques utilisés par un algorithme MCTS pour Stratego </w:t>
       </w:r>
       <w:sdt>
         <w:sdtPr>
+          <w:rPr>
+            <w:sz w:val="20"/>
+            <w:szCs w:val="14"/>
+          </w:rPr>
           <w:id w:val="-1622836471"/>
           <w:citation/>
         </w:sdtPr>
         <w:sdtContent>
           <w:r>
+            <w:rPr>
+              <w:sz w:val="20"/>
+              <w:szCs w:val="14"/>
+            </w:rPr>
             <w:fldChar w:fldCharType="begin"/>
           </w:r>
           <w:r>
+            <w:rPr>
+              <w:sz w:val="20"/>
+              <w:szCs w:val="14"/>
+            </w:rPr>
             <w:instrText xml:space="preserve"> CITATION Ope26 \l 3084 </w:instrText>
           </w:r>
           <w:r>
+            <w:rPr>
+              <w:sz w:val="20"/>
+              <w:szCs w:val="14"/>
+            </w:rPr>
             <w:fldChar w:fldCharType="separate"/>
           </w:r>
           <w:r>
             <w:rPr>
               <w:noProof/>
+              <w:sz w:val="20"/>
+              <w:szCs w:val="14"/>
             </w:rPr>
             <w:t>(OpenAI, 2026)</w:t>
           </w:r>
           <w:r>
+            <w:rPr>
+              <w:sz w:val="20"/>
+              <w:szCs w:val="14"/>
+            </w:rPr>
             <w:fldChar w:fldCharType="end"/>
           </w:r>
         </w:sdtContent>
@@ -632,196 +671,13 @@
       </w:pPr>
       <w:r>
         <w:rPr>
-          <w:noProof/>
-        </w:rPr>
-        <mc:AlternateContent>
-          <mc:Choice Requires="wps">
-            <w:drawing>
-              <wp:anchor distT="0" distB="0" distL="114300" distR="114300" simplePos="0" relativeHeight="251662336" behindDoc="0" locked="0" layoutInCell="1" allowOverlap="1" wp14:anchorId="5D0269FA" wp14:editId="4B1B628E">
-                <wp:simplePos x="0" y="0"/>
-                <wp:positionH relativeFrom="column">
-                  <wp:posOffset>676275</wp:posOffset>
-                </wp:positionH>
-                <wp:positionV relativeFrom="paragraph">
-                  <wp:posOffset>2809240</wp:posOffset>
-                </wp:positionV>
-                <wp:extent cx="4124325" cy="635"/>
-                <wp:effectExtent l="0" t="0" r="0" b="0"/>
-                <wp:wrapThrough wrapText="bothSides">
-                  <wp:wrapPolygon edited="0">
-                    <wp:start x="0" y="0"/>
-                    <wp:lineTo x="0" y="21600"/>
-                    <wp:lineTo x="21600" y="21600"/>
-                    <wp:lineTo x="21600" y="0"/>
-                  </wp:wrapPolygon>
-                </wp:wrapThrough>
-                <wp:docPr id="9" name="Zone de texte 9"/>
-                <wp:cNvGraphicFramePr/>
-                <a:graphic xmlns:a="http://schemas.openxmlformats.org/drawingml/2006/main">
-                  <a:graphicData uri="http://schemas.microsoft.com/office/word/2010/wordprocessingShape">
-                    <wps:wsp>
-                      <wps:cNvSpPr txBox="1"/>
-                      <wps:spPr>
-                        <a:xfrm>
-                          <a:off x="0" y="0"/>
-                          <a:ext cx="4124325" cy="635"/>
-                        </a:xfrm>
-                        <a:prstGeom prst="rect">
-                          <a:avLst/>
-                        </a:prstGeom>
-                        <a:solidFill>
-                          <a:prstClr val="white"/>
-                        </a:solidFill>
-                        <a:ln>
-                          <a:noFill/>
-                        </a:ln>
-                      </wps:spPr>
-                      <wps:txbx>
-                        <w:txbxContent>
-                          <w:p>
-                            <w:pPr>
-                              <w:pStyle w:val="Lgende"/>
-                              <w:jc w:val="center"/>
-                              <w:rPr>
-                                <w:rFonts w:ascii="Times New Roman" w:eastAsia="Times New Roman" w:hAnsi="Times New Roman" w:cs="Times New Roman"/>
-                                <w:noProof/>
-                                <w:sz w:val="24"/>
-                                <w:szCs w:val="24"/>
-                              </w:rPr>
-                            </w:pPr>
-                            <w:r>
-                              <w:t xml:space="preserve">Figure </w:t>
-                            </w:r>
-                            <w:fldSimple w:instr=" SEQ Figure \* ARABIC ">
-                              <w:r>
-                                <w:rPr>
-                                  <w:noProof/>
-                                </w:rPr>
-                                <w:t>1</w:t>
-                              </w:r>
-                            </w:fldSimple>
-                            <w:r>
-                              <w:t xml:space="preserve"> : 3 déterminisations différentes d’une main adverse selon les belief states de l’algorithme </w:t>
-                            </w:r>
-                            <w:sdt>
-                              <w:sdtPr>
-                                <w:id w:val="2940355"/>
-                                <w:citation/>
-                              </w:sdtPr>
-                              <w:sdtContent>
-                                <w:r>
-                                  <w:fldChar w:fldCharType="begin"/>
-                                </w:r>
-                                <w:r>
-                                  <w:instrText xml:space="preserve"> CITATION Świ22 \l 3084 </w:instrText>
-                                </w:r>
-                                <w:r>
-                                  <w:fldChar w:fldCharType="separate"/>
-                                </w:r>
-                                <w:r>
-                                  <w:rPr>
-                                    <w:noProof/>
-                                  </w:rPr>
-                                  <w:t>(Świechowski, 2022)</w:t>
-                                </w:r>
-                                <w:r>
-                                  <w:fldChar w:fldCharType="end"/>
-                                </w:r>
-                              </w:sdtContent>
-                            </w:sdt>
-                          </w:p>
-                        </w:txbxContent>
-                      </wps:txbx>
-                      <wps:bodyPr rot="0" spcFirstLastPara="0" vertOverflow="overflow" horzOverflow="overflow" vert="horz" wrap="square" lIns="0" tIns="0" rIns="0" bIns="0" numCol="1" spcCol="0" rtlCol="0" fromWordArt="0" anchor="t" anchorCtr="0" forceAA="0" compatLnSpc="1">
-                        <a:prstTxWarp prst="textNoShape">
-                          <a:avLst/>
-                        </a:prstTxWarp>
-                        <a:spAutoFit/>
-                      </wps:bodyPr>
-                    </wps:wsp>
-                  </a:graphicData>
-                </a:graphic>
-              </wp:anchor>
-            </w:drawing>
-          </mc:Choice>
-          <mc:Fallback>
-            <w:pict>
-              <v:shapetype w14:anchorId="5D0269FA" id="_x0000_t202" coordsize="21600,21600" o:spt="202" path="m,l,21600r21600,l21600,xe">
-                <v:stroke joinstyle="miter"/>
-                <v:path gradientshapeok="t" o:connecttype="rect"/>
-              </v:shapetype>
-              <v:shape id="Zone de texte 9" o:spid="_x0000_s1026" type="#_x0000_t202" style="position:absolute;margin-left:53.25pt;margin-top:221.2pt;width:324.75pt;height:.05pt;z-index:251662336;visibility:visible;mso-wrap-style:square;mso-wrap-distance-left:9pt;mso-wrap-distance-top:0;mso-wrap-distance-right:9pt;mso-wrap-distance-bottom:0;mso-position-horizontal:absolute;mso-position-horizontal-relative:text;mso-position-vertical:absolute;mso-position-vertical-relative:text;v-text-anchor:top" o:gfxdata="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" stroked="f">
-                <v:textbox style="mso-fit-shape-to-text:t" inset="0,0,0,0">
-                  <w:txbxContent>
-                    <w:p>
-                      <w:pPr>
-                        <w:pStyle w:val="Lgende"/>
-                        <w:jc w:val="center"/>
-                        <w:rPr>
-                          <w:rFonts w:ascii="Times New Roman" w:eastAsia="Times New Roman" w:hAnsi="Times New Roman" w:cs="Times New Roman"/>
-                          <w:noProof/>
-                          <w:sz w:val="24"/>
-                          <w:szCs w:val="24"/>
-                        </w:rPr>
-                      </w:pPr>
-                      <w:r>
-                        <w:t xml:space="preserve">Figure </w:t>
-                      </w:r>
-                      <w:fldSimple w:instr=" SEQ Figure \* ARABIC ">
-                        <w:r>
-                          <w:rPr>
-                            <w:noProof/>
-                          </w:rPr>
-                          <w:t>1</w:t>
-                        </w:r>
-                      </w:fldSimple>
-                      <w:r>
-                        <w:t xml:space="preserve"> : 3 déterminisations différentes d’une main adverse selon les belief states de l’algorithme </w:t>
-                      </w:r>
-                      <w:sdt>
-                        <w:sdtPr>
-                          <w:id w:val="2940355"/>
-                          <w:citation/>
-                        </w:sdtPr>
-                        <w:sdtContent>
-                          <w:r>
-                            <w:fldChar w:fldCharType="begin"/>
-                          </w:r>
-                          <w:r>
-                            <w:instrText xml:space="preserve"> CITATION Świ22 \l 3084 </w:instrText>
-                          </w:r>
-                          <w:r>
-                            <w:fldChar w:fldCharType="separate"/>
-                          </w:r>
-                          <w:r>
-                            <w:rPr>
-                              <w:noProof/>
-                            </w:rPr>
-                            <w:t>(Świechowski, 2022)</w:t>
-                          </w:r>
-                          <w:r>
-                            <w:fldChar w:fldCharType="end"/>
-                          </w:r>
-                        </w:sdtContent>
-                      </w:sdt>
-                    </w:p>
-                  </w:txbxContent>
-                </v:textbox>
-                <w10:wrap type="through"/>
-              </v:shape>
-            </w:pict>
-          </mc:Fallback>
-        </mc:AlternateContent>
-      </w:r>
-      <w:r>
-        <w:rPr>
           <w:rFonts w:ascii="Times New Roman" w:eastAsia="Times New Roman" w:hAnsi="Times New Roman" w:cs="Times New Roman"/>
           <w:noProof/>
           <w:kern w:val="0"/>
           <w:lang w:eastAsia="fr-CA"/>
         </w:rPr>
         <w:drawing>
-          <wp:anchor distT="0" distB="0" distL="114300" distR="114300" simplePos="0" relativeHeight="251660288" behindDoc="0" locked="0" layoutInCell="1" allowOverlap="1" wp14:anchorId="3D460912" wp14:editId="2A438596">
+          <wp:anchor distT="0" distB="0" distL="114300" distR="114300" simplePos="0" relativeHeight="251660288" behindDoc="0" locked="0" layoutInCell="1" allowOverlap="1" wp14:anchorId="3D460912" wp14:editId="1C9AAE89">
             <wp:simplePos x="0" y="0"/>
             <wp:positionH relativeFrom="margin">
               <wp:align>center</wp:align>
@@ -1163,10 +1019,186 @@
         <w:rPr>
           <w:rFonts w:ascii="Times New Roman" w:eastAsia="Times New Roman" w:hAnsi="Times New Roman" w:cs="Times New Roman"/>
           <w:kern w:val="0"/>
+          <w:sz w:val="32"/>
+          <w:szCs w:val="32"/>
           <w:lang w:eastAsia="fr-CA"/>
           <w14:ligatures w14:val="none"/>
         </w:rPr>
       </w:pPr>
+      <w:r>
+        <w:rPr>
+          <w:noProof/>
+        </w:rPr>
+        <mc:AlternateContent>
+          <mc:Choice Requires="wps">
+            <w:drawing>
+              <wp:anchor distT="0" distB="0" distL="114300" distR="114300" simplePos="0" relativeHeight="251662336" behindDoc="0" locked="0" layoutInCell="1" allowOverlap="1" wp14:anchorId="5D0269FA" wp14:editId="634AB6E2">
+                <wp:simplePos x="0" y="0"/>
+                <wp:positionH relativeFrom="column">
+                  <wp:posOffset>676275</wp:posOffset>
+                </wp:positionH>
+                <wp:positionV relativeFrom="paragraph">
+                  <wp:posOffset>23886</wp:posOffset>
+                </wp:positionV>
+                <wp:extent cx="4124325" cy="635"/>
+                <wp:effectExtent l="0" t="0" r="0" b="0"/>
+                <wp:wrapThrough wrapText="bothSides">
+                  <wp:wrapPolygon edited="0">
+                    <wp:start x="0" y="0"/>
+                    <wp:lineTo x="0" y="21600"/>
+                    <wp:lineTo x="21600" y="21600"/>
+                    <wp:lineTo x="21600" y="0"/>
+                  </wp:wrapPolygon>
+                </wp:wrapThrough>
+                <wp:docPr id="9" name="Zone de texte 9"/>
+                <wp:cNvGraphicFramePr/>
+                <a:graphic xmlns:a="http://schemas.openxmlformats.org/drawingml/2006/main">
+                  <a:graphicData uri="http://schemas.microsoft.com/office/word/2010/wordprocessingShape">
+                    <wps:wsp>
+                      <wps:cNvSpPr txBox="1"/>
+                      <wps:spPr>
+                        <a:xfrm>
+                          <a:off x="0" y="0"/>
+                          <a:ext cx="4124325" cy="635"/>
+                        </a:xfrm>
+                        <a:prstGeom prst="rect">
+                          <a:avLst/>
+                        </a:prstGeom>
+                        <a:solidFill>
+                          <a:prstClr val="white"/>
+                        </a:solidFill>
+                        <a:ln>
+                          <a:noFill/>
+                        </a:ln>
+                      </wps:spPr>
+                      <wps:txbx>
+                        <w:txbxContent/>
+                      </wps:txbx>
+                      <wps:bodyPr rot="0" spcFirstLastPara="0" vertOverflow="overflow" horzOverflow="overflow" vert="horz" wrap="square" lIns="0" tIns="0" rIns="0" bIns="0" numCol="1" spcCol="0" rtlCol="0" fromWordArt="0" anchor="t" anchorCtr="0" forceAA="0" compatLnSpc="1">
+                        <a:prstTxWarp prst="textNoShape">
+                          <a:avLst/>
+                        </a:prstTxWarp>
+                        <a:spAutoFit/>
+                      </wps:bodyPr>
+                    </wps:wsp>
+                  </a:graphicData>
+                </a:graphic>
+              </wp:anchor>
+            </w:drawing>
+          </mc:Choice>
+          <mc:Fallback>
+            <w:pict>
+              <v:shapetype w14:anchorId="5D0269FA" id="_x0000_t202" coordsize="21600,21600" o:spt="202" path="m,l,21600r21600,l21600,xe">
+                <v:stroke joinstyle="miter"/>
+                <v:path gradientshapeok="t" o:connecttype="rect"/>
+              </v:shapetype>
+              <v:shape id="Zone de texte 9" o:spid="_x0000_s1026" type="#_x0000_t202" style="position:absolute;margin-left:53.25pt;margin-top:1.9pt;width:324.75pt;height:.05pt;z-index:251662336;visibility:visible;mso-wrap-style:square;mso-wrap-distance-left:9pt;mso-wrap-distance-top:0;mso-wrap-distance-right:9pt;mso-wrap-distance-bottom:0;mso-position-horizontal:absolute;mso-position-horizontal-relative:text;mso-position-vertical:absolute;mso-position-vertical-relative:text;v-text-anchor:top" o:gfxdata="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" stroked="f">
+                <v:textbox style="mso-fit-shape-to-text:t" inset="0,0,0,0">
+                  <w:txbxContent/>
+                </v:textbox>
+                <w10:wrap type="through"/>
+              </v:shape>
+            </w:pict>
+          </mc:Fallback>
+        </mc:AlternateContent>
+      </w:r>
+    </w:p>
+    <w:p>
+      <w:pPr>
+        <w:pStyle w:val="Lgende"/>
+        <w:jc w:val="center"/>
+        <w:rPr>
+          <w:rFonts w:ascii="Times New Roman" w:eastAsia="Times New Roman" w:hAnsi="Times New Roman" w:cs="Times New Roman"/>
+          <w:noProof/>
+          <w:sz w:val="28"/>
+          <w:szCs w:val="28"/>
+        </w:rPr>
+      </w:pPr>
+      <w:r>
+        <w:rPr>
+          <w:sz w:val="20"/>
+          <w:szCs w:val="20"/>
+        </w:rPr>
+        <w:t xml:space="preserve">Figure </w:t>
+      </w:r>
+      <w:r>
+        <w:rPr>
+          <w:sz w:val="20"/>
+          <w:szCs w:val="20"/>
+        </w:rPr>
+        <w:t>2</w:t>
+      </w:r>
+      <w:r>
+        <w:rPr>
+          <w:sz w:val="20"/>
+          <w:szCs w:val="20"/>
+        </w:rPr>
+        <w:t xml:space="preserve"> : 3 </w:t>
+      </w:r>
+      <w:proofErr w:type="spellStart"/>
+      <w:r>
+        <w:rPr>
+          <w:sz w:val="20"/>
+          <w:szCs w:val="20"/>
+        </w:rPr>
+        <w:t>déterminisations</w:t>
+      </w:r>
+      <w:proofErr w:type="spellEnd"/>
+      <w:r>
+        <w:rPr>
+          <w:sz w:val="20"/>
+          <w:szCs w:val="20"/>
+        </w:rPr>
+        <w:t xml:space="preserve"> différentes d’une main adverse selon les belief states de l’algorithme </w:t>
+      </w:r>
+      <w:sdt>
+        <w:sdtPr>
+          <w:rPr>
+            <w:sz w:val="20"/>
+            <w:szCs w:val="20"/>
+          </w:rPr>
+          <w:id w:val="2940355"/>
+          <w:citation/>
+        </w:sdtPr>
+        <w:sdtContent>
+          <w:r>
+            <w:rPr>
+              <w:sz w:val="20"/>
+              <w:szCs w:val="20"/>
+            </w:rPr>
+            <w:fldChar w:fldCharType="begin"/>
+          </w:r>
+          <w:r>
+            <w:rPr>
+              <w:sz w:val="20"/>
+              <w:szCs w:val="20"/>
+            </w:rPr>
+            <w:instrText xml:space="preserve"> CITATION Świ22 \l 3084 </w:instrText>
+          </w:r>
+          <w:r>
+            <w:rPr>
+              <w:sz w:val="20"/>
+              <w:szCs w:val="20"/>
+            </w:rPr>
+            <w:fldChar w:fldCharType="separate"/>
+          </w:r>
+          <w:r>
+            <w:rPr>
+              <w:noProof/>
+              <w:sz w:val="20"/>
+              <w:szCs w:val="20"/>
+            </w:rPr>
+            <w:t>(Świechowski, 2022)</w:t>
+          </w:r>
+          <w:r>
+            <w:rPr>
+              <w:sz w:val="20"/>
+              <w:szCs w:val="20"/>
+            </w:rPr>
+            <w:fldChar w:fldCharType="end"/>
+          </w:r>
+        </w:sdtContent>
+      </w:sdt>
     </w:p>
     <w:p>
       <w:pPr>
@@ -1197,43 +1229,32 @@
           <w14:ligatures w14:val="none"/>
         </w:rPr>
       </w:pPr>
-    </w:p>
-    <w:p>
-      <w:pPr>
+      <w:r>
         <w:rPr>
           <w:rFonts w:ascii="Times New Roman" w:eastAsia="Times New Roman" w:hAnsi="Times New Roman" w:cs="Times New Roman"/>
           <w:kern w:val="0"/>
           <w:lang w:eastAsia="fr-CA"/>
           <w14:ligatures w14:val="none"/>
         </w:rPr>
-      </w:pPr>
-      <w:r>
+        <w:t>Ensuite, le MCTS explore progressivement l’arbre des coups possibles sur le plateau « déterminisé » en se concentrant sur les branches les plus prometteuses grâce aux priors. Les priors servent à guider cette exploration en attribuant une valeur initiale aux actions avant même d’effectuer une quelconque simulation. Ils estiment si un coup révèle de l’information sur une pièce non révélée, s’il permet de capturer une pièce de haut rang, ou s’il expose une pièce importante à un danger immédiat. Ces signaux permettent de privilégier les décisions qui ont un potentiel stratégique élevé dès les premières itérations de recherche, tout en laissant le MCTS affiner progressivement les évaluations via les résultats des simulations.</w:t>
+      </w:r>
+    </w:p>
+    <w:p>
+      <w:pPr>
         <w:rPr>
           <w:rFonts w:ascii="Times New Roman" w:eastAsia="Times New Roman" w:hAnsi="Times New Roman" w:cs="Times New Roman"/>
           <w:kern w:val="0"/>
           <w:lang w:eastAsia="fr-CA"/>
           <w14:ligatures w14:val="none"/>
         </w:rPr>
-        <w:lastRenderedPageBreak/>
-        <w:t>Ensuite, le MCTS explore progressivement l’arbre des coups possibles sur le plateau « déterminisé » en se concentrant sur les branches les plus prometteuses grâce aux priors. Les priors servent à guider cette exploration en attribuant une valeur initiale aux actions avant même d’effectuer une quelconque simulation. Ils estiment si un coup révèle de l’information sur une pièce non révélée, s’il permet de capturer une pièce de haut rang, ou s’il expose une pièce importante à un danger immédiat. Ces signaux permettent de privilégier les décisions qui ont un potentiel stratégique élevé dès les premières itérations de recherche, tout en laissant le MCTS affiner progressivement les évaluations via les résultats des simulations.</w:t>
-      </w:r>
-    </w:p>
-    <w:p>
-      <w:pPr>
+      </w:pPr>
+      <w:r>
         <w:rPr>
           <w:rFonts w:ascii="Times New Roman" w:eastAsia="Times New Roman" w:hAnsi="Times New Roman" w:cs="Times New Roman"/>
           <w:kern w:val="0"/>
           <w:lang w:eastAsia="fr-CA"/>
           <w14:ligatures w14:val="none"/>
         </w:rPr>
-      </w:pPr>
-      <w:r>
-        <w:rPr>
-          <w:rFonts w:ascii="Times New Roman" w:eastAsia="Times New Roman" w:hAnsi="Times New Roman" w:cs="Times New Roman"/>
-          <w:kern w:val="0"/>
-          <w:lang w:eastAsia="fr-CA"/>
-          <w14:ligatures w14:val="none"/>
-        </w:rPr>
         <w:t>Finalement, les fonctions heuristiques permettent d’évaluer l’état du plateau de jeu après plusieurs itérations de simulation. Elles servent à attribuer un score aux positions atteintes en prenant en compte des facteurs stratégiques globaux. Elles combinent l’avantage matériel, la sécurité des pièces restantes, les informations gagnées sur les pièces adverses, ainsi que la pression exercée sur les zones critiques du plateau. Contrairement aux priors qui orientent la recherche au début, les heuristiques synthétisent les résultats des simulations pour estimer la qualité réelle d’un état. Le MCTS va rétropropager cette qualité afin d’affiner la sélection des coups prometteurs.</w:t>
       </w:r>
     </w:p>
@@ -1300,20 +1321,37 @@
         <w:rPr>
           <w:rFonts w:ascii="Times New Roman" w:hAnsi="Times New Roman" w:cs="Times New Roman"/>
         </w:rPr>
-        <w:t xml:space="preserve">L’intégration de React dans L’Attaque a rapidement confirmé la pertinence de son modèle par composants pour un jeu dont l’état évolue en permanence. Le composant principal, Game.jsx, coordonne à lui seul le plateau, les </w:t>
-      </w:r>
+        <w:t xml:space="preserve">L’intégration de React dans L’Attaque a rapidement confirmé la pertinence de son modèle par composants pour un jeu dont l’état évolue en permanence. Le composant principal, </w:t>
+      </w:r>
+      <w:proofErr w:type="spellStart"/>
+      <w:r>
+        <w:rPr>
+          <w:rFonts w:ascii="Times New Roman" w:hAnsi="Times New Roman" w:cs="Times New Roman"/>
+        </w:rPr>
+        <w:t>Game.jsx</w:t>
+      </w:r>
+      <w:proofErr w:type="spellEnd"/>
+      <w:r>
+        <w:rPr>
+          <w:rFonts w:ascii="Times New Roman" w:hAnsi="Times New Roman" w:cs="Times New Roman"/>
+        </w:rPr>
+        <w:t xml:space="preserve">, coordonne à lui seul le plateau, les </w:t>
+      </w:r>
+      <w:proofErr w:type="spellStart"/>
       <w:r>
         <w:rPr>
           <w:rFonts w:ascii="Times New Roman" w:hAnsi="Times New Roman" w:cs="Times New Roman"/>
         </w:rPr>
         <w:t>timers</w:t>
       </w:r>
+      <w:proofErr w:type="spellEnd"/>
       <w:r>
         <w:rPr>
           <w:rFonts w:ascii="Times New Roman" w:hAnsi="Times New Roman" w:cs="Times New Roman"/>
         </w:rPr>
         <w:t xml:space="preserve">, les animations de combat, l’indicateur de tour et les notifications, soit un ensemble d’éléments devant demeurer synchronisés en </w:t>
       </w:r>
+      <w:proofErr w:type="spellStart"/>
       <w:r>
         <w:rPr>
           <w:rFonts w:ascii="Times New Roman" w:hAnsi="Times New Roman" w:cs="Times New Roman"/>
@@ -1330,7 +1368,14 @@
         <w:rPr>
           <w:rFonts w:ascii="Times New Roman" w:hAnsi="Times New Roman" w:cs="Times New Roman"/>
         </w:rPr>
-        <w:t>temps réel.</w:t>
+        <w:t>temps</w:t>
+      </w:r>
+      <w:proofErr w:type="spellEnd"/>
+      <w:r>
+        <w:rPr>
+          <w:rFonts w:ascii="Times New Roman" w:hAnsi="Times New Roman" w:cs="Times New Roman"/>
+        </w:rPr>
+        <w:t xml:space="preserve"> réel.</w:t>
       </w:r>
     </w:p>
     <w:p>
@@ -1358,19 +1403,91 @@
         <w:rPr>
           <w:rFonts w:ascii="Times New Roman" w:hAnsi="Times New Roman" w:cs="Times New Roman"/>
         </w:rPr>
-        <w:t xml:space="preserve">Devant la complexité croissante du composant principal, plusieurs hooks personnalisés ont été mis en place. </w:t>
-      </w:r>
+        <w:t xml:space="preserve">Devant la complexité croissante du composant principal, plusieurs </w:t>
+      </w:r>
+      <w:proofErr w:type="spellStart"/>
+      <w:r>
+        <w:rPr>
+          <w:rFonts w:ascii="Times New Roman" w:hAnsi="Times New Roman" w:cs="Times New Roman"/>
+        </w:rPr>
+        <w:t>hooks</w:t>
+      </w:r>
+      <w:proofErr w:type="spellEnd"/>
+      <w:r>
+        <w:rPr>
+          <w:rFonts w:ascii="Times New Roman" w:hAnsi="Times New Roman" w:cs="Times New Roman"/>
+        </w:rPr>
+        <w:t xml:space="preserve"> personnalisés ont été mis en place. </w:t>
+      </w:r>
+      <w:proofErr w:type="spellStart"/>
       <w:r>
         <w:rPr>
           <w:rFonts w:ascii="Times New Roman" w:hAnsi="Times New Roman" w:cs="Times New Roman"/>
         </w:rPr>
         <w:t>UseGameSync</w:t>
       </w:r>
-      <w:r>
-        <w:rPr>
-          <w:rFonts w:ascii="Times New Roman" w:hAnsi="Times New Roman" w:cs="Times New Roman"/>
-        </w:rPr>
-        <w:t xml:space="preserve"> interroge périodiquement le serveur pour garder l’état du jeu à jour, usePlacement gère la phase de placement des pièces, tandis que useCellClick traite les interactions effectuées sur le plateau. Ces hooks reposent eux-mêmes sur les hooks natifs useState et useEffect, qui permettent de gérer l’état et les effets de bord directement dans des composants fonctionnels, sans avoir recours à des classes.</w:t>
+      <w:proofErr w:type="spellEnd"/>
+      <w:r>
+        <w:rPr>
+          <w:rFonts w:ascii="Times New Roman" w:hAnsi="Times New Roman" w:cs="Times New Roman"/>
+        </w:rPr>
+        <w:t xml:space="preserve"> interroge périodiquement le serveur pour garder l’état du jeu à jour, </w:t>
+      </w:r>
+      <w:proofErr w:type="spellStart"/>
+      <w:r>
+        <w:rPr>
+          <w:rFonts w:ascii="Times New Roman" w:hAnsi="Times New Roman" w:cs="Times New Roman"/>
+        </w:rPr>
+        <w:t>usePlacement</w:t>
+      </w:r>
+      <w:proofErr w:type="spellEnd"/>
+      <w:r>
+        <w:rPr>
+          <w:rFonts w:ascii="Times New Roman" w:hAnsi="Times New Roman" w:cs="Times New Roman"/>
+        </w:rPr>
+        <w:t xml:space="preserve"> gère la phase de placement des pièces, tandis que </w:t>
+      </w:r>
+      <w:proofErr w:type="spellStart"/>
+      <w:r>
+        <w:rPr>
+          <w:rFonts w:ascii="Times New Roman" w:hAnsi="Times New Roman" w:cs="Times New Roman"/>
+        </w:rPr>
+        <w:t>useCellClick</w:t>
+      </w:r>
+      <w:proofErr w:type="spellEnd"/>
+      <w:r>
+        <w:rPr>
+          <w:rFonts w:ascii="Times New Roman" w:hAnsi="Times New Roman" w:cs="Times New Roman"/>
+        </w:rPr>
+        <w:t xml:space="preserve"> traite les interactions effectuées sur le plateau. Ces </w:t>
+      </w:r>
+      <w:proofErr w:type="spellStart"/>
+      <w:r>
+        <w:rPr>
+          <w:rFonts w:ascii="Times New Roman" w:hAnsi="Times New Roman" w:cs="Times New Roman"/>
+        </w:rPr>
+        <w:t>hooks</w:t>
+      </w:r>
+      <w:proofErr w:type="spellEnd"/>
+      <w:r>
+        <w:rPr>
+          <w:rFonts w:ascii="Times New Roman" w:hAnsi="Times New Roman" w:cs="Times New Roman"/>
+        </w:rPr>
+        <w:t xml:space="preserve"> reposent eux-mêmes sur les </w:t>
+      </w:r>
+      <w:proofErr w:type="spellStart"/>
+      <w:r>
+        <w:rPr>
+          <w:rFonts w:ascii="Times New Roman" w:hAnsi="Times New Roman" w:cs="Times New Roman"/>
+        </w:rPr>
+        <w:t>hooks</w:t>
+      </w:r>
+      <w:proofErr w:type="spellEnd"/>
+      <w:r>
+        <w:rPr>
+          <w:rFonts w:ascii="Times New Roman" w:hAnsi="Times New Roman" w:cs="Times New Roman"/>
+        </w:rPr>
+        <w:t xml:space="preserve"> natifs useState et useEffect, qui permettent de gérer l’état et les effets de bord directement dans des composants fonctionnels, sans avoir recours à des classes.</w:t>
       </w:r>
     </w:p>
     <w:p>
@@ -1384,6 +1501,7 @@
         <w:rPr>
           <w:rFonts w:ascii="Times New Roman" w:hAnsi="Times New Roman" w:cs="Times New Roman"/>
         </w:rPr>
+        <w:lastRenderedPageBreak/>
         <w:t xml:space="preserve">Cette organisation montre clairement que React favorise une architecture modulaire, plus simple à maintenir et à déboguer. L’utilisation de useState et de useEffect s’est également révélée naturelle pour représenter les différentes données du jeu, comme le plateau, le tour actif, les </w:t>
       </w:r>
       <w:r>
@@ -1396,14 +1514,21 @@
         <w:rPr>
           <w:rFonts w:ascii="Times New Roman" w:hAnsi="Times New Roman" w:cs="Times New Roman"/>
         </w:rPr>
-        <w:t xml:space="preserve">s ou encore les résultats des combats, puis pour les synchroniser avec le serveur Flask au moyen de requêtes périodiques. Si cette méthode s’intègre bien à Flask, </w:t>
-      </w:r>
-      <w:r>
-        <w:rPr>
-          <w:rFonts w:ascii="Times New Roman" w:hAnsi="Times New Roman" w:cs="Times New Roman"/>
-        </w:rPr>
-        <w:lastRenderedPageBreak/>
-        <w:t xml:space="preserve">elle introduit néanmoins un certain délai et entraîne l’envoi continu de requêtes, même en l’absence de changement. Dans ce contexte, l’isolation de cette logique dans des hooks personnalisés reste essentielle : selon </w:t>
+        <w:t xml:space="preserve">s ou encore les résultats des combats, puis pour les synchroniser avec le serveur Flask au moyen de requêtes périodiques. Si cette méthode s’intègre bien à Flask, elle introduit néanmoins un certain délai et entraîne l’envoi continu de requêtes, même en l’absence de changement. Dans ce contexte, l’isolation de cette logique dans des </w:t>
+      </w:r>
+      <w:proofErr w:type="spellStart"/>
+      <w:r>
+        <w:rPr>
+          <w:rFonts w:ascii="Times New Roman" w:hAnsi="Times New Roman" w:cs="Times New Roman"/>
+        </w:rPr>
+        <w:t>hooks</w:t>
+      </w:r>
+      <w:proofErr w:type="spellEnd"/>
+      <w:r>
+        <w:rPr>
+          <w:rFonts w:ascii="Times New Roman" w:hAnsi="Times New Roman" w:cs="Times New Roman"/>
+        </w:rPr>
+        <w:t xml:space="preserve"> personnalisés reste essentielle : selon </w:t>
       </w:r>
       <w:sdt>
         <w:sdtPr>
@@ -1473,17 +1598,25 @@
           <w:noProof/>
         </w:rPr>
         <w:drawing>
-          <wp:anchor distT="0" distB="0" distL="114300" distR="114300" simplePos="0" relativeHeight="251658240" behindDoc="0" locked="0" layoutInCell="1" allowOverlap="1" wp14:anchorId="130A7A4F" wp14:editId="591E19B3">
+          <wp:anchor distT="0" distB="0" distL="114300" distR="114300" simplePos="0" relativeHeight="251658240" behindDoc="1" locked="0" layoutInCell="1" allowOverlap="1" wp14:anchorId="130A7A4F" wp14:editId="2F52D3D3">
             <wp:simplePos x="0" y="0"/>
             <wp:positionH relativeFrom="column">
-              <wp:posOffset>0</wp:posOffset>
+              <wp:posOffset>407942</wp:posOffset>
             </wp:positionH>
             <wp:positionV relativeFrom="paragraph">
-              <wp:posOffset>83820</wp:posOffset>
+              <wp:posOffset>82550</wp:posOffset>
             </wp:positionV>
             <wp:extent cx="4841631" cy="2581082"/>
             <wp:effectExtent l="0" t="0" r="0" b="0"/>
-            <wp:wrapNone/>
+            <wp:wrapTight wrapText="bothSides">
+              <wp:wrapPolygon edited="0">
+                <wp:start x="0" y="0"/>
+                <wp:lineTo x="0" y="21366"/>
+                <wp:lineTo x="21504" y="21366"/>
+                <wp:lineTo x="21504" y="0"/>
+                <wp:lineTo x="0" y="0"/>
+              </wp:wrapPolygon>
+            </wp:wrapTight>
             <wp:docPr id="1" name="Image 1"/>
             <wp:cNvGraphicFramePr>
               <a:graphicFrameLocks xmlns:a="http://schemas.openxmlformats.org/drawingml/2006/main" noChangeAspect="1"/>
@@ -1579,20 +1712,406 @@
     </w:p>
     <w:p>
       <w:pPr>
+        <w:jc w:val="both"/>
+        <w:rPr>
+          <w:rFonts w:ascii="Times New Roman" w:hAnsi="Times New Roman" w:cs="Times New Roman"/>
+        </w:rPr>
+      </w:pPr>
+    </w:p>
+    <w:p>
+      <w:pPr>
+        <w:jc w:val="both"/>
+        <w:rPr>
+          <w:rFonts w:ascii="Times New Roman" w:hAnsi="Times New Roman" w:cs="Times New Roman"/>
+        </w:rPr>
+      </w:pPr>
+    </w:p>
+    <w:p>
+      <w:pPr>
+        <w:jc w:val="both"/>
+        <w:rPr>
+          <w:rFonts w:ascii="Times New Roman" w:hAnsi="Times New Roman" w:cs="Times New Roman"/>
+        </w:rPr>
+      </w:pPr>
+      <w:r>
+        <w:rPr>
+          <w:noProof/>
+        </w:rPr>
+        <mc:AlternateContent>
+          <mc:Choice Requires="wps">
+            <w:drawing>
+              <wp:anchor distT="0" distB="0" distL="114300" distR="114300" simplePos="0" relativeHeight="251664384" behindDoc="1" locked="0" layoutInCell="1" allowOverlap="1" wp14:anchorId="52F16733" wp14:editId="4F9BDDA8">
+                <wp:simplePos x="0" y="0"/>
+                <wp:positionH relativeFrom="column">
+                  <wp:posOffset>86360</wp:posOffset>
+                </wp:positionH>
+                <wp:positionV relativeFrom="paragraph">
+                  <wp:posOffset>67506</wp:posOffset>
+                </wp:positionV>
+                <wp:extent cx="4841240" cy="5229225"/>
+                <wp:effectExtent l="0" t="0" r="0" b="0"/>
+                <wp:wrapTight wrapText="bothSides">
+                  <wp:wrapPolygon edited="0">
+                    <wp:start x="0" y="0"/>
+                    <wp:lineTo x="0" y="20057"/>
+                    <wp:lineTo x="21504" y="20057"/>
+                    <wp:lineTo x="21504" y="0"/>
+                    <wp:lineTo x="0" y="0"/>
+                  </wp:wrapPolygon>
+                </wp:wrapTight>
+                <wp:docPr id="6" name="Zone de texte 6"/>
+                <wp:cNvGraphicFramePr/>
+                <a:graphic xmlns:a="http://schemas.openxmlformats.org/drawingml/2006/main">
+                  <a:graphicData uri="http://schemas.microsoft.com/office/word/2010/wordprocessingShape">
+                    <wps:wsp>
+                      <wps:cNvSpPr txBox="1"/>
+                      <wps:spPr>
+                        <a:xfrm>
+                          <a:off x="0" y="0"/>
+                          <a:ext cx="4841240" cy="5229225"/>
+                        </a:xfrm>
+                        <a:prstGeom prst="rect">
+                          <a:avLst/>
+                        </a:prstGeom>
+                        <a:solidFill>
+                          <a:prstClr val="white"/>
+                        </a:solidFill>
+                        <a:ln>
+                          <a:noFill/>
+                        </a:ln>
+                      </wps:spPr>
+                      <wps:txbx>
+                        <w:txbxContent>
+                          <w:p>
+                            <w:pPr>
+                              <w:pStyle w:val="Lgende"/>
+                              <w:jc w:val="center"/>
+                              <w:rPr>
+                                <w:rFonts w:ascii="Times New Roman" w:hAnsi="Times New Roman" w:cs="Times New Roman"/>
+                                <w:noProof/>
+                                <w:sz w:val="20"/>
+                                <w:szCs w:val="20"/>
+                              </w:rPr>
+                            </w:pPr>
+                            <w:r>
+                              <w:rPr>
+                                <w:sz w:val="20"/>
+                                <w:szCs w:val="20"/>
+                              </w:rPr>
+                              <w:t xml:space="preserve">Figure 3 : </w:t>
+                            </w:r>
+                            <w:r>
+                              <w:rPr>
+                                <w:sz w:val="20"/>
+                                <w:szCs w:val="20"/>
+                              </w:rPr>
+                              <w:t xml:space="preserve"> Remontée d'état en React (Lifting State Up)</w:t>
+                            </w:r>
+                          </w:p>
+                        </w:txbxContent>
+                      </wps:txbx>
+                      <wps:bodyPr rot="0" spcFirstLastPara="0" vertOverflow="overflow" horzOverflow="overflow" vert="horz" wrap="square" lIns="0" tIns="0" rIns="0" bIns="0" numCol="1" spcCol="0" rtlCol="0" fromWordArt="0" anchor="t" anchorCtr="0" forceAA="0" compatLnSpc="1">
+                        <a:prstTxWarp prst="textNoShape">
+                          <a:avLst/>
+                        </a:prstTxWarp>
+                        <a:spAutoFit/>
+                      </wps:bodyPr>
+                    </wps:wsp>
+                  </a:graphicData>
+                </a:graphic>
+              </wp:anchor>
+            </w:drawing>
+          </mc:Choice>
+          <mc:Fallback>
+            <w:pict>
+              <v:shape w14:anchorId="52F16733" id="Zone de texte 6" o:spid="_x0000_s1027" type="#_x0000_t202" style="position:absolute;left:0;text-align:left;margin-left:6.8pt;margin-top:5.3pt;width:381.2pt;height:411.75pt;z-index:-251652096;visibility:visible;mso-wrap-style:square;mso-wrap-distance-left:9pt;mso-wrap-distance-top:0;mso-wrap-distance-right:9pt;mso-wrap-distance-bottom:0;mso-position-horizontal:absolute;mso-position-horizontal-relative:text;mso-position-vertical:absolute;mso-position-vertical-relative:text;v-text-anchor:top" o:gfxdata="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" stroked="f">
+                <v:textbox style="mso-fit-shape-to-text:t" inset="0,0,0,0">
+                  <w:txbxContent>
+                    <w:p>
+                      <w:pPr>
+                        <w:pStyle w:val="Lgende"/>
+                        <w:jc w:val="center"/>
+                        <w:rPr>
+                          <w:rFonts w:ascii="Times New Roman" w:hAnsi="Times New Roman" w:cs="Times New Roman"/>
+                          <w:noProof/>
+                          <w:sz w:val="20"/>
+                          <w:szCs w:val="20"/>
+                        </w:rPr>
+                      </w:pPr>
+                      <w:r>
+                        <w:rPr>
+                          <w:sz w:val="20"/>
+                          <w:szCs w:val="20"/>
+                        </w:rPr>
+                        <w:t xml:space="preserve">Figure 3 : </w:t>
+                      </w:r>
+                      <w:r>
+                        <w:rPr>
+                          <w:sz w:val="20"/>
+                          <w:szCs w:val="20"/>
+                        </w:rPr>
+                        <w:t xml:space="preserve"> Remontée d'état en React (Lifting State Up)</w:t>
+                      </w:r>
+                    </w:p>
+                  </w:txbxContent>
+                </v:textbox>
+                <w10:wrap type="tight"/>
+              </v:shape>
+            </w:pict>
+          </mc:Fallback>
+        </mc:AlternateContent>
+      </w:r>
+    </w:p>
+    <w:p>
+      <w:pPr>
+        <w:jc w:val="both"/>
+        <w:rPr>
+          <w:rFonts w:ascii="Times New Roman" w:hAnsi="Times New Roman"/>
+        </w:rPr>
+      </w:pPr>
+    </w:p>
+    <w:p>
+      <w:pPr>
         <w:pStyle w:val="Titre2"/>
+        <w:spacing w:before="0" w:line="240" w:lineRule="auto"/>
+      </w:pPr>
+      <w:r>
+        <w:t>2.3 Liens et synergies entre les deux technologies</w:t>
+      </w:r>
+    </w:p>
+    <w:p>
+      <w:pPr>
+        <w:jc w:val="both"/>
+        <w:rPr>
+          <w:rFonts w:ascii="Times New Roman" w:hAnsi="Times New Roman"/>
+        </w:rPr>
+      </w:pPr>
+      <w:r>
+        <w:rPr>
+          <w:rFonts w:ascii="Times New Roman" w:hAnsi="Times New Roman"/>
+        </w:rPr>
+        <w:t xml:space="preserve">À première vue, React et le MCTS </w:t>
+      </w:r>
+      <w:r>
+        <w:rPr>
+          <w:rFonts w:ascii="Times New Roman" w:hAnsi="Times New Roman" w:cs="Times New Roman"/>
+        </w:rPr>
+        <w:t>n'interviennent</w:t>
+      </w:r>
+      <w:r>
+        <w:rPr>
+          <w:rFonts w:ascii="Times New Roman" w:hAnsi="Times New Roman"/>
+        </w:rPr>
+        <w:t xml:space="preserve"> pas au même niveau dans </w:t>
+      </w:r>
+      <w:r>
+        <w:rPr>
+          <w:rFonts w:ascii="Times New Roman" w:hAnsi="Times New Roman" w:cs="Times New Roman"/>
+        </w:rPr>
+        <w:t>L'Attaque</w:t>
+      </w:r>
+      <w:r>
+        <w:rPr>
+          <w:rFonts w:ascii="Times New Roman" w:hAnsi="Times New Roman"/>
+        </w:rPr>
+        <w:t xml:space="preserve"> : React </w:t>
+      </w:r>
+      <w:r>
+        <w:rPr>
+          <w:rFonts w:ascii="Times New Roman" w:hAnsi="Times New Roman" w:cs="Times New Roman"/>
+        </w:rPr>
+        <w:t>s'occupe</w:t>
+      </w:r>
+      <w:r>
+        <w:rPr>
+          <w:rFonts w:ascii="Times New Roman" w:hAnsi="Times New Roman"/>
+        </w:rPr>
+        <w:t xml:space="preserve"> de </w:t>
+      </w:r>
+      <w:r>
+        <w:rPr>
+          <w:rFonts w:ascii="Times New Roman" w:hAnsi="Times New Roman" w:cs="Times New Roman"/>
+        </w:rPr>
+        <w:t>l'affichage</w:t>
+      </w:r>
+      <w:r>
+        <w:rPr>
+          <w:rFonts w:ascii="Times New Roman" w:hAnsi="Times New Roman"/>
+        </w:rPr>
+        <w:t xml:space="preserve"> et des interactions du joueur, alors que le MCTS </w:t>
+      </w:r>
+      <w:r>
+        <w:rPr>
+          <w:rFonts w:ascii="Times New Roman" w:hAnsi="Times New Roman" w:cs="Times New Roman"/>
+        </w:rPr>
+        <w:t>oriente</w:t>
+      </w:r>
+      <w:r>
+        <w:rPr>
+          <w:rFonts w:ascii="Times New Roman" w:hAnsi="Times New Roman"/>
+        </w:rPr>
+        <w:t xml:space="preserve"> les décisions de </w:t>
+      </w:r>
+      <w:r>
+        <w:rPr>
+          <w:rFonts w:ascii="Times New Roman" w:hAnsi="Times New Roman" w:cs="Times New Roman"/>
+        </w:rPr>
+        <w:t>l'intelligence</w:t>
+      </w:r>
+      <w:r>
+        <w:rPr>
+          <w:rFonts w:ascii="Times New Roman" w:hAnsi="Times New Roman"/>
+        </w:rPr>
+        <w:t xml:space="preserve"> artificielle. Pourtant, leur intégration montre une complémentarité concrète, puisque le coup calculé par </w:t>
+      </w:r>
+      <w:r>
+        <w:rPr>
+          <w:rFonts w:ascii="Times New Roman" w:hAnsi="Times New Roman" w:cs="Times New Roman"/>
+        </w:rPr>
+        <w:t>l'IA</w:t>
+      </w:r>
+      <w:r>
+        <w:rPr>
+          <w:rFonts w:ascii="Times New Roman" w:hAnsi="Times New Roman"/>
+        </w:rPr>
+        <w:t xml:space="preserve"> peut être pris en compte sans interrompre le déroulement visuel de la partie, puis affiché automatiquement dans </w:t>
+      </w:r>
+      <w:r>
+        <w:rPr>
+          <w:rFonts w:ascii="Times New Roman" w:hAnsi="Times New Roman" w:cs="Times New Roman"/>
+        </w:rPr>
+        <w:t>l'interface</w:t>
+      </w:r>
+      <w:r>
+        <w:rPr>
+          <w:rFonts w:ascii="Times New Roman" w:hAnsi="Times New Roman"/>
+        </w:rPr>
+        <w:t xml:space="preserve">. Cette collaboration </w:t>
+      </w:r>
+      <w:r>
+        <w:rPr>
+          <w:rFonts w:ascii="Times New Roman" w:hAnsi="Times New Roman" w:cs="Times New Roman"/>
+        </w:rPr>
+        <w:t>fluidifie l'expérience utilisateur</w:t>
+      </w:r>
+      <w:r>
+        <w:rPr>
+          <w:rFonts w:ascii="Times New Roman" w:hAnsi="Times New Roman"/>
+        </w:rPr>
+        <w:t xml:space="preserve"> tout en renforçant </w:t>
+      </w:r>
+      <w:r>
+        <w:rPr>
+          <w:rFonts w:ascii="Times New Roman" w:hAnsi="Times New Roman" w:cs="Times New Roman"/>
+        </w:rPr>
+        <w:t>la</w:t>
+      </w:r>
+      <w:r>
+        <w:rPr>
+          <w:rFonts w:ascii="Times New Roman" w:hAnsi="Times New Roman"/>
+        </w:rPr>
+        <w:t xml:space="preserve"> dimension stratégique</w:t>
+      </w:r>
+      <w:r>
+        <w:rPr>
+          <w:rFonts w:ascii="Times New Roman" w:hAnsi="Times New Roman" w:cs="Times New Roman"/>
+        </w:rPr>
+        <w:t xml:space="preserve"> du jeu. Cette séparation des responsabilités entre la couche d'affichage (</w:t>
+      </w:r>
+      <w:r>
+        <w:rPr>
+          <w:rFonts w:ascii="Times New Roman" w:hAnsi="Times New Roman"/>
+        </w:rPr>
+        <w:t>React</w:t>
+      </w:r>
+      <w:r>
+        <w:rPr>
+          <w:rFonts w:ascii="Times New Roman" w:hAnsi="Times New Roman" w:cs="Times New Roman"/>
+        </w:rPr>
+        <w:t>) et le moteur de décision (</w:t>
+      </w:r>
+      <w:r>
+        <w:rPr>
+          <w:rFonts w:ascii="Times New Roman" w:hAnsi="Times New Roman"/>
+        </w:rPr>
+        <w:t>MCTS</w:t>
+      </w:r>
+      <w:r>
+        <w:rPr>
+          <w:rFonts w:ascii="Times New Roman" w:hAnsi="Times New Roman" w:cs="Times New Roman"/>
+        </w:rPr>
+        <w:t xml:space="preserve">) correspond au patron d'architecture en couches, où chaque niveau remplit un rôle distinct sans dépendre de l'implémentation interne des autres </w:t>
+      </w:r>
+      <w:sdt>
+        <w:sdtPr>
+          <w:rPr>
+            <w:rFonts w:ascii="Times New Roman" w:hAnsi="Times New Roman" w:cs="Times New Roman"/>
+          </w:rPr>
+          <w:id w:val="34855850"/>
+          <w:citation/>
+        </w:sdtPr>
+        <w:sdtContent>
+          <w:r>
+            <w:rPr>
+              <w:rFonts w:ascii="Times New Roman" w:hAnsi="Times New Roman" w:cs="Times New Roman"/>
+            </w:rPr>
+            <w:fldChar w:fldCharType="begin"/>
+          </w:r>
+          <w:r>
+            <w:rPr>
+              <w:rFonts w:ascii="Times New Roman" w:hAnsi="Times New Roman" w:cs="Times New Roman"/>
+            </w:rPr>
+            <w:instrText xml:space="preserve"> CITATION Reb26 \l 3084 </w:instrText>
+          </w:r>
+          <w:r>
+            <w:rPr>
+              <w:rFonts w:ascii="Times New Roman" w:hAnsi="Times New Roman" w:cs="Times New Roman"/>
+            </w:rPr>
+            <w:fldChar w:fldCharType="separate"/>
+          </w:r>
+          <w:r>
+            <w:rPr>
+              <w:rFonts w:ascii="Times New Roman" w:hAnsi="Times New Roman" w:cs="Times New Roman"/>
+              <w:noProof/>
+            </w:rPr>
+            <w:t>(Murphey, 2026)</w:t>
+          </w:r>
+          <w:r>
+            <w:rPr>
+              <w:rFonts w:ascii="Times New Roman" w:hAnsi="Times New Roman" w:cs="Times New Roman"/>
+            </w:rPr>
+            <w:fldChar w:fldCharType="end"/>
+          </w:r>
+        </w:sdtContent>
+      </w:sdt>
+      <w:r>
+        <w:rPr>
+          <w:rFonts w:ascii="Times New Roman" w:hAnsi="Times New Roman"/>
+        </w:rPr>
+        <w:t>.</w:t>
+      </w:r>
+    </w:p>
+    <w:p>
+      <w:pPr>
+        <w:jc w:val="both"/>
+        <w:rPr>
+          <w:rFonts w:ascii="Times New Roman" w:hAnsi="Times New Roman" w:cs="Times New Roman"/>
+        </w:rPr>
       </w:pPr>
     </w:p>
     <w:p>
       <w:pPr>
         <w:pStyle w:val="Titre2"/>
       </w:pPr>
-    </w:p>
-    <w:p>
-      <w:pPr>
-        <w:pStyle w:val="Titre2"/>
-      </w:pPr>
-      <w:r>
-        <w:t>2.3 Liens et synergies entre les deux technologies</w:t>
+      <w:r>
+        <w:lastRenderedPageBreak/>
+        <w:t xml:space="preserve">2.4 Intérêt </w:t>
+      </w:r>
+      <w:r>
+        <w:t>général, interopérabilité</w:t>
+      </w:r>
+      <w:r>
+        <w:t xml:space="preserve"> et technologies similaires</w:t>
       </w:r>
     </w:p>
     <w:p>
@@ -1613,34 +2132,17 @@
           <w:sz w:val="24"/>
           <w:szCs w:val="24"/>
         </w:rPr>
-        <w:t>À première vue, React et le MCTS n’interviennent pas au même niveau dans L’Attaque : React s’occupe surtout de l’affichage et des interactions du joueur, alors que le MCTS sert à orienter les décisions de l’intelligence artificielle. Pourtant, leur intégration dans le projet montre une complémentarité concrète, puisque le coup calculé par l’IA peut être pris en compte sans interrompre le déroulement visuel de la partie, puis affiché automatiquement dans l’interface. Cette collaboration rend le jeu plus fluide pour l’utilisateur tout en renforçant sa dimension stratégique, car React rend visibles les effets des choix produits par le MCTS.</w:t>
-      </w:r>
-    </w:p>
-    <w:p>
-      <w:pPr>
-        <w:pStyle w:val="Titre2"/>
-      </w:pPr>
-      <w:r>
-        <w:t xml:space="preserve">2.4 Intérêt </w:t>
-      </w:r>
-      <w:r>
-        <w:t>général, interopérabilité</w:t>
-      </w:r>
-      <w:r>
-        <w:t xml:space="preserve"> et technologies similaires</w:t>
-      </w:r>
-    </w:p>
-    <w:p>
-      <w:pPr>
-        <w:pStyle w:val="Titre2"/>
-        <w:jc w:val="both"/>
+        <w:t xml:space="preserve">Au-delà de </w:t>
+      </w:r>
+      <w:r>
         <w:rPr>
           <w:rFonts w:ascii="Times New Roman" w:eastAsiaTheme="minorHAnsi" w:hAnsi="Times New Roman" w:cs="Times New Roman"/>
           <w:color w:val="auto"/>
           <w:sz w:val="24"/>
           <w:szCs w:val="24"/>
         </w:rPr>
-      </w:pPr>
+        <w:t>L'Attaque</w:t>
+      </w:r>
       <w:r>
         <w:rPr>
           <w:rFonts w:ascii="Times New Roman" w:eastAsiaTheme="minorHAnsi" w:hAnsi="Times New Roman" w:cs="Times New Roman"/>
@@ -1648,7 +2150,7 @@
           <w:sz w:val="24"/>
           <w:szCs w:val="24"/>
         </w:rPr>
-        <w:t xml:space="preserve">Au-delà de L’Attaque, ces deux technologies sont intéressantes parce qu’elles répondent à des besoins importants en informatique : React facilite la conception d’interfaces web modulaires et réactives, tandis que le MCTS aide à prendre des décisions efficaces dans des situations complexes où toutes les possibilités ne peuvent pas être explorées complètement. React conserve une place majeure dans le développement web </w:t>
+        <w:t xml:space="preserve">, ces deux technologies répondent à des besoins importants en informatique : React facilite la conception </w:t>
       </w:r>
       <w:r>
         <w:rPr>
@@ -1657,7 +2159,7 @@
           <w:sz w:val="24"/>
           <w:szCs w:val="24"/>
         </w:rPr>
-        <w:t xml:space="preserve">actuel </w:t>
+        <w:t>d'interfaces</w:t>
       </w:r>
       <w:r>
         <w:rPr>
@@ -1666,7 +2168,7 @@
           <w:sz w:val="24"/>
           <w:szCs w:val="24"/>
         </w:rPr>
-        <w:t>et continue d’évoluer avec React 19, ce qui confirme sa pertinence</w:t>
+        <w:t xml:space="preserve"> web modulaires et réactives, tandis que le MCTS </w:t>
       </w:r>
       <w:r>
         <w:rPr>
@@ -1675,7 +2177,7 @@
           <w:sz w:val="24"/>
           <w:szCs w:val="24"/>
         </w:rPr>
-        <w:t>.</w:t>
+        <w:t>permet de</w:t>
       </w:r>
       <w:r>
         <w:rPr>
@@ -1684,7 +2186,117 @@
           <w:sz w:val="24"/>
           <w:szCs w:val="24"/>
         </w:rPr>
-        <w:t xml:space="preserve"> De son côté, le MCTS reste une approche reconnue dans l’intelligence artificielle des jeux, mais son intérêt tient aussi à sa mise en œuvre pratique : dans L’Attaque, son implémentation en Python permet de structurer plus clairement la logique de recherche, de tester plus facilement les simulations et d’ajuster l’algorithme au comportement du jeu. On peut ainsi comparer React à Angular ou à Vue pour l’interface</w:t>
+        <w:t xml:space="preserve"> prendre des décisions efficaces dans des situations complexes où toutes les possibilités ne peuvent être explorées complètement.</w:t>
+      </w:r>
+      <w:r>
+        <w:rPr>
+          <w:rFonts w:ascii="Times New Roman" w:eastAsiaTheme="minorHAnsi" w:hAnsi="Times New Roman" w:cs="Times New Roman"/>
+          <w:color w:val="auto"/>
+          <w:sz w:val="24"/>
+          <w:szCs w:val="24"/>
+        </w:rPr>
+        <w:t xml:space="preserve"> </w:t>
+      </w:r>
+      <w:r>
+        <w:rPr>
+          <w:rFonts w:ascii="Times New Roman" w:eastAsiaTheme="minorHAnsi" w:hAnsi="Times New Roman" w:cs="Times New Roman"/>
+          <w:color w:val="auto"/>
+          <w:sz w:val="24"/>
+          <w:szCs w:val="24"/>
+        </w:rPr>
+        <w:t xml:space="preserve">React </w:t>
+      </w:r>
+      <w:r>
+        <w:rPr>
+          <w:rFonts w:ascii="Times New Roman" w:eastAsiaTheme="minorHAnsi" w:hAnsi="Times New Roman" w:cs="Times New Roman"/>
+          <w:color w:val="auto"/>
+          <w:sz w:val="24"/>
+          <w:szCs w:val="24"/>
+        </w:rPr>
+        <w:t>demeure</w:t>
+      </w:r>
+      <w:r>
+        <w:rPr>
+          <w:rFonts w:ascii="Times New Roman" w:eastAsiaTheme="minorHAnsi" w:hAnsi="Times New Roman" w:cs="Times New Roman"/>
+          <w:color w:val="auto"/>
+          <w:sz w:val="24"/>
+          <w:szCs w:val="24"/>
+        </w:rPr>
+        <w:t xml:space="preserve"> une </w:t>
+      </w:r>
+      <w:r>
+        <w:rPr>
+          <w:rFonts w:ascii="Times New Roman" w:eastAsiaTheme="minorHAnsi" w:hAnsi="Times New Roman" w:cs="Times New Roman"/>
+          <w:color w:val="auto"/>
+          <w:sz w:val="24"/>
+          <w:szCs w:val="24"/>
+        </w:rPr>
+        <w:t>technologie</w:t>
+      </w:r>
+      <w:r>
+        <w:rPr>
+          <w:rFonts w:ascii="Times New Roman" w:eastAsiaTheme="minorHAnsi" w:hAnsi="Times New Roman" w:cs="Times New Roman"/>
+          <w:color w:val="auto"/>
+          <w:sz w:val="24"/>
+          <w:szCs w:val="24"/>
+        </w:rPr>
+        <w:t xml:space="preserve"> web </w:t>
+      </w:r>
+      <w:r>
+        <w:rPr>
+          <w:rFonts w:ascii="Times New Roman" w:eastAsiaTheme="minorHAnsi" w:hAnsi="Times New Roman" w:cs="Times New Roman"/>
+          <w:color w:val="auto"/>
+          <w:sz w:val="24"/>
+          <w:szCs w:val="24"/>
+        </w:rPr>
+        <w:t>de référence, dont l'évolution</w:t>
+      </w:r>
+      <w:r>
+        <w:rPr>
+          <w:rFonts w:ascii="Times New Roman" w:eastAsiaTheme="minorHAnsi" w:hAnsi="Times New Roman" w:cs="Times New Roman"/>
+          <w:color w:val="auto"/>
+          <w:sz w:val="24"/>
+          <w:szCs w:val="24"/>
+        </w:rPr>
+        <w:t xml:space="preserve"> continue confirme sa pertinence.</w:t>
+      </w:r>
+      <w:r>
+        <w:rPr>
+          <w:rFonts w:ascii="Times New Roman" w:eastAsiaTheme="minorHAnsi" w:hAnsi="Times New Roman" w:cs="Times New Roman"/>
+          <w:color w:val="auto"/>
+          <w:sz w:val="24"/>
+          <w:szCs w:val="24"/>
+        </w:rPr>
+        <w:t xml:space="preserve"> </w:t>
+      </w:r>
+      <w:r>
+        <w:rPr>
+          <w:rFonts w:ascii="Times New Roman" w:eastAsiaTheme="minorHAnsi" w:hAnsi="Times New Roman" w:cs="Times New Roman"/>
+          <w:color w:val="auto"/>
+          <w:sz w:val="24"/>
+          <w:szCs w:val="24"/>
+        </w:rPr>
+        <w:t xml:space="preserve">De son côté, le MCTS reste une approche reconnue dans l’intelligence artificielle des jeux, mais son intérêt tient aussi à sa mise en œuvre pratique : dans L’Attaque, son implémentation en Python permet de structurer plus clairement la logique de recherche, de tester plus facilement les simulations et d’ajuster l’algorithme au comportement du jeu. On peut ainsi comparer React à </w:t>
+      </w:r>
+      <w:proofErr w:type="spellStart"/>
+      <w:r>
+        <w:rPr>
+          <w:rFonts w:ascii="Times New Roman" w:eastAsiaTheme="minorHAnsi" w:hAnsi="Times New Roman" w:cs="Times New Roman"/>
+          <w:color w:val="auto"/>
+          <w:sz w:val="24"/>
+          <w:szCs w:val="24"/>
+        </w:rPr>
+        <w:t>Angular</w:t>
+      </w:r>
+      <w:proofErr w:type="spellEnd"/>
+      <w:r>
+        <w:rPr>
+          <w:rFonts w:ascii="Times New Roman" w:eastAsiaTheme="minorHAnsi" w:hAnsi="Times New Roman" w:cs="Times New Roman"/>
+          <w:color w:val="auto"/>
+          <w:sz w:val="24"/>
+          <w:szCs w:val="24"/>
+        </w:rPr>
+        <w:t xml:space="preserve"> ou à Vue pour l’interface</w:t>
       </w:r>
       <w:r>
         <w:rPr>
@@ -1766,22 +2378,19 @@
       </w:r>
     </w:p>
     <w:p/>
-    <w:p/>
-    <w:p/>
     <w:p>
       <w:r>
         <w:rPr>
           <w:noProof/>
         </w:rPr>
-        <w:lastRenderedPageBreak/>
         <w:drawing>
-          <wp:anchor distT="0" distB="0" distL="114300" distR="114300" simplePos="0" relativeHeight="251659264" behindDoc="0" locked="0" layoutInCell="1" allowOverlap="1" wp14:anchorId="4B04B8A9" wp14:editId="7F9BA4B3">
+          <wp:anchor distT="0" distB="0" distL="114300" distR="114300" simplePos="0" relativeHeight="251659264" behindDoc="0" locked="0" layoutInCell="1" allowOverlap="1" wp14:anchorId="4B04B8A9" wp14:editId="026F6BE3">
             <wp:simplePos x="0" y="0"/>
             <wp:positionH relativeFrom="margin">
-              <wp:align>center</wp:align>
+              <wp:posOffset>1379402</wp:posOffset>
             </wp:positionH>
             <wp:positionV relativeFrom="paragraph">
-              <wp:posOffset>177165</wp:posOffset>
+              <wp:posOffset>87630</wp:posOffset>
             </wp:positionV>
             <wp:extent cx="2849880" cy="2173033"/>
             <wp:effectExtent l="0" t="0" r="7620" b="0"/>
@@ -1845,7 +2454,6 @@
     <w:p/>
     <w:p/>
     <w:p/>
-    <w:p/>
     <w:p>
       <w:r>
         <w:rPr>
@@ -1854,77 +2462,158 @@
         <mc:AlternateContent>
           <mc:Choice Requires="wps">
             <w:drawing>
-              <wp:inline distT="0" distB="0" distL="0" distR="0" wp14:anchorId="439FAD28" wp14:editId="23C48206">
-                <wp:extent cx="304800" cy="304800"/>
+              <wp:anchor distT="0" distB="0" distL="114300" distR="114300" simplePos="0" relativeHeight="251666432" behindDoc="0" locked="0" layoutInCell="1" allowOverlap="1" wp14:anchorId="061DEB22" wp14:editId="67EC4E90">
+                <wp:simplePos x="0" y="0"/>
+                <wp:positionH relativeFrom="column">
+                  <wp:posOffset>1379220</wp:posOffset>
+                </wp:positionH>
+                <wp:positionV relativeFrom="paragraph">
+                  <wp:posOffset>162902</wp:posOffset>
+                </wp:positionV>
+                <wp:extent cx="2849880" cy="635"/>
                 <wp:effectExtent l="0" t="0" r="0" b="0"/>
-                <wp:docPr id="3" name="Rectangle 3" descr="Image description"/>
-                <wp:cNvGraphicFramePr>
-                  <a:graphicFrameLocks xmlns:a="http://schemas.openxmlformats.org/drawingml/2006/main" noChangeAspect="1"/>
-                </wp:cNvGraphicFramePr>
+                <wp:wrapThrough wrapText="bothSides">
+                  <wp:wrapPolygon edited="0">
+                    <wp:start x="0" y="0"/>
+                    <wp:lineTo x="0" y="21600"/>
+                    <wp:lineTo x="21600" y="21600"/>
+                    <wp:lineTo x="21600" y="0"/>
+                  </wp:wrapPolygon>
+                </wp:wrapThrough>
+                <wp:docPr id="10" name="Zone de texte 10"/>
+                <wp:cNvGraphicFramePr/>
                 <a:graphic xmlns:a="http://schemas.openxmlformats.org/drawingml/2006/main">
                   <a:graphicData uri="http://schemas.microsoft.com/office/word/2010/wordprocessingShape">
                     <wps:wsp>
-                      <wps:cNvSpPr>
-                        <a:spLocks noChangeAspect="1" noChangeArrowheads="1"/>
-                      </wps:cNvSpPr>
-                      <wps:spPr bwMode="auto">
+                      <wps:cNvSpPr txBox="1"/>
+                      <wps:spPr>
                         <a:xfrm>
                           <a:off x="0" y="0"/>
-                          <a:ext cx="304800" cy="304800"/>
+                          <a:ext cx="2849880" cy="635"/>
                         </a:xfrm>
                         <a:prstGeom prst="rect">
                           <a:avLst/>
                         </a:prstGeom>
-                        <a:noFill/>
+                        <a:solidFill>
+                          <a:prstClr val="white"/>
+                        </a:solidFill>
                         <a:ln>
                           <a:noFill/>
                         </a:ln>
-                        <a:extLst>
-                          <a:ext uri="{909E8E84-426E-40DD-AFC4-6F175D3DCCD1}">
-                            <a14:hiddenFill xmlns:a14="http://schemas.microsoft.com/office/drawing/2010/main">
-                              <a:solidFill>
-                                <a:srgbClr val="FFFFFF"/>
-                              </a:solidFill>
-                            </a14:hiddenFill>
-                          </a:ext>
-                          <a:ext uri="{91240B29-F687-4F45-9708-019B960494DF}">
-                            <a14:hiddenLine xmlns:a14="http://schemas.microsoft.com/office/drawing/2010/main" w="9525">
-                              <a:solidFill>
-                                <a:srgbClr val="000000"/>
-                              </a:solidFill>
-                              <a:miter lim="800000"/>
-                              <a:headEnd/>
-                              <a:tailEnd/>
-                            </a14:hiddenLine>
-                          </a:ext>
-                        </a:extLst>
                       </wps:spPr>
-                      <wps:bodyPr rot="0" vert="horz" wrap="square" lIns="91440" tIns="45720" rIns="91440" bIns="45720" anchor="t" anchorCtr="0" upright="1">
-                        <a:noAutofit/>
+                      <wps:txbx>
+                        <w:txbxContent>
+                          <w:p>
+                            <w:pPr>
+                              <w:pStyle w:val="Lgende"/>
+                              <w:jc w:val="center"/>
+                              <w:rPr>
+                                <w:noProof/>
+                                <w:sz w:val="20"/>
+                                <w:szCs w:val="20"/>
+                              </w:rPr>
+                            </w:pPr>
+                            <w:r>
+                              <w:rPr>
+                                <w:sz w:val="20"/>
+                                <w:szCs w:val="20"/>
+                              </w:rPr>
+                              <w:t xml:space="preserve">Figure 4 : </w:t>
+                            </w:r>
+                            <w:r>
+                              <w:rPr>
+                                <w:sz w:val="20"/>
+                                <w:szCs w:val="20"/>
+                              </w:rPr>
+                              <w:t xml:space="preserve">React vs </w:t>
+                            </w:r>
+                            <w:proofErr w:type="spellStart"/>
+                            <w:r>
+                              <w:rPr>
+                                <w:sz w:val="20"/>
+                                <w:szCs w:val="20"/>
+                              </w:rPr>
+                              <w:t>Angular</w:t>
+                            </w:r>
+                            <w:proofErr w:type="spellEnd"/>
+                            <w:r>
+                              <w:rPr>
+                                <w:sz w:val="20"/>
+                                <w:szCs w:val="20"/>
+                              </w:rPr>
+                              <w:t xml:space="preserve"> — Tableau comparatif</w:t>
+                            </w:r>
+                          </w:p>
+                        </w:txbxContent>
+                      </wps:txbx>
+                      <wps:bodyPr rot="0" spcFirstLastPara="0" vertOverflow="overflow" horzOverflow="overflow" vert="horz" wrap="square" lIns="0" tIns="0" rIns="0" bIns="0" numCol="1" spcCol="0" rtlCol="0" fromWordArt="0" anchor="t" anchorCtr="0" forceAA="0" compatLnSpc="1">
+                        <a:prstTxWarp prst="textNoShape">
+                          <a:avLst/>
+                        </a:prstTxWarp>
+                        <a:spAutoFit/>
                       </wps:bodyPr>
                     </wps:wsp>
                   </a:graphicData>
                 </a:graphic>
-              </wp:inline>
+              </wp:anchor>
             </w:drawing>
           </mc:Choice>
           <mc:Fallback>
             <w:pict>
-              <v:rect w14:anchorId="26949FDD" id="Rectangle 3" o:spid="_x0000_s1026" alt="Image description" style="width:24pt;height:24pt;visibility:visible;mso-wrap-style:square;mso-left-percent:-10001;mso-top-percent:-10001;mso-position-horizontal:absolute;mso-position-horizontal-relative:char;mso-position-vertical:absolute;mso-position-vertical-relative:line;mso-left-percent:-10001;mso-top-percent:-10001;v-text-anchor:top" o:gfxdata="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" filled="f" stroked="f">
-                <o:lock v:ext="edit" aspectratio="t"/>
-                <w10:anchorlock/>
-              </v:rect>
+              <v:shape w14:anchorId="061DEB22" id="Zone de texte 10" o:spid="_x0000_s1028" type="#_x0000_t202" style="position:absolute;margin-left:108.6pt;margin-top:12.85pt;width:224.4pt;height:.05pt;z-index:251666432;visibility:visible;mso-wrap-style:square;mso-wrap-distance-left:9pt;mso-wrap-distance-top:0;mso-wrap-distance-right:9pt;mso-wrap-distance-bottom:0;mso-position-horizontal:absolute;mso-position-horizontal-relative:text;mso-position-vertical:absolute;mso-position-vertical-relative:text;v-text-anchor:top" o:gfxdata="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" stroked="f">
+                <v:textbox style="mso-fit-shape-to-text:t" inset="0,0,0,0">
+                  <w:txbxContent>
+                    <w:p>
+                      <w:pPr>
+                        <w:pStyle w:val="Lgende"/>
+                        <w:jc w:val="center"/>
+                        <w:rPr>
+                          <w:noProof/>
+                          <w:sz w:val="20"/>
+                          <w:szCs w:val="20"/>
+                        </w:rPr>
+                      </w:pPr>
+                      <w:r>
+                        <w:rPr>
+                          <w:sz w:val="20"/>
+                          <w:szCs w:val="20"/>
+                        </w:rPr>
+                        <w:t xml:space="preserve">Figure 4 : </w:t>
+                      </w:r>
+                      <w:r>
+                        <w:rPr>
+                          <w:sz w:val="20"/>
+                          <w:szCs w:val="20"/>
+                        </w:rPr>
+                        <w:t xml:space="preserve">React vs </w:t>
+                      </w:r>
+                      <w:proofErr w:type="spellStart"/>
+                      <w:r>
+                        <w:rPr>
+                          <w:sz w:val="20"/>
+                          <w:szCs w:val="20"/>
+                        </w:rPr>
+                        <w:t>Angular</w:t>
+                      </w:r>
+                      <w:proofErr w:type="spellEnd"/>
+                      <w:r>
+                        <w:rPr>
+                          <w:sz w:val="20"/>
+                          <w:szCs w:val="20"/>
+                        </w:rPr>
+                        <w:t xml:space="preserve"> — Tableau comparatif</w:t>
+                      </w:r>
+                    </w:p>
+                  </w:txbxContent>
+                </v:textbox>
+                <w10:wrap type="through"/>
+              </v:shape>
             </w:pict>
           </mc:Fallback>
         </mc:AlternateContent>
       </w:r>
-      <w:r>
-        <w:rPr>
-          <w:noProof/>
-        </w:rPr>
-        <w:t xml:space="preserve"> </w:t>
-      </w:r>
-    </w:p>
+    </w:p>
+    <w:p/>
     <w:p>
       <w:pPr>
         <w:pStyle w:val="Titre1"/>
@@ -1986,6 +2675,7 @@
         <w:rPr>
           <w:rFonts w:ascii="Times New Roman" w:hAnsi="Times New Roman" w:cs="Times New Roman"/>
         </w:rPr>
+        <w:lastRenderedPageBreak/>
         <w:t xml:space="preserve"> </w:t>
       </w:r>
       <w:r>
@@ -2087,7 +2777,6 @@
           <w:sz w:val="24"/>
           <w:szCs w:val="24"/>
         </w:rPr>
-        <w:lastRenderedPageBreak/>
         <w:t>Quant à leur avenir, React et le MCTS devraient rester pertinents dans les années à venir. React continue d’évoluer, même si les aspects client-serveur de son écosystème, comme les Server Components ou Next.js, n’ont pas été abordés dans notre projet. De son côté, le MCTS demeure une méthode efficace pour explorer de grands espaces de décision en conciliant exploration et exploitation</w:t>
       </w:r>
       <w:r>
@@ -2349,6 +3038,7 @@
                   <w:noProof/>
                   <w:lang w:val="en-CA"/>
                 </w:rPr>
+                <w:lastRenderedPageBreak/>
                 <w:t xml:space="preserve">Chaslot, G. M.-B. (2008, Volume 4). PROGRESSIVE STRATEGIES FOR MONTE-CARLO TREE SEARCH. </w:t>
               </w:r>
               <w:r>
@@ -2516,7 +3206,6 @@
                   <w:noProof/>
                   <w:lang w:val="en-CA"/>
                 </w:rPr>
-                <w:lastRenderedPageBreak/>
                 <w:t xml:space="preserve">freecodecamp.org. (2026, 03 27). </w:t>
               </w:r>
               <w:r>
@@ -2797,7 +3486,14 @@
                 <w:rPr>
                   <w:noProof/>
                 </w:rPr>
-                <w:t>. Récupéré sur https://developer.mozilla.org/fr/docs/Learn_web_development/Core/Frameworks_libraries/React_getting_started.</w:t>
+                <w:t xml:space="preserve">. Récupéré sur </w:t>
+              </w:r>
+              <w:r>
+                <w:rPr>
+                  <w:noProof/>
+                </w:rPr>
+                <w:lastRenderedPageBreak/>
+                <w:t>https://developer.mozilla.org/fr/docs/Learn_web_development/Core/Frameworks_libraries/React_getting_started.</w:t>
               </w:r>
             </w:p>
             <w:p>
@@ -2811,22 +3507,31 @@
               <w:r>
                 <w:rPr>
                   <w:noProof/>
-                </w:rPr>
-                <w:t xml:space="preserve">OpenAI. (2026). </w:t>
+                  <w:lang w:val="en-CA"/>
+                </w:rPr>
+                <w:t xml:space="preserve">Murphey, R. (2026, 05 20). </w:t>
               </w:r>
               <w:r>
                 <w:rPr>
                   <w:i/>
                   <w:iCs/>
                   <w:noProof/>
-                </w:rPr>
-                <w:t>ChatGPT.</w:t>
-              </w:r>
-              <w:r>
-                <w:rPr>
-                  <w:noProof/>
-                </w:rPr>
-                <w:t xml:space="preserve"> Récupéré sur https://chat.openai.com/</w:t>
+                  <w:lang w:val="en-CA"/>
+                </w:rPr>
+                <w:t>https://www.simform.com/blog/react-architecture-best-practices/</w:t>
+              </w:r>
+              <w:r>
+                <w:rPr>
+                  <w:noProof/>
+                  <w:lang w:val="en-CA"/>
+                </w:rPr>
+                <w:t xml:space="preserve">. </w:t>
+              </w:r>
+              <w:r>
+                <w:rPr>
+                  <w:noProof/>
+                </w:rPr>
+                <w:t xml:space="preserve">Récupéré sur https://www.simform.com/blog/react-architecture-best-practices/: </w:t>
               </w:r>
             </w:p>
             <w:p>
@@ -2841,29 +3546,21 @@
                 <w:rPr>
                   <w:noProof/>
                 </w:rPr>
-                <w:t xml:space="preserve">Perolat et al, J. (2022, Juin 30). </w:t>
+                <w:t xml:space="preserve">OpenAI. (2026). </w:t>
               </w:r>
               <w:r>
                 <w:rPr>
                   <w:i/>
                   <w:iCs/>
                   <w:noProof/>
-                  <w:lang w:val="en-CA"/>
-                </w:rPr>
-                <w:t>Mastering the Game of Stratego with Model-Free Multiagent Reinforcement Learning</w:t>
-              </w:r>
-              <w:r>
-                <w:rPr>
-                  <w:noProof/>
-                  <w:lang w:val="en-CA"/>
-                </w:rPr>
-                <w:t xml:space="preserve">. </w:t>
-              </w:r>
-              <w:r>
-                <w:rPr>
-                  <w:noProof/>
-                </w:rPr>
-                <w:t>Récupéré sur arxiv.com: https://arxiv.org/pdf/2206.15378</w:t>
+                </w:rPr>
+                <w:t>ChatGPT.</w:t>
+              </w:r>
+              <w:r>
+                <w:rPr>
+                  <w:noProof/>
+                </w:rPr>
+                <w:t xml:space="preserve"> Récupéré sur https://chat.openai.com/</w:t>
               </w:r>
             </w:p>
             <w:p>
@@ -2878,28 +3575,29 @@
                 <w:rPr>
                   <w:noProof/>
                 </w:rPr>
-                <w:t xml:space="preserve">Świechowski, M. G. (2022, July 19). </w:t>
-              </w:r>
-              <w:r>
-                <w:rPr>
-                  <w:noProof/>
-                  <w:lang w:val="en-CA"/>
-                </w:rPr>
-                <w:t xml:space="preserve">Monte Carlo Tree Search: a review of recent modifications and applications. </w:t>
+                <w:t xml:space="preserve">Perolat et al, J. (2022, Juin 30). </w:t>
               </w:r>
               <w:r>
                 <w:rPr>
                   <w:i/>
                   <w:iCs/>
                   <w:noProof/>
-                </w:rPr>
-                <w:t>Open Access</w:t>
-              </w:r>
-              <w:r>
-                <w:rPr>
-                  <w:noProof/>
-                </w:rPr>
-                <w:t>, pp. 2497-2652.</w:t>
+                  <w:lang w:val="en-CA"/>
+                </w:rPr>
+                <w:t>Mastering the Game of Stratego with Model-Free Multiagent Reinforcement Learning</w:t>
+              </w:r>
+              <w:r>
+                <w:rPr>
+                  <w:noProof/>
+                  <w:lang w:val="en-CA"/>
+                </w:rPr>
+                <w:t xml:space="preserve">. </w:t>
+              </w:r>
+              <w:r>
+                <w:rPr>
+                  <w:noProof/>
+                </w:rPr>
+                <w:t>Récupéré sur arxiv.com: https://arxiv.org/pdf/2206.15378</w:t>
               </w:r>
             </w:p>
             <w:p>
@@ -2914,7 +3612,14 @@
                 <w:rPr>
                   <w:noProof/>
                 </w:rPr>
-                <w:t xml:space="preserve">Turcotte, M. (2025, Décembre 1). </w:t>
+                <w:t xml:space="preserve">Świechowski, M. G. (2022, July 19). </w:t>
+              </w:r>
+              <w:r>
+                <w:rPr>
+                  <w:noProof/>
+                  <w:lang w:val="en-CA"/>
+                </w:rPr>
+                <w:t xml:space="preserve">Monte Carlo Tree Search: a review of recent modifications and applications. </w:t>
               </w:r>
               <w:r>
                 <w:rPr>
@@ -2922,13 +3627,13 @@
                   <w:iCs/>
                   <w:noProof/>
                 </w:rPr>
-                <w:t>CSI 4106: Introduction to Artificial Intelligence.</w:t>
-              </w:r>
-              <w:r>
-                <w:rPr>
-                  <w:noProof/>
-                </w:rPr>
-                <w:t xml:space="preserve"> Récupéré sur turcotte.xyz: https://turcotte.xyz/teaching/csi-4106/lectures/22/slides.html?q=monte#/monte-carlo-tree-search-mcts</w:t>
+                <w:t>Open Access</w:t>
+              </w:r>
+              <w:r>
+                <w:rPr>
+                  <w:noProof/>
+                </w:rPr>
+                <w:t>, pp. 2497-2652.</w:t>
               </w:r>
             </w:p>
             <w:p>
@@ -2937,6 +3642,35 @@
                 <w:ind w:left="720" w:hanging="720"/>
                 <w:rPr>
                   <w:noProof/>
+                </w:rPr>
+              </w:pPr>
+              <w:r>
+                <w:rPr>
+                  <w:noProof/>
+                </w:rPr>
+                <w:t xml:space="preserve">Turcotte, M. (2025, Décembre 1). </w:t>
+              </w:r>
+              <w:r>
+                <w:rPr>
+                  <w:i/>
+                  <w:iCs/>
+                  <w:noProof/>
+                </w:rPr>
+                <w:t>CSI 4106: Introduction to Artificial Intelligence.</w:t>
+              </w:r>
+              <w:r>
+                <w:rPr>
+                  <w:noProof/>
+                </w:rPr>
+                <w:t xml:space="preserve"> Récupéré sur turcotte.xyz: https://turcotte.xyz/teaching/csi-4106/lectures/22/slides.html?q=monte#/monte-carlo-tree-search-mcts</w:t>
+              </w:r>
+            </w:p>
+            <w:p>
+              <w:pPr>
+                <w:pStyle w:val="Bibliographie"/>
+                <w:ind w:left="720" w:hanging="720"/>
+                <w:rPr>
+                  <w:noProof/>
                   <w:lang w:val="en-CA"/>
                 </w:rPr>
               </w:pPr>
@@ -2945,7 +3679,6 @@
                   <w:noProof/>
                   <w:lang w:val="en-CA"/>
                 </w:rPr>
-                <w:lastRenderedPageBreak/>
                 <w:t xml:space="preserve">Vodopivec, T., Samothrakis, S., &amp; Ster, B. (2017). On Monte Carlo Tree Search and Reinforcement Learning. </w:t>
               </w:r>
               <w:r>
@@ -3015,7 +3748,8 @@
       </w:sdtContent>
     </w:sdt>
     <w:sectPr>
-      <w:footerReference w:type="default" r:id="rId12"/>
+      <w:headerReference w:type="default" r:id="rId12"/>
+      <w:footerReference w:type="default" r:id="rId13"/>
       <w:pgSz w:w="12240" w:h="15840"/>
       <w:pgMar w:top="709" w:right="1800" w:bottom="993" w:left="1800" w:header="708" w:footer="0" w:gutter="0"/>
       <w:pgNumType w:start="0"/>
@@ -3122,6 +3856,16 @@
 </w:footnotes>
 </file>
 
+<file path=word/header1.xml><?xml version="1.0" encoding="utf-8"?>
+<w:hdr xmlns:wpc="http://schemas.microsoft.com/office/word/2010/wordprocessingCanvas" xmlns:cx="http://schemas.microsoft.com/office/drawing/2014/chartex" xmlns:cx1="http://schemas.microsoft.com/office/drawing/2015/9/8/chartex" xmlns:cx2="http://schemas.microsoft.com/office/drawing/2015/10/21/chartex" xmlns:cx3="http://schemas.microsoft.com/office/drawing/2016/5/9/chartex" xmlns:cx4="http://schemas.microsoft.com/office/drawing/2016/5/10/chartex" xmlns:cx5="http://schemas.microsoft.com/office/drawing/2016/5/11/chartex" xmlns:cx6="http://schemas.microsoft.com/office/drawing/2016/5/12/chartex" xmlns:cx7="http://schemas.microsoft.com/office/drawing/2016/5/13/chartex" xmlns:cx8="http://schemas.microsoft.com/office/drawing/2016/5/14/chartex" xmlns:mc="http://schemas.openxmlformats.org/markup-compatibility/2006" xmlns:aink="http://schemas.microsoft.com/office/drawing/2016/ink" xmlns:am3d="http://schemas.microsoft.com/office/drawing/2017/model3d" xmlns:o="urn:schemas-microsoft-com:office:office" xmlns:oel="http://schemas.microsoft.com/office/2019/extlst" xmlns:r="http://schemas.openxmlformats.org/officeDocument/2006/relationships" xmlns:m="http://schemas.openxmlformats.org/officeDocument/2006/math" xmlns:v="urn:schemas-microsoft-com:vml" xmlns:wp14="http://schemas.microsoft.com/office/word/2010/wordprocessingDrawing" xmlns:wp="http://schemas.openxmlformats.org/drawingml/2006/wordprocessingDrawing" xmlns:w10="urn:schemas-microsoft-com:office:word" xmlns:w="http://schemas.openxmlformats.org/wordprocessingml/2006/main" xmlns:w14="http://schemas.microsoft.com/office/word/2010/wordml" xmlns:w15="http://schemas.microsoft.com/office/word/2012/wordml" xmlns:w16cex="http://schemas.microsoft.com/office/word/2018/wordml/cex" xmlns:w16cid="http://schemas.microsoft.com/office/word/2016/wordml/cid" xmlns:w16="http://schemas.microsoft.com/office/word/2018/wordml" xmlns:w16du="http://schemas.microsoft.com/office/word/2023/wordml/word16du" xmlns:w16sdtdh="http://schemas.microsoft.com/office/word/2020/wordml/sdtdatahash" xmlns:w16sdtfl="http://schemas.microsoft.com/office/word/2024/wordml/sdtformatlock" xmlns:w16se="http://schemas.microsoft.com/office/word/2015/wordml/symex" xmlns:wpg="http://schemas.microsoft.com/office/word/2010/wordprocessingGroup" xmlns:wpi="http://schemas.microsoft.com/office/word/2010/wordprocessingInk" xmlns:wne="http://schemas.microsoft.com/office/word/2006/wordml" xmlns:wps="http://schemas.microsoft.com/office/word/2010/wordprocessingShape" mc:Ignorable="w14 w15 w16se w16cid w16 w16cex w16sdtdh w16sdtfl w16du wp14">
+  <w:p>
+    <w:pPr>
+      <w:pStyle w:val="En-tte"/>
+    </w:pPr>
+  </w:p>
+</w:hdr>
+</file>
+
 <file path=word/numbering.xml><?xml version="1.0" encoding="utf-8"?>
 <w:numbering xmlns:wpc="http://schemas.microsoft.com/office/word/2010/wordprocessingCanvas" xmlns:cx="http://schemas.microsoft.com/office/drawing/2014/chartex" xmlns:cx1="http://schemas.microsoft.com/office/drawing/2015/9/8/chartex" xmlns:cx2="http://schemas.microsoft.com/office/drawing/2015/10/21/chartex" xmlns:cx3="http://schemas.microsoft.com/office/drawing/2016/5/9/chartex" xmlns:cx4="http://schemas.microsoft.com/office/drawing/2016/5/10/chartex" xmlns:cx5="http://schemas.microsoft.com/office/drawing/2016/5/11/chartex" xmlns:cx6="http://schemas.microsoft.com/office/drawing/2016/5/12/chartex" xmlns:cx7="http://schemas.microsoft.com/office/drawing/2016/5/13/chartex" xmlns:cx8="http://schemas.microsoft.com/office/drawing/2016/5/14/chartex" xmlns:mc="http://schemas.openxmlformats.org/markup-compatibility/2006" xmlns:aink="http://schemas.microsoft.com/office/drawing/2016/ink" xmlns:am3d="http://schemas.microsoft.com/office/drawing/2017/model3d" xmlns:o="urn:schemas-microsoft-com:office:office" xmlns:oel="http://schemas.microsoft.com/office/2019/extlst" xmlns:r="http://schemas.openxmlformats.org/officeDocument/2006/relationships" xmlns:m="http://schemas.openxmlformats.org/officeDocument/2006/math" xmlns:v="urn:schemas-microsoft-com:vml" xmlns:wp14="http://schemas.microsoft.com/office/word/2010/wordprocessingDrawing" xmlns:wp="http://schemas.openxmlformats.org/drawingml/2006/wordprocessingDrawing" xmlns:w10="urn:schemas-microsoft-com:office:word" xmlns:w="http://schemas.openxmlformats.org/wordprocessingml/2006/main" xmlns:w14="http://schemas.microsoft.com/office/word/2010/wordml" xmlns:w15="http://schemas.microsoft.com/office/word/2012/wordml" xmlns:w16cex="http://schemas.microsoft.com/office/word/2018/wordml/cex" xmlns:w16cid="http://schemas.microsoft.com/office/word/2016/wordml/cid" xmlns:w16="http://schemas.microsoft.com/office/word/2018/wordml" xmlns:w16du="http://schemas.microsoft.com/office/word/2023/wordml/word16du" xmlns:w16sdtdh="http://schemas.microsoft.com/office/word/2020/wordml/sdtdatahash" xmlns:w16sdtfl="http://schemas.microsoft.com/office/word/2024/wordml/sdtformatlock" xmlns:w16se="http://schemas.microsoft.com/office/word/2015/wordml/symex" xmlns:wpg="http://schemas.microsoft.com/office/word/2010/wordprocessingGroup" xmlns:wpi="http://schemas.microsoft.com/office/word/2010/wordprocessingInk" xmlns:wne="http://schemas.microsoft.com/office/word/2006/wordml" xmlns:wps="http://schemas.microsoft.com/office/word/2010/wordprocessingShape" mc:Ignorable="w14 w15 w16se w16cid w16 w16cex w16sdtdh w16sdtfl w16du wp14">
   <w:abstractNum w:abstractNumId="0" w15:restartNumberingAfterBreak="0">
@@ -4422,34 +5166,34 @@
       </w:rPr>
     </w:lvl>
   </w:abstractNum>
-  <w:num w:numId="1" w16cid:durableId="532807924">
+  <w:num w:numId="1" w16cid:durableId="1476142290">
     <w:abstractNumId w:val="2"/>
   </w:num>
-  <w:num w:numId="2" w16cid:durableId="1063022845">
+  <w:num w:numId="2" w16cid:durableId="1847743187">
     <w:abstractNumId w:val="5"/>
   </w:num>
-  <w:num w:numId="3" w16cid:durableId="1096099151">
+  <w:num w:numId="3" w16cid:durableId="1104959789">
     <w:abstractNumId w:val="9"/>
   </w:num>
-  <w:num w:numId="4" w16cid:durableId="1342589655">
+  <w:num w:numId="4" w16cid:durableId="1906867327">
     <w:abstractNumId w:val="3"/>
   </w:num>
-  <w:num w:numId="5" w16cid:durableId="2075620790">
+  <w:num w:numId="5" w16cid:durableId="1122503358">
     <w:abstractNumId w:val="8"/>
   </w:num>
-  <w:num w:numId="6" w16cid:durableId="1728914265">
+  <w:num w:numId="6" w16cid:durableId="499857161">
     <w:abstractNumId w:val="4"/>
   </w:num>
-  <w:num w:numId="7" w16cid:durableId="671614539">
+  <w:num w:numId="7" w16cid:durableId="1224878240">
     <w:abstractNumId w:val="7"/>
   </w:num>
-  <w:num w:numId="8" w16cid:durableId="1044716997">
+  <w:num w:numId="8" w16cid:durableId="1812750036">
     <w:abstractNumId w:val="0"/>
   </w:num>
-  <w:num w:numId="9" w16cid:durableId="2143964954">
+  <w:num w:numId="9" w16cid:durableId="469593790">
     <w:abstractNumId w:val="1"/>
   </w:num>
-  <w:num w:numId="10" w16cid:durableId="88700415">
+  <w:num w:numId="10" w16cid:durableId="947275970">
     <w:abstractNumId w:val="6"/>
   </w:num>
 </w:numbering>
@@ -5673,6 +6417,16 @@
       <w14:ligatures w14:val="none"/>
     </w:rPr>
   </w:style>
+  <w:style w:type="paragraph" w:styleId="Rvision">
+    <w:name w:val="Revision"/>
+    <w:hidden/>
+    <w:uiPriority w:val="99"/>
+    <w:semiHidden/>
+    <w:rsid w:val="002D7804"/>
+    <w:pPr>
+      <w:spacing w:after="0" w:line="240" w:lineRule="auto"/>
+    </w:pPr>
+  </w:style>
 </w:styles>
 </file>
 
@@ -6007,7 +6761,7 @@
     <b:Month>30</b:Month>
     <b:Day>01</b:Day>
     <b:InternetSiteTitle>https://react.dev/reference/react</b:InternetSiteTitle>
-    <b:RefOrder>4</b:RefOrder>
+    <b:RefOrder>5</b:RefOrder>
   </b:Source>
   <b:Source>
     <b:Tag>htt26</b:Tag>
@@ -6022,7 +6776,7 @@
         <b:Corporate>Geeksforgeeks</b:Corporate>
       </b:Author>
     </b:Author>
-    <b:RefOrder>5</b:RefOrder>
+    <b:RefOrder>6</b:RefOrder>
   </b:Source>
   <b:Source>
     <b:Tag>w3s26</b:Tag>
@@ -6038,7 +6792,7 @@
     <b:Month>01</b:Month>
     <b:Day>30</b:Day>
     <b:InternetSiteTitle>https://www.w3schools.com/REACT/default.asp</b:InternetSiteTitle>
-    <b:RefOrder>6</b:RefOrder>
+    <b:RefOrder>7</b:RefOrder>
   </b:Source>
   <b:Source xmlns:b="http://schemas.openxmlformats.org/officeDocument/2006/bibliography">
     <b:Tag>gra26</b:Tag>
@@ -6054,7 +6808,7 @@
     <b:Month>01</b:Month>
     <b:Day>30</b:Day>
     <b:Title>Apprendre React</b:Title>
-    <b:RefOrder>7</b:RefOrder>
+    <b:RefOrder>8</b:RefOrder>
   </b:Source>
   <b:Source>
     <b:Tag>mik26</b:Tag>
@@ -6070,7 +6824,7 @@
     <b:InternetSiteTitle>https://blog.mikecodeur.com/post/getting-started-with-react-and-vite-the-complete-guide</b:InternetSiteTitle>
     <b:Month>03</b:Month>
     <b:Day>27</b:Day>
-    <b:RefOrder>8</b:RefOrder>
+    <b:RefOrder>9</b:RefOrder>
   </b:Source>
   <b:Source>
     <b:Tag>Fla26</b:Tag>
@@ -6086,7 +6840,7 @@
     <b:Month>27</b:Month>
     <b:Day>03</b:Day>
     <b:InternetSiteTitle>https://www.premieroctet.com/blog/nouveautes-react-19</b:InternetSiteTitle>
-    <b:RefOrder>9</b:RefOrder>
+    <b:RefOrder>10</b:RefOrder>
   </b:Source>
   <b:Source>
     <b:Tag>Cop26</b:Tag>
@@ -6104,7 +6858,7 @@
         </b:NameList>
       </b:Author>
     </b:Author>
-    <b:RefOrder>10</b:RefOrder>
+    <b:RefOrder>11</b:RefOrder>
   </b:Source>
   <b:Source>
     <b:Tag>moz26</b:Tag>
@@ -6124,7 +6878,7 @@
         </b:NameList>
       </b:Author>
     </b:Author>
-    <b:RefOrder>11</b:RefOrder>
+    <b:RefOrder>12</b:RefOrder>
   </b:Source>
   <b:Source>
     <b:Tag>fre26</b:Tag>
@@ -6144,7 +6898,7 @@
     <b:Year>2026</b:Year>
     <b:Month>03</b:Month>
     <b:Day>27</b:Day>
-    <b:RefOrder>12</b:RefOrder>
+    <b:RefOrder>13</b:RefOrder>
   </b:Source>
   <b:Source>
     <b:Tag>blo26</b:Tag>
@@ -6164,7 +6918,7 @@
     <b:Year>2026</b:Year>
     <b:Month>27</b:Month>
     <b:Day>03</b:Day>
-    <b:RefOrder>13</b:RefOrder>
+    <b:RefOrder>14</b:RefOrder>
   </b:Source>
   <b:Source>
     <b:Tag>Ken26</b:Tag>
@@ -6208,7 +6962,7 @@
     <b:Month>05</b:Month>
     <b:Day>04</b:Day>
     <b:URL>https://dev.to/08ayush/what-is-the-difference-between-angular-and-reactjs-and-which-is-best-to-use-for-building-a-website-4h8b</b:URL>
-    <b:RefOrder>3</b:RefOrder>
+    <b:RefOrder>4</b:RefOrder>
   </b:Source>
   <b:Source>
     <b:Tag>Ope26</b:Tag>
@@ -6245,7 +6999,7 @@
         </b:NameList>
       </b:Author>
     </b:Author>
-    <b:RefOrder>14</b:RefOrder>
+    <b:RefOrder>15</b:RefOrder>
   </b:Source>
   <b:Source>
     <b:Tag>Sil16</b:Tag>
@@ -6267,7 +7021,7 @@
     <b:PeriodicalTitle>New Mathematics and Natural Computation</b:PeriodicalTitle>
     <b:Month>Volume 4</b:Month>
     <b:Pages>343-357</b:Pages>
-    <b:RefOrder>15</b:RefOrder>
+    <b:RefOrder>16</b:RefOrder>
   </b:Source>
   <b:Source>
     <b:Tag>Pet12</b:Tag>
@@ -6296,7 +7050,7 @@
     <b:Year>2012</b:Year>
     <b:Month>September</b:Month>
     <b:URL>https://mcts.ai/code/python.html</b:URL>
-    <b:RefOrder>16</b:RefOrder>
+    <b:RefOrder>17</b:RefOrder>
   </b:Source>
   <b:Source>
     <b:Tag>Gee26</b:Tag>
@@ -6319,7 +7073,7 @@
     <b:Month>01</b:Month>
     <b:Day>30</b:Day>
     <b:URL>https://www.geeksforgeeks.org/machine-learning/monte-carlo-tree-search-mcts-in-machine-learning/</b:URL>
-    <b:RefOrder>17</b:RefOrder>
+    <b:RefOrder>18</b:RefOrder>
   </b:Source>
   <b:Source>
     <b:Tag>Lan14</b:Tag>
@@ -6342,7 +7096,7 @@
     </b:Author>
     <b:InternetSiteTitle>arxiv</b:InternetSiteTitle>
     <b:URL>https://arxiv.org/abs/1406.0486?utm_source=chatgpt.com</b:URL>
-    <b:RefOrder>18</b:RefOrder>
+    <b:RefOrder>19</b:RefOrder>
   </b:Source>
   <b:Source>
     <b:Tag>Lor16</b:Tag>
@@ -6363,7 +7117,7 @@
     <b:Year>2016</b:Year>
     <b:Month>September</b:Month>
     <b:Pages>106-113</b:Pages>
-    <b:RefOrder>19</b:RefOrder>
+    <b:RefOrder>20</b:RefOrder>
   </b:Source>
   <b:Source>
     <b:Tag>Ach25</b:Tag>
@@ -6389,7 +7143,7 @@
         </b:NameList>
       </b:Author>
     </b:Author>
-    <b:RefOrder>20</b:RefOrder>
+    <b:RefOrder>21</b:RefOrder>
   </b:Source>
   <b:Source>
     <b:Tag>Jul22</b:Tag>
@@ -6411,7 +7165,7 @@
     <b:Month>Juin</b:Month>
     <b:Day>30</b:Day>
     <b:URL>https://arxiv.org/pdf/2206.15378</b:URL>
-    <b:RefOrder>21</b:RefOrder>
+    <b:RefOrder>22</b:RefOrder>
   </b:Source>
   <b:Source>
     <b:Tag>Świ22</b:Tag>
@@ -6434,7 +7188,7 @@
     <b:PeriodicalTitle>Open Access</b:PeriodicalTitle>
     <b:Month>July</b:Month>
     <b:Day>19</b:Day>
-    <b:RefOrder>22</b:RefOrder>
+    <b:RefOrder>23</b:RefOrder>
   </b:Source>
   <b:Source>
     <b:Tag>Mar25</b:Tag>
@@ -6456,7 +7210,30 @@
         </b:NameList>
       </b:Author>
     </b:Author>
-    <b:RefOrder>23</b:RefOrder>
+    <b:RefOrder>24</b:RefOrder>
+  </b:Source>
+  <b:Source>
+    <b:Tag>Reb26</b:Tag>
+    <b:SourceType>InternetSite</b:SourceType>
+    <b:Guid>{0722F40F-8B55-43E6-907E-C73100C54550}</b:Guid>
+    <b:Author>
+      <b:Author>
+        <b:NameList>
+          <b:Person>
+            <b:Last>Murphey</b:Last>
+            <b:First>Rebecca</b:First>
+          </b:Person>
+        </b:NameList>
+      </b:Author>
+    </b:Author>
+    <b:Title>https://www.simform.com/blog/react-architecture-best-practices/</b:Title>
+    <b:InternetSiteTitle>https://www.simform.com/blog/react-architecture-best-practices/</b:InternetSiteTitle>
+    <b:Year>2026</b:Year>
+    <b:Month>05</b:Month>
+    <b:Day>20</b:Day>
+    <b:URL>
+		</b:URL>
+    <b:RefOrder>3</b:RefOrder>
   </b:Source>
   <b:Source>
     <b:Tag>Vod17</b:Tag>
@@ -6484,13 +7261,13 @@
       </b:Author>
     </b:Author>
     <b:JournalName>Journal of Artificial Intelligence Research</b:JournalName>
-    <b:RefOrder>24</b:RefOrder>
+    <b:RefOrder>25</b:RefOrder>
   </b:Source>
 </b:Sources>
 </file>
 
 <file path=customXml/itemProps1.xml><?xml version="1.0" encoding="utf-8"?>
-<ds:datastoreItem xmlns:ds="http://schemas.openxmlformats.org/officeDocument/2006/customXml" ds:itemID="{B99D96C0-EF57-4E69-A4D2-5D74985064FD}">
+<ds:datastoreItem xmlns:ds="http://schemas.openxmlformats.org/officeDocument/2006/customXml" ds:itemID="{947E253D-71FB-4CD6-A0BB-C6C2143755D6}">
   <ds:schemaRefs>
     <ds:schemaRef ds:uri="http://schemas.openxmlformats.org/officeDocument/2006/bibliography"/>
   </ds:schemaRefs>

</xml_diff>

<commit_message>
retrait de sources tp3 veille
</commit_message>
<xml_diff>
--- a/brouillon-veille/Brouillon_Projet_3.docx
+++ b/brouillon-veille/Brouillon_Projet_3.docx
@@ -371,16 +371,7 @@
         <w:jc w:val="both"/>
       </w:pPr>
       <w:r>
-        <w:t>L'Attaque</w:t>
-      </w:r>
-      <w:r>
-        <w:t xml:space="preserve"> est un jeu de plateau web multijoueur inspiré de Stratego, </w:t>
-      </w:r>
-      <w:r>
-        <w:t xml:space="preserve">avec </w:t>
-      </w:r>
-      <w:r>
-        <w:t>une interface React et une logique serveur en Python/Flask.</w:t>
+        <w:t>L'Attaque est un jeu de plateau web multijoueur inspiré de Stratego, avec une interface React et une logique serveur en Python/Flask.</w:t>
       </w:r>
       <w:r>
         <w:t xml:space="preserve"> </w:t>
@@ -677,22 +668,22 @@
           <w:lang w:eastAsia="fr-CA"/>
         </w:rPr>
         <w:drawing>
-          <wp:anchor distT="0" distB="0" distL="114300" distR="114300" simplePos="0" relativeHeight="251660288" behindDoc="0" locked="0" layoutInCell="1" allowOverlap="1" wp14:anchorId="3D460912" wp14:editId="1C9AAE89">
+          <wp:anchor distT="0" distB="0" distL="114300" distR="114300" simplePos="0" relativeHeight="251660288" behindDoc="0" locked="0" layoutInCell="1" allowOverlap="1" wp14:anchorId="3D460912" wp14:editId="2E6C5790">
             <wp:simplePos x="0" y="0"/>
             <wp:positionH relativeFrom="margin">
               <wp:align>center</wp:align>
             </wp:positionH>
             <wp:positionV relativeFrom="paragraph">
-              <wp:posOffset>83820</wp:posOffset>
+              <wp:posOffset>88900</wp:posOffset>
             </wp:positionV>
-            <wp:extent cx="4124325" cy="2668270"/>
-            <wp:effectExtent l="0" t="0" r="9525" b="0"/>
+            <wp:extent cx="3381375" cy="2187575"/>
+            <wp:effectExtent l="0" t="0" r="9525" b="3175"/>
             <wp:wrapThrough wrapText="bothSides">
               <wp:wrapPolygon edited="0">
                 <wp:start x="0" y="0"/>
-                <wp:lineTo x="0" y="21436"/>
-                <wp:lineTo x="21550" y="21436"/>
-                <wp:lineTo x="21550" y="0"/>
+                <wp:lineTo x="0" y="21443"/>
+                <wp:lineTo x="21539" y="21443"/>
+                <wp:lineTo x="21539" y="0"/>
                 <wp:lineTo x="0" y="0"/>
               </wp:wrapPolygon>
             </wp:wrapThrough>
@@ -722,7 +713,7 @@
                   <pic:spPr>
                     <a:xfrm>
                       <a:off x="0" y="0"/>
-                      <a:ext cx="4124325" cy="2668270"/>
+                      <a:ext cx="3381375" cy="2187575"/>
                     </a:xfrm>
                     <a:prstGeom prst="rect">
                       <a:avLst/>
@@ -966,6 +957,7 @@
     </w:p>
     <w:p>
       <w:pPr>
+        <w:jc w:val="center"/>
         <w:rPr>
           <w:rFonts w:ascii="Times New Roman" w:eastAsia="Times New Roman" w:hAnsi="Times New Roman" w:cs="Times New Roman"/>
           <w:kern w:val="0"/>
@@ -1072,7 +1064,9 @@
                         </a:ln>
                       </wps:spPr>
                       <wps:txbx>
-                        <w:txbxContent/>
+                        <w:txbxContent>
+                          <w:p/>
+                        </w:txbxContent>
                       </wps:txbx>
                       <wps:bodyPr rot="0" spcFirstLastPara="0" vertOverflow="overflow" horzOverflow="overflow" vert="horz" wrap="square" lIns="0" tIns="0" rIns="0" bIns="0" numCol="1" spcCol="0" rtlCol="0" fromWordArt="0" anchor="t" anchorCtr="0" forceAA="0" compatLnSpc="1">
                         <a:prstTxWarp prst="textNoShape">
@@ -1094,7 +1088,9 @@
               </v:shapetype>
               <v:shape id="Zone de texte 9" o:spid="_x0000_s1026" type="#_x0000_t202" style="position:absolute;margin-left:53.25pt;margin-top:1.9pt;width:324.75pt;height:.05pt;z-index:251662336;visibility:visible;mso-wrap-style:square;mso-wrap-distance-left:9pt;mso-wrap-distance-top:0;mso-wrap-distance-right:9pt;mso-wrap-distance-bottom:0;mso-position-horizontal:absolute;mso-position-horizontal-relative:text;mso-position-vertical:absolute;mso-position-vertical-relative:text;v-text-anchor:top" o:gfxdata="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" stroked="f">
                 <v:textbox style="mso-fit-shape-to-text:t" inset="0,0,0,0">
-                  <w:txbxContent/>
+                  <w:txbxContent>
+                    <w:p/>
+                  </w:txbxContent>
                 </v:textbox>
                 <w10:wrap type="through"/>
               </v:shape>
@@ -1236,6 +1232,7 @@
           <w:lang w:eastAsia="fr-CA"/>
           <w14:ligatures w14:val="none"/>
         </w:rPr>
+        <w:lastRenderedPageBreak/>
         <w:t>Ensuite, le MCTS explore progressivement l’arbre des coups possibles sur le plateau « déterminisé » en se concentrant sur les branches les plus prometteuses grâce aux priors. Les priors servent à guider cette exploration en attribuant une valeur initiale aux actions avant même d’effectuer une quelconque simulation. Ils estiment si un coup révèle de l’information sur une pièce non révélée, s’il permet de capturer une pièce de haut rang, ou s’il expose une pièce importante à un danger immédiat. Ces signaux permettent de privilégier les décisions qui ont un potentiel stratégique élevé dès les premières itérations de recherche, tout en laissant le MCTS affiner progressivement les évaluations via les résultats des simulations.</w:t>
       </w:r>
     </w:p>
@@ -1501,20 +1498,26 @@
         <w:rPr>
           <w:rFonts w:ascii="Times New Roman" w:hAnsi="Times New Roman" w:cs="Times New Roman"/>
         </w:rPr>
+        <w:t xml:space="preserve">Cette organisation montre clairement que React favorise une architecture modulaire, plus simple à maintenir et à déboguer. L’utilisation de useState et de useEffect s’est également révélée naturelle pour représenter les différentes données du jeu, comme le plateau, le tour actif, les </w:t>
+      </w:r>
+      <w:r>
+        <w:rPr>
+          <w:rFonts w:ascii="Times New Roman" w:hAnsi="Times New Roman" w:cs="Times New Roman"/>
+        </w:rPr>
+        <w:t>horloge</w:t>
+      </w:r>
+      <w:r>
+        <w:rPr>
+          <w:rFonts w:ascii="Times New Roman" w:hAnsi="Times New Roman" w:cs="Times New Roman"/>
+        </w:rPr>
+        <w:t xml:space="preserve">s ou encore les résultats des combats, puis pour les synchroniser avec le </w:t>
+      </w:r>
+      <w:r>
+        <w:rPr>
+          <w:rFonts w:ascii="Times New Roman" w:hAnsi="Times New Roman" w:cs="Times New Roman"/>
+        </w:rPr>
         <w:lastRenderedPageBreak/>
-        <w:t xml:space="preserve">Cette organisation montre clairement que React favorise une architecture modulaire, plus simple à maintenir et à déboguer. L’utilisation de useState et de useEffect s’est également révélée naturelle pour représenter les différentes données du jeu, comme le plateau, le tour actif, les </w:t>
-      </w:r>
-      <w:r>
-        <w:rPr>
-          <w:rFonts w:ascii="Times New Roman" w:hAnsi="Times New Roman" w:cs="Times New Roman"/>
-        </w:rPr>
-        <w:t>horloge</w:t>
-      </w:r>
-      <w:r>
-        <w:rPr>
-          <w:rFonts w:ascii="Times New Roman" w:hAnsi="Times New Roman" w:cs="Times New Roman"/>
-        </w:rPr>
-        <w:t xml:space="preserve">s ou encore les résultats des combats, puis pour les synchroniser avec le serveur Flask au moyen de requêtes périodiques. Si cette méthode s’intègre bien à Flask, elle introduit néanmoins un certain délai et entraîne l’envoi continu de requêtes, même en l’absence de changement. Dans ce contexte, l’isolation de cette logique dans des </w:t>
+        <w:t xml:space="preserve">serveur Flask au moyen de requêtes périodiques. Si cette méthode s’intègre bien à Flask, elle introduit néanmoins un certain délai et entraîne l’envoi continu de requêtes, même en l’absence de changement. Dans ce contexte, l’isolation de cette logique dans des </w:t>
       </w:r>
       <w:proofErr w:type="spellStart"/>
       <w:r>
@@ -2212,71 +2215,71 @@
         <w:rPr>
           <w:rFonts w:ascii="Times New Roman" w:hAnsi="Times New Roman"/>
         </w:rPr>
+        <w:t>React et le MCTS se complètent</w:t>
+      </w:r>
+      <w:r>
+        <w:rPr>
+          <w:rFonts w:ascii="Times New Roman" w:hAnsi="Times New Roman"/>
+        </w:rPr>
+        <w:t xml:space="preserve"> donc</w:t>
+      </w:r>
+      <w:r>
+        <w:rPr>
+          <w:rFonts w:ascii="Times New Roman" w:hAnsi="Times New Roman"/>
+        </w:rPr>
+        <w:t xml:space="preserve"> </w:t>
+      </w:r>
+      <w:r>
+        <w:rPr>
+          <w:rFonts w:ascii="Times New Roman" w:hAnsi="Times New Roman"/>
+        </w:rPr>
+        <w:t xml:space="preserve">dans </w:t>
+      </w:r>
+      <w:r>
+        <w:rPr>
+          <w:rFonts w:ascii="Times New Roman" w:hAnsi="Times New Roman"/>
+        </w:rPr>
+        <w:t xml:space="preserve">une architecture où la </w:t>
+      </w:r>
+      <w:r>
+        <w:rPr>
+          <w:rFonts w:ascii="Times New Roman" w:hAnsi="Times New Roman"/>
+        </w:rPr>
+        <w:t>qualité de</w:t>
+      </w:r>
+      <w:r>
+        <w:rPr>
+          <w:rFonts w:ascii="Times New Roman" w:hAnsi="Times New Roman"/>
+        </w:rPr>
+        <w:t xml:space="preserve"> </w:t>
+      </w:r>
+      <w:r>
+        <w:rPr>
+          <w:rFonts w:ascii="Times New Roman" w:hAnsi="Times New Roman"/>
+        </w:rPr>
+        <w:t>l</w:t>
+      </w:r>
+      <w:r>
+        <w:rPr>
+          <w:rFonts w:ascii="Times New Roman" w:hAnsi="Times New Roman"/>
+        </w:rPr>
+        <w:t>’affichage et de la prise de décision influencent conjointement l’expérience de jeu.</w:t>
+      </w:r>
+    </w:p>
+    <w:p>
+      <w:pPr>
+        <w:jc w:val="both"/>
+        <w:rPr>
+          <w:rFonts w:ascii="Times New Roman" w:hAnsi="Times New Roman" w:cs="Times New Roman"/>
+        </w:rPr>
+      </w:pPr>
+    </w:p>
+    <w:p>
+      <w:pPr>
+        <w:pStyle w:val="Titre2"/>
+      </w:pPr>
+      <w:r>
         <w:lastRenderedPageBreak/>
-        <w:t>React et le MCTS se complètent</w:t>
-      </w:r>
-      <w:r>
-        <w:rPr>
-          <w:rFonts w:ascii="Times New Roman" w:hAnsi="Times New Roman"/>
-        </w:rPr>
-        <w:t xml:space="preserve"> donc</w:t>
-      </w:r>
-      <w:r>
-        <w:rPr>
-          <w:rFonts w:ascii="Times New Roman" w:hAnsi="Times New Roman"/>
-        </w:rPr>
-        <w:t xml:space="preserve"> </w:t>
-      </w:r>
-      <w:r>
-        <w:rPr>
-          <w:rFonts w:ascii="Times New Roman" w:hAnsi="Times New Roman"/>
-        </w:rPr>
-        <w:t xml:space="preserve">dans </w:t>
-      </w:r>
-      <w:r>
-        <w:rPr>
-          <w:rFonts w:ascii="Times New Roman" w:hAnsi="Times New Roman"/>
-        </w:rPr>
-        <w:t xml:space="preserve">une architecture où la </w:t>
-      </w:r>
-      <w:r>
-        <w:rPr>
-          <w:rFonts w:ascii="Times New Roman" w:hAnsi="Times New Roman"/>
-        </w:rPr>
-        <w:t>qualité de</w:t>
-      </w:r>
-      <w:r>
-        <w:rPr>
-          <w:rFonts w:ascii="Times New Roman" w:hAnsi="Times New Roman"/>
-        </w:rPr>
-        <w:t xml:space="preserve"> </w:t>
-      </w:r>
-      <w:r>
-        <w:rPr>
-          <w:rFonts w:ascii="Times New Roman" w:hAnsi="Times New Roman"/>
-        </w:rPr>
-        <w:t>l</w:t>
-      </w:r>
-      <w:r>
-        <w:rPr>
-          <w:rFonts w:ascii="Times New Roman" w:hAnsi="Times New Roman"/>
-        </w:rPr>
-        <w:t>’affichage et de la prise de décision influencent conjointement l’expérience de jeu.</w:t>
-      </w:r>
-    </w:p>
-    <w:p>
-      <w:pPr>
-        <w:jc w:val="both"/>
-        <w:rPr>
-          <w:rFonts w:ascii="Times New Roman" w:hAnsi="Times New Roman" w:cs="Times New Roman"/>
-        </w:rPr>
-      </w:pPr>
-    </w:p>
-    <w:p>
-      <w:pPr>
-        <w:pStyle w:val="Titre2"/>
-      </w:pPr>
-      <w:r>
         <w:t xml:space="preserve">2.4 </w:t>
       </w:r>
       <w:r>
@@ -2376,16 +2379,7 @@
           <w:sz w:val="24"/>
           <w:szCs w:val="24"/>
         </w:rPr>
-        <w:t>.</w:t>
-      </w:r>
-      <w:r>
-        <w:rPr>
-          <w:rFonts w:ascii="Times New Roman" w:eastAsiaTheme="minorHAnsi" w:hAnsi="Times New Roman" w:cs="Times New Roman"/>
-          <w:color w:val="auto"/>
-          <w:sz w:val="24"/>
-          <w:szCs w:val="24"/>
-        </w:rPr>
-        <w:t xml:space="preserve"> </w:t>
+        <w:t xml:space="preserve">. </w:t>
       </w:r>
     </w:p>
     <w:p>
@@ -2854,26 +2848,32 @@
         <w:rPr>
           <w:rFonts w:ascii="Times New Roman" w:hAnsi="Times New Roman" w:cs="Times New Roman"/>
         </w:rPr>
+        <w:t xml:space="preserve">Du côté de React, la version 19 continue d’introduire des fonctionnalités visant à améliorer la gestion des actions asynchrones et l’intégration entre le client et le serveur. Toutefois, </w:t>
+      </w:r>
+      <w:r>
+        <w:rPr>
+          <w:rFonts w:ascii="Times New Roman" w:hAnsi="Times New Roman" w:cs="Times New Roman"/>
+        </w:rPr>
+        <w:t>puisque l’architecture d</w:t>
+      </w:r>
+      <w:r>
+        <w:rPr>
+          <w:rFonts w:ascii="Times New Roman" w:hAnsi="Times New Roman" w:cs="Times New Roman"/>
+        </w:rPr>
+        <w:t xml:space="preserve">u jeu </w:t>
+      </w:r>
+      <w:r>
+        <w:rPr>
+          <w:rFonts w:ascii="Times New Roman" w:hAnsi="Times New Roman" w:cs="Times New Roman"/>
+        </w:rPr>
+        <w:t xml:space="preserve">repose principalement sur une logique client </w:t>
+      </w:r>
+      <w:r>
+        <w:rPr>
+          <w:rFonts w:ascii="Times New Roman" w:hAnsi="Times New Roman" w:cs="Times New Roman"/>
+        </w:rPr>
         <w:lastRenderedPageBreak/>
-        <w:t xml:space="preserve">Du côté de React, la version 19 continue d’introduire des fonctionnalités visant à améliorer la gestion des actions asynchrones et l’intégration entre le client et le serveur. Toutefois, </w:t>
-      </w:r>
-      <w:r>
-        <w:rPr>
-          <w:rFonts w:ascii="Times New Roman" w:hAnsi="Times New Roman" w:cs="Times New Roman"/>
-        </w:rPr>
-        <w:t>puisque l’architecture d</w:t>
-      </w:r>
-      <w:r>
-        <w:rPr>
-          <w:rFonts w:ascii="Times New Roman" w:hAnsi="Times New Roman" w:cs="Times New Roman"/>
-        </w:rPr>
-        <w:t xml:space="preserve">u jeu </w:t>
-      </w:r>
-      <w:r>
-        <w:rPr>
-          <w:rFonts w:ascii="Times New Roman" w:hAnsi="Times New Roman" w:cs="Times New Roman"/>
-        </w:rPr>
-        <w:t xml:space="preserve">repose principalement sur une logique client légère </w:t>
+        <w:t xml:space="preserve">légère </w:t>
       </w:r>
       <w:r>
         <w:rPr>
@@ -3332,6 +3332,27 @@
     </w:p>
     <w:p>
       <w:pPr>
+        <w:spacing w:after="120"/>
+        <w:jc w:val="both"/>
+        <w:rPr>
+          <w:rFonts w:ascii="Times New Roman" w:hAnsi="Times New Roman" w:cs="Times New Roman"/>
+        </w:rPr>
+      </w:pPr>
+      <w:r>
+        <w:rPr>
+          <w:rFonts w:ascii="Times New Roman" w:hAnsi="Times New Roman" w:cs="Times New Roman"/>
+        </w:rPr>
+        <w:t>Quant à leur avenir, React et le MCTS devraient rester pertinents dans les années à venir. React continue d’évoluer, même si les aspects client-serveur de son écosystème, comme les Server Components ou Next.js, n’ont pas été abordés dans notre projet. De son côté, le MCTS demeure une méthode efficace pour explorer de grands espaces de décision en conciliant exploration et exploitation</w:t>
+      </w:r>
+      <w:r>
+        <w:rPr>
+          <w:rFonts w:ascii="Times New Roman" w:hAnsi="Times New Roman" w:cs="Times New Roman"/>
+        </w:rPr>
+        <w:t>.</w:t>
+      </w:r>
+    </w:p>
+    <w:p>
+      <w:pPr>
         <w:pStyle w:val="Titre1"/>
         <w:jc w:val="both"/>
         <w:rPr>
@@ -3349,7 +3370,7 @@
           <w:szCs w:val="24"/>
         </w:rPr>
         <w:lastRenderedPageBreak/>
-        <w:t>Quant à leur avenir, React et le MCTS devraient rester pertinents dans les années à venir. React continue d’évoluer, même si les aspects client-serveur de son écosystème, comme les Server Components ou Next.js, n’ont pas été abordés dans notre projet. De son côté, le MCTS demeure une méthode efficace pour explorer de grands espaces de décision en conciliant exploration et exploitation</w:t>
+        <w:t>Finalement</w:t>
       </w:r>
       <w:r>
         <w:rPr>
@@ -3358,20 +3379,17 @@
           <w:sz w:val="24"/>
           <w:szCs w:val="24"/>
         </w:rPr>
-        <w:t>.</w:t>
-      </w:r>
-    </w:p>
-    <w:p>
-      <w:pPr>
-        <w:pStyle w:val="Titre1"/>
-        <w:jc w:val="both"/>
+        <w:t>, le développement de L’Attaque montre qu’il est possible de concevoir une application à la fois fonctionnelle, claire et capable d’évoluer avec le temps. React et le MCTS appartiennent à deux domaines différents, mais leur association répond bien aux besoins d’un jeu web moderne. L’un facilite la création d’une interface structurée et dynamique, tandis que l’autre permet de mettre en place une intelligence artificielle capable de prendre des décision</w:t>
+      </w:r>
+      <w:r>
         <w:rPr>
           <w:rFonts w:ascii="Times New Roman" w:eastAsiaTheme="minorHAnsi" w:hAnsi="Times New Roman" w:cs="Times New Roman"/>
           <w:color w:val="auto"/>
           <w:sz w:val="24"/>
           <w:szCs w:val="24"/>
         </w:rPr>
-      </w:pPr>
+        <w:t>s</w:t>
+      </w:r>
       <w:r>
         <w:rPr>
           <w:rFonts w:ascii="Times New Roman" w:eastAsiaTheme="minorHAnsi" w:hAnsi="Times New Roman" w:cs="Times New Roman"/>
@@ -3379,36 +3397,30 @@
           <w:sz w:val="24"/>
           <w:szCs w:val="24"/>
         </w:rPr>
-        <w:t>Finalement</w:t>
-      </w:r>
-      <w:r>
-        <w:rPr>
-          <w:rFonts w:ascii="Times New Roman" w:eastAsiaTheme="minorHAnsi" w:hAnsi="Times New Roman" w:cs="Times New Roman"/>
-          <w:color w:val="auto"/>
-          <w:sz w:val="24"/>
-          <w:szCs w:val="24"/>
-        </w:rPr>
-        <w:t>, le développement de L’Attaque montre qu’il est possible de concevoir une application à la fois fonctionnelle, claire et capable d’évoluer avec le temps. React et le MCTS appartiennent à deux domaines différents, mais leur association répond bien aux besoins d’un jeu web moderne. L’un facilite la création d’une interface structurée et dynamique, tandis que l’autre permet de mettre en place une intelligence artificielle capable de prendre des décision</w:t>
-      </w:r>
-      <w:r>
-        <w:rPr>
-          <w:rFonts w:ascii="Times New Roman" w:eastAsiaTheme="minorHAnsi" w:hAnsi="Times New Roman" w:cs="Times New Roman"/>
-          <w:color w:val="auto"/>
-          <w:sz w:val="24"/>
-          <w:szCs w:val="24"/>
-        </w:rPr>
-        <w:t>s</w:t>
-      </w:r>
-      <w:r>
-        <w:rPr>
-          <w:rFonts w:ascii="Times New Roman" w:eastAsiaTheme="minorHAnsi" w:hAnsi="Times New Roman" w:cs="Times New Roman"/>
-          <w:color w:val="auto"/>
-          <w:sz w:val="24"/>
-          <w:szCs w:val="24"/>
-        </w:rPr>
         <w:t>.</w:t>
       </w:r>
     </w:p>
+    <w:p/>
+    <w:p/>
+    <w:p/>
+    <w:p/>
+    <w:p/>
+    <w:p/>
+    <w:p/>
+    <w:p/>
+    <w:p/>
+    <w:p/>
+    <w:p/>
+    <w:p/>
+    <w:p/>
+    <w:p/>
+    <w:p/>
+    <w:p/>
+    <w:p/>
+    <w:p/>
+    <w:p/>
+    <w:p/>
+    <w:p/>
     <w:p>
       <w:pPr>
         <w:pStyle w:val="Titre1"/>
@@ -3420,6 +3432,7 @@
         <w:rPr>
           <w:rFonts w:ascii="Times New Roman" w:hAnsi="Times New Roman" w:cs="Times New Roman"/>
         </w:rPr>
+        <w:lastRenderedPageBreak/>
         <w:t>5.</w:t>
       </w:r>
       <w:r>
@@ -3511,22 +3524,14 @@
                   <w:i/>
                   <w:iCs/>
                   <w:noProof/>
-                  <w:lang w:val="en-CA"/>
                 </w:rPr>
                 <w:t>WebSocket in Real Time Application</w:t>
               </w:r>
               <w:r>
                 <w:rPr>
                   <w:noProof/>
-                  <w:lang w:val="en-CA"/>
-                </w:rPr>
-                <w:t xml:space="preserve">. </w:t>
-              </w:r>
-              <w:r>
-                <w:rPr>
-                  <w:noProof/>
-                </w:rPr>
-                <w:t>Récupéré sur SSRN: https://papers.ssrn.com/sol3/papers.cfm?abstract_id=4772151</w:t>
+                </w:rPr>
+                <w:t>. Récupéré sur SSRN: https://papers.ssrn.com/sol3/papers.cfm?abstract_id=4772151</w:t>
               </w:r>
             </w:p>
             <w:p>
@@ -3569,7 +3574,6 @@
               <w:r>
                 <w:rPr>
                   <w:noProof/>
-                  <w:lang w:val="en-CA"/>
                 </w:rPr>
                 <w:t xml:space="preserve">blog.isquaredsoftware.com. (2026, 27 03). </w:t>
               </w:r>
@@ -3578,22 +3582,14 @@
                   <w:i/>
                   <w:iCs/>
                   <w:noProof/>
-                  <w:lang w:val="en-CA"/>
                 </w:rPr>
                 <w:t>https://blog.isquaredsoftware.com/2025/06/react-community-2025/</w:t>
               </w:r>
               <w:r>
                 <w:rPr>
                   <w:noProof/>
-                  <w:lang w:val="en-CA"/>
-                </w:rPr>
-                <w:t xml:space="preserve">. </w:t>
-              </w:r>
-              <w:r>
-                <w:rPr>
-                  <w:noProof/>
-                </w:rPr>
-                <w:t>Récupéré sur https://blog.isquaredsoftware.com/2025/06/react-community-2025/.</w:t>
+                </w:rPr>
+                <w:t>. Récupéré sur https://blog.isquaredsoftware.com/2025/06/react-community-2025/.</w:t>
               </w:r>
             </w:p>
             <w:p>
@@ -3608,60 +3604,19 @@
                 <w:rPr>
                   <w:noProof/>
                 </w:rPr>
-                <w:t xml:space="preserve">Bradberry, J. (2015, Septembre 7). </w:t>
+                <w:t xml:space="preserve">Chaslot, G. M.-B. (2008, Volume 4). PROGRESSIVE STRATEGIES FOR MONTE-CARLO TREE SEARCH. </w:t>
               </w:r>
               <w:r>
                 <w:rPr>
                   <w:i/>
                   <w:iCs/>
                   <w:noProof/>
-                  <w:lang w:val="en-CA"/>
-                </w:rPr>
-                <w:t>Introduction to Monte Carlo Tree Search</w:t>
-              </w:r>
-              <w:r>
-                <w:rPr>
-                  <w:noProof/>
-                  <w:lang w:val="en-CA"/>
-                </w:rPr>
-                <w:t xml:space="preserve">. </w:t>
-              </w:r>
-              <w:r>
-                <w:rPr>
-                  <w:noProof/>
-                </w:rPr>
-                <w:t>Récupéré sur Jeff Bradberry: https://jeffbradberry.com/posts/2015/09/intro-to-monte-carlo-tree-search/</w:t>
-              </w:r>
-            </w:p>
-            <w:p>
-              <w:pPr>
-                <w:pStyle w:val="Bibliographie"/>
-                <w:ind w:left="720" w:hanging="720"/>
-                <w:rPr>
-                  <w:noProof/>
-                  <w:lang w:val="en-CA"/>
-                </w:rPr>
-              </w:pPr>
-              <w:r>
-                <w:rPr>
-                  <w:noProof/>
-                  <w:lang w:val="en-CA"/>
-                </w:rPr>
-                <w:t xml:space="preserve">Chaslot, G. M.-B. (2008, Volume 4). PROGRESSIVE STRATEGIES FOR MONTE-CARLO TREE SEARCH. </w:t>
-              </w:r>
-              <w:r>
-                <w:rPr>
-                  <w:i/>
-                  <w:iCs/>
-                  <w:noProof/>
-                  <w:lang w:val="en-CA"/>
                 </w:rPr>
                 <w:t>New Mathematics and Natural Computation</w:t>
               </w:r>
               <w:r>
                 <w:rPr>
                   <w:noProof/>
-                  <w:lang w:val="en-CA"/>
                 </w:rPr>
                 <w:t>, pp. 343-357.</w:t>
               </w:r>
@@ -3677,9 +3632,8 @@
               <w:r>
                 <w:rPr>
                   <w:noProof/>
-                  <w:lang w:val="en-CA"/>
-                </w:rPr>
-                <w:t xml:space="preserve">Cowling, P., Powley, E., &amp; Whitehouse, D. (2012, September). </w:t>
+                </w:rPr>
+                <w:t xml:space="preserve">Dan Abramov et Rachel Nabors. (2026, 30 01). </w:t>
               </w:r>
               <w:r>
                 <w:rPr>
@@ -3687,50 +3641,11 @@
                   <w:iCs/>
                   <w:noProof/>
                 </w:rPr>
-                <w:t>Python Code</w:t>
-              </w:r>
-              <w:r>
-                <w:rPr>
-                  <w:noProof/>
-                </w:rPr>
-                <w:t>. Récupéré sur mcts.ai: https://mcts.ai/code/python.html</w:t>
-              </w:r>
-            </w:p>
-            <w:p>
-              <w:pPr>
-                <w:pStyle w:val="Bibliographie"/>
-                <w:ind w:left="720" w:hanging="720"/>
-                <w:rPr>
-                  <w:noProof/>
-                  <w:lang w:val="en-CA"/>
-                </w:rPr>
-              </w:pPr>
-              <w:r>
-                <w:rPr>
-                  <w:noProof/>
-                </w:rPr>
-                <w:t xml:space="preserve">Dan Abramov et Rachel Nabors. </w:t>
-              </w:r>
-              <w:r>
-                <w:rPr>
-                  <w:noProof/>
-                  <w:lang w:val="en-CA"/>
-                </w:rPr>
-                <w:t xml:space="preserve">(2026, 30 01). </w:t>
-              </w:r>
-              <w:r>
-                <w:rPr>
-                  <w:i/>
-                  <w:iCs/>
-                  <w:noProof/>
-                  <w:lang w:val="en-CA"/>
-                </w:rPr>
                 <w:t>React Reference Overview</w:t>
               </w:r>
               <w:r>
                 <w:rPr>
                   <w:noProof/>
-                  <w:lang w:val="en-CA"/>
                 </w:rPr>
                 <w:t>. Récupéré sur https://react.dev/reference/react.</w:t>
               </w:r>
@@ -3741,15 +3656,12 @@
                 <w:ind w:left="720" w:hanging="720"/>
                 <w:rPr>
                   <w:noProof/>
-                  <w:lang w:val="en-CA"/>
                 </w:rPr>
               </w:pPr>
               <w:r>
                 <w:rPr>
                   <w:noProof/>
-                  <w:lang w:val="en-CA"/>
-                </w:rPr>
-                <w:lastRenderedPageBreak/>
+                </w:rPr>
                 <w:t xml:space="preserve">Dodds, K. C. (2026, 05 04). </w:t>
               </w:r>
               <w:r>
@@ -3757,14 +3669,12 @@
                   <w:i/>
                   <w:iCs/>
                   <w:noProof/>
-                  <w:lang w:val="en-CA"/>
                 </w:rPr>
                 <w:t>kentcdodds.com</w:t>
               </w:r>
               <w:r>
                 <w:rPr>
                   <w:noProof/>
-                  <w:lang w:val="en-CA"/>
                 </w:rPr>
                 <w:t>. Récupéré sur kentcdodds.com: https://kentcdodds.com/blog/application-state-management-with-react</w:t>
               </w:r>
@@ -3775,13 +3685,11 @@
                 <w:ind w:left="720" w:hanging="720"/>
                 <w:rPr>
                   <w:noProof/>
-                  <w:lang w:val="en-CA"/>
                 </w:rPr>
               </w:pPr>
               <w:r>
                 <w:rPr>
                   <w:noProof/>
-                  <w:lang w:val="en-CA"/>
                 </w:rPr>
                 <w:t xml:space="preserve">Flavio, C. (2026). </w:t>
               </w:r>
@@ -3790,14 +3698,12 @@
                   <w:i/>
                   <w:iCs/>
                   <w:noProof/>
-                  <w:lang w:val="en-CA"/>
                 </w:rPr>
                 <w:t>React Handbook.</w:t>
               </w:r>
               <w:r>
                 <w:rPr>
                   <w:noProof/>
-                  <w:lang w:val="en-CA"/>
                 </w:rPr>
                 <w:t xml:space="preserve"> </w:t>
               </w:r>
@@ -3813,7 +3719,6 @@
               <w:r>
                 <w:rPr>
                   <w:noProof/>
-                  <w:lang w:val="en-CA"/>
                 </w:rPr>
                 <w:t xml:space="preserve">freecodecamp.org. (2026, 03 27). </w:t>
               </w:r>
@@ -3822,88 +3727,14 @@
                   <w:i/>
                   <w:iCs/>
                   <w:noProof/>
-                  <w:lang w:val="en-CA"/>
                 </w:rPr>
                 <w:t>https://www.freecodecamp.org/news/react-state-management/</w:t>
               </w:r>
               <w:r>
                 <w:rPr>
                   <w:noProof/>
-                  <w:lang w:val="en-CA"/>
-                </w:rPr>
-                <w:t xml:space="preserve">. </w:t>
-              </w:r>
-              <w:r>
-                <w:rPr>
-                  <w:noProof/>
-                </w:rPr>
-                <w:t>Récupéré sur https://www.freecodecamp.org/news/react-state-management/.</w:t>
-              </w:r>
-            </w:p>
-            <w:p>
-              <w:pPr>
-                <w:pStyle w:val="Bibliographie"/>
-                <w:ind w:left="720" w:hanging="720"/>
-                <w:rPr>
-                  <w:noProof/>
-                  <w:lang w:val="en-CA"/>
-                </w:rPr>
-              </w:pPr>
-              <w:r>
-                <w:rPr>
-                  <w:noProof/>
-                  <w:lang w:val="en-CA"/>
-                </w:rPr>
-                <w:t xml:space="preserve">Geeks, G. f. (2026, 01 30). </w:t>
-              </w:r>
-              <w:r>
-                <w:rPr>
-                  <w:i/>
-                  <w:iCs/>
-                  <w:noProof/>
-                  <w:lang w:val="en-CA"/>
-                </w:rPr>
-                <w:t>Monte Carlo Tree Search (MCTS) in Machine Learning</w:t>
-              </w:r>
-              <w:r>
-                <w:rPr>
-                  <w:noProof/>
-                  <w:lang w:val="en-CA"/>
-                </w:rPr>
-                <w:t>. Récupéré sur Geeks for Geeks: https://www.geeksforgeeks.org/machine-learning/monte-carlo-tree-search-mcts-in-machine-learning/</w:t>
-              </w:r>
-            </w:p>
-            <w:p>
-              <w:pPr>
-                <w:pStyle w:val="Bibliographie"/>
-                <w:ind w:left="720" w:hanging="720"/>
-                <w:rPr>
-                  <w:noProof/>
-                  <w:lang w:val="en-CA"/>
-                </w:rPr>
-              </w:pPr>
-              <w:r>
-                <w:rPr>
-                  <w:noProof/>
-                  <w:lang w:val="en-CA"/>
-                </w:rPr>
-                <w:t xml:space="preserve">Geeksforgeeks. (2026, 01 30). </w:t>
-              </w:r>
-              <w:r>
-                <w:rPr>
-                  <w:i/>
-                  <w:iCs/>
-                  <w:noProof/>
-                  <w:lang w:val="en-CA"/>
-                </w:rPr>
-                <w:t>https://www.geeksforgeeks.org/reactjs/reactjs-examples/</w:t>
-              </w:r>
-              <w:r>
-                <w:rPr>
-                  <w:noProof/>
-                  <w:lang w:val="en-CA"/>
-                </w:rPr>
-                <w:t>.</w:t>
+                </w:rPr>
+                <w:t>. Récupéré sur https://www.freecodecamp.org/news/react-state-management/.</w:t>
               </w:r>
             </w:p>
             <w:p>
@@ -3946,7 +3777,6 @@
               <w:r>
                 <w:rPr>
                   <w:noProof/>
-                  <w:lang w:val="en-CA"/>
                 </w:rPr>
                 <w:t xml:space="preserve">Grill, J.-B., Altché, F., &amp; al, e. (2020, 07 4). </w:t>
               </w:r>
@@ -3955,89 +3785,14 @@
                   <w:i/>
                   <w:iCs/>
                   <w:noProof/>
-                  <w:lang w:val="en-CA"/>
                 </w:rPr>
                 <w:t>Monte-Carlo Tree Search as Regularized Policy Optimization.</w:t>
               </w:r>
               <w:r>
                 <w:rPr>
                   <w:noProof/>
-                  <w:lang w:val="en-CA"/>
-                </w:rPr>
-                <w:t xml:space="preserve"> </w:t>
-              </w:r>
-              <w:r>
-                <w:rPr>
-                  <w:noProof/>
-                </w:rPr>
-                <w:t>Récupéré sur Arxiv: https://arxiv.org/abs/2007.12509</w:t>
-              </w:r>
-            </w:p>
-            <w:p>
-              <w:pPr>
-                <w:pStyle w:val="Bibliographie"/>
-                <w:ind w:left="720" w:hanging="720"/>
-                <w:rPr>
-                  <w:noProof/>
-                </w:rPr>
-              </w:pPr>
-              <w:r>
-                <w:rPr>
-                  <w:noProof/>
-                </w:rPr>
-                <w:t xml:space="preserve">Lanctot, M. W. (2014, June 2). </w:t>
-              </w:r>
-              <w:r>
-                <w:rPr>
-                  <w:i/>
-                  <w:iCs/>
-                  <w:noProof/>
-                  <w:lang w:val="en-CA"/>
-                </w:rPr>
-                <w:t>Monte Carlo Tree Search with Heuristic Evaluations using Implicit Minimax Backups</w:t>
-              </w:r>
-              <w:r>
-                <w:rPr>
-                  <w:noProof/>
-                  <w:lang w:val="en-CA"/>
-                </w:rPr>
-                <w:t xml:space="preserve">. </w:t>
-              </w:r>
-              <w:r>
-                <w:rPr>
-                  <w:noProof/>
-                </w:rPr>
-                <w:t>Récupéré sur arxiv: https://arxiv.org/abs/1406.0486?utm_source=chatgpt.com</w:t>
-              </w:r>
-            </w:p>
-            <w:p>
-              <w:pPr>
-                <w:pStyle w:val="Bibliographie"/>
-                <w:ind w:left="720" w:hanging="720"/>
-                <w:rPr>
-                  <w:noProof/>
-                </w:rPr>
-              </w:pPr>
-              <w:r>
-                <w:rPr>
-                  <w:noProof/>
-                  <w:lang w:val="en-CA"/>
-                </w:rPr>
-                <w:t xml:space="preserve">Lorentz, R. (2016, September). Using evaluation functions in Monte-Carlo Tree Search. </w:t>
-              </w:r>
-              <w:r>
-                <w:rPr>
-                  <w:i/>
-                  <w:iCs/>
-                  <w:noProof/>
-                </w:rPr>
-                <w:t>ScienceDirect</w:t>
-              </w:r>
-              <w:r>
-                <w:rPr>
-                  <w:noProof/>
-                </w:rPr>
-                <w:t>, pp. 106-113.</w:t>
+                </w:rPr>
+                <w:t xml:space="preserve"> Récupéré sur Arxiv: https://arxiv.org/abs/2007.12509</w:t>
               </w:r>
             </w:p>
             <w:p>
@@ -4081,29 +3836,28 @@
                 <w:rPr>
                   <w:noProof/>
                 </w:rPr>
-                <w:t xml:space="preserve">Morenville, A., &amp; Piette, E. (2025, Août 19). </w:t>
+                <w:t xml:space="preserve">mozilla. (2026, 03 26). </w:t>
               </w:r>
               <w:r>
                 <w:rPr>
                   <w:i/>
                   <w:iCs/>
                   <w:noProof/>
-                  <w:lang w:val="en-CA"/>
-                </w:rPr>
-                <w:t>Modeling Uncertainty: Constraint-Based Belief</w:t>
+                </w:rPr>
+                <w:t>https://developer.mozilla.org/fr/docs/Learn_web_development/Core/Frameworks_libraries/React_getting_started</w:t>
               </w:r>
               <w:r>
                 <w:rPr>
                   <w:noProof/>
-                  <w:lang w:val="en-CA"/>
-                </w:rPr>
-                <w:t xml:space="preserve">. </w:t>
+                </w:rPr>
+                <w:t xml:space="preserve">. Récupéré sur </w:t>
               </w:r>
               <w:r>
                 <w:rPr>
                   <w:noProof/>
                 </w:rPr>
-                <w:t>Récupéré sur arxiv: https://arxiv.org/pdf/2507.19263</w:t>
+                <w:lastRenderedPageBreak/>
+                <w:t>https://developer.mozilla.org/fr/docs/Learn_web_development/Core/Frameworks_libraries/React_getting_started.</w:t>
               </w:r>
             </w:p>
             <w:p>
@@ -4118,7 +3872,7 @@
                 <w:rPr>
                   <w:noProof/>
                 </w:rPr>
-                <w:t xml:space="preserve">mozilla. (2026, 03 26). </w:t>
+                <w:t xml:space="preserve">Murphey, R. (2026, 05 20). </w:t>
               </w:r>
               <w:r>
                 <w:rPr>
@@ -4126,13 +3880,13 @@
                   <w:iCs/>
                   <w:noProof/>
                 </w:rPr>
-                <w:t>https://developer.mozilla.org/fr/docs/Learn_web_development/Core/Frameworks_libraries/React_getting_started</w:t>
+                <w:t>https://www.simform.com/blog/react-architecture-best-practices/</w:t>
               </w:r>
               <w:r>
                 <w:rPr>
                   <w:noProof/>
                 </w:rPr>
-                <w:t>. Récupéré sur https://developer.mozilla.org/fr/docs/Learn_web_development/Core/Frameworks_libraries/React_getting_started.</w:t>
+                <w:t xml:space="preserve">. Récupéré sur https://www.simform.com/blog/react-architecture-best-practices/: </w:t>
               </w:r>
             </w:p>
             <w:p>
@@ -4146,46 +3900,7 @@
               <w:r>
                 <w:rPr>
                   <w:noProof/>
-                  <w:lang w:val="en-CA"/>
-                </w:rPr>
-                <w:t xml:space="preserve">Murphey, R. (2026, 05 20). </w:t>
-              </w:r>
-              <w:r>
-                <w:rPr>
-                  <w:i/>
-                  <w:iCs/>
-                  <w:noProof/>
-                  <w:lang w:val="en-CA"/>
-                </w:rPr>
-                <w:t>https://www.simform.com/blog/react-architecture-best-practices/</w:t>
-              </w:r>
-              <w:r>
-                <w:rPr>
-                  <w:noProof/>
-                  <w:lang w:val="en-CA"/>
-                </w:rPr>
-                <w:t xml:space="preserve">. </w:t>
-              </w:r>
-              <w:r>
-                <w:rPr>
-                  <w:noProof/>
-                </w:rPr>
-                <w:t xml:space="preserve">Récupéré sur https://www.simform.com/blog/react-architecture-best-practices/: </w:t>
-              </w:r>
-            </w:p>
-            <w:p>
-              <w:pPr>
-                <w:pStyle w:val="Bibliographie"/>
-                <w:ind w:left="720" w:hanging="720"/>
-                <w:rPr>
-                  <w:noProof/>
-                </w:rPr>
-              </w:pPr>
-              <w:r>
-                <w:rPr>
-                  <w:noProof/>
-                </w:rPr>
-                <w:lastRenderedPageBreak/>
+                </w:rPr>
                 <w:t xml:space="preserve">OpenAI. (2026). </w:t>
               </w:r>
               <w:r>
@@ -4215,51 +3930,7 @@
                 <w:rPr>
                   <w:noProof/>
                 </w:rPr>
-                <w:t xml:space="preserve">Perolat et al, J. (2022, Juin 30). </w:t>
-              </w:r>
-              <w:r>
-                <w:rPr>
-                  <w:i/>
-                  <w:iCs/>
-                  <w:noProof/>
-                  <w:lang w:val="en-CA"/>
-                </w:rPr>
-                <w:t>Mastering the Game of Stratego with Model-Free Multiagent Reinforcement Learning</w:t>
-              </w:r>
-              <w:r>
-                <w:rPr>
-                  <w:noProof/>
-                  <w:lang w:val="en-CA"/>
-                </w:rPr>
-                <w:t xml:space="preserve">. </w:t>
-              </w:r>
-              <w:r>
-                <w:rPr>
-                  <w:noProof/>
-                </w:rPr>
-                <w:t>Récupéré sur arxiv.com: https://arxiv.org/pdf/2206.15378</w:t>
-              </w:r>
-            </w:p>
-            <w:p>
-              <w:pPr>
-                <w:pStyle w:val="Bibliographie"/>
-                <w:ind w:left="720" w:hanging="720"/>
-                <w:rPr>
-                  <w:noProof/>
-                </w:rPr>
-              </w:pPr>
-              <w:r>
-                <w:rPr>
-                  <w:noProof/>
-                </w:rPr>
-                <w:t xml:space="preserve">Świechowski, M. G. (2022, July 19). </w:t>
-              </w:r>
-              <w:r>
-                <w:rPr>
-                  <w:noProof/>
-                  <w:lang w:val="en-CA"/>
-                </w:rPr>
-                <w:t xml:space="preserve">Monte Carlo Tree Search: a review of recent modifications and applications. </w:t>
+                <w:t xml:space="preserve">Świechowski, M. G. (2022, July 19). Monte Carlo Tree Search: a review of recent modifications and applications. </w:t>
               </w:r>
               <w:r>
                 <w:rPr>
@@ -4288,7 +3959,7 @@
                 <w:rPr>
                   <w:noProof/>
                 </w:rPr>
-                <w:t xml:space="preserve">Turcotte, M. (2025, Décembre 1). </w:t>
+                <w:t xml:space="preserve">Vodopivec, T., Samothrakis, S., &amp; Ster, B. (2017). On Monte Carlo Tree Search and Reinforcement Learning. </w:t>
               </w:r>
               <w:r>
                 <w:rPr>
@@ -4296,44 +3967,11 @@
                   <w:iCs/>
                   <w:noProof/>
                 </w:rPr>
-                <w:t>CSI 4106: Introduction to Artificial Intelligence.</w:t>
-              </w:r>
-              <w:r>
-                <w:rPr>
-                  <w:noProof/>
-                </w:rPr>
-                <w:t xml:space="preserve"> Récupéré sur turcotte.xyz: https://turcotte.xyz/teaching/csi-4106/lectures/22/slides.html?q=monte#/monte-carlo-tree-search-mcts</w:t>
-              </w:r>
-            </w:p>
-            <w:p>
-              <w:pPr>
-                <w:pStyle w:val="Bibliographie"/>
-                <w:ind w:left="720" w:hanging="720"/>
-                <w:rPr>
-                  <w:noProof/>
-                  <w:lang w:val="en-CA"/>
-                </w:rPr>
-              </w:pPr>
-              <w:r>
-                <w:rPr>
-                  <w:noProof/>
-                  <w:lang w:val="en-CA"/>
-                </w:rPr>
-                <w:t xml:space="preserve">Vodopivec, T., Samothrakis, S., &amp; Ster, B. (2017). On Monte Carlo Tree Search and Reinforcement Learning. </w:t>
-              </w:r>
-              <w:r>
-                <w:rPr>
-                  <w:i/>
-                  <w:iCs/>
-                  <w:noProof/>
-                  <w:lang w:val="en-CA"/>
-                </w:rPr>
                 <w:t>Journal of Artificial Intelligence Research</w:t>
               </w:r>
               <w:r>
                 <w:rPr>
                   <w:noProof/>
-                  <w:lang w:val="en-CA"/>
                 </w:rPr>
                 <w:t>, 881-936.</w:t>
               </w:r>
@@ -4344,13 +3982,11 @@
                 <w:ind w:left="720" w:hanging="720"/>
                 <w:rPr>
                   <w:noProof/>
-                  <w:lang w:val="en-CA"/>
                 </w:rPr>
               </w:pPr>
               <w:r>
                 <w:rPr>
                   <w:noProof/>
-                  <w:lang w:val="en-CA"/>
                 </w:rPr>
                 <w:t xml:space="preserve">w3schools. (2026, 01 30). </w:t>
               </w:r>
@@ -4359,14 +3995,12 @@
                   <w:i/>
                   <w:iCs/>
                   <w:noProof/>
-                  <w:lang w:val="en-CA"/>
                 </w:rPr>
                 <w:t>React Tutorial</w:t>
               </w:r>
               <w:r>
                 <w:rPr>
                   <w:noProof/>
-                  <w:lang w:val="en-CA"/>
                 </w:rPr>
                 <w:t>. Récupéré sur https://www.w3schools.com/REACT/default.asp.</w:t>
               </w:r>
@@ -6441,6 +6075,7 @@
   <w:style w:type="character" w:default="1" w:styleId="Policepardfaut">
     <w:name w:val="Default Paragraph Font"/>
     <w:uiPriority w:val="1"/>
+    <w:semiHidden/>
     <w:unhideWhenUsed/>
   </w:style>
   <w:style w:type="table" w:default="1" w:styleId="TableauNormal">
@@ -7403,21 +7038,6 @@
     <b:RefOrder>7</b:RefOrder>
   </b:Source>
   <b:Source>
-    <b:Tag>htt26</b:Tag>
-    <b:SourceType>InternetSite</b:SourceType>
-    <b:Guid>{3F75E63F-A85B-4621-822D-D25002B7B5C5}</b:Guid>
-    <b:Title>https://www.geeksforgeeks.org/reactjs/reactjs-examples/</b:Title>
-    <b:Year>2026</b:Year>
-    <b:Month>01</b:Month>
-    <b:Day>30</b:Day>
-    <b:Author>
-      <b:Author>
-        <b:Corporate>Geeksforgeeks</b:Corporate>
-      </b:Author>
-    </b:Author>
-    <b:RefOrder>8</b:RefOrder>
-  </b:Source>
-  <b:Source>
     <b:Tag>w3s26</b:Tag>
     <b:SourceType>InternetSite</b:SourceType>
     <b:Guid>{822057B5-EF53-4A6D-8DBF-A2054BA46743}</b:Guid>
@@ -7431,7 +7051,7 @@
     <b:Month>01</b:Month>
     <b:Day>30</b:Day>
     <b:InternetSiteTitle>https://www.w3schools.com/REACT/default.asp</b:InternetSiteTitle>
-    <b:RefOrder>9</b:RefOrder>
+    <b:RefOrder>8</b:RefOrder>
   </b:Source>
   <b:Source xmlns:b="http://schemas.openxmlformats.org/officeDocument/2006/bibliography">
     <b:Tag>gra26</b:Tag>
@@ -7447,7 +7067,7 @@
     <b:Month>01</b:Month>
     <b:Day>30</b:Day>
     <b:Title>Apprendre React</b:Title>
-    <b:RefOrder>10</b:RefOrder>
+    <b:RefOrder>9</b:RefOrder>
   </b:Source>
   <b:Source>
     <b:Tag>mik26</b:Tag>
@@ -7463,7 +7083,7 @@
     <b:InternetSiteTitle>https://blog.mikecodeur.com/post/getting-started-with-react-and-vite-the-complete-guide</b:InternetSiteTitle>
     <b:Month>03</b:Month>
     <b:Day>27</b:Day>
-    <b:RefOrder>11</b:RefOrder>
+    <b:RefOrder>10</b:RefOrder>
   </b:Source>
   <b:Source>
     <b:Tag>Fla26</b:Tag>
@@ -7479,7 +7099,7 @@
     <b:Month>27</b:Month>
     <b:Day>03</b:Day>
     <b:InternetSiteTitle>https://www.premieroctet.com/blog/nouveautes-react-19</b:InternetSiteTitle>
-    <b:RefOrder>12</b:RefOrder>
+    <b:RefOrder>11</b:RefOrder>
   </b:Source>
   <b:Source>
     <b:Tag>Cop26</b:Tag>
@@ -7497,7 +7117,7 @@
         </b:NameList>
       </b:Author>
     </b:Author>
-    <b:RefOrder>13</b:RefOrder>
+    <b:RefOrder>12</b:RefOrder>
   </b:Source>
   <b:Source>
     <b:Tag>moz26</b:Tag>
@@ -7517,7 +7137,7 @@
         </b:NameList>
       </b:Author>
     </b:Author>
-    <b:RefOrder>14</b:RefOrder>
+    <b:RefOrder>13</b:RefOrder>
   </b:Source>
   <b:Source>
     <b:Tag>fre26</b:Tag>
@@ -7537,7 +7157,7 @@
     <b:Year>2026</b:Year>
     <b:Month>03</b:Month>
     <b:Day>27</b:Day>
-    <b:RefOrder>15</b:RefOrder>
+    <b:RefOrder>14</b:RefOrder>
   </b:Source>
   <b:Source>
     <b:Tag>blo26</b:Tag>
@@ -7557,7 +7177,7 @@
     <b:Year>2026</b:Year>
     <b:Month>27</b:Month>
     <b:Day>03</b:Day>
-    <b:RefOrder>16</b:RefOrder>
+    <b:RefOrder>15</b:RefOrder>
   </b:Source>
   <b:Source>
     <b:Tag>Ken26</b:Tag>
@@ -7601,7 +7221,7 @@
     <b:Month>05</b:Month>
     <b:Day>04</b:Day>
     <b:URL>https://dev.to/08ayush/what-is-the-difference-between-angular-and-reactjs-and-which-is-best-to-use-for-building-a-website-4h8b</b:URL>
-    <b:RefOrder>17</b:RefOrder>
+    <b:RefOrder>16</b:RefOrder>
   </b:Source>
   <b:Source>
     <b:Tag>Ope26</b:Tag>
@@ -7617,28 +7237,6 @@
     <b:URL>https://chat.openai.com/</b:URL>
     <b:Comments>I am building a Stratego AI using belief-state MCTS (IS-MCTS style). Before each MCTS iteration, I sample a possible opponent board from my belief distribution, so each iteration runs on a fully deterministic hidden-information rollout.</b:Comments>
     <b:RefOrder>1</b:RefOrder>
-  </b:Source>
-  <b:Source>
-    <b:Tag>Jef15</b:Tag>
-    <b:SourceType>InternetSite</b:SourceType>
-    <b:Guid>{392E606C-6EB1-48F8-A4CD-47B9F5C92ED3}</b:Guid>
-    <b:Title>Introduction to Monte Carlo Tree Search</b:Title>
-    <b:InternetSiteTitle>Jeff Bradberry</b:InternetSiteTitle>
-    <b:Year>2015</b:Year>
-    <b:Month>Septembre</b:Month>
-    <b:Day>7</b:Day>
-    <b:URL>https://jeffbradberry.com/posts/2015/09/intro-to-monte-carlo-tree-search/</b:URL>
-    <b:Author>
-      <b:Author>
-        <b:NameList>
-          <b:Person>
-            <b:Last>Bradberry</b:Last>
-            <b:First>Jeff</b:First>
-          </b:Person>
-        </b:NameList>
-      </b:Author>
-    </b:Author>
-    <b:RefOrder>18</b:RefOrder>
   </b:Source>
   <b:Source>
     <b:Tag>Sil16</b:Tag>
@@ -7661,150 +7259,6 @@
     <b:Month>Volume 4</b:Month>
     <b:Pages>343-357</b:Pages>
     <b:RefOrder>6</b:RefOrder>
-  </b:Source>
-  <b:Source>
-    <b:Tag>Pet12</b:Tag>
-    <b:SourceType>InternetSite</b:SourceType>
-    <b:Guid>{9039DA65-5912-4660-AACE-0691F65DC27A}</b:Guid>
-    <b:Author>
-      <b:Author>
-        <b:NameList>
-          <b:Person>
-            <b:Last>Cowling</b:Last>
-            <b:First>Peter</b:First>
-          </b:Person>
-          <b:Person>
-            <b:Last>Powley</b:Last>
-            <b:First>Ed</b:First>
-          </b:Person>
-          <b:Person>
-            <b:Last>Whitehouse</b:Last>
-            <b:First>Daniel</b:First>
-          </b:Person>
-        </b:NameList>
-      </b:Author>
-    </b:Author>
-    <b:Title>Python Code</b:Title>
-    <b:InternetSiteTitle>mcts.ai</b:InternetSiteTitle>
-    <b:Year>2012</b:Year>
-    <b:Month>September</b:Month>
-    <b:URL>https://mcts.ai/code/python.html</b:URL>
-    <b:RefOrder>19</b:RefOrder>
-  </b:Source>
-  <b:Source>
-    <b:Tag>Gee26</b:Tag>
-    <b:SourceType>InternetSite</b:SourceType>
-    <b:Guid>{260A8ED4-DA5A-42AE-8A6E-E54621278433}</b:Guid>
-    <b:Title>Monte Carlo Tree Search (MCTS) in Machine Learning</b:Title>
-    <b:Year>2026</b:Year>
-    <b:Author>
-      <b:Author>
-        <b:NameList>
-          <b:Person>
-            <b:Last>Geeks</b:Last>
-            <b:First>Geeks</b:First>
-            <b:Middle>for</b:Middle>
-          </b:Person>
-        </b:NameList>
-      </b:Author>
-    </b:Author>
-    <b:InternetSiteTitle>Geeks for Geeks</b:InternetSiteTitle>
-    <b:Month>01</b:Month>
-    <b:Day>30</b:Day>
-    <b:URL>https://www.geeksforgeeks.org/machine-learning/monte-carlo-tree-search-mcts-in-machine-learning/</b:URL>
-    <b:RefOrder>20</b:RefOrder>
-  </b:Source>
-  <b:Source>
-    <b:Tag>Lan14</b:Tag>
-    <b:SourceType>InternetSite</b:SourceType>
-    <b:Guid>{520599F7-406C-4419-86C3-385DD76CB90D}</b:Guid>
-    <b:Title>Monte Carlo Tree Search with Heuristic Evaluations using Implicit Minimax Backups</b:Title>
-    <b:Year>2014</b:Year>
-    <b:Month>June</b:Month>
-    <b:Day>2</b:Day>
-    <b:Author>
-      <b:Author>
-        <b:NameList>
-          <b:Person>
-            <b:Last>Lanctot</b:Last>
-            <b:First>M.,</b:First>
-            <b:Middle>Winands, M. H. M, et al.</b:Middle>
-          </b:Person>
-        </b:NameList>
-      </b:Author>
-    </b:Author>
-    <b:InternetSiteTitle>arxiv</b:InternetSiteTitle>
-    <b:URL>https://arxiv.org/abs/1406.0486?utm_source=chatgpt.com</b:URL>
-    <b:RefOrder>21</b:RefOrder>
-  </b:Source>
-  <b:Source>
-    <b:Tag>Lor16</b:Tag>
-    <b:SourceType>ArticleInAPeriodical</b:SourceType>
-    <b:Guid>{06C0C3FD-4C4B-46FA-AB21-17A5A7AC566F}</b:Guid>
-    <b:Author>
-      <b:Author>
-        <b:NameList>
-          <b:Person>
-            <b:Last>Lorentz</b:Last>
-            <b:First>R.</b:First>
-          </b:Person>
-        </b:NameList>
-      </b:Author>
-    </b:Author>
-    <b:Title>Using evaluation functions in Monte-Carlo Tree Search</b:Title>
-    <b:PeriodicalTitle>ScienceDirect</b:PeriodicalTitle>
-    <b:Year>2016</b:Year>
-    <b:Month>September</b:Month>
-    <b:Pages>106-113</b:Pages>
-    <b:RefOrder>22</b:RefOrder>
-  </b:Source>
-  <b:Source>
-    <b:Tag>Ach25</b:Tag>
-    <b:SourceType>InternetSite</b:SourceType>
-    <b:Guid>{845A54FF-4CA4-4676-9664-62005D249D0A}</b:Guid>
-    <b:Title>Modeling Uncertainty: Constraint-Based Belief</b:Title>
-    <b:InternetSiteTitle>arxiv</b:InternetSiteTitle>
-    <b:Year>2025</b:Year>
-    <b:Month>Août</b:Month>
-    <b:Day>19</b:Day>
-    <b:URL>https://arxiv.org/pdf/2507.19263</b:URL>
-    <b:Author>
-      <b:Author>
-        <b:NameList>
-          <b:Person>
-            <b:Last>Morenville</b:Last>
-            <b:First>Achille</b:First>
-          </b:Person>
-          <b:Person>
-            <b:Last>Piette</b:Last>
-            <b:First>Eric</b:First>
-          </b:Person>
-        </b:NameList>
-      </b:Author>
-    </b:Author>
-    <b:RefOrder>23</b:RefOrder>
-  </b:Source>
-  <b:Source>
-    <b:Tag>Jul22</b:Tag>
-    <b:SourceType>InternetSite</b:SourceType>
-    <b:Guid>{4FBBFBE0-0FA8-4459-91FC-F40B5E922FA9}</b:Guid>
-    <b:Title>Mastering the Game of Stratego with Model-Free Multiagent Reinforcement Learning</b:Title>
-    <b:Year>2022</b:Year>
-    <b:Author>
-      <b:Author>
-        <b:NameList>
-          <b:Person>
-            <b:Last>Perolat et al</b:Last>
-            <b:First>Julien</b:First>
-          </b:Person>
-        </b:NameList>
-      </b:Author>
-    </b:Author>
-    <b:InternetSiteTitle>arxiv.com</b:InternetSiteTitle>
-    <b:Month>Juin</b:Month>
-    <b:Day>30</b:Day>
-    <b:URL>https://arxiv.org/pdf/2206.15378</b:URL>
-    <b:RefOrder>24</b:RefOrder>
   </b:Source>
   <b:Source>
     <b:Tag>Świ22</b:Tag>
@@ -7830,28 +7284,6 @@
     <b:RefOrder>2</b:RefOrder>
   </b:Source>
   <b:Source>
-    <b:Tag>Mar25</b:Tag>
-    <b:SourceType>DocumentFromInternetSite</b:SourceType>
-    <b:Guid>{EB57107D-3BD8-40C8-A608-B345AFFBE7C4}</b:Guid>
-    <b:Title>CSI 4106: Introduction to Artificial Intelligence</b:Title>
-    <b:InternetSiteTitle>turcotte.xyz</b:InternetSiteTitle>
-    <b:Year>2025</b:Year>
-    <b:Month>Décembre</b:Month>
-    <b:Day>1</b:Day>
-    <b:URL>https://turcotte.xyz/teaching/csi-4106/lectures/22/slides.html?q=monte#/monte-carlo-tree-search-mcts</b:URL>
-    <b:Author>
-      <b:Author>
-        <b:NameList>
-          <b:Person>
-            <b:Last>Turcotte</b:Last>
-            <b:First>Marcel</b:First>
-          </b:Person>
-        </b:NameList>
-      </b:Author>
-    </b:Author>
-    <b:RefOrder>25</b:RefOrder>
-  </b:Source>
-  <b:Source>
     <b:Tag>Reb26</b:Tag>
     <b:SourceType>InternetSite</b:SourceType>
     <b:Guid>{0722F40F-8B55-43E6-907E-C73100C54550}</b:Guid>
@@ -7872,7 +7304,7 @@
     <b:Day>20</b:Day>
     <b:URL>
 		</b:URL>
-    <b:RefOrder>26</b:RefOrder>
+    <b:RefOrder>17</b:RefOrder>
   </b:Source>
   <b:Source>
     <b:Tag>Vod17</b:Tag>
@@ -7900,7 +7332,7 @@
       </b:Author>
     </b:Author>
     <b:JournalName>Journal of Artificial Intelligence Research</b:JournalName>
-    <b:RefOrder>27</b:RefOrder>
+    <b:RefOrder>18</b:RefOrder>
   </b:Source>
   <b:Source>
     <b:Tag>Gri20</b:Tag>
@@ -7958,7 +7390,7 @@
 </file>
 
 <file path=customXml/itemProps1.xml><?xml version="1.0" encoding="utf-8"?>
-<ds:datastoreItem xmlns:ds="http://schemas.openxmlformats.org/officeDocument/2006/customXml" ds:itemID="{B14234DC-5D9A-442F-A421-14726107309C}">
+<ds:datastoreItem xmlns:ds="http://schemas.openxmlformats.org/officeDocument/2006/customXml" ds:itemID="{617ABD52-3857-454A-9258-0A8D56E3DE8E}">
   <ds:schemaRefs>
     <ds:schemaRef ds:uri="http://schemas.openxmlformats.org/officeDocument/2006/bibliography"/>
   </ds:schemaRefs>

</xml_diff>